<commit_message>
docs: one reference per kit (10-APPKIT ... 18-PRINTERKIT), made from the kits' headers by tools/docgen/kitdocs.py; the exports
Co-Authored-By: Claude Opus 5.5 <noreply@anthropic.com>
</commit_message>
<xml_diff>
--- a/docs/exports/06-KITS-GUIDE.docx
+++ b/docs/exports/06-KITS-GUIDE.docx
@@ -71,7 +71,21 @@
           <w:i/>
           <w:iCs/>
         </w:rPr>
-        <w:t xml:space="preserve">for each. Companion of the</w:t>
+        <w:t xml:space="preserve">for each. Each kit has its reference, with every operation it exposes (documents 10 to 18, linked in the</w:t>
+      </w:r>
+      <w:r>
+        <w:rPr>
+          <w:i/>
+          <w:iCs/>
+        </w:rPr>
+        <w:t xml:space="preserve"> </w:t>
+      </w:r>
+      <w:r>
+        <w:rPr>
+          <w:i/>
+          <w:iCs/>
+        </w:rPr>
+        <w:t xml:space="preserve">table below). Companion of the</w:t>
       </w:r>
       <w:r>
         <w:rPr>
@@ -102,7 +116,7 @@
           <w:i/>
           <w:iCs/>
         </w:rPr>
-        <w:t xml:space="preserve">(the reference: every call, the</w:t>
+        <w:t xml:space="preserve">(the build, the application</w:t>
       </w:r>
       <w:r>
         <w:rPr>
@@ -116,7 +130,7 @@
           <w:i/>
           <w:iCs/>
         </w:rPr>
-        <w:t xml:space="preserve">build, the ports) and of</w:t>
+        <w:t xml:space="preserve">model, the ports) and of</w:t>
       </w:r>
       <w:r>
         <w:rPr>
@@ -381,7 +395,7 @@
       </w:r>
     </w:p>
     <w:bookmarkEnd w:id="20"/>
-    <w:bookmarkStart w:id="21" w:name="Xf42949ce2155418547b745b31f0a8bd30f8ab19"/>
+    <w:bookmarkStart w:id="30" w:name="Xf42949ce2155418547b745b31f0a8bd30f8ab19"/>
     <w:p>
       <w:pPr>
         <w:pStyle w:val="Heading2"/>
@@ -424,10 +438,11 @@
         <w:tblLook w:firstRow="1" w:lastRow="0" w:firstColumn="0" w:lastColumn="0" w:noHBand="0" w:noVBand="0" w:val="0020"/>
       </w:tblPr>
       <w:tblGrid>
-        <w:gridCol w:w="1980"/>
-        <w:gridCol w:w="1980"/>
-        <w:gridCol w:w="1980"/>
-        <w:gridCol w:w="1980"/>
+        <w:gridCol w:w="1584"/>
+        <w:gridCol w:w="1584"/>
+        <w:gridCol w:w="1584"/>
+        <w:gridCol w:w="1584"/>
+        <w:gridCol w:w="1584"/>
       </w:tblGrid>
       <w:tr>
         <w:trPr>
@@ -477,8 +492,6 @@
             </w:r>
           </w:p>
         </w:tc>
-      </w:tr>
-      <w:tr>
         <w:tc>
           <w:tcPr/>
           <w:p>
@@ -486,65 +499,7 @@
               <w:pStyle w:val="Compact"/>
             </w:pPr>
             <w:r>
-              <w:rPr>
-                <w:b/>
-                <w:bCs/>
-              </w:rPr>
-              <w:t xml:space="preserve">AppKit</w:t>
-            </w:r>
-          </w:p>
-        </w:tc>
-        <w:tc>
-          <w:tcPr/>
-          <w:p>
-            <w:pPr>
-              <w:pStyle w:val="Compact"/>
-            </w:pPr>
-            <w:r>
-              <w:t xml:space="preserve">What makes a program run: the system's calls, strings, the console,</w:t>
-            </w:r>
-            <w:r>
-              <w:t xml:space="preserve"> </w:t>
-            </w:r>
-            <w:r>
-              <w:rPr>
-                <w:rStyle w:val="VerbatimChar"/>
-              </w:rPr>
-              <w:t xml:space="preserve">.ini</w:t>
-            </w:r>
-            <w:r>
-              <w:t xml:space="preserve"> </w:t>
-            </w:r>
-            <w:r>
-              <w:t xml:space="preserve">files, starting programs</w:t>
-            </w:r>
-          </w:p>
-        </w:tc>
-        <w:tc>
-          <w:tcPr/>
-          <w:p>
-            <w:pPr>
-              <w:pStyle w:val="Compact"/>
-            </w:pPr>
-            <w:r>
-              <w:rPr>
-                <w:rStyle w:val="VerbatimChar"/>
-              </w:rPr>
-              <w:t xml:space="preserve">SD:/lib/appkit.so</w:t>
-            </w:r>
-          </w:p>
-        </w:tc>
-        <w:tc>
-          <w:tcPr/>
-          <w:p>
-            <w:pPr>
-              <w:pStyle w:val="Compact"/>
-            </w:pPr>
-            <w:r>
-              <w:rPr>
-                <w:rStyle w:val="VerbatimChar"/>
-              </w:rPr>
-              <w:t xml:space="preserve">user/Kits/appkit</w:t>
+              <w:t xml:space="preserve">Reference</w:t>
             </w:r>
           </w:p>
         </w:tc>
@@ -561,7 +516,7 @@
                 <w:b/>
                 <w:bCs/>
               </w:rPr>
-              <w:t xml:space="preserve">UIKit</w:t>
+              <w:t xml:space="preserve">AppKit</w:t>
             </w:r>
           </w:p>
         </w:tc>
@@ -572,7 +527,22 @@
               <w:pStyle w:val="Compact"/>
             </w:pPr>
             <w:r>
-              <w:t xml:space="preserve">The interface: windows, widgets, dialogs, the theme, icons</w:t>
+              <w:t xml:space="preserve">What makes a program run: the system's calls, strings, the console,</w:t>
+            </w:r>
+            <w:r>
+              <w:t xml:space="preserve"> </w:t>
+            </w:r>
+            <w:r>
+              <w:rPr>
+                <w:rStyle w:val="VerbatimChar"/>
+              </w:rPr>
+              <w:t xml:space="preserve">.ini</w:t>
+            </w:r>
+            <w:r>
+              <w:t xml:space="preserve"> </w:t>
+            </w:r>
+            <w:r>
+              <w:t xml:space="preserve">files, starting programs</w:t>
             </w:r>
           </w:p>
         </w:tc>
@@ -586,7 +556,7 @@
               <w:rPr>
                 <w:rStyle w:val="VerbatimChar"/>
               </w:rPr>
-              <w:t xml:space="preserve">SD:/lib/uikit.so</w:t>
+              <w:t xml:space="preserve">SD:/lib/appkit.so</w:t>
             </w:r>
           </w:p>
         </w:tc>
@@ -600,8 +570,24 @@
               <w:rPr>
                 <w:rStyle w:val="VerbatimChar"/>
               </w:rPr>
-              <w:t xml:space="preserve">user/Kits/uikit</w:t>
-            </w:r>
+              <w:t xml:space="preserve">user/Kits/appkit</w:t>
+            </w:r>
+          </w:p>
+        </w:tc>
+        <w:tc>
+          <w:tcPr/>
+          <w:p>
+            <w:pPr>
+              <w:pStyle w:val="Compact"/>
+            </w:pPr>
+            <w:hyperlink r:id="rId21">
+              <w:r>
+                <w:rPr>
+                  <w:rStyle w:val="Hyperlink"/>
+                </w:rPr>
+                <w:t xml:space="preserve">10 — AppKit</w:t>
+              </w:r>
+            </w:hyperlink>
           </w:p>
         </w:tc>
       </w:tr>
@@ -617,7 +603,7 @@
                 <w:b/>
                 <w:bCs/>
               </w:rPr>
-              <w:t xml:space="preserve">SystemKit</w:t>
+              <w:t xml:space="preserve">UIKit</w:t>
             </w:r>
           </w:p>
         </w:tc>
@@ -628,7 +614,7 @@
               <w:pStyle w:val="Compact"/>
             </w:pPr>
             <w:r>
-              <w:t xml:space="preserve">Talking to the system and the other programs: notifications, clipboard, trash, volume, wallpaper, file associations, the dock</w:t>
+              <w:t xml:space="preserve">The interface: windows, widgets, dialogs, the theme, icons</w:t>
             </w:r>
           </w:p>
         </w:tc>
@@ -642,7 +628,7 @@
               <w:rPr>
                 <w:rStyle w:val="VerbatimChar"/>
               </w:rPr>
-              <w:t xml:space="preserve">SD:/lib/systemkit.so</w:t>
+              <w:t xml:space="preserve">SD:/lib/uikit.so</w:t>
             </w:r>
           </w:p>
         </w:tc>
@@ -656,8 +642,24 @@
               <w:rPr>
                 <w:rStyle w:val="VerbatimChar"/>
               </w:rPr>
-              <w:t xml:space="preserve">user/Kits/systemkit</w:t>
-            </w:r>
+              <w:t xml:space="preserve">user/Kits/uikit</w:t>
+            </w:r>
+          </w:p>
+        </w:tc>
+        <w:tc>
+          <w:tcPr/>
+          <w:p>
+            <w:pPr>
+              <w:pStyle w:val="Compact"/>
+            </w:pPr>
+            <w:hyperlink r:id="rId22">
+              <w:r>
+                <w:rPr>
+                  <w:rStyle w:val="Hyperlink"/>
+                </w:rPr>
+                <w:t xml:space="preserve">11 — UIKit</w:t>
+              </w:r>
+            </w:hyperlink>
           </w:p>
         </w:tc>
       </w:tr>
@@ -673,7 +675,7 @@
                 <w:b/>
                 <w:bCs/>
               </w:rPr>
-              <w:t xml:space="preserve">NetKit</w:t>
+              <w:t xml:space="preserve">SystemKit</w:t>
             </w:r>
           </w:p>
         </w:tc>
@@ -684,7 +686,7 @@
               <w:pStyle w:val="Compact"/>
             </w:pPr>
             <w:r>
-              <w:t xml:space="preserve">The network: HTTP, the FTP volumes</w:t>
+              <w:t xml:space="preserve">Talking to the system and the other programs: notifications, clipboard, trash, volume, wallpaper, file associations, the dock</w:t>
             </w:r>
           </w:p>
         </w:tc>
@@ -698,7 +700,7 @@
               <w:rPr>
                 <w:rStyle w:val="VerbatimChar"/>
               </w:rPr>
-              <w:t xml:space="preserve">SD:/lib/netkit.so</w:t>
+              <w:t xml:space="preserve">SD:/lib/systemkit.so</w:t>
             </w:r>
           </w:p>
         </w:tc>
@@ -712,8 +714,24 @@
               <w:rPr>
                 <w:rStyle w:val="VerbatimChar"/>
               </w:rPr>
-              <w:t xml:space="preserve">user/Kits/netkit</w:t>
-            </w:r>
+              <w:t xml:space="preserve">user/Kits/systemkit</w:t>
+            </w:r>
+          </w:p>
+        </w:tc>
+        <w:tc>
+          <w:tcPr/>
+          <w:p>
+            <w:pPr>
+              <w:pStyle w:val="Compact"/>
+            </w:pPr>
+            <w:hyperlink r:id="rId23">
+              <w:r>
+                <w:rPr>
+                  <w:rStyle w:val="Hyperlink"/>
+                </w:rPr>
+                <w:t xml:space="preserve">12 — SystemKit</w:t>
+              </w:r>
+            </w:hyperlink>
           </w:p>
         </w:tc>
       </w:tr>
@@ -729,7 +747,7 @@
                 <w:b/>
                 <w:bCs/>
               </w:rPr>
-              <w:t xml:space="preserve">FileKit</w:t>
+              <w:t xml:space="preserve">NetKit</w:t>
             </w:r>
           </w:p>
         </w:tc>
@@ -740,7 +758,7 @@
               <w:pStyle w:val="Compact"/>
             </w:pPr>
             <w:r>
-              <w:t xml:space="preserve">Files and folders, paths, compression, archives</w:t>
+              <w:t xml:space="preserve">The network: HTTP, the FTP volumes</w:t>
             </w:r>
           </w:p>
         </w:tc>
@@ -754,7 +772,7 @@
               <w:rPr>
                 <w:rStyle w:val="VerbatimChar"/>
               </w:rPr>
-              <w:t xml:space="preserve">SD:/lib/filekit.so</w:t>
+              <w:t xml:space="preserve">SD:/lib/netkit.so</w:t>
             </w:r>
           </w:p>
         </w:tc>
@@ -768,8 +786,24 @@
               <w:rPr>
                 <w:rStyle w:val="VerbatimChar"/>
               </w:rPr>
-              <w:t xml:space="preserve">user/Kits/filekit</w:t>
-            </w:r>
+              <w:t xml:space="preserve">user/Kits/netkit</w:t>
+            </w:r>
+          </w:p>
+        </w:tc>
+        <w:tc>
+          <w:tcPr/>
+          <w:p>
+            <w:pPr>
+              <w:pStyle w:val="Compact"/>
+            </w:pPr>
+            <w:hyperlink r:id="rId24">
+              <w:r>
+                <w:rPr>
+                  <w:rStyle w:val="Hyperlink"/>
+                </w:rPr>
+                <w:t xml:space="preserve">13 — NetKit</w:t>
+              </w:r>
+            </w:hyperlink>
           </w:p>
         </w:tc>
       </w:tr>
@@ -785,7 +819,7 @@
                 <w:b/>
                 <w:bCs/>
               </w:rPr>
-              <w:t xml:space="preserve">ImageKit</w:t>
+              <w:t xml:space="preserve">FileKit</w:t>
             </w:r>
           </w:p>
         </w:tc>
@@ -796,7 +830,7 @@
               <w:pStyle w:val="Compact"/>
             </w:pPr>
             <w:r>
-              <w:t xml:space="preserve">Pictures: reading, writing, resizing, adjusting</w:t>
+              <w:t xml:space="preserve">Files and folders, paths, compression, archives</w:t>
             </w:r>
           </w:p>
         </w:tc>
@@ -810,7 +844,7 @@
               <w:rPr>
                 <w:rStyle w:val="VerbatimChar"/>
               </w:rPr>
-              <w:t xml:space="preserve">SD:/lib/imagekit.so</w:t>
+              <w:t xml:space="preserve">SD:/lib/filekit.so</w:t>
             </w:r>
           </w:p>
         </w:tc>
@@ -824,8 +858,24 @@
               <w:rPr>
                 <w:rStyle w:val="VerbatimChar"/>
               </w:rPr>
-              <w:t xml:space="preserve">user/Kits/imagekit</w:t>
-            </w:r>
+              <w:t xml:space="preserve">user/Kits/filekit</w:t>
+            </w:r>
+          </w:p>
+        </w:tc>
+        <w:tc>
+          <w:tcPr/>
+          <w:p>
+            <w:pPr>
+              <w:pStyle w:val="Compact"/>
+            </w:pPr>
+            <w:hyperlink r:id="rId25">
+              <w:r>
+                <w:rPr>
+                  <w:rStyle w:val="Hyperlink"/>
+                </w:rPr>
+                <w:t xml:space="preserve">14 — FileKit</w:t>
+              </w:r>
+            </w:hyperlink>
           </w:p>
         </w:tc>
       </w:tr>
@@ -841,7 +891,7 @@
                 <w:b/>
                 <w:bCs/>
               </w:rPr>
-              <w:t xml:space="preserve">AudioKit</w:t>
+              <w:t xml:space="preserve">ImageKit</w:t>
             </w:r>
           </w:p>
         </w:tc>
@@ -852,7 +902,7 @@
               <w:pStyle w:val="Compact"/>
             </w:pPr>
             <w:r>
-              <w:t xml:space="preserve">Sound: playing files, notes, synthesis, the sound output</w:t>
+              <w:t xml:space="preserve">Pictures: reading, writing, resizing, adjusting</w:t>
             </w:r>
           </w:p>
         </w:tc>
@@ -866,7 +916,7 @@
               <w:rPr>
                 <w:rStyle w:val="VerbatimChar"/>
               </w:rPr>
-              <w:t xml:space="preserve">SD:/lib/audiokit.so</w:t>
+              <w:t xml:space="preserve">SD:/lib/imagekit.so</w:t>
             </w:r>
           </w:p>
         </w:tc>
@@ -880,8 +930,24 @@
               <w:rPr>
                 <w:rStyle w:val="VerbatimChar"/>
               </w:rPr>
-              <w:t xml:space="preserve">user/Kits/audiokit</w:t>
-            </w:r>
+              <w:t xml:space="preserve">user/Kits/imagekit</w:t>
+            </w:r>
+          </w:p>
+        </w:tc>
+        <w:tc>
+          <w:tcPr/>
+          <w:p>
+            <w:pPr>
+              <w:pStyle w:val="Compact"/>
+            </w:pPr>
+            <w:hyperlink r:id="rId26">
+              <w:r>
+                <w:rPr>
+                  <w:rStyle w:val="Hyperlink"/>
+                </w:rPr>
+                <w:t xml:space="preserve">15 — ImageKit</w:t>
+              </w:r>
+            </w:hyperlink>
           </w:p>
         </w:tc>
       </w:tr>
@@ -897,7 +963,7 @@
                 <w:b/>
                 <w:bCs/>
               </w:rPr>
-              <w:t xml:space="preserve">FontKit</w:t>
+              <w:t xml:space="preserve">AudioKit</w:t>
             </w:r>
           </w:p>
         </w:tc>
@@ -908,7 +974,7 @@
               <w:pStyle w:val="Compact"/>
             </w:pPr>
             <w:r>
-              <w:t xml:space="preserve">Fonts: FreeType, the font manager, anti-aliased text</w:t>
+              <w:t xml:space="preserve">Sound: playing files, notes, synthesis, the sound output</w:t>
             </w:r>
           </w:p>
         </w:tc>
@@ -922,7 +988,7 @@
               <w:rPr>
                 <w:rStyle w:val="VerbatimChar"/>
               </w:rPr>
-              <w:t xml:space="preserve">SD:/lib/fontkit.so</w:t>
+              <w:t xml:space="preserve">SD:/lib/audiokit.so</w:t>
             </w:r>
           </w:p>
         </w:tc>
@@ -936,8 +1002,24 @@
               <w:rPr>
                 <w:rStyle w:val="VerbatimChar"/>
               </w:rPr>
-              <w:t xml:space="preserve">user/Kits/fontkit</w:t>
-            </w:r>
+              <w:t xml:space="preserve">user/Kits/audiokit</w:t>
+            </w:r>
+          </w:p>
+        </w:tc>
+        <w:tc>
+          <w:tcPr/>
+          <w:p>
+            <w:pPr>
+              <w:pStyle w:val="Compact"/>
+            </w:pPr>
+            <w:hyperlink r:id="rId27">
+              <w:r>
+                <w:rPr>
+                  <w:rStyle w:val="Hyperlink"/>
+                </w:rPr>
+                <w:t xml:space="preserve">16 — AudioKit</w:t>
+              </w:r>
+            </w:hyperlink>
           </w:p>
         </w:tc>
       </w:tr>
@@ -953,7 +1035,7 @@
                 <w:b/>
                 <w:bCs/>
               </w:rPr>
-              <w:t xml:space="preserve">PrinterKit</w:t>
+              <w:t xml:space="preserve">FontKit</w:t>
             </w:r>
           </w:p>
         </w:tc>
@@ -964,7 +1046,7 @@
               <w:pStyle w:val="Compact"/>
             </w:pPr>
             <w:r>
-              <w:t xml:space="preserve">Printing: the Print dialog, a job's pages</w:t>
+              <w:t xml:space="preserve">Fonts: FreeType, the font manager, anti-aliased text</w:t>
             </w:r>
           </w:p>
         </w:tc>
@@ -978,7 +1060,7 @@
               <w:rPr>
                 <w:rStyle w:val="VerbatimChar"/>
               </w:rPr>
-              <w:t xml:space="preserve">SD:/lib/printerkit.so</w:t>
+              <w:t xml:space="preserve">SD:/lib/fontkit.so</w:t>
             </w:r>
           </w:p>
         </w:tc>
@@ -992,8 +1074,96 @@
               <w:rPr>
                 <w:rStyle w:val="VerbatimChar"/>
               </w:rPr>
+              <w:t xml:space="preserve">user/Kits/fontkit</w:t>
+            </w:r>
+          </w:p>
+        </w:tc>
+        <w:tc>
+          <w:tcPr/>
+          <w:p>
+            <w:pPr>
+              <w:pStyle w:val="Compact"/>
+            </w:pPr>
+            <w:hyperlink r:id="rId28">
+              <w:r>
+                <w:rPr>
+                  <w:rStyle w:val="Hyperlink"/>
+                </w:rPr>
+                <w:t xml:space="preserve">17 — FontKit</w:t>
+              </w:r>
+            </w:hyperlink>
+          </w:p>
+        </w:tc>
+      </w:tr>
+      <w:tr>
+        <w:tc>
+          <w:tcPr/>
+          <w:p>
+            <w:pPr>
+              <w:pStyle w:val="Compact"/>
+            </w:pPr>
+            <w:r>
+              <w:rPr>
+                <w:b/>
+                <w:bCs/>
+              </w:rPr>
+              <w:t xml:space="preserve">PrinterKit</w:t>
+            </w:r>
+          </w:p>
+        </w:tc>
+        <w:tc>
+          <w:tcPr/>
+          <w:p>
+            <w:pPr>
+              <w:pStyle w:val="Compact"/>
+            </w:pPr>
+            <w:r>
+              <w:t xml:space="preserve">Printing: the Print dialog, a job's pages</w:t>
+            </w:r>
+          </w:p>
+        </w:tc>
+        <w:tc>
+          <w:tcPr/>
+          <w:p>
+            <w:pPr>
+              <w:pStyle w:val="Compact"/>
+            </w:pPr>
+            <w:r>
+              <w:rPr>
+                <w:rStyle w:val="VerbatimChar"/>
+              </w:rPr>
+              <w:t xml:space="preserve">SD:/lib/printerkit.so</w:t>
+            </w:r>
+          </w:p>
+        </w:tc>
+        <w:tc>
+          <w:tcPr/>
+          <w:p>
+            <w:pPr>
+              <w:pStyle w:val="Compact"/>
+            </w:pPr>
+            <w:r>
+              <w:rPr>
+                <w:rStyle w:val="VerbatimChar"/>
+              </w:rPr>
               <w:t xml:space="preserve">user/Kits/printerkit</w:t>
             </w:r>
+          </w:p>
+        </w:tc>
+        <w:tc>
+          <w:tcPr/>
+          <w:p>
+            <w:pPr>
+              <w:pStyle w:val="Compact"/>
+            </w:pPr>
+            <w:hyperlink r:id="rId29">
+              <w:r>
+                <w:rPr>
+                  <w:rStyle w:val="Hyperlink"/>
+                </w:rPr>
+                <w:t xml:space="preserve">18 — PrinterKit</w:t>
+              </w:r>
+            </w:hyperlink>
           </w:p>
         </w:tc>
       </w:tr>
@@ -1083,7 +1253,7 @@
         <w:pStyle w:val="FirstParagraph"/>
       </w:pPr>
       <w:r>
-        <w:t xml:space="preserve">A kit's header</w:t>
+        <w:t xml:space="preserve">A kit has</w:t>
       </w:r>
       <w:r>
         <w:t xml:space="preserve"> </w:t>
@@ -1093,6 +1263,31 @@
           <w:b/>
           <w:bCs/>
         </w:rPr>
+        <w:t xml:space="preserve">one header</w:t>
+      </w:r>
+      <w:r>
+        <w:t xml:space="preserve">,</w:t>
+      </w:r>
+      <w:r>
+        <w:t xml:space="preserve"> </w:t>
+      </w:r>
+      <w:r>
+        <w:rPr>
+          <w:rStyle w:val="VerbatimChar"/>
+        </w:rPr>
+        <w:t xml:space="preserve">&lt;kit&gt;/&lt;kit&gt;.h</w:t>
+      </w:r>
+      <w:r>
+        <w:t xml:space="preserve">, which</w:t>
+      </w:r>
+      <w:r>
+        <w:t xml:space="preserve"> </w:t>
+      </w:r>
+      <w:r>
+        <w:rPr>
+          <w:b/>
+          <w:bCs/>
+        </w:rPr>
         <w:t xml:space="preserve">declares</w:t>
       </w:r>
       <w:r>
@@ -1105,8 +1300,8 @@
         <w:t xml:space="preserve">code is shared by every program that uses it.</w:t>
       </w:r>
     </w:p>
-    <w:bookmarkEnd w:id="21"/>
-    <w:bookmarkStart w:id="26" w:name="X85b9036d0c437b6d6abf0631055454f6f74ddb8"/>
+    <w:bookmarkEnd w:id="30"/>
+    <w:bookmarkStart w:id="35" w:name="X85b9036d0c437b6d6abf0631055454f6f74ddb8"/>
     <w:p>
       <w:pPr>
         <w:pStyle w:val="Heading2"/>
@@ -1115,7 +1310,7 @@
         <w:t xml:space="preserve">2. Using a kit in a program</w:t>
       </w:r>
     </w:p>
-    <w:bookmarkStart w:id="22" w:name="including"/>
+    <w:bookmarkStart w:id="31" w:name="including"/>
     <w:p>
       <w:pPr>
         <w:pStyle w:val="Heading3"/>
@@ -1215,19 +1410,19 @@
         <w:rPr>
           <w:rStyle w:val="ImportTok"/>
         </w:rPr>
-        <w:t xml:space="preserve">"systemkit/notify.h"</w:t>
+        <w:t xml:space="preserve">"systemkit/systemkit.h"</w:t>
       </w:r>
       <w:r>
         <w:rPr>
           <w:rStyle w:val="PreprocessorTok"/>
         </w:rPr>
-        <w:t xml:space="preserve">       </w:t>
+        <w:t xml:space="preserve">    </w:t>
       </w:r>
       <w:r>
         <w:rPr>
           <w:rStyle w:val="CommentTok"/>
         </w:rPr>
-        <w:t xml:space="preserve">// SystemKit: one header per subject</w:t>
+        <w:t xml:space="preserve">// SystemKit</w:t>
       </w:r>
       <w:r>
         <w:br/>
@@ -1242,13 +1437,13 @@
         <w:rPr>
           <w:rStyle w:val="ImportTok"/>
         </w:rPr>
-        <w:t xml:space="preserve">"netkit/httpc.h"</w:t>
+        <w:t xml:space="preserve">"netkit/netkit.h"</w:t>
       </w:r>
       <w:r>
         <w:rPr>
           <w:rStyle w:val="PreprocessorTok"/>
         </w:rPr>
-        <w:t xml:space="preserve">           </w:t>
+        <w:t xml:space="preserve">          </w:t>
       </w:r>
       <w:r>
         <w:rPr>
@@ -1392,8 +1587,8 @@
         <w:t xml:space="preserve">// PrinterKit</w:t>
       </w:r>
     </w:p>
-    <w:bookmarkEnd w:id="22"/>
-    <w:bookmarkStart w:id="23" w:name="linking"/>
+    <w:bookmarkEnd w:id="31"/>
+    <w:bookmarkStart w:id="32" w:name="linking"/>
     <w:p>
       <w:pPr>
         <w:pStyle w:val="Heading3"/>
@@ -1609,8 +1804,8 @@
         <w:t xml:space="preserve">mytool.elf: ../lib/systemkit.imp_c.a</w:t>
       </w:r>
     </w:p>
-    <w:bookmarkEnd w:id="23"/>
-    <w:bookmarkStart w:id="24" w:name="versions"/>
+    <w:bookmarkEnd w:id="32"/>
+    <w:bookmarkStart w:id="33" w:name="versions"/>
     <w:p>
       <w:pPr>
         <w:pStyle w:val="Heading3"/>
@@ -1669,8 +1864,8 @@
         <w:t xml:space="preserve">library first.</w:t>
       </w:r>
     </w:p>
-    <w:bookmarkEnd w:id="24"/>
-    <w:bookmarkStart w:id="25" w:name="on-a-pc"/>
+    <w:bookmarkEnd w:id="33"/>
+    <w:bookmarkStart w:id="34" w:name="on-a-pc"/>
     <w:p>
       <w:pPr>
         <w:pStyle w:val="Heading3"/>
@@ -1699,9 +1894,9 @@
         <w:t xml:space="preserve">changes in the program's code.</w:t>
       </w:r>
     </w:p>
-    <w:bookmarkEnd w:id="25"/>
-    <w:bookmarkEnd w:id="26"/>
-    <w:bookmarkStart w:id="27" w:name="X479a017f3f362789bae7c4b9122aafaba533bfa"/>
+    <w:bookmarkEnd w:id="34"/>
+    <w:bookmarkEnd w:id="35"/>
+    <w:bookmarkStart w:id="36" w:name="X479a017f3f362789bae7c4b9122aafaba533bfa"/>
     <w:p>
       <w:pPr>
         <w:pStyle w:val="Heading2"/>
@@ -3533,8 +3728,8 @@
         <w:t xml:space="preserve">// a file: by its runner</w:t>
       </w:r>
     </w:p>
-    <w:bookmarkEnd w:id="27"/>
-    <w:bookmarkStart w:id="28" w:name="X0a53c701f88fdf6f7c7ea97f28ca21204deb07c"/>
+    <w:bookmarkEnd w:id="36"/>
+    <w:bookmarkStart w:id="37" w:name="X0a53c701f88fdf6f7c7ea97f28ca21204deb07c"/>
     <w:p>
       <w:pPr>
         <w:pStyle w:val="Heading2"/>
@@ -5608,8 +5803,8 @@
         <w:t xml:space="preserve">(called about 60 times a second).</w:t>
       </w:r>
     </w:p>
-    <w:bookmarkEnd w:id="28"/>
-    <w:bookmarkStart w:id="29" w:name="X1c12e241ab2b4ebd18b32f840f751712082d5e1"/>
+    <w:bookmarkEnd w:id="37"/>
+    <w:bookmarkStart w:id="38" w:name="X1c12e241ab2b4ebd18b32f840f751712082d5e1"/>
     <w:p>
       <w:pPr>
         <w:pStyle w:val="Heading2"/>
@@ -5623,16 +5818,10 @@
         <w:pStyle w:val="FirstParagraph"/>
       </w:pPr>
       <w:r>
-        <w:t xml:space="preserve">One header per subject, in</w:t>
-      </w:r>
-      <w:r>
-        <w:t xml:space="preserve"> </w:t>
-      </w:r>
-      <w:r>
         <w:rPr>
           <w:rStyle w:val="VerbatimChar"/>
         </w:rPr>
-        <w:t xml:space="preserve">systemkit/</w:t>
+        <w:t xml:space="preserve">#include "systemkit/systemkit.h"</w:t>
       </w:r>
       <w:r>
         <w:t xml:space="preserve"> </w:t>
@@ -5669,6 +5858,18 @@
       </w:r>
       <w:r>
         <w:t xml:space="preserve">(C).</w:t>
+      </w:r>
+      <w:r>
+        <w:t xml:space="preserve"> </w:t>
+      </w:r>
+      <w:r>
+        <w:t xml:space="preserve">The one header brings every subject below (a C program gets those written in C: notifications,</w:t>
+      </w:r>
+      <w:r>
+        <w:t xml:space="preserve"> </w:t>
+      </w:r>
+      <w:r>
+        <w:t xml:space="preserve">volume, preload list, the applets' protocol).</w:t>
       </w:r>
     </w:p>
     <w:p>
@@ -5718,7 +5919,7 @@
         <w:rPr>
           <w:rStyle w:val="ImportTok"/>
         </w:rPr>
-        <w:t xml:space="preserve">"systemkit/notify.h"</w:t>
+        <w:t xml:space="preserve">"systemkit/systemkit.h"</w:t>
       </w:r>
       <w:r>
         <w:br/>
@@ -5861,7 +6062,7 @@
         <w:rPr>
           <w:rStyle w:val="ImportTok"/>
         </w:rPr>
-        <w:t xml:space="preserve">"systemkit/clipboard.h"</w:t>
+        <w:t xml:space="preserve">"systemkit/systemkit.h"</w:t>
       </w:r>
       <w:r>
         <w:br/>
@@ -6301,7 +6502,7 @@
         <w:rPr>
           <w:rStyle w:val="ImportTok"/>
         </w:rPr>
-        <w:t xml:space="preserve">"systemkit/trash.h"</w:t>
+        <w:t xml:space="preserve">"systemkit/systemkit.h"</w:t>
       </w:r>
       <w:r>
         <w:br/>
@@ -6471,7 +6672,7 @@
         <w:rPr>
           <w:rStyle w:val="ImportTok"/>
         </w:rPr>
-        <w:t xml:space="preserve">"systemkit/fileassoc.h"</w:t>
+        <w:t xml:space="preserve">"systemkit/systemkit.h"</w:t>
       </w:r>
       <w:r>
         <w:br/>
@@ -6698,37 +6899,7 @@
         <w:rPr>
           <w:rStyle w:val="ImportTok"/>
         </w:rPr>
-        <w:t xml:space="preserve">"systemkit/volume.h"</w:t>
-      </w:r>
-      <w:r>
-        <w:br/>
-      </w:r>
-      <w:r>
-        <w:rPr>
-          <w:rStyle w:val="PreprocessorTok"/>
-        </w:rPr>
-        <w:t xml:space="preserve">#include </w:t>
-      </w:r>
-      <w:r>
-        <w:rPr>
-          <w:rStyle w:val="ImportTok"/>
-        </w:rPr>
-        <w:t xml:space="preserve">"systemkit/wallpaper.h"</w:t>
-      </w:r>
-      <w:r>
-        <w:br/>
-      </w:r>
-      <w:r>
-        <w:rPr>
-          <w:rStyle w:val="PreprocessorTok"/>
-        </w:rPr>
-        <w:t xml:space="preserve">#include </w:t>
-      </w:r>
-      <w:r>
-        <w:rPr>
-          <w:rStyle w:val="ImportTok"/>
-        </w:rPr>
-        <w:t xml:space="preserve">"systemkit/dockconf.h"</w:t>
+        <w:t xml:space="preserve">"systemkit/systemkit.h"</w:t>
       </w:r>
       <w:r>
         <w:br/>
@@ -6935,7 +7106,19 @@
               <w:pStyle w:val="Compact"/>
             </w:pPr>
             <w:r>
-              <w:t xml:space="preserve">Header</w:t>
+              <w:t xml:space="preserve">Its part (a header of its own, beside</w:t>
+            </w:r>
+            <w:r>
+              <w:t xml:space="preserve"> </w:t>
+            </w:r>
+            <w:r>
+              <w:rPr>
+                <w:rStyle w:val="VerbatimChar"/>
+              </w:rPr>
+              <w:t xml:space="preserve">systemkit.h</w:t>
+            </w:r>
+            <w:r>
+              <w:t xml:space="preserve">)</w:t>
             </w:r>
           </w:p>
         </w:tc>
@@ -7210,8 +7393,8 @@
         </w:tc>
       </w:tr>
     </w:tbl>
-    <w:bookmarkEnd w:id="29"/>
-    <w:bookmarkStart w:id="30" w:name="X21c5dfbcb5a69cd5c428264b88180cd193f70a2"/>
+    <w:bookmarkEnd w:id="38"/>
+    <w:bookmarkStart w:id="39" w:name="X21c5dfbcb5a69cd5c428264b88180cd193f70a2"/>
     <w:p>
       <w:pPr>
         <w:pStyle w:val="Heading2"/>
@@ -7228,7 +7411,7 @@
         <w:rPr>
           <w:rStyle w:val="VerbatimChar"/>
         </w:rPr>
-        <w:t xml:space="preserve">#include "netkit/…"</w:t>
+        <w:t xml:space="preserve">#include "netkit/netkit.h"</w:t>
       </w:r>
       <w:r>
         <w:t xml:space="preserve"> </w:t>
@@ -7264,7 +7447,34 @@
         <w:t xml:space="preserve"> </w:t>
       </w:r>
       <w:r>
-        <w:t xml:space="preserve">(C).</w:t>
+        <w:t xml:space="preserve">(C). The</w:t>
+      </w:r>
+      <w:r>
+        <w:t xml:space="preserve"> </w:t>
+      </w:r>
+      <w:r>
+        <w:rPr>
+          <w:rStyle w:val="VerbatimChar"/>
+        </w:rPr>
+        <w:t xml:space="preserve">HttpClient</w:t>
+      </w:r>
+      <w:r>
+        <w:t xml:space="preserve"> </w:t>
+      </w:r>
+      <w:r>
+        <w:t xml:space="preserve">class is apart:</w:t>
+      </w:r>
+      <w:r>
+        <w:t xml:space="preserve"> </w:t>
+      </w:r>
+      <w:r>
+        <w:rPr>
+          <w:rStyle w:val="VerbatimChar"/>
+        </w:rPr>
+        <w:t xml:space="preserve">#include "netkit/http.hpp"</w:t>
+      </w:r>
+      <w:r>
+        <w:t xml:space="preserve">.</w:t>
       </w:r>
     </w:p>
     <w:p>
@@ -7314,7 +7524,7 @@
         <w:rPr>
           <w:rStyle w:val="ImportTok"/>
         </w:rPr>
-        <w:t xml:space="preserve">"netkit/httpc.h"</w:t>
+        <w:t xml:space="preserve">"netkit/netkit.h"</w:t>
       </w:r>
       <w:r>
         <w:br/>
@@ -8269,7 +8479,7 @@
         <w:rPr>
           <w:rStyle w:val="ImportTok"/>
         </w:rPr>
-        <w:t xml:space="preserve">"netkit/ftpfs.h"</w:t>
+        <w:t xml:space="preserve">"netkit/netkit.h"</w:t>
       </w:r>
       <w:r>
         <w:br/>
@@ -8517,8 +8727,8 @@
         <w:t xml:space="preserve">them belong.</w:t>
       </w:r>
     </w:p>
-    <w:bookmarkEnd w:id="30"/>
-    <w:bookmarkStart w:id="31" w:name="X491a56bd334c8c4c777570fe8bd846c18e7eccb"/>
+    <w:bookmarkEnd w:id="39"/>
+    <w:bookmarkStart w:id="40" w:name="X491a56bd334c8c4c777570fe8bd846c18e7eccb"/>
     <w:p>
       <w:pPr>
         <w:pStyle w:val="Heading2"/>
@@ -8541,19 +8751,7 @@
         <w:t xml:space="preserve"> </w:t>
       </w:r>
       <w:r>
-        <w:t xml:space="preserve">(and</w:t>
-      </w:r>
-      <w:r>
-        <w:t xml:space="preserve"> </w:t>
-      </w:r>
-      <w:r>
-        <w:rPr>
-          <w:rStyle w:val="VerbatimChar"/>
-        </w:rPr>
-        <w:t xml:space="preserve">"filekit/fsutil.h"</w:t>
-      </w:r>
-      <w:r>
-        <w:t xml:space="preserve">) — link</w:t>
+        <w:t xml:space="preserve">— link</w:t>
       </w:r>
       <w:r>
         <w:t xml:space="preserve"> </w:t>
@@ -8917,7 +9115,7 @@
         <w:rPr>
           <w:rStyle w:val="ImportTok"/>
         </w:rPr>
-        <w:t xml:space="preserve">"filekit/fsutil.h"</w:t>
+        <w:t xml:space="preserve">"filekit/filekit.h"</w:t>
       </w:r>
       <w:r>
         <w:br/>
@@ -10141,8 +10339,8 @@
         <w:t xml:space="preserve">) instead of keeping its own list.</w:t>
       </w:r>
     </w:p>
-    <w:bookmarkEnd w:id="31"/>
-    <w:bookmarkStart w:id="32" w:name="Xf777c6178c1b7acc606d863a1dc288d7a0b8399"/>
+    <w:bookmarkEnd w:id="40"/>
+    <w:bookmarkStart w:id="41" w:name="Xf777c6178c1b7acc606d863a1dc288d7a0b8399"/>
     <w:p>
       <w:pPr>
         <w:pStyle w:val="Heading2"/>
@@ -11006,8 +11204,8 @@
         <w:t xml:space="preserve">same header.</w:t>
       </w:r>
     </w:p>
-    <w:bookmarkEnd w:id="32"/>
-    <w:bookmarkStart w:id="33" w:name="X5d555d25266128ff4d9fa5481cdbbe513b622de"/>
+    <w:bookmarkEnd w:id="41"/>
+    <w:bookmarkStart w:id="42" w:name="X5d555d25266128ff4d9fa5481cdbbe513b622de"/>
     <w:p>
       <w:pPr>
         <w:pStyle w:val="Heading2"/>
@@ -11901,8 +12099,8 @@
         <w:t xml:space="preserve">}</w:t>
       </w:r>
     </w:p>
-    <w:bookmarkEnd w:id="33"/>
-    <w:bookmarkStart w:id="34" w:name="Xfe4ab0ec0802ddea0ccd1e2aa45325e2067bf65"/>
+    <w:bookmarkEnd w:id="42"/>
+    <w:bookmarkStart w:id="43" w:name="Xfe4ab0ec0802ddea0ccd1e2aa45325e2067bf65"/>
     <w:p>
       <w:pPr>
         <w:pStyle w:val="Heading2"/>
@@ -12936,8 +13134,8 @@
         <w:t xml:space="preserve">// in 26.6 units</w:t>
       </w:r>
     </w:p>
-    <w:bookmarkEnd w:id="34"/>
-    <w:bookmarkStart w:id="35" w:name="Xc2f542cdd1b9794d820c6abd4ac9243886c7e6b"/>
+    <w:bookmarkEnd w:id="43"/>
+    <w:bookmarkStart w:id="44" w:name="Xc2f542cdd1b9794d820c6abd4ac9243886c7e6b"/>
     <w:p>
       <w:pPr>
         <w:pStyle w:val="Heading2"/>
@@ -13998,8 +14196,8 @@
         <w:t xml:space="preserve">).</w:t>
       </w:r>
     </w:p>
-    <w:bookmarkEnd w:id="35"/>
-    <w:bookmarkStart w:id="38" w:name="Xf452947779f3bd1a7569ef68ee5cf3beada5d88"/>
+    <w:bookmarkEnd w:id="44"/>
+    <w:bookmarkStart w:id="47" w:name="Xf452947779f3bd1a7569ef68ee5cf3beada5d88"/>
     <w:p>
       <w:pPr>
         <w:pStyle w:val="Heading2"/>
@@ -14032,7 +14230,7 @@
         <w:t xml:space="preserve">kit.</w:t>
       </w:r>
     </w:p>
-    <w:bookmarkStart w:id="36" w:name="adding-a-function-to-a-kit"/>
+    <w:bookmarkStart w:id="45" w:name="adding-a-function-to-a-kit"/>
     <w:p>
       <w:pPr>
         <w:pStyle w:val="Heading3"/>
@@ -14250,11 +14448,44 @@
         <w:t xml:space="preserve"> </w:t>
       </w:r>
       <w:r>
-        <w:t xml:space="preserve">it — the Developer Guide, and here if it deserves an example.</w:t>
+        <w:t xml:space="preserve">it: its comment in the header is its documentation — run</w:t>
+      </w:r>
+      <w:r>
+        <w:t xml:space="preserve"> </w:t>
+      </w:r>
+      <w:r>
+        <w:rPr>
+          <w:rStyle w:val="VerbatimChar"/>
+        </w:rPr>
+        <w:t xml:space="preserve">python tools/docgen/kitdocs.py</w:t>
+      </w:r>
+      <w:r>
+        <w:t xml:space="preserve"> </w:t>
+      </w:r>
+      <w:r>
+        <w:t xml:space="preserve">(the kit's reference follows), add an example here if it deserves</w:t>
+      </w:r>
+      <w:r>
+        <w:t xml:space="preserve"> </w:t>
+      </w:r>
+      <w:r>
+        <w:t xml:space="preserve">one, then</w:t>
+      </w:r>
+      <w:r>
+        <w:t xml:space="preserve"> </w:t>
+      </w:r>
+      <w:r>
+        <w:rPr>
+          <w:rStyle w:val="VerbatimChar"/>
+        </w:rPr>
+        <w:t xml:space="preserve">python docs/build_docs.py</w:t>
+      </w:r>
+      <w:r>
+        <w:t xml:space="preserve">.</w:t>
       </w:r>
     </w:p>
-    <w:bookmarkEnd w:id="36"/>
-    <w:bookmarkStart w:id="37" w:name="creating-a-kit"/>
+    <w:bookmarkEnd w:id="45"/>
+    <w:bookmarkStart w:id="46" w:name="creating-a-kit"/>
     <w:p>
       <w:pPr>
         <w:pStyle w:val="Heading3"/>
@@ -14292,16 +14523,53 @@
         <w:t xml:space="preserve">user/Kits/&lt;kit&gt;/</w:t>
       </w:r>
       <w:r>
-        <w:t xml:space="preserve">: a header per subject that declares (</w:t>
+        <w:t xml:space="preserve">:</w:t>
+      </w:r>
+      <w:r>
+        <w:t xml:space="preserve"> </w:t>
+      </w:r>
+      <w:r>
+        <w:rPr>
+          <w:b/>
+          <w:bCs/>
+        </w:rPr>
+        <w:t xml:space="preserve">one header a program includes,</w:t>
+      </w:r>
+      <w:r>
+        <w:rPr>
+          <w:b/>
+          <w:bCs/>
+        </w:rPr>
+        <w:t xml:space="preserve"> </w:t>
       </w:r>
       <w:r>
         <w:rPr>
           <w:rStyle w:val="VerbatimChar"/>
+          <w:b/>
+          <w:bCs/>
+        </w:rPr>
+        <w:t xml:space="preserve">&lt;kit&gt;/&lt;kit&gt;.h</w:t>
+      </w:r>
+      <w:r>
+        <w:t xml:space="preserve"> </w:t>
+      </w:r>
+      <w:r>
+        <w:t xml:space="preserve">— it may bring a</w:t>
+      </w:r>
+      <w:r>
+        <w:t xml:space="preserve"> </w:t>
+      </w:r>
+      <w:r>
+        <w:t xml:space="preserve">header per subject, each declaring its functions (</w:t>
+      </w:r>
+      <w:r>
+        <w:rPr>
+          <w:rStyle w:val="VerbatimChar"/>
         </w:rPr>
         <w:t xml:space="preserve">XK_API int f (...);</w:t>
       </w:r>
       <w:r>
-        <w:t xml:space="preserve">), a</w:t>
+        <w:t xml:space="preserve">) with a</w:t>
       </w:r>
       <w:r>
         <w:t xml:space="preserve"> </w:t>
@@ -14316,7 +14584,13 @@
         <w:t xml:space="preserve"> </w:t>
       </w:r>
       <w:r>
-        <w:t xml:space="preserve">beside it with the code, and one source</w:t>
+        <w:t xml:space="preserve">beside it for</w:t>
+      </w:r>
+      <w:r>
+        <w:t xml:space="preserve"> </w:t>
+      </w:r>
+      <w:r>
+        <w:t xml:space="preserve">the code — and one source</w:t>
       </w:r>
       <w:r>
         <w:t xml:space="preserve"> </w:t>
@@ -14331,22 +14605,7 @@
         <w:t xml:space="preserve"> </w:t>
       </w:r>
       <w:r>
-        <w:t xml:space="preserve">that compiles every</w:t>
-      </w:r>
-      <w:r>
-        <w:t xml:space="preserve"> </w:t>
-      </w:r>
-      <w:r>
-        <w:rPr>
-          <w:rStyle w:val="VerbatimChar"/>
-        </w:rPr>
-        <w:t xml:space="preserve">.inc</w:t>
-      </w:r>
-      <w:r>
-        <w:t xml:space="preserve"> </w:t>
-      </w:r>
-      <w:r>
-        <w:t xml:space="preserve">into the library;</w:t>
+        <w:t xml:space="preserve">that compiles the code into the library;</w:t>
       </w:r>
     </w:p>
     <w:p>
@@ -14480,9 +14739,9 @@
         <w:t xml:space="preserve">The header of a kit a C program may use is written in C.</w:t>
       </w:r>
     </w:p>
-    <w:bookmarkEnd w:id="37"/>
-    <w:bookmarkEnd w:id="38"/>
-    <w:bookmarkStart w:id="39" w:name="X727ca5ffb7cfa954933197d729c7f04b3404e24"/>
+    <w:bookmarkEnd w:id="46"/>
+    <w:bookmarkEnd w:id="47"/>
+    <w:bookmarkStart w:id="48" w:name="X727ca5ffb7cfa954933197d729c7f04b3404e24"/>
     <w:p>
       <w:pPr>
         <w:pStyle w:val="Heading2"/>
@@ -15777,7 +16036,7 @@
         </w:tc>
       </w:tr>
     </w:tbl>
-    <w:bookmarkEnd w:id="39"/>
+    <w:bookmarkEnd w:id="48"/>
     <w:sectPr>
       <w:footerReference r:id="rId9" w:type="default"/>
       <w:footnotePr>

</xml_diff>

<commit_message>
BASIC kits: the kits' structures as TYPEs (DIM e AS FileKit.zip_entry), passed where a function takes a pointer
- kitbi.py lists in <kit>.bi the structures the functions name (struct / field lines: sizes and
  offsets), from the kit's headers and what they include; --check writes <kit>.bi.check.cpp,
  static_asserts the build compiles: the compiler agrees with every layout (56 structures).
- #import makes each a TYPE of the program (KIT.NAME, and under its C name); a variable, an
  element or a whole array (name ()) is packed into the C structure before the call and unpacked
  after it; PEEKT / POKET address, variable do it at an address. .bax format 5.
- Tested: t24_kits (PC, .bax, AArch64 under qemu, machine code and VM) and on the Pi (AppKit's
  vol_info, PrinterKit's PrintSetup, ImageKit's formats; SD:/basic/examples/kits.bas).
- Docs 03, 04, 06, QBasic's help, HANDOFF.

Co-Authored-By: Claude Opus 5.5 <noreply@anthropic.com>
</commit_message>
<xml_diff>
--- a/docs/exports/06-KITS-GUIDE.docx
+++ b/docs/exports/06-KITS-GUIDE.docx
@@ -1912,7 +1912,22 @@
         <w:t xml:space="preserve"> </w:t>
       </w:r>
       <w:r>
-        <w:t xml:space="preserve">of a kit that takes and returns numbers, strings and pointers, by its name (docs/04 §13,</w:t>
+        <w:t xml:space="preserve">of a kit that takes and returns numbers, strings and pointers, by its name, and its structures as TYPEs</w:t>
+      </w:r>
+      <w:r>
+        <w:t xml:space="preserve"> </w:t>
+      </w:r>
+      <w:r>
+        <w:t xml:space="preserve">(</w:t>
+      </w:r>
+      <w:r>
+        <w:rPr>
+          <w:rStyle w:val="VerbatimChar"/>
+        </w:rPr>
+        <w:t xml:space="preserve">DIM e AS FileKit.zip_entry</w:t>
+      </w:r>
+      <w:r>
+        <w:t xml:space="preserve">) (docs/04 §13,</w:t>
       </w:r>
       <w:r>
         <w:t xml:space="preserve"> </w:t>
@@ -1922,124 +1937,110 @@
           <w:i/>
           <w:iCs/>
         </w:rPr>
-        <w:t xml:space="preserve">The system's</w:t>
+        <w:t xml:space="preserve">The system's kits</w:t>
+      </w:r>
+      <w:r>
+        <w:t xml:space="preserve">). BASIC knows a kit by its</w:t>
+      </w:r>
+      <w:r>
+        <w:t xml:space="preserve"> </w:t>
+      </w:r>
+      <w:r>
+        <w:rPr>
+          <w:b/>
+          <w:bCs/>
+        </w:rPr>
+        <w:t xml:space="preserve">description</w:t>
+      </w:r>
+      <w:r>
+        <w:t xml:space="preserve">,</w:t>
+      </w:r>
+      <w:r>
+        <w:t xml:space="preserve"> </w:t>
+      </w:r>
+      <w:r>
+        <w:rPr>
+          <w:rStyle w:val="VerbatimChar"/>
+        </w:rPr>
+        <w:t xml:space="preserve">SD:/lib/&lt;kit&gt;.bi</w:t>
+      </w:r>
+      <w:r>
+        <w:t xml:space="preserve">, made from the kit's</w:t>
+      </w:r>
+      <w:r>
+        <w:t xml:space="preserve"> </w:t>
+      </w:r>
+      <w:r>
+        <w:rPr>
+          <w:rStyle w:val="VerbatimChar"/>
+        </w:rPr>
+        <w:t xml:space="preserve">.abi</w:t>
+      </w:r>
+      <w:r>
+        <w:t xml:space="preserve"> </w:t>
+      </w:r>
+      <w:r>
+        <w:t xml:space="preserve">and its</w:t>
+      </w:r>
+      <w:r>
+        <w:t xml:space="preserve"> </w:t>
+      </w:r>
+      <w:r>
+        <w:t xml:space="preserve">headers by</w:t>
+      </w:r>
+      <w:r>
+        <w:t xml:space="preserve"> </w:t>
+      </w:r>
+      <w:r>
+        <w:rPr>
+          <w:rStyle w:val="VerbatimChar"/>
+        </w:rPr>
+        <w:t xml:space="preserve">tools/kitbi/kitbi.py</w:t>
+      </w:r>
+      <w:r>
+        <w:t xml:space="preserve"> </w:t>
+      </w:r>
+      <w:r>
+        <w:t xml:space="preserve">when the kits are built: nothing in BASIC names a kit, so</w:t>
+      </w:r>
+      <w:r>
+        <w:t xml:space="preserve"> </w:t>
+      </w:r>
+      <w:r>
+        <w:rPr>
+          <w:b/>
+          <w:bCs/>
+        </w:rPr>
+        <w:t xml:space="preserve">a new kit is</w:t>
+      </w:r>
+      <w:r>
+        <w:rPr>
+          <w:b/>
+          <w:bCs/>
+        </w:rPr>
+        <w:t xml:space="preserve"> </w:t>
+      </w:r>
+      <w:r>
+        <w:rPr>
+          <w:b/>
+          <w:bCs/>
+        </w:rPr>
+        <w:t xml:space="preserve">importable as soon as it is built</w:t>
+      </w:r>
+      <w:r>
+        <w:t xml:space="preserve"> </w:t>
+      </w:r>
+      <w:r>
+        <w:t xml:space="preserve">(docs/03,</w:t>
+      </w:r>
+      <w:r>
+        <w:t xml:space="preserve"> </w:t>
       </w:r>
       <w:r>
         <w:rPr>
           <w:i/>
           <w:iCs/>
         </w:rPr>
-        <w:t xml:space="preserve"> </w:t>
-      </w:r>
-      <w:r>
-        <w:rPr>
-          <w:i/>
-          <w:iCs/>
-        </w:rPr>
-        <w:t xml:space="preserve">kits</w:t>
-      </w:r>
-      <w:r>
-        <w:t xml:space="preserve">). BASIC knows a kit by its</w:t>
-      </w:r>
-      <w:r>
-        <w:t xml:space="preserve"> </w:t>
-      </w:r>
-      <w:r>
-        <w:rPr>
-          <w:b/>
-          <w:bCs/>
-        </w:rPr>
-        <w:t xml:space="preserve">description</w:t>
-      </w:r>
-      <w:r>
-        <w:t xml:space="preserve">,</w:t>
-      </w:r>
-      <w:r>
-        <w:t xml:space="preserve"> </w:t>
-      </w:r>
-      <w:r>
-        <w:rPr>
-          <w:rStyle w:val="VerbatimChar"/>
-        </w:rPr>
-        <w:t xml:space="preserve">SD:/lib/&lt;kit&gt;.bi</w:t>
-      </w:r>
-      <w:r>
-        <w:t xml:space="preserve">, made from the kit's</w:t>
-      </w:r>
-      <w:r>
-        <w:t xml:space="preserve"> </w:t>
-      </w:r>
-      <w:r>
-        <w:rPr>
-          <w:rStyle w:val="VerbatimChar"/>
-        </w:rPr>
-        <w:t xml:space="preserve">.abi</w:t>
-      </w:r>
-      <w:r>
-        <w:t xml:space="preserve"> </w:t>
-      </w:r>
-      <w:r>
-        <w:t xml:space="preserve">and its</w:t>
-      </w:r>
-      <w:r>
-        <w:t xml:space="preserve"> </w:t>
-      </w:r>
-      <w:r>
-        <w:t xml:space="preserve">headers by</w:t>
-      </w:r>
-      <w:r>
-        <w:t xml:space="preserve"> </w:t>
-      </w:r>
-      <w:r>
-        <w:rPr>
-          <w:rStyle w:val="VerbatimChar"/>
-        </w:rPr>
-        <w:t xml:space="preserve">tools/kitbi/kitbi.py</w:t>
-      </w:r>
-      <w:r>
-        <w:t xml:space="preserve"> </w:t>
-      </w:r>
-      <w:r>
-        <w:t xml:space="preserve">when the kits are built: nothing in BASIC names a kit, so</w:t>
-      </w:r>
-      <w:r>
-        <w:t xml:space="preserve"> </w:t>
-      </w:r>
-      <w:r>
-        <w:rPr>
-          <w:b/>
-          <w:bCs/>
-        </w:rPr>
-        <w:t xml:space="preserve">a new kit is</w:t>
-      </w:r>
-      <w:r>
-        <w:rPr>
-          <w:b/>
-          <w:bCs/>
-        </w:rPr>
-        <w:t xml:space="preserve"> </w:t>
-      </w:r>
-      <w:r>
-        <w:rPr>
-          <w:b/>
-          <w:bCs/>
-        </w:rPr>
-        <w:t xml:space="preserve">importable as soon as it is built</w:t>
-      </w:r>
-      <w:r>
-        <w:t xml:space="preserve"> </w:t>
-      </w:r>
-      <w:r>
-        <w:t xml:space="preserve">(docs/03,</w:t>
-      </w:r>
-      <w:r>
-        <w:t xml:space="preserve"> </w:t>
-      </w:r>
-      <w:r>
-        <w:rPr>
-          <w:i/>
-          <w:iCs/>
-        </w:rPr>
         <w:t xml:space="preserve">BASIC and the kits</w:t>
       </w:r>
       <w:r>
@@ -2049,7 +2050,7 @@
         <w:t xml:space="preserve"> </w:t>
       </w:r>
       <w:r>
-        <w:t xml:space="preserve">structures passed by value — is left out of the description: a kit meant for BASIC too exposes plain C</w:t>
+        <w:t xml:space="preserve">structures passed by value, a structure with a union or a bit field — is left out of the description: a kit meant for BASIC too exposes plain C</w:t>
       </w:r>
       <w:r>
         <w:t xml:space="preserve"> </w:t>

</xml_diff>

<commit_message>
USB sticks: hot mount / unmount, eject, format (kapi v91: vol_list, vol_eject, vol_mount, vol_format); Disks, the menu bar's USB box, mount / eject / mkfs
The kernel mounts USB:, USB2:, USB3: (Circle's umsd1..3) when a stick is plugged in and unmounts it at an
eject or when it is pulled out (kernel/sys/volume.cpp): its open files then fail cleanly, the volume lock is
never left held, the programs go on. The eject syncs the open files and the stick's cache; the format makes
FAT / FAT32 / exFAT with a label and refuses SD: in the kernel. The Circle fork: f_mkfs and labels, FatFs'
re-checks after the volume lock, the mutex kept across an unmount, a yield between USB transfers, SCSI
SYNCHRONIZE CACHE. Docs 02 §17, 03 §5.3.1, 04, 05 §28, 06; tests run_fs_test.sh (usbtest).

Co-Authored-By: Claude Opus 5.5 <noreply@anthropic.com>
Claude-Session: https://claude.ai/code/session_019swJDCUhMbX62nsKhgL9Te
</commit_message>
<xml_diff>
--- a/docs/exports/06-KITS-GUIDE.docx
+++ b/docs/exports/06-KITS-GUIDE.docx
@@ -24,140 +24,140 @@
       </w:pPr>
       <w:r>
         <w:rPr>
+          <w:iCs/>
           <w:i/>
+        </w:rPr>
+        <w:t xml:space="preserve">How an Onyx program is built on the system's shared libraries — the</w:t>
+      </w:r>
+      <w:r>
+        <w:rPr>
           <w:iCs/>
-        </w:rPr>
-        <w:t xml:space="preserve">How an Onyx program is built on the system's shared libraries — the</w:t>
-      </w:r>
-      <w:r>
-        <w:rPr>
           <w:i/>
+        </w:rPr>
+        <w:t xml:space="preserve"> </w:t>
+      </w:r>
+      <w:r>
+        <w:rPr>
+          <w:bCs/>
+          <w:b/>
           <w:iCs/>
-        </w:rPr>
-        <w:t xml:space="preserve"> </w:t>
-      </w:r>
-      <w:r>
-        <w:rPr>
-          <w:b/>
-          <w:bCs/>
           <w:i/>
+        </w:rPr>
+        <w:t xml:space="preserve">kits</w:t>
+      </w:r>
+      <w:r>
+        <w:rPr>
           <w:iCs/>
-        </w:rPr>
-        <w:t xml:space="preserve">kits</w:t>
-      </w:r>
-      <w:r>
-        <w:rPr>
           <w:i/>
+        </w:rPr>
+        <w:t xml:space="preserve"> </w:t>
+      </w:r>
+      <w:r>
+        <w:rPr>
           <w:iCs/>
-        </w:rPr>
-        <w:t xml:space="preserve"> </w:t>
-      </w:r>
-      <w:r>
-        <w:rPr>
           <w:i/>
+        </w:rPr>
+        <w:t xml:space="preserve">— with a short example</w:t>
+      </w:r>
+      <w:r>
+        <w:rPr>
           <w:iCs/>
-        </w:rPr>
-        <w:t xml:space="preserve">— with a short example</w:t>
-      </w:r>
-      <w:r>
-        <w:rPr>
           <w:i/>
+        </w:rPr>
+        <w:t xml:space="preserve"> </w:t>
+      </w:r>
+      <w:r>
+        <w:rPr>
           <w:iCs/>
-        </w:rPr>
-        <w:t xml:space="preserve"> </w:t>
-      </w:r>
-      <w:r>
-        <w:rPr>
           <w:i/>
+        </w:rPr>
+        <w:t xml:space="preserve">for each. Each kit has its reference, with every operation it exposes (documents 10 to 18, linked in the</w:t>
+      </w:r>
+      <w:r>
+        <w:rPr>
           <w:iCs/>
-        </w:rPr>
-        <w:t xml:space="preserve">for each. Each kit has its reference, with every operation it exposes (documents 10 to 18, linked in the</w:t>
-      </w:r>
-      <w:r>
-        <w:rPr>
           <w:i/>
+        </w:rPr>
+        <w:t xml:space="preserve"> </w:t>
+      </w:r>
+      <w:r>
+        <w:rPr>
           <w:iCs/>
-        </w:rPr>
-        <w:t xml:space="preserve"> </w:t>
-      </w:r>
-      <w:r>
-        <w:rPr>
           <w:i/>
+        </w:rPr>
+        <w:t xml:space="preserve">table below). Companion of the</w:t>
+      </w:r>
+      <w:r>
+        <w:rPr>
           <w:iCs/>
-        </w:rPr>
-        <w:t xml:space="preserve">table below). Companion of the</w:t>
-      </w:r>
-      <w:r>
-        <w:rPr>
           <w:i/>
-          <w:iCs/>
-        </w:rPr>
-        <w:t xml:space="preserve"> </w:t>
-      </w:r>
-      <w:hyperlink r:id="rId18">
+        </w:rPr>
+        <w:t xml:space="preserve"> </w:t>
+      </w:r>
+      <w:hyperlink r:id="rId20">
         <w:r>
           <w:rPr>
             <w:rStyle w:val="Hyperlink"/>
+            <w:iCs/>
             <w:i/>
-            <w:iCs/>
           </w:rPr>
           <w:t xml:space="preserve">Developer Guide</w:t>
         </w:r>
       </w:hyperlink>
       <w:r>
         <w:rPr>
+          <w:iCs/>
           <w:i/>
+        </w:rPr>
+        <w:t xml:space="preserve"> </w:t>
+      </w:r>
+      <w:r>
+        <w:rPr>
           <w:iCs/>
-        </w:rPr>
-        <w:t xml:space="preserve"> </w:t>
-      </w:r>
-      <w:r>
-        <w:rPr>
           <w:i/>
+        </w:rPr>
+        <w:t xml:space="preserve">(the build, the application</w:t>
+      </w:r>
+      <w:r>
+        <w:rPr>
           <w:iCs/>
-        </w:rPr>
-        <w:t xml:space="preserve">(the build, the application</w:t>
-      </w:r>
-      <w:r>
-        <w:rPr>
           <w:i/>
+        </w:rPr>
+        <w:t xml:space="preserve"> </w:t>
+      </w:r>
+      <w:r>
+        <w:rPr>
           <w:iCs/>
-        </w:rPr>
-        <w:t xml:space="preserve"> </w:t>
-      </w:r>
-      <w:r>
-        <w:rPr>
           <w:i/>
+        </w:rPr>
+        <w:t xml:space="preserve">model, the ports) and of</w:t>
+      </w:r>
+      <w:r>
+        <w:rPr>
           <w:iCs/>
-        </w:rPr>
-        <w:t xml:space="preserve">model, the ports) and of</w:t>
-      </w:r>
-      <w:r>
-        <w:rPr>
           <w:i/>
-          <w:iCs/>
-        </w:rPr>
-        <w:t xml:space="preserve"> </w:t>
-      </w:r>
-      <w:hyperlink r:id="rId19">
+        </w:rPr>
+        <w:t xml:space="preserve"> </w:t>
+      </w:r>
+      <w:hyperlink r:id="rId21">
         <w:r>
           <w:rPr>
             <w:rStyle w:val="Hyperlink"/>
+            <w:iCs/>
             <w:i/>
-            <w:iCs/>
           </w:rPr>
           <w:t xml:space="preserve">Kernel Internals</w:t>
         </w:r>
       </w:hyperlink>
       <w:r>
         <w:rPr>
+          <w:iCs/>
           <w:i/>
-          <w:iCs/>
         </w:rPr>
         <w:t xml:space="preserve">.</w:t>
       </w:r>
     </w:p>
-    <w:bookmarkStart w:id="20" w:name="table-of-contents"/>
+    <w:bookmarkStart w:id="22" w:name="table-of-contents"/>
     <w:p>
       <w:pPr>
         <w:pStyle w:val="Heading2"/>
@@ -168,11 +168,11 @@
     </w:p>
     <w:p>
       <w:pPr>
-        <w:pStyle w:val="Compact"/>
         <w:numPr>
           <w:ilvl w:val="0"/>
           <w:numId w:val="1001"/>
         </w:numPr>
+        <w:pStyle w:val="Compact"/>
       </w:pPr>
       <w:hyperlink w:anchor="Xf42949ce2155418547b745b31f0a8bd30f8ab19">
         <w:r>
@@ -185,11 +185,11 @@
     </w:p>
     <w:p>
       <w:pPr>
-        <w:pStyle w:val="Compact"/>
         <w:numPr>
           <w:ilvl w:val="0"/>
           <w:numId w:val="1001"/>
         </w:numPr>
+        <w:pStyle w:val="Compact"/>
       </w:pPr>
       <w:hyperlink w:anchor="X85b9036d0c437b6d6abf0631055454f6f74ddb8">
         <w:r>
@@ -202,11 +202,11 @@
     </w:p>
     <w:p>
       <w:pPr>
-        <w:pStyle w:val="Compact"/>
         <w:numPr>
           <w:ilvl w:val="0"/>
           <w:numId w:val="1001"/>
         </w:numPr>
+        <w:pStyle w:val="Compact"/>
       </w:pPr>
       <w:hyperlink w:anchor="X479a017f3f362789bae7c4b9122aafaba533bfa">
         <w:r>
@@ -219,11 +219,11 @@
     </w:p>
     <w:p>
       <w:pPr>
-        <w:pStyle w:val="Compact"/>
         <w:numPr>
           <w:ilvl w:val="0"/>
           <w:numId w:val="1001"/>
         </w:numPr>
+        <w:pStyle w:val="Compact"/>
       </w:pPr>
       <w:hyperlink w:anchor="X0a53c701f88fdf6f7c7ea97f28ca21204deb07c">
         <w:r>
@@ -236,11 +236,11 @@
     </w:p>
     <w:p>
       <w:pPr>
-        <w:pStyle w:val="Compact"/>
         <w:numPr>
           <w:ilvl w:val="0"/>
           <w:numId w:val="1001"/>
         </w:numPr>
+        <w:pStyle w:val="Compact"/>
       </w:pPr>
       <w:hyperlink w:anchor="X1c12e241ab2b4ebd18b32f840f751712082d5e1">
         <w:r>
@@ -253,11 +253,11 @@
     </w:p>
     <w:p>
       <w:pPr>
-        <w:pStyle w:val="Compact"/>
         <w:numPr>
           <w:ilvl w:val="0"/>
           <w:numId w:val="1001"/>
         </w:numPr>
+        <w:pStyle w:val="Compact"/>
       </w:pPr>
       <w:hyperlink w:anchor="X21c5dfbcb5a69cd5c428264b88180cd193f70a2">
         <w:r>
@@ -270,11 +270,11 @@
     </w:p>
     <w:p>
       <w:pPr>
-        <w:pStyle w:val="Compact"/>
         <w:numPr>
           <w:ilvl w:val="0"/>
           <w:numId w:val="1001"/>
         </w:numPr>
+        <w:pStyle w:val="Compact"/>
       </w:pPr>
       <w:hyperlink w:anchor="X491a56bd334c8c4c777570fe8bd846c18e7eccb">
         <w:r>
@@ -287,11 +287,11 @@
     </w:p>
     <w:p>
       <w:pPr>
-        <w:pStyle w:val="Compact"/>
         <w:numPr>
           <w:ilvl w:val="0"/>
           <w:numId w:val="1001"/>
         </w:numPr>
+        <w:pStyle w:val="Compact"/>
       </w:pPr>
       <w:hyperlink w:anchor="Xf777c6178c1b7acc606d863a1dc288d7a0b8399">
         <w:r>
@@ -304,11 +304,11 @@
     </w:p>
     <w:p>
       <w:pPr>
-        <w:pStyle w:val="Compact"/>
         <w:numPr>
           <w:ilvl w:val="0"/>
           <w:numId w:val="1001"/>
         </w:numPr>
+        <w:pStyle w:val="Compact"/>
       </w:pPr>
       <w:hyperlink w:anchor="X5d555d25266128ff4d9fa5481cdbbe513b622de">
         <w:r>
@@ -321,11 +321,11 @@
     </w:p>
     <w:p>
       <w:pPr>
-        <w:pStyle w:val="Compact"/>
         <w:numPr>
           <w:ilvl w:val="0"/>
           <w:numId w:val="1001"/>
         </w:numPr>
+        <w:pStyle w:val="Compact"/>
       </w:pPr>
       <w:hyperlink w:anchor="Xfe4ab0ec0802ddea0ccd1e2aa45325e2067bf65">
         <w:r>
@@ -338,11 +338,11 @@
     </w:p>
     <w:p>
       <w:pPr>
-        <w:pStyle w:val="Compact"/>
         <w:numPr>
           <w:ilvl w:val="0"/>
           <w:numId w:val="1001"/>
         </w:numPr>
+        <w:pStyle w:val="Compact"/>
       </w:pPr>
       <w:hyperlink w:anchor="Xc2f542cdd1b9794d820c6abd4ac9243886c7e6b">
         <w:r>
@@ -355,11 +355,11 @@
     </w:p>
     <w:p>
       <w:pPr>
-        <w:pStyle w:val="Compact"/>
         <w:numPr>
           <w:ilvl w:val="0"/>
           <w:numId w:val="1001"/>
         </w:numPr>
+        <w:pStyle w:val="Compact"/>
       </w:pPr>
       <w:hyperlink w:anchor="Xf452947779f3bd1a7569ef68ee5cf3beada5d88">
         <w:r>
@@ -372,11 +372,11 @@
     </w:p>
     <w:p>
       <w:pPr>
-        <w:pStyle w:val="Compact"/>
         <w:numPr>
           <w:ilvl w:val="0"/>
           <w:numId w:val="1001"/>
         </w:numPr>
+        <w:pStyle w:val="Compact"/>
       </w:pPr>
       <w:hyperlink w:anchor="X727ca5ffb7cfa954933197d729c7f04b3404e24">
         <w:r>
@@ -394,8 +394,8 @@
         </w:pict>
       </w:r>
     </w:p>
-    <w:bookmarkEnd w:id="20"/>
-    <w:bookmarkStart w:id="30" w:name="Xf42949ce2155418547b745b31f0a8bd30f8ab19"/>
+    <w:bookmarkEnd w:id="22"/>
+    <w:bookmarkStart w:id="32" w:name="Xf42949ce2155418547b745b31f0a8bd30f8ab19"/>
     <w:p>
       <w:pPr>
         <w:pStyle w:val="Heading2"/>
@@ -416,8 +416,8 @@
       </w:r>
       <w:r>
         <w:rPr>
+          <w:bCs/>
           <w:b/>
-          <w:bCs/>
         </w:rPr>
         <w:t xml:space="preserve">kits</w:t>
       </w:r>
@@ -436,6 +436,7 @@
         <w:tblStyle w:val="Table"/>
         <w:tblW w:type="auto" w:w="0"/>
         <w:tblLook w:firstRow="1" w:lastRow="0" w:firstColumn="0" w:lastColumn="0" w:noHBand="0" w:noVBand="0" w:val="0020"/>
+        <w:jc w:val="start"/>
       </w:tblPr>
       <w:tblGrid>
         <w:gridCol w:w="1584"/>
@@ -446,13 +447,14 @@
       </w:tblGrid>
       <w:tr>
         <w:trPr>
-          <w:tblHeader w:val="on"/>
+          <w:tblHeader w:val="true"/>
         </w:trPr>
         <w:tc>
           <w:tcPr/>
           <w:p>
             <w:pPr>
               <w:pStyle w:val="Compact"/>
+              <w:jc w:val="left"/>
             </w:pPr>
             <w:r>
               <w:t xml:space="preserve">Kit</w:t>
@@ -464,6 +466,7 @@
           <w:p>
             <w:pPr>
               <w:pStyle w:val="Compact"/>
+              <w:jc w:val="left"/>
             </w:pPr>
             <w:r>
               <w:t xml:space="preserve">Domain</w:t>
@@ -475,6 +478,7 @@
           <w:p>
             <w:pPr>
               <w:pStyle w:val="Compact"/>
+              <w:jc w:val="left"/>
             </w:pPr>
             <w:r>
               <w:t xml:space="preserve">On the card</w:t>
@@ -486,6 +490,7 @@
           <w:p>
             <w:pPr>
               <w:pStyle w:val="Compact"/>
+              <w:jc w:val="left"/>
             </w:pPr>
             <w:r>
               <w:t xml:space="preserve">Sources</w:t>
@@ -497,6 +502,7 @@
           <w:p>
             <w:pPr>
               <w:pStyle w:val="Compact"/>
+              <w:jc w:val="left"/>
             </w:pPr>
             <w:r>
               <w:t xml:space="preserve">Reference</w:t>
@@ -510,11 +516,12 @@
           <w:p>
             <w:pPr>
               <w:pStyle w:val="Compact"/>
+              <w:jc w:val="left"/>
             </w:pPr>
             <w:r>
               <w:rPr>
+                <w:bCs/>
                 <w:b/>
-                <w:bCs/>
               </w:rPr>
               <w:t xml:space="preserve">AppKit</w:t>
             </w:r>
@@ -525,6 +532,7 @@
           <w:p>
             <w:pPr>
               <w:pStyle w:val="Compact"/>
+              <w:jc w:val="left"/>
             </w:pPr>
             <w:r>
               <w:t xml:space="preserve">What makes a program run: the system's calls, strings, the console,</w:t>
@@ -551,6 +559,7 @@
           <w:p>
             <w:pPr>
               <w:pStyle w:val="Compact"/>
+              <w:jc w:val="left"/>
             </w:pPr>
             <w:r>
               <w:rPr>
@@ -565,6 +574,7 @@
           <w:p>
             <w:pPr>
               <w:pStyle w:val="Compact"/>
+              <w:jc w:val="left"/>
             </w:pPr>
             <w:r>
               <w:rPr>
@@ -579,8 +589,9 @@
           <w:p>
             <w:pPr>
               <w:pStyle w:val="Compact"/>
+              <w:jc w:val="left"/>
             </w:pPr>
-            <w:hyperlink r:id="rId21">
+            <w:hyperlink r:id="rId23">
               <w:r>
                 <w:rPr>
                   <w:rStyle w:val="Hyperlink"/>
@@ -597,11 +608,12 @@
           <w:p>
             <w:pPr>
               <w:pStyle w:val="Compact"/>
+              <w:jc w:val="left"/>
             </w:pPr>
             <w:r>
               <w:rPr>
+                <w:bCs/>
                 <w:b/>
-                <w:bCs/>
               </w:rPr>
               <w:t xml:space="preserve">UIKit</w:t>
             </w:r>
@@ -612,6 +624,7 @@
           <w:p>
             <w:pPr>
               <w:pStyle w:val="Compact"/>
+              <w:jc w:val="left"/>
             </w:pPr>
             <w:r>
               <w:t xml:space="preserve">The interface: windows, widgets, dialogs, the theme, icons</w:t>
@@ -623,6 +636,7 @@
           <w:p>
             <w:pPr>
               <w:pStyle w:val="Compact"/>
+              <w:jc w:val="left"/>
             </w:pPr>
             <w:r>
               <w:rPr>
@@ -637,6 +651,7 @@
           <w:p>
             <w:pPr>
               <w:pStyle w:val="Compact"/>
+              <w:jc w:val="left"/>
             </w:pPr>
             <w:r>
               <w:rPr>
@@ -651,8 +666,9 @@
           <w:p>
             <w:pPr>
               <w:pStyle w:val="Compact"/>
+              <w:jc w:val="left"/>
             </w:pPr>
-            <w:hyperlink r:id="rId22">
+            <w:hyperlink r:id="rId24">
               <w:r>
                 <w:rPr>
                   <w:rStyle w:val="Hyperlink"/>
@@ -669,11 +685,12 @@
           <w:p>
             <w:pPr>
               <w:pStyle w:val="Compact"/>
+              <w:jc w:val="left"/>
             </w:pPr>
             <w:r>
               <w:rPr>
+                <w:bCs/>
                 <w:b/>
-                <w:bCs/>
               </w:rPr>
               <w:t xml:space="preserve">SystemKit</w:t>
             </w:r>
@@ -684,6 +701,7 @@
           <w:p>
             <w:pPr>
               <w:pStyle w:val="Compact"/>
+              <w:jc w:val="left"/>
             </w:pPr>
             <w:r>
               <w:t xml:space="preserve">Talking to the system and the other programs: notifications, clipboard, trash, volume, wallpaper, file associations, the dock</w:t>
@@ -695,6 +713,7 @@
           <w:p>
             <w:pPr>
               <w:pStyle w:val="Compact"/>
+              <w:jc w:val="left"/>
             </w:pPr>
             <w:r>
               <w:rPr>
@@ -709,6 +728,7 @@
           <w:p>
             <w:pPr>
               <w:pStyle w:val="Compact"/>
+              <w:jc w:val="left"/>
             </w:pPr>
             <w:r>
               <w:rPr>
@@ -723,8 +743,9 @@
           <w:p>
             <w:pPr>
               <w:pStyle w:val="Compact"/>
+              <w:jc w:val="left"/>
             </w:pPr>
-            <w:hyperlink r:id="rId23">
+            <w:hyperlink r:id="rId25">
               <w:r>
                 <w:rPr>
                   <w:rStyle w:val="Hyperlink"/>
@@ -741,11 +762,12 @@
           <w:p>
             <w:pPr>
               <w:pStyle w:val="Compact"/>
+              <w:jc w:val="left"/>
             </w:pPr>
             <w:r>
               <w:rPr>
+                <w:bCs/>
                 <w:b/>
-                <w:bCs/>
               </w:rPr>
               <w:t xml:space="preserve">NetKit</w:t>
             </w:r>
@@ -756,6 +778,7 @@
           <w:p>
             <w:pPr>
               <w:pStyle w:val="Compact"/>
+              <w:jc w:val="left"/>
             </w:pPr>
             <w:r>
               <w:t xml:space="preserve">The network: HTTP, the FTP volumes</w:t>
@@ -767,6 +790,7 @@
           <w:p>
             <w:pPr>
               <w:pStyle w:val="Compact"/>
+              <w:jc w:val="left"/>
             </w:pPr>
             <w:r>
               <w:rPr>
@@ -781,6 +805,7 @@
           <w:p>
             <w:pPr>
               <w:pStyle w:val="Compact"/>
+              <w:jc w:val="left"/>
             </w:pPr>
             <w:r>
               <w:rPr>
@@ -795,8 +820,9 @@
           <w:p>
             <w:pPr>
               <w:pStyle w:val="Compact"/>
+              <w:jc w:val="left"/>
             </w:pPr>
-            <w:hyperlink r:id="rId24">
+            <w:hyperlink r:id="rId26">
               <w:r>
                 <w:rPr>
                   <w:rStyle w:val="Hyperlink"/>
@@ -813,11 +839,12 @@
           <w:p>
             <w:pPr>
               <w:pStyle w:val="Compact"/>
+              <w:jc w:val="left"/>
             </w:pPr>
             <w:r>
               <w:rPr>
+                <w:bCs/>
                 <w:b/>
-                <w:bCs/>
               </w:rPr>
               <w:t xml:space="preserve">FileKit</w:t>
             </w:r>
@@ -828,6 +855,7 @@
           <w:p>
             <w:pPr>
               <w:pStyle w:val="Compact"/>
+              <w:jc w:val="left"/>
             </w:pPr>
             <w:r>
               <w:t xml:space="preserve">Files and folders, paths, compression, archives</w:t>
@@ -839,6 +867,7 @@
           <w:p>
             <w:pPr>
               <w:pStyle w:val="Compact"/>
+              <w:jc w:val="left"/>
             </w:pPr>
             <w:r>
               <w:rPr>
@@ -853,6 +882,7 @@
           <w:p>
             <w:pPr>
               <w:pStyle w:val="Compact"/>
+              <w:jc w:val="left"/>
             </w:pPr>
             <w:r>
               <w:rPr>
@@ -867,8 +897,9 @@
           <w:p>
             <w:pPr>
               <w:pStyle w:val="Compact"/>
+              <w:jc w:val="left"/>
             </w:pPr>
-            <w:hyperlink r:id="rId25">
+            <w:hyperlink r:id="rId27">
               <w:r>
                 <w:rPr>
                   <w:rStyle w:val="Hyperlink"/>
@@ -885,11 +916,12 @@
           <w:p>
             <w:pPr>
               <w:pStyle w:val="Compact"/>
+              <w:jc w:val="left"/>
             </w:pPr>
             <w:r>
               <w:rPr>
+                <w:bCs/>
                 <w:b/>
-                <w:bCs/>
               </w:rPr>
               <w:t xml:space="preserve">ImageKit</w:t>
             </w:r>
@@ -900,6 +932,7 @@
           <w:p>
             <w:pPr>
               <w:pStyle w:val="Compact"/>
+              <w:jc w:val="left"/>
             </w:pPr>
             <w:r>
               <w:t xml:space="preserve">Pictures: reading, writing, resizing, adjusting</w:t>
@@ -911,6 +944,7 @@
           <w:p>
             <w:pPr>
               <w:pStyle w:val="Compact"/>
+              <w:jc w:val="left"/>
             </w:pPr>
             <w:r>
               <w:rPr>
@@ -925,6 +959,7 @@
           <w:p>
             <w:pPr>
               <w:pStyle w:val="Compact"/>
+              <w:jc w:val="left"/>
             </w:pPr>
             <w:r>
               <w:rPr>
@@ -939,8 +974,9 @@
           <w:p>
             <w:pPr>
               <w:pStyle w:val="Compact"/>
+              <w:jc w:val="left"/>
             </w:pPr>
-            <w:hyperlink r:id="rId26">
+            <w:hyperlink r:id="rId28">
               <w:r>
                 <w:rPr>
                   <w:rStyle w:val="Hyperlink"/>
@@ -957,11 +993,12 @@
           <w:p>
             <w:pPr>
               <w:pStyle w:val="Compact"/>
+              <w:jc w:val="left"/>
             </w:pPr>
             <w:r>
               <w:rPr>
+                <w:bCs/>
                 <w:b/>
-                <w:bCs/>
               </w:rPr>
               <w:t xml:space="preserve">AudioKit</w:t>
             </w:r>
@@ -972,6 +1009,7 @@
           <w:p>
             <w:pPr>
               <w:pStyle w:val="Compact"/>
+              <w:jc w:val="left"/>
             </w:pPr>
             <w:r>
               <w:t xml:space="preserve">Sound: playing files, notes, synthesis, the sound output</w:t>
@@ -983,6 +1021,7 @@
           <w:p>
             <w:pPr>
               <w:pStyle w:val="Compact"/>
+              <w:jc w:val="left"/>
             </w:pPr>
             <w:r>
               <w:rPr>
@@ -997,6 +1036,7 @@
           <w:p>
             <w:pPr>
               <w:pStyle w:val="Compact"/>
+              <w:jc w:val="left"/>
             </w:pPr>
             <w:r>
               <w:rPr>
@@ -1011,8 +1051,9 @@
           <w:p>
             <w:pPr>
               <w:pStyle w:val="Compact"/>
+              <w:jc w:val="left"/>
             </w:pPr>
-            <w:hyperlink r:id="rId27">
+            <w:hyperlink r:id="rId29">
               <w:r>
                 <w:rPr>
                   <w:rStyle w:val="Hyperlink"/>
@@ -1029,11 +1070,12 @@
           <w:p>
             <w:pPr>
               <w:pStyle w:val="Compact"/>
+              <w:jc w:val="left"/>
             </w:pPr>
             <w:r>
               <w:rPr>
+                <w:bCs/>
                 <w:b/>
-                <w:bCs/>
               </w:rPr>
               <w:t xml:space="preserve">FontKit</w:t>
             </w:r>
@@ -1044,6 +1086,7 @@
           <w:p>
             <w:pPr>
               <w:pStyle w:val="Compact"/>
+              <w:jc w:val="left"/>
             </w:pPr>
             <w:r>
               <w:t xml:space="preserve">Fonts: FreeType, the font manager, anti-aliased text</w:t>
@@ -1055,6 +1098,7 @@
           <w:p>
             <w:pPr>
               <w:pStyle w:val="Compact"/>
+              <w:jc w:val="left"/>
             </w:pPr>
             <w:r>
               <w:rPr>
@@ -1069,6 +1113,7 @@
           <w:p>
             <w:pPr>
               <w:pStyle w:val="Compact"/>
+              <w:jc w:val="left"/>
             </w:pPr>
             <w:r>
               <w:rPr>
@@ -1083,8 +1128,9 @@
           <w:p>
             <w:pPr>
               <w:pStyle w:val="Compact"/>
+              <w:jc w:val="left"/>
             </w:pPr>
-            <w:hyperlink r:id="rId28">
+            <w:hyperlink r:id="rId30">
               <w:r>
                 <w:rPr>
                   <w:rStyle w:val="Hyperlink"/>
@@ -1101,11 +1147,12 @@
           <w:p>
             <w:pPr>
               <w:pStyle w:val="Compact"/>
+              <w:jc w:val="left"/>
             </w:pPr>
             <w:r>
               <w:rPr>
+                <w:bCs/>
                 <w:b/>
-                <w:bCs/>
               </w:rPr>
               <w:t xml:space="preserve">PrinterKit</w:t>
             </w:r>
@@ -1116,6 +1163,7 @@
           <w:p>
             <w:pPr>
               <w:pStyle w:val="Compact"/>
+              <w:jc w:val="left"/>
             </w:pPr>
             <w:r>
               <w:t xml:space="preserve">Printing: the Print dialog, a job's pages</w:t>
@@ -1127,6 +1175,7 @@
           <w:p>
             <w:pPr>
               <w:pStyle w:val="Compact"/>
+              <w:jc w:val="left"/>
             </w:pPr>
             <w:r>
               <w:rPr>
@@ -1141,6 +1190,7 @@
           <w:p>
             <w:pPr>
               <w:pStyle w:val="Compact"/>
+              <w:jc w:val="left"/>
             </w:pPr>
             <w:r>
               <w:rPr>
@@ -1155,8 +1205,9 @@
           <w:p>
             <w:pPr>
               <w:pStyle w:val="Compact"/>
+              <w:jc w:val="left"/>
             </w:pPr>
-            <w:hyperlink r:id="rId29">
+            <w:hyperlink r:id="rId31">
               <w:r>
                 <w:rPr>
                   <w:rStyle w:val="Hyperlink"/>
@@ -1178,16 +1229,16 @@
     </w:p>
     <w:p>
       <w:pPr>
-        <w:pStyle w:val="Compact"/>
         <w:numPr>
           <w:ilvl w:val="0"/>
           <w:numId w:val="1002"/>
         </w:numPr>
+        <w:pStyle w:val="Compact"/>
       </w:pPr>
       <w:r>
         <w:rPr>
+          <w:bCs/>
           <w:b/>
-          <w:bCs/>
         </w:rPr>
         <w:t xml:space="preserve">Reusable code goes into the adequate kit</w:t>
       </w:r>
@@ -1206,16 +1257,16 @@
     </w:p>
     <w:p>
       <w:pPr>
-        <w:pStyle w:val="Compact"/>
         <w:numPr>
           <w:ilvl w:val="0"/>
           <w:numId w:val="1002"/>
         </w:numPr>
+        <w:pStyle w:val="Compact"/>
       </w:pPr>
       <w:r>
         <w:rPr>
+          <w:bCs/>
           <w:b/>
-          <w:bCs/>
         </w:rPr>
         <w:t xml:space="preserve">A program draws on the kits as much as it can</w:t>
       </w:r>
@@ -1231,16 +1282,16 @@
     </w:p>
     <w:p>
       <w:pPr>
-        <w:pStyle w:val="Compact"/>
         <w:numPr>
           <w:ilvl w:val="0"/>
           <w:numId w:val="1002"/>
         </w:numPr>
+        <w:pStyle w:val="Compact"/>
       </w:pPr>
       <w:r>
         <w:rPr>
+          <w:bCs/>
           <w:b/>
-          <w:bCs/>
         </w:rPr>
         <w:t xml:space="preserve">What one program alone uses stays beside that program</w:t>
       </w:r>
@@ -1260,33 +1311,33 @@
       </w:r>
       <w:r>
         <w:rPr>
+          <w:bCs/>
           <w:b/>
+        </w:rPr>
+        <w:t xml:space="preserve">one header</w:t>
+      </w:r>
+      <w:r>
+        <w:t xml:space="preserve">,</w:t>
+      </w:r>
+      <w:r>
+        <w:t xml:space="preserve"> </w:t>
+      </w:r>
+      <w:r>
+        <w:rPr>
+          <w:rStyle w:val="VerbatimChar"/>
+        </w:rPr>
+        <w:t xml:space="preserve">&lt;kit&gt;/&lt;kit&gt;.h</w:t>
+      </w:r>
+      <w:r>
+        <w:t xml:space="preserve">, which</w:t>
+      </w:r>
+      <w:r>
+        <w:t xml:space="preserve"> </w:t>
+      </w:r>
+      <w:r>
+        <w:rPr>
           <w:bCs/>
-        </w:rPr>
-        <w:t xml:space="preserve">one header</w:t>
-      </w:r>
-      <w:r>
-        <w:t xml:space="preserve">,</w:t>
-      </w:r>
-      <w:r>
-        <w:t xml:space="preserve"> </w:t>
-      </w:r>
-      <w:r>
-        <w:rPr>
-          <w:rStyle w:val="VerbatimChar"/>
-        </w:rPr>
-        <w:t xml:space="preserve">&lt;kit&gt;/&lt;kit&gt;.h</w:t>
-      </w:r>
-      <w:r>
-        <w:t xml:space="preserve">, which</w:t>
-      </w:r>
-      <w:r>
-        <w:t xml:space="preserve"> </w:t>
-      </w:r>
-      <w:r>
-        <w:rPr>
           <w:b/>
-          <w:bCs/>
         </w:rPr>
         <w:t xml:space="preserve">declares</w:t>
       </w:r>
@@ -1300,8 +1351,8 @@
         <w:t xml:space="preserve">code is shared by every program that uses it.</w:t>
       </w:r>
     </w:p>
-    <w:bookmarkEnd w:id="30"/>
-    <w:bookmarkStart w:id="36" w:name="X85b9036d0c437b6d6abf0631055454f6f74ddb8"/>
+    <w:bookmarkEnd w:id="32"/>
+    <w:bookmarkStart w:id="38" w:name="X85b9036d0c437b6d6abf0631055454f6f74ddb8"/>
     <w:p>
       <w:pPr>
         <w:pStyle w:val="Heading2"/>
@@ -1310,7 +1361,7 @@
         <w:t xml:space="preserve">2. Using a kit in a program</w:t>
       </w:r>
     </w:p>
-    <w:bookmarkStart w:id="31" w:name="including"/>
+    <w:bookmarkStart w:id="33" w:name="including"/>
     <w:p>
       <w:pPr>
         <w:pStyle w:val="Heading3"/>
@@ -1587,8 +1638,8 @@
         <w:t xml:space="preserve">// PrinterKit</w:t>
       </w:r>
     </w:p>
-    <w:bookmarkEnd w:id="31"/>
-    <w:bookmarkStart w:id="32" w:name="linking"/>
+    <w:bookmarkEnd w:id="33"/>
+    <w:bookmarkStart w:id="34" w:name="linking"/>
     <w:p>
       <w:pPr>
         <w:pStyle w:val="Heading3"/>
@@ -1615,8 +1666,8 @@
       </w:r>
       <w:r>
         <w:rPr>
+          <w:bCs/>
           <w:b/>
-          <w:bCs/>
         </w:rPr>
         <w:t xml:space="preserve">import archive</w:t>
       </w:r>
@@ -1641,6 +1692,7 @@
         <w:tblStyle w:val="Table"/>
         <w:tblW w:type="auto" w:w="0"/>
         <w:tblLook w:firstRow="1" w:lastRow="0" w:firstColumn="0" w:lastColumn="0" w:noHBand="0" w:noVBand="0" w:val="0020"/>
+        <w:jc w:val="start"/>
       </w:tblPr>
       <w:tblGrid>
         <w:gridCol w:w="3960"/>
@@ -1648,13 +1700,14 @@
       </w:tblGrid>
       <w:tr>
         <w:trPr>
-          <w:tblHeader w:val="on"/>
+          <w:tblHeader w:val="true"/>
         </w:trPr>
         <w:tc>
           <w:tcPr/>
           <w:p>
             <w:pPr>
               <w:pStyle w:val="Compact"/>
+              <w:jc w:val="left"/>
             </w:pPr>
             <w:r>
               <w:t xml:space="preserve">The program is</w:t>
@@ -1666,6 +1719,7 @@
           <w:p>
             <w:pPr>
               <w:pStyle w:val="Compact"/>
+              <w:jc w:val="left"/>
             </w:pPr>
             <w:r>
               <w:t xml:space="preserve">It links</w:t>
@@ -1679,6 +1733,7 @@
           <w:p>
             <w:pPr>
               <w:pStyle w:val="Compact"/>
+              <w:jc w:val="left"/>
             </w:pPr>
             <w:r>
               <w:t xml:space="preserve">C++ (an application)</w:t>
@@ -1690,6 +1745,7 @@
           <w:p>
             <w:pPr>
               <w:pStyle w:val="Compact"/>
+              <w:jc w:val="left"/>
             </w:pPr>
             <w:r>
               <w:rPr>
@@ -1706,6 +1762,7 @@
           <w:p>
             <w:pPr>
               <w:pStyle w:val="Compact"/>
+              <w:jc w:val="left"/>
             </w:pPr>
             <w:r>
               <w:t xml:space="preserve">C (a console tool)</w:t>
@@ -1717,6 +1774,7 @@
           <w:p>
             <w:pPr>
               <w:pStyle w:val="Compact"/>
+              <w:jc w:val="left"/>
             </w:pPr>
             <w:r>
               <w:rPr>
@@ -1804,8 +1862,8 @@
         <w:t xml:space="preserve">mytool.elf: ../lib/systemkit.imp_c.a</w:t>
       </w:r>
     </w:p>
-    <w:bookmarkEnd w:id="32"/>
-    <w:bookmarkStart w:id="33" w:name="versions"/>
+    <w:bookmarkEnd w:id="34"/>
+    <w:bookmarkStart w:id="35" w:name="versions"/>
     <w:p>
       <w:pPr>
         <w:pStyle w:val="Heading3"/>
@@ -1864,8 +1922,8 @@
         <w:t xml:space="preserve">library first.</w:t>
       </w:r>
     </w:p>
-    <w:bookmarkEnd w:id="33"/>
-    <w:bookmarkStart w:id="34" w:name="from-basic"/>
+    <w:bookmarkEnd w:id="35"/>
+    <w:bookmarkStart w:id="36" w:name="from-basic"/>
     <w:p>
       <w:pPr>
         <w:pStyle w:val="Heading3"/>
@@ -1934,112 +1992,112 @@
       </w:r>
       <w:r>
         <w:rPr>
+          <w:iCs/>
           <w:i/>
+        </w:rPr>
+        <w:t xml:space="preserve">The system's kits</w:t>
+      </w:r>
+      <w:r>
+        <w:t xml:space="preserve">). BASIC knows a kit by its</w:t>
+      </w:r>
+      <w:r>
+        <w:t xml:space="preserve"> </w:t>
+      </w:r>
+      <w:r>
+        <w:rPr>
+          <w:bCs/>
+          <w:b/>
+        </w:rPr>
+        <w:t xml:space="preserve">description</w:t>
+      </w:r>
+      <w:r>
+        <w:t xml:space="preserve">,</w:t>
+      </w:r>
+      <w:r>
+        <w:t xml:space="preserve"> </w:t>
+      </w:r>
+      <w:r>
+        <w:rPr>
+          <w:rStyle w:val="VerbatimChar"/>
+        </w:rPr>
+        <w:t xml:space="preserve">SD:/lib/&lt;kit&gt;.bi</w:t>
+      </w:r>
+      <w:r>
+        <w:t xml:space="preserve">, made from the kit's</w:t>
+      </w:r>
+      <w:r>
+        <w:t xml:space="preserve"> </w:t>
+      </w:r>
+      <w:r>
+        <w:rPr>
+          <w:rStyle w:val="VerbatimChar"/>
+        </w:rPr>
+        <w:t xml:space="preserve">.abi</w:t>
+      </w:r>
+      <w:r>
+        <w:t xml:space="preserve"> </w:t>
+      </w:r>
+      <w:r>
+        <w:t xml:space="preserve">and its</w:t>
+      </w:r>
+      <w:r>
+        <w:t xml:space="preserve"> </w:t>
+      </w:r>
+      <w:r>
+        <w:t xml:space="preserve">headers by</w:t>
+      </w:r>
+      <w:r>
+        <w:t xml:space="preserve"> </w:t>
+      </w:r>
+      <w:r>
+        <w:rPr>
+          <w:rStyle w:val="VerbatimChar"/>
+        </w:rPr>
+        <w:t xml:space="preserve">tools/kitbi/kitbi.py</w:t>
+      </w:r>
+      <w:r>
+        <w:t xml:space="preserve"> </w:t>
+      </w:r>
+      <w:r>
+        <w:t xml:space="preserve">when the kits are built: nothing in BASIC names a kit, so</w:t>
+      </w:r>
+      <w:r>
+        <w:t xml:space="preserve"> </w:t>
+      </w:r>
+      <w:r>
+        <w:rPr>
+          <w:bCs/>
+          <w:b/>
+        </w:rPr>
+        <w:t xml:space="preserve">a new kit is</w:t>
+      </w:r>
+      <w:r>
+        <w:rPr>
+          <w:bCs/>
+          <w:b/>
+        </w:rPr>
+        <w:t xml:space="preserve"> </w:t>
+      </w:r>
+      <w:r>
+        <w:rPr>
+          <w:bCs/>
+          <w:b/>
+        </w:rPr>
+        <w:t xml:space="preserve">importable as soon as it is built</w:t>
+      </w:r>
+      <w:r>
+        <w:t xml:space="preserve"> </w:t>
+      </w:r>
+      <w:r>
+        <w:t xml:space="preserve">(docs/03,</w:t>
+      </w:r>
+      <w:r>
+        <w:t xml:space="preserve"> </w:t>
+      </w:r>
+      <w:r>
+        <w:rPr>
           <w:iCs/>
-        </w:rPr>
-        <w:t xml:space="preserve">The system's kits</w:t>
-      </w:r>
-      <w:r>
-        <w:t xml:space="preserve">). BASIC knows a kit by its</w:t>
-      </w:r>
-      <w:r>
-        <w:t xml:space="preserve"> </w:t>
-      </w:r>
-      <w:r>
-        <w:rPr>
-          <w:b/>
-          <w:bCs/>
-        </w:rPr>
-        <w:t xml:space="preserve">description</w:t>
-      </w:r>
-      <w:r>
-        <w:t xml:space="preserve">,</w:t>
-      </w:r>
-      <w:r>
-        <w:t xml:space="preserve"> </w:t>
-      </w:r>
-      <w:r>
-        <w:rPr>
-          <w:rStyle w:val="VerbatimChar"/>
-        </w:rPr>
-        <w:t xml:space="preserve">SD:/lib/&lt;kit&gt;.bi</w:t>
-      </w:r>
-      <w:r>
-        <w:t xml:space="preserve">, made from the kit's</w:t>
-      </w:r>
-      <w:r>
-        <w:t xml:space="preserve"> </w:t>
-      </w:r>
-      <w:r>
-        <w:rPr>
-          <w:rStyle w:val="VerbatimChar"/>
-        </w:rPr>
-        <w:t xml:space="preserve">.abi</w:t>
-      </w:r>
-      <w:r>
-        <w:t xml:space="preserve"> </w:t>
-      </w:r>
-      <w:r>
-        <w:t xml:space="preserve">and its</w:t>
-      </w:r>
-      <w:r>
-        <w:t xml:space="preserve"> </w:t>
-      </w:r>
-      <w:r>
-        <w:t xml:space="preserve">headers by</w:t>
-      </w:r>
-      <w:r>
-        <w:t xml:space="preserve"> </w:t>
-      </w:r>
-      <w:r>
-        <w:rPr>
-          <w:rStyle w:val="VerbatimChar"/>
-        </w:rPr>
-        <w:t xml:space="preserve">tools/kitbi/kitbi.py</w:t>
-      </w:r>
-      <w:r>
-        <w:t xml:space="preserve"> </w:t>
-      </w:r>
-      <w:r>
-        <w:t xml:space="preserve">when the kits are built: nothing in BASIC names a kit, so</w:t>
-      </w:r>
-      <w:r>
-        <w:t xml:space="preserve"> </w:t>
-      </w:r>
-      <w:r>
-        <w:rPr>
-          <w:b/>
-          <w:bCs/>
-        </w:rPr>
-        <w:t xml:space="preserve">a new kit is</w:t>
-      </w:r>
-      <w:r>
-        <w:rPr>
-          <w:b/>
-          <w:bCs/>
-        </w:rPr>
-        <w:t xml:space="preserve"> </w:t>
-      </w:r>
-      <w:r>
-        <w:rPr>
-          <w:b/>
-          <w:bCs/>
-        </w:rPr>
-        <w:t xml:space="preserve">importable as soon as it is built</w:t>
-      </w:r>
-      <w:r>
-        <w:t xml:space="preserve"> </w:t>
-      </w:r>
-      <w:r>
-        <w:t xml:space="preserve">(docs/03,</w:t>
-      </w:r>
-      <w:r>
-        <w:t xml:space="preserve"> </w:t>
-      </w:r>
-      <w:r>
-        <w:rPr>
           <w:i/>
-          <w:iCs/>
         </w:rPr>
         <w:t xml:space="preserve">BASIC and the kits</w:t>
       </w:r>
@@ -2059,8 +2117,8 @@
         <w:t xml:space="preserve">functions.</w:t>
       </w:r>
     </w:p>
-    <w:bookmarkEnd w:id="34"/>
-    <w:bookmarkStart w:id="35" w:name="on-a-pc"/>
+    <w:bookmarkEnd w:id="36"/>
+    <w:bookmarkStart w:id="37" w:name="on-a-pc"/>
     <w:p>
       <w:pPr>
         <w:pStyle w:val="Heading3"/>
@@ -2089,9 +2147,9 @@
         <w:t xml:space="preserve">changes in the program's code.</w:t>
       </w:r>
     </w:p>
-    <w:bookmarkEnd w:id="35"/>
-    <w:bookmarkEnd w:id="36"/>
-    <w:bookmarkStart w:id="37" w:name="X479a017f3f362789bae7c4b9122aafaba533bfa"/>
+    <w:bookmarkEnd w:id="37"/>
+    <w:bookmarkEnd w:id="38"/>
+    <w:bookmarkStart w:id="39" w:name="X479a017f3f362789bae7c4b9122aafaba533bfa"/>
     <w:p>
       <w:pPr>
         <w:pStyle w:val="Heading2"/>
@@ -2167,8 +2225,8 @@
       </w:pPr>
       <w:r>
         <w:rPr>
+          <w:bCs/>
           <w:b/>
-          <w:bCs/>
         </w:rPr>
         <w:t xml:space="preserve">A console tool</w:t>
       </w:r>
@@ -2835,37 +2893,37 @@
       </w:pPr>
       <w:r>
         <w:rPr>
+          <w:bCs/>
           <w:b/>
+        </w:rPr>
+        <w:t xml:space="preserve">Settings from an</w:t>
+      </w:r>
+      <w:r>
+        <w:rPr>
           <w:bCs/>
-        </w:rPr>
-        <w:t xml:space="preserve">Settings from an</w:t>
-      </w:r>
-      <w:r>
-        <w:rPr>
           <w:b/>
+        </w:rPr>
+        <w:t xml:space="preserve"> </w:t>
+      </w:r>
+      <w:r>
+        <w:rPr>
+          <w:rStyle w:val="VerbatimChar"/>
           <w:bCs/>
-        </w:rPr>
-        <w:t xml:space="preserve"> </w:t>
-      </w:r>
-      <w:r>
-        <w:rPr>
-          <w:rStyle w:val="VerbatimChar"/>
           <w:b/>
+        </w:rPr>
+        <w:t xml:space="preserve">.ini</w:t>
+      </w:r>
+      <w:r>
+        <w:rPr>
           <w:bCs/>
-        </w:rPr>
-        <w:t xml:space="preserve">.ini</w:t>
-      </w:r>
-      <w:r>
-        <w:rPr>
           <w:b/>
+        </w:rPr>
+        <w:t xml:space="preserve"> </w:t>
+      </w:r>
+      <w:r>
+        <w:rPr>
           <w:bCs/>
-        </w:rPr>
-        <w:t xml:space="preserve"> </w:t>
-      </w:r>
-      <w:r>
-        <w:rPr>
           <w:b/>
-          <w:bCs/>
         </w:rPr>
         <w:t xml:space="preserve">file</w:t>
       </w:r>
@@ -3325,8 +3383,8 @@
       </w:pPr>
       <w:r>
         <w:rPr>
+          <w:bCs/>
           <w:b/>
-          <w:bCs/>
         </w:rPr>
         <w:t xml:space="preserve">Strings</w:t>
       </w:r>
@@ -3774,8 +3832,8 @@
       </w:pPr>
       <w:r>
         <w:rPr>
+          <w:bCs/>
           <w:b/>
-          <w:bCs/>
         </w:rPr>
         <w:t xml:space="preserve">Starting a program</w:t>
       </w:r>
@@ -3923,8 +3981,805 @@
         <w:t xml:space="preserve">// a file: by its runner</w:t>
       </w:r>
     </w:p>
-    <w:bookmarkEnd w:id="37"/>
-    <w:bookmarkStart w:id="38" w:name="X0a53c701f88fdf6f7c7ea97f28ca21204deb07c"/>
+    <w:p>
+      <w:pPr>
+        <w:pStyle w:val="FirstParagraph"/>
+      </w:pPr>
+      <w:r>
+        <w:rPr>
+          <w:bCs/>
+          <w:b/>
+        </w:rPr>
+        <w:t xml:space="preserve">The volumes, USB sticks</w:t>
+      </w:r>
+      <w:r>
+        <w:t xml:space="preserve"> </w:t>
+      </w:r>
+      <w:r>
+        <w:t xml:space="preserve">(kapi v91) — list them, eject a stick, format one:</w:t>
+      </w:r>
+    </w:p>
+    <w:p>
+      <w:pPr>
+        <w:pStyle w:val="SourceCode"/>
+      </w:pPr>
+      <w:r>
+        <w:rPr>
+          <w:rStyle w:val="KeywordTok"/>
+        </w:rPr>
+        <w:t xml:space="preserve">struct</w:t>
+      </w:r>
+      <w:r>
+        <w:rPr>
+          <w:rStyle w:val="NormalTok"/>
+        </w:rPr>
+        <w:t xml:space="preserve"> kapi_volume v</w:t>
+      </w:r>
+      <w:r>
+        <w:rPr>
+          <w:rStyle w:val="OperatorTok"/>
+        </w:rPr>
+        <w:t xml:space="preserve">[</w:t>
+      </w:r>
+      <w:r>
+        <w:rPr>
+          <w:rStyle w:val="DecValTok"/>
+        </w:rPr>
+        <w:t xml:space="preserve">16</w:t>
+      </w:r>
+      <w:r>
+        <w:rPr>
+          <w:rStyle w:val="OperatorTok"/>
+        </w:rPr>
+        <w:t xml:space="preserve">];</w:t>
+      </w:r>
+      <w:r>
+        <w:br/>
+      </w:r>
+      <w:r>
+        <w:rPr>
+          <w:rStyle w:val="DataTypeTok"/>
+        </w:rPr>
+        <w:t xml:space="preserve">int</w:t>
+      </w:r>
+      <w:r>
+        <w:rPr>
+          <w:rStyle w:val="NormalTok"/>
+        </w:rPr>
+        <w:t xml:space="preserve"> n </w:t>
+      </w:r>
+      <w:r>
+        <w:rPr>
+          <w:rStyle w:val="OperatorTok"/>
+        </w:rPr>
+        <w:t xml:space="preserve">=</w:t>
+      </w:r>
+      <w:r>
+        <w:rPr>
+          <w:rStyle w:val="NormalTok"/>
+        </w:rPr>
+        <w:t xml:space="preserve"> kapi_vol_list </w:t>
+      </w:r>
+      <w:r>
+        <w:rPr>
+          <w:rStyle w:val="OperatorTok"/>
+        </w:rPr>
+        <w:t xml:space="preserve">(</w:t>
+      </w:r>
+      <w:r>
+        <w:rPr>
+          <w:rStyle w:val="NormalTok"/>
+        </w:rPr>
+        <w:t xml:space="preserve">v</w:t>
+      </w:r>
+      <w:r>
+        <w:rPr>
+          <w:rStyle w:val="OperatorTok"/>
+        </w:rPr>
+        <w:t xml:space="preserve">,</w:t>
+      </w:r>
+      <w:r>
+        <w:rPr>
+          <w:rStyle w:val="NormalTok"/>
+        </w:rPr>
+        <w:t xml:space="preserve"> </w:t>
+      </w:r>
+      <w:r>
+        <w:rPr>
+          <w:rStyle w:val="DecValTok"/>
+        </w:rPr>
+        <w:t xml:space="preserve">16</w:t>
+      </w:r>
+      <w:r>
+        <w:rPr>
+          <w:rStyle w:val="OperatorTok"/>
+        </w:rPr>
+        <w:t xml:space="preserve">,</w:t>
+      </w:r>
+      <w:r>
+        <w:rPr>
+          <w:rStyle w:val="NormalTok"/>
+        </w:rPr>
+        <w:t xml:space="preserve"> KAPI_VOLS_ROOM</w:t>
+      </w:r>
+      <w:r>
+        <w:rPr>
+          <w:rStyle w:val="OperatorTok"/>
+        </w:rPr>
+        <w:t xml:space="preserve">);</w:t>
+      </w:r>
+      <w:r>
+        <w:rPr>
+          <w:rStyle w:val="NormalTok"/>
+        </w:rPr>
+        <w:t xml:space="preserve">        </w:t>
+      </w:r>
+      <w:r>
+        <w:rPr>
+          <w:rStyle w:val="CommentTok"/>
+        </w:rPr>
+        <w:t xml:space="preserve">// SD:, SD1:.., USB:.., RAM: (n: how many)</w:t>
+      </w:r>
+      <w:r>
+        <w:br/>
+      </w:r>
+      <w:r>
+        <w:rPr>
+          <w:rStyle w:val="ControlFlowTok"/>
+        </w:rPr>
+        <w:t xml:space="preserve">for</w:t>
+      </w:r>
+      <w:r>
+        <w:rPr>
+          <w:rStyle w:val="NormalTok"/>
+        </w:rPr>
+        <w:t xml:space="preserve"> </w:t>
+      </w:r>
+      <w:r>
+        <w:rPr>
+          <w:rStyle w:val="OperatorTok"/>
+        </w:rPr>
+        <w:t xml:space="preserve">(</w:t>
+      </w:r>
+      <w:r>
+        <w:rPr>
+          <w:rStyle w:val="DataTypeTok"/>
+        </w:rPr>
+        <w:t xml:space="preserve">int</w:t>
+      </w:r>
+      <w:r>
+        <w:rPr>
+          <w:rStyle w:val="NormalTok"/>
+        </w:rPr>
+        <w:t xml:space="preserve"> i </w:t>
+      </w:r>
+      <w:r>
+        <w:rPr>
+          <w:rStyle w:val="OperatorTok"/>
+        </w:rPr>
+        <w:t xml:space="preserve">=</w:t>
+      </w:r>
+      <w:r>
+        <w:rPr>
+          <w:rStyle w:val="NormalTok"/>
+        </w:rPr>
+        <w:t xml:space="preserve"> </w:t>
+      </w:r>
+      <w:r>
+        <w:rPr>
+          <w:rStyle w:val="DecValTok"/>
+        </w:rPr>
+        <w:t xml:space="preserve">0</w:t>
+      </w:r>
+      <w:r>
+        <w:rPr>
+          <w:rStyle w:val="OperatorTok"/>
+        </w:rPr>
+        <w:t xml:space="preserve">;</w:t>
+      </w:r>
+      <w:r>
+        <w:rPr>
+          <w:rStyle w:val="NormalTok"/>
+        </w:rPr>
+        <w:t xml:space="preserve"> i </w:t>
+      </w:r>
+      <w:r>
+        <w:rPr>
+          <w:rStyle w:val="OperatorTok"/>
+        </w:rPr>
+        <w:t xml:space="preserve">&lt;</w:t>
+      </w:r>
+      <w:r>
+        <w:rPr>
+          <w:rStyle w:val="NormalTok"/>
+        </w:rPr>
+        <w:t xml:space="preserve"> n </w:t>
+      </w:r>
+      <w:r>
+        <w:rPr>
+          <w:rStyle w:val="OperatorTok"/>
+        </w:rPr>
+        <w:t xml:space="preserve">&amp;&amp;</w:t>
+      </w:r>
+      <w:r>
+        <w:rPr>
+          <w:rStyle w:val="NormalTok"/>
+        </w:rPr>
+        <w:t xml:space="preserve"> i </w:t>
+      </w:r>
+      <w:r>
+        <w:rPr>
+          <w:rStyle w:val="OperatorTok"/>
+        </w:rPr>
+        <w:t xml:space="preserve">&lt;</w:t>
+      </w:r>
+      <w:r>
+        <w:rPr>
+          <w:rStyle w:val="NormalTok"/>
+        </w:rPr>
+        <w:t xml:space="preserve"> </w:t>
+      </w:r>
+      <w:r>
+        <w:rPr>
+          <w:rStyle w:val="DecValTok"/>
+        </w:rPr>
+        <w:t xml:space="preserve">16</w:t>
+      </w:r>
+      <w:r>
+        <w:rPr>
+          <w:rStyle w:val="OperatorTok"/>
+        </w:rPr>
+        <w:t xml:space="preserve">;</w:t>
+      </w:r>
+      <w:r>
+        <w:rPr>
+          <w:rStyle w:val="NormalTok"/>
+        </w:rPr>
+        <w:t xml:space="preserve"> i</w:t>
+      </w:r>
+      <w:r>
+        <w:rPr>
+          <w:rStyle w:val="OperatorTok"/>
+        </w:rPr>
+        <w:t xml:space="preserve">++)</w:t>
+      </w:r>
+      <w:r>
+        <w:br/>
+      </w:r>
+      <w:r>
+        <w:rPr>
+          <w:rStyle w:val="NormalTok"/>
+        </w:rPr>
+        <w:t xml:space="preserve">    </w:t>
+      </w:r>
+      <w:r>
+        <w:rPr>
+          <w:rStyle w:val="ControlFlowTok"/>
+        </w:rPr>
+        <w:t xml:space="preserve">if</w:t>
+      </w:r>
+      <w:r>
+        <w:rPr>
+          <w:rStyle w:val="NormalTok"/>
+        </w:rPr>
+        <w:t xml:space="preserve"> </w:t>
+      </w:r>
+      <w:r>
+        <w:rPr>
+          <w:rStyle w:val="OperatorTok"/>
+        </w:rPr>
+        <w:t xml:space="preserve">((</w:t>
+      </w:r>
+      <w:r>
+        <w:rPr>
+          <w:rStyle w:val="NormalTok"/>
+        </w:rPr>
+        <w:t xml:space="preserve">v</w:t>
+      </w:r>
+      <w:r>
+        <w:rPr>
+          <w:rStyle w:val="OperatorTok"/>
+        </w:rPr>
+        <w:t xml:space="preserve">[</w:t>
+      </w:r>
+      <w:r>
+        <w:rPr>
+          <w:rStyle w:val="NormalTok"/>
+        </w:rPr>
+        <w:t xml:space="preserve">i</w:t>
+      </w:r>
+      <w:r>
+        <w:rPr>
+          <w:rStyle w:val="OperatorTok"/>
+        </w:rPr>
+        <w:t xml:space="preserve">].</w:t>
+      </w:r>
+      <w:r>
+        <w:rPr>
+          <w:rStyle w:val="NormalTok"/>
+        </w:rPr>
+        <w:t xml:space="preserve">flags </w:t>
+      </w:r>
+      <w:r>
+        <w:rPr>
+          <w:rStyle w:val="OperatorTok"/>
+        </w:rPr>
+        <w:t xml:space="preserve">&amp;</w:t>
+      </w:r>
+      <w:r>
+        <w:rPr>
+          <w:rStyle w:val="NormalTok"/>
+        </w:rPr>
+        <w:t xml:space="preserve"> KAPI_VF_REMOVABLE</w:t>
+      </w:r>
+      <w:r>
+        <w:rPr>
+          <w:rStyle w:val="OperatorTok"/>
+        </w:rPr>
+        <w:t xml:space="preserve">)</w:t>
+      </w:r>
+      <w:r>
+        <w:rPr>
+          <w:rStyle w:val="NormalTok"/>
+        </w:rPr>
+        <w:t xml:space="preserve"> </w:t>
+      </w:r>
+      <w:r>
+        <w:rPr>
+          <w:rStyle w:val="OperatorTok"/>
+        </w:rPr>
+        <w:t xml:space="preserve">&amp;&amp;</w:t>
+      </w:r>
+      <w:r>
+        <w:rPr>
+          <w:rStyle w:val="NormalTok"/>
+        </w:rPr>
+        <w:t xml:space="preserve"> v</w:t>
+      </w:r>
+      <w:r>
+        <w:rPr>
+          <w:rStyle w:val="OperatorTok"/>
+        </w:rPr>
+        <w:t xml:space="preserve">[</w:t>
+      </w:r>
+      <w:r>
+        <w:rPr>
+          <w:rStyle w:val="NormalTok"/>
+        </w:rPr>
+        <w:t xml:space="preserve">i</w:t>
+      </w:r>
+      <w:r>
+        <w:rPr>
+          <w:rStyle w:val="OperatorTok"/>
+        </w:rPr>
+        <w:t xml:space="preserve">].</w:t>
+      </w:r>
+      <w:r>
+        <w:rPr>
+          <w:rStyle w:val="NormalTok"/>
+        </w:rPr>
+        <w:t xml:space="preserve">state </w:t>
+      </w:r>
+      <w:r>
+        <w:rPr>
+          <w:rStyle w:val="OperatorTok"/>
+        </w:rPr>
+        <w:t xml:space="preserve">==</w:t>
+      </w:r>
+      <w:r>
+        <w:rPr>
+          <w:rStyle w:val="NormalTok"/>
+        </w:rPr>
+        <w:t xml:space="preserve"> KAPI_VST_MOUNTED</w:t>
+      </w:r>
+      <w:r>
+        <w:rPr>
+          <w:rStyle w:val="OperatorTok"/>
+        </w:rPr>
+        <w:t xml:space="preserve">)</w:t>
+      </w:r>
+      <w:r>
+        <w:br/>
+      </w:r>
+      <w:r>
+        <w:rPr>
+          <w:rStyle w:val="NormalTok"/>
+        </w:rPr>
+        <w:t xml:space="preserve">        ax_putln </w:t>
+      </w:r>
+      <w:r>
+        <w:rPr>
+          <w:rStyle w:val="OperatorTok"/>
+        </w:rPr>
+        <w:t xml:space="preserve">(</w:t>
+      </w:r>
+      <w:r>
+        <w:rPr>
+          <w:rStyle w:val="NormalTok"/>
+        </w:rPr>
+        <w:t xml:space="preserve">v</w:t>
+      </w:r>
+      <w:r>
+        <w:rPr>
+          <w:rStyle w:val="OperatorTok"/>
+        </w:rPr>
+        <w:t xml:space="preserve">[</w:t>
+      </w:r>
+      <w:r>
+        <w:rPr>
+          <w:rStyle w:val="NormalTok"/>
+        </w:rPr>
+        <w:t xml:space="preserve">i</w:t>
+      </w:r>
+      <w:r>
+        <w:rPr>
+          <w:rStyle w:val="OperatorTok"/>
+        </w:rPr>
+        <w:t xml:space="preserve">].</w:t>
+      </w:r>
+      <w:r>
+        <w:rPr>
+          <w:rStyle w:val="NormalTok"/>
+        </w:rPr>
+        <w:t xml:space="preserve">label</w:t>
+      </w:r>
+      <w:r>
+        <w:rPr>
+          <w:rStyle w:val="OperatorTok"/>
+        </w:rPr>
+        <w:t xml:space="preserve">);</w:t>
+      </w:r>
+      <w:r>
+        <w:rPr>
+          <w:rStyle w:val="NormalTok"/>
+        </w:rPr>
+        <w:t xml:space="preserve">                        </w:t>
+      </w:r>
+      <w:r>
+        <w:rPr>
+          <w:rStyle w:val="CommentTok"/>
+        </w:rPr>
+        <w:t xml:space="preserve">// a stick plugged in: "USB" + its label</w:t>
+      </w:r>
+      <w:r>
+        <w:br/>
+      </w:r>
+      <w:r>
+        <w:br/>
+      </w:r>
+      <w:r>
+        <w:rPr>
+          <w:rStyle w:val="ControlFlowTok"/>
+        </w:rPr>
+        <w:t xml:space="preserve">if</w:t>
+      </w:r>
+      <w:r>
+        <w:rPr>
+          <w:rStyle w:val="NormalTok"/>
+        </w:rPr>
+        <w:t xml:space="preserve"> </w:t>
+      </w:r>
+      <w:r>
+        <w:rPr>
+          <w:rStyle w:val="OperatorTok"/>
+        </w:rPr>
+        <w:t xml:space="preserve">(</w:t>
+      </w:r>
+      <w:r>
+        <w:rPr>
+          <w:rStyle w:val="NormalTok"/>
+        </w:rPr>
+        <w:t xml:space="preserve">kapi_vol_eject </w:t>
+      </w:r>
+      <w:r>
+        <w:rPr>
+          <w:rStyle w:val="OperatorTok"/>
+        </w:rPr>
+        <w:t xml:space="preserve">(</w:t>
+      </w:r>
+      <w:r>
+        <w:rPr>
+          <w:rStyle w:val="StringTok"/>
+        </w:rPr>
+        <w:t xml:space="preserve">"USB:"</w:t>
+      </w:r>
+      <w:r>
+        <w:rPr>
+          <w:rStyle w:val="OperatorTok"/>
+        </w:rPr>
+        <w:t xml:space="preserve">,</w:t>
+      </w:r>
+      <w:r>
+        <w:rPr>
+          <w:rStyle w:val="NormalTok"/>
+        </w:rPr>
+        <w:t xml:space="preserve"> </w:t>
+      </w:r>
+      <w:r>
+        <w:rPr>
+          <w:rStyle w:val="DecValTok"/>
+        </w:rPr>
+        <w:t xml:space="preserve">0</w:t>
+      </w:r>
+      <w:r>
+        <w:rPr>
+          <w:rStyle w:val="OperatorTok"/>
+        </w:rPr>
+        <w:t xml:space="preserve">)</w:t>
+      </w:r>
+      <w:r>
+        <w:rPr>
+          <w:rStyle w:val="NormalTok"/>
+        </w:rPr>
+        <w:t xml:space="preserve"> </w:t>
+      </w:r>
+      <w:r>
+        <w:rPr>
+          <w:rStyle w:val="OperatorTok"/>
+        </w:rPr>
+        <w:t xml:space="preserve">==</w:t>
+      </w:r>
+      <w:r>
+        <w:rPr>
+          <w:rStyle w:val="NormalTok"/>
+        </w:rPr>
+        <w:t xml:space="preserve"> </w:t>
+      </w:r>
+      <w:r>
+        <w:rPr>
+          <w:rStyle w:val="OperatorTok"/>
+        </w:rPr>
+        <w:t xml:space="preserve">-</w:t>
+      </w:r>
+      <w:r>
+        <w:rPr>
+          <w:rStyle w:val="NormalTok"/>
+        </w:rPr>
+        <w:t xml:space="preserve">KAPI_EBUSY</w:t>
+      </w:r>
+      <w:r>
+        <w:rPr>
+          <w:rStyle w:val="OperatorTok"/>
+        </w:rPr>
+        <w:t xml:space="preserve">)</w:t>
+      </w:r>
+      <w:r>
+        <w:rPr>
+          <w:rStyle w:val="NormalTok"/>
+        </w:rPr>
+        <w:t xml:space="preserve">        </w:t>
+      </w:r>
+      <w:r>
+        <w:rPr>
+          <w:rStyle w:val="CommentTok"/>
+        </w:rPr>
+        <w:t xml:space="preserve">// files open on it (they were synced)</w:t>
+      </w:r>
+      <w:r>
+        <w:br/>
+      </w:r>
+      <w:r>
+        <w:rPr>
+          <w:rStyle w:val="NormalTok"/>
+        </w:rPr>
+        <w:t xml:space="preserve">    kapi_vol_eject </w:t>
+      </w:r>
+      <w:r>
+        <w:rPr>
+          <w:rStyle w:val="OperatorTok"/>
+        </w:rPr>
+        <w:t xml:space="preserve">(</w:t>
+      </w:r>
+      <w:r>
+        <w:rPr>
+          <w:rStyle w:val="StringTok"/>
+        </w:rPr>
+        <w:t xml:space="preserve">"USB:"</w:t>
+      </w:r>
+      <w:r>
+        <w:rPr>
+          <w:rStyle w:val="OperatorTok"/>
+        </w:rPr>
+        <w:t xml:space="preserve">,</w:t>
+      </w:r>
+      <w:r>
+        <w:rPr>
+          <w:rStyle w:val="NormalTok"/>
+        </w:rPr>
+        <w:t xml:space="preserve"> KAPI_EJECT_FORCE</w:t>
+      </w:r>
+      <w:r>
+        <w:rPr>
+          <w:rStyle w:val="OperatorTok"/>
+        </w:rPr>
+        <w:t xml:space="preserve">);</w:t>
+      </w:r>
+      <w:r>
+        <w:rPr>
+          <w:rStyle w:val="NormalTok"/>
+        </w:rPr>
+        <w:t xml:space="preserve">        </w:t>
+      </w:r>
+      <w:r>
+        <w:rPr>
+          <w:rStyle w:val="CommentTok"/>
+        </w:rPr>
+        <w:t xml:space="preserve">// ... after asking the user</w:t>
+      </w:r>
+      <w:r>
+        <w:br/>
+      </w:r>
+      <w:r>
+        <w:br/>
+      </w:r>
+      <w:r>
+        <w:rPr>
+          <w:rStyle w:val="KeywordTok"/>
+        </w:rPr>
+        <w:t xml:space="preserve">struct</w:t>
+      </w:r>
+      <w:r>
+        <w:rPr>
+          <w:rStyle w:val="NormalTok"/>
+        </w:rPr>
+        <w:t xml:space="preserve"> kapi_format f </w:t>
+      </w:r>
+      <w:r>
+        <w:rPr>
+          <w:rStyle w:val="OperatorTok"/>
+        </w:rPr>
+        <w:t xml:space="preserve">=</w:t>
+      </w:r>
+      <w:r>
+        <w:rPr>
+          <w:rStyle w:val="NormalTok"/>
+        </w:rPr>
+        <w:t xml:space="preserve"> </w:t>
+      </w:r>
+      <w:r>
+        <w:rPr>
+          <w:rStyle w:val="OperatorTok"/>
+        </w:rPr>
+        <w:t xml:space="preserve">{</w:t>
+      </w:r>
+      <w:r>
+        <w:rPr>
+          <w:rStyle w:val="NormalTok"/>
+        </w:rPr>
+        <w:t xml:space="preserve"> KAPI_FMT_EXFAT</w:t>
+      </w:r>
+      <w:r>
+        <w:rPr>
+          <w:rStyle w:val="OperatorTok"/>
+        </w:rPr>
+        <w:t xml:space="preserve">,</w:t>
+      </w:r>
+      <w:r>
+        <w:rPr>
+          <w:rStyle w:val="NormalTok"/>
+        </w:rPr>
+        <w:t xml:space="preserve"> </w:t>
+      </w:r>
+      <w:r>
+        <w:rPr>
+          <w:rStyle w:val="DecValTok"/>
+        </w:rPr>
+        <w:t xml:space="preserve">0</w:t>
+      </w:r>
+      <w:r>
+        <w:rPr>
+          <w:rStyle w:val="OperatorTok"/>
+        </w:rPr>
+        <w:t xml:space="preserve">,</w:t>
+      </w:r>
+      <w:r>
+        <w:rPr>
+          <w:rStyle w:val="NormalTok"/>
+        </w:rPr>
+        <w:t xml:space="preserve"> </w:t>
+      </w:r>
+      <w:r>
+        <w:rPr>
+          <w:rStyle w:val="DecValTok"/>
+        </w:rPr>
+        <w:t xml:space="preserve">0</w:t>
+      </w:r>
+      <w:r>
+        <w:rPr>
+          <w:rStyle w:val="OperatorTok"/>
+        </w:rPr>
+        <w:t xml:space="preserve">,</w:t>
+      </w:r>
+      <w:r>
+        <w:rPr>
+          <w:rStyle w:val="NormalTok"/>
+        </w:rPr>
+        <w:t xml:space="preserve"> </w:t>
+      </w:r>
+      <w:r>
+        <w:rPr>
+          <w:rStyle w:val="StringTok"/>
+        </w:rPr>
+        <w:t xml:space="preserve">"PHOTOS"</w:t>
+      </w:r>
+      <w:r>
+        <w:rPr>
+          <w:rStyle w:val="NormalTok"/>
+        </w:rPr>
+        <w:t xml:space="preserve"> </w:t>
+      </w:r>
+      <w:r>
+        <w:rPr>
+          <w:rStyle w:val="OperatorTok"/>
+        </w:rPr>
+        <w:t xml:space="preserve">};</w:t>
+      </w:r>
+      <w:r>
+        <w:br/>
+      </w:r>
+      <w:r>
+        <w:rPr>
+          <w:rStyle w:val="NormalTok"/>
+        </w:rPr>
+        <w:t xml:space="preserve">kapi_vol_format </w:t>
+      </w:r>
+      <w:r>
+        <w:rPr>
+          <w:rStyle w:val="OperatorTok"/>
+        </w:rPr>
+        <w:t xml:space="preserve">(</w:t>
+      </w:r>
+      <w:r>
+        <w:rPr>
+          <w:rStyle w:val="StringTok"/>
+        </w:rPr>
+        <w:t xml:space="preserve">"USB:"</w:t>
+      </w:r>
+      <w:r>
+        <w:rPr>
+          <w:rStyle w:val="OperatorTok"/>
+        </w:rPr>
+        <w:t xml:space="preserve">,</w:t>
+      </w:r>
+      <w:r>
+        <w:rPr>
+          <w:rStyle w:val="NormalTok"/>
+        </w:rPr>
+        <w:t xml:space="preserve"> </w:t>
+      </w:r>
+      <w:r>
+        <w:rPr>
+          <w:rStyle w:val="OperatorTok"/>
+        </w:rPr>
+        <w:t xml:space="preserve">&amp;</w:t>
+      </w:r>
+      <w:r>
+        <w:rPr>
+          <w:rStyle w:val="NormalTok"/>
+        </w:rPr>
+        <w:t xml:space="preserve">f</w:t>
+      </w:r>
+      <w:r>
+        <w:rPr>
+          <w:rStyle w:val="OperatorTok"/>
+        </w:rPr>
+        <w:t xml:space="preserve">);</w:t>
+      </w:r>
+      <w:r>
+        <w:rPr>
+          <w:rStyle w:val="NormalTok"/>
+        </w:rPr>
+        <w:t xml:space="preserve">                         </w:t>
+      </w:r>
+      <w:r>
+        <w:rPr>
+          <w:rStyle w:val="CommentTok"/>
+        </w:rPr>
+        <w:t xml:space="preserve">// erases it; SD: is always refused</w:t>
+      </w:r>
+    </w:p>
+    <w:bookmarkEnd w:id="39"/>
+    <w:bookmarkStart w:id="40" w:name="X0a53c701f88fdf6f7c7ea97f28ca21204deb07c"/>
     <w:p>
       <w:pPr>
         <w:pStyle w:val="Heading2"/>
@@ -4024,8 +4879,8 @@
       </w:pPr>
       <w:r>
         <w:rPr>
+          <w:bCs/>
           <w:b/>
-          <w:bCs/>
         </w:rPr>
         <w:t xml:space="preserve">A window, a label, a button:</w:t>
       </w:r>
@@ -5151,8 +6006,8 @@
       </w:pPr>
       <w:r>
         <w:rPr>
+          <w:bCs/>
           <w:b/>
-          <w:bCs/>
         </w:rPr>
         <w:t xml:space="preserve">Dialogs</w:t>
       </w:r>
@@ -5594,8 +6449,8 @@
       </w:pPr>
       <w:r>
         <w:rPr>
+          <w:bCs/>
           <w:b/>
-          <w:bCs/>
         </w:rPr>
         <w:t xml:space="preserve">The theme</w:t>
       </w:r>
@@ -5660,8 +6515,8 @@
       </w:pPr>
       <w:r>
         <w:rPr>
+          <w:bCs/>
           <w:b/>
-          <w:bCs/>
         </w:rPr>
         <w:t xml:space="preserve">Without C++</w:t>
       </w:r>
@@ -6348,22 +7203,22 @@
       </w:r>
       <w:r>
         <w:rPr>
+          <w:iCs/>
           <w:i/>
+        </w:rPr>
+        <w:t xml:space="preserve">or a</w:t>
+      </w:r>
+      <w:r>
+        <w:rPr>
           <w:iCs/>
-        </w:rPr>
-        <w:t xml:space="preserve">or a</w:t>
-      </w:r>
-      <w:r>
-        <w:rPr>
           <w:i/>
+        </w:rPr>
+        <w:t xml:space="preserve"> </w:t>
+      </w:r>
+      <w:r>
+        <w:rPr>
           <w:iCs/>
-        </w:rPr>
-        <w:t xml:space="preserve"> </w:t>
-      </w:r>
-      <w:r>
-        <w:rPr>
           <w:i/>
-          <w:iCs/>
         </w:rPr>
         <w:t xml:space="preserve">panel</w:t>
       </w:r>
@@ -6442,8 +7297,8 @@
       </w:pPr>
       <w:r>
         <w:rPr>
+          <w:bCs/>
           <w:b/>
-          <w:bCs/>
         </w:rPr>
         <w:t xml:space="preserve">An icon</w:t>
       </w:r>
@@ -6741,8 +7596,8 @@
       </w:pPr>
       <w:r>
         <w:rPr>
+          <w:bCs/>
           <w:b/>
-          <w:bCs/>
         </w:rPr>
         <w:t xml:space="preserve">A timer or polling</w:t>
       </w:r>
@@ -6780,8 +7635,8 @@
         <w:t xml:space="preserve">(called about 60 times a second).</w:t>
       </w:r>
     </w:p>
-    <w:bookmarkEnd w:id="38"/>
-    <w:bookmarkStart w:id="39" w:name="X1c12e241ab2b4ebd18b32f840f751712082d5e1"/>
+    <w:bookmarkEnd w:id="40"/>
+    <w:bookmarkStart w:id="41" w:name="X1c12e241ab2b4ebd18b32f840f751712082d5e1"/>
     <w:p>
       <w:pPr>
         <w:pStyle w:val="Heading2"/>
@@ -6855,8 +7710,8 @@
       </w:pPr>
       <w:r>
         <w:rPr>
+          <w:bCs/>
           <w:b/>
-          <w:bCs/>
         </w:rPr>
         <w:t xml:space="preserve">A notification</w:t>
       </w:r>
@@ -7016,8 +7871,8 @@
       </w:pPr>
       <w:r>
         <w:rPr>
+          <w:bCs/>
           <w:b/>
-          <w:bCs/>
         </w:rPr>
         <w:t xml:space="preserve">The clipboard</w:t>
       </w:r>
@@ -7453,8 +8308,8 @@
       </w:pPr>
       <w:r>
         <w:rPr>
+          <w:bCs/>
           <w:b/>
-          <w:bCs/>
         </w:rPr>
         <w:t xml:space="preserve">The trash</w:t>
       </w:r>
@@ -7623,8 +8478,8 @@
       </w:pPr>
       <w:r>
         <w:rPr>
+          <w:bCs/>
           <w:b/>
-          <w:bCs/>
         </w:rPr>
         <w:t xml:space="preserve">Opening a file with the right application</w:t>
       </w:r>
@@ -7850,8 +8705,8 @@
       </w:pPr>
       <w:r>
         <w:rPr>
+          <w:bCs/>
           <w:b/>
-          <w:bCs/>
         </w:rPr>
         <w:t xml:space="preserve">The volume, the wallpaper, the dock</w:t>
       </w:r>
@@ -8067,6 +8922,7 @@
         <w:tblStyle w:val="Table"/>
         <w:tblW w:type="auto" w:w="0"/>
         <w:tblLook w:firstRow="1" w:lastRow="0" w:firstColumn="0" w:lastColumn="0" w:noHBand="0" w:noVBand="0" w:val="0020"/>
+        <w:jc w:val="start"/>
       </w:tblPr>
       <w:tblGrid>
         <w:gridCol w:w="3960"/>
@@ -8074,13 +8930,14 @@
       </w:tblGrid>
       <w:tr>
         <w:trPr>
-          <w:tblHeader w:val="on"/>
+          <w:tblHeader w:val="true"/>
         </w:trPr>
         <w:tc>
           <w:tcPr/>
           <w:p>
             <w:pPr>
               <w:pStyle w:val="Compact"/>
+              <w:jc w:val="left"/>
             </w:pPr>
             <w:r>
               <w:t xml:space="preserve">Its part (a header of its own, beside</w:t>
@@ -8104,6 +8961,7 @@
           <w:p>
             <w:pPr>
               <w:pStyle w:val="Compact"/>
+              <w:jc w:val="left"/>
             </w:pPr>
             <w:r>
               <w:t xml:space="preserve">Subject</w:t>
@@ -8117,6 +8975,7 @@
           <w:p>
             <w:pPr>
               <w:pStyle w:val="Compact"/>
+              <w:jc w:val="left"/>
             </w:pPr>
             <w:r>
               <w:rPr>
@@ -8131,6 +8990,7 @@
           <w:p>
             <w:pPr>
               <w:pStyle w:val="Compact"/>
+              <w:jc w:val="left"/>
             </w:pPr>
             <w:r>
               <w:t xml:space="preserve">Notifications</w:t>
@@ -8144,6 +9004,7 @@
           <w:p>
             <w:pPr>
               <w:pStyle w:val="Compact"/>
+              <w:jc w:val="left"/>
             </w:pPr>
             <w:r>
               <w:rPr>
@@ -8173,6 +9034,7 @@
           <w:p>
             <w:pPr>
               <w:pStyle w:val="Compact"/>
+              <w:jc w:val="left"/>
             </w:pPr>
             <w:r>
               <w:t xml:space="preserve">The clipboard</w:t>
@@ -8186,6 +9048,7 @@
           <w:p>
             <w:pPr>
               <w:pStyle w:val="Compact"/>
+              <w:jc w:val="left"/>
             </w:pPr>
             <w:r>
               <w:rPr>
@@ -8200,6 +9063,7 @@
           <w:p>
             <w:pPr>
               <w:pStyle w:val="Compact"/>
+              <w:jc w:val="left"/>
             </w:pPr>
             <w:r>
               <w:t xml:space="preserve">The trash</w:t>
@@ -8213,6 +9077,7 @@
           <w:p>
             <w:pPr>
               <w:pStyle w:val="Compact"/>
+              <w:jc w:val="left"/>
             </w:pPr>
             <w:r>
               <w:rPr>
@@ -8227,6 +9092,7 @@
           <w:p>
             <w:pPr>
               <w:pStyle w:val="Compact"/>
+              <w:jc w:val="left"/>
             </w:pPr>
             <w:r>
               <w:t xml:space="preserve">Which application opens which file</w:t>
@@ -8240,6 +9106,7 @@
           <w:p>
             <w:pPr>
               <w:pStyle w:val="Compact"/>
+              <w:jc w:val="left"/>
             </w:pPr>
             <w:r>
               <w:rPr>
@@ -8254,6 +9121,7 @@
           <w:p>
             <w:pPr>
               <w:pStyle w:val="Compact"/>
+              <w:jc w:val="left"/>
             </w:pPr>
             <w:r>
               <w:t xml:space="preserve">The master volume, the output, each program's volume</w:t>
@@ -8267,6 +9135,7 @@
           <w:p>
             <w:pPr>
               <w:pStyle w:val="Compact"/>
+              <w:jc w:val="left"/>
             </w:pPr>
             <w:r>
               <w:rPr>
@@ -8281,6 +9150,7 @@
           <w:p>
             <w:pPr>
               <w:pStyle w:val="Compact"/>
+              <w:jc w:val="left"/>
             </w:pPr>
             <w:r>
               <w:t xml:space="preserve">The wallpaper's settings and its painter</w:t>
@@ -8294,6 +9164,7 @@
           <w:p>
             <w:pPr>
               <w:pStyle w:val="Compact"/>
+              <w:jc w:val="left"/>
             </w:pPr>
             <w:r>
               <w:rPr>
@@ -8308,6 +9179,7 @@
           <w:p>
             <w:pPr>
               <w:pStyle w:val="Compact"/>
+              <w:jc w:val="left"/>
             </w:pPr>
             <w:r>
               <w:t xml:space="preserve">The dock's settings</w:t>
@@ -8321,6 +9193,7 @@
           <w:p>
             <w:pPr>
               <w:pStyle w:val="Compact"/>
+              <w:jc w:val="left"/>
             </w:pPr>
             <w:r>
               <w:rPr>
@@ -8335,6 +9208,7 @@
           <w:p>
             <w:pPr>
               <w:pStyle w:val="Compact"/>
+              <w:jc w:val="left"/>
             </w:pPr>
             <w:r>
               <w:t xml:space="preserve">The programs loaded ahead at boot</w:t>
@@ -8348,6 +9222,7 @@
           <w:p>
             <w:pPr>
               <w:pStyle w:val="Compact"/>
+              <w:jc w:val="left"/>
             </w:pPr>
             <w:r>
               <w:rPr>
@@ -8362,6 +9237,7 @@
           <w:p>
             <w:pPr>
               <w:pStyle w:val="Compact"/>
+              <w:jc w:val="left"/>
             </w:pPr>
             <w:r>
               <w:t xml:space="preserve">A settings applet shown inside the Control Panel</w:t>
@@ -8370,8 +9246,8 @@
         </w:tc>
       </w:tr>
     </w:tbl>
-    <w:bookmarkEnd w:id="39"/>
-    <w:bookmarkStart w:id="40" w:name="X21c5dfbcb5a69cd5c428264b88180cd193f70a2"/>
+    <w:bookmarkEnd w:id="41"/>
+    <w:bookmarkStart w:id="42" w:name="X21c5dfbcb5a69cd5c428264b88180cd193f70a2"/>
     <w:p>
       <w:pPr>
         <w:pStyle w:val="Heading2"/>
@@ -8460,8 +9336,8 @@
       </w:pPr>
       <w:r>
         <w:rPr>
+          <w:bCs/>
           <w:b/>
-          <w:bCs/>
         </w:rPr>
         <w:t xml:space="preserve">A page fetched</w:t>
       </w:r>
@@ -9044,8 +9920,8 @@
       </w:pPr>
       <w:r>
         <w:rPr>
+          <w:bCs/>
           <w:b/>
-          <w:bCs/>
         </w:rPr>
         <w:t xml:space="preserve">A web API</w:t>
       </w:r>
@@ -9412,8 +10288,8 @@
       </w:pPr>
       <w:r>
         <w:rPr>
+          <w:bCs/>
           <w:b/>
-          <w:bCs/>
         </w:rPr>
         <w:t xml:space="preserve">An FTP server as a volume</w:t>
       </w:r>
@@ -9704,8 +10580,8 @@
         <w:t xml:space="preserve">them belong.</w:t>
       </w:r>
     </w:p>
-    <w:bookmarkEnd w:id="40"/>
-    <w:bookmarkStart w:id="41" w:name="X491a56bd334c8c4c777570fe8bd846c18e7eccb"/>
+    <w:bookmarkEnd w:id="42"/>
+    <w:bookmarkStart w:id="43" w:name="X491a56bd334c8c4c777570fe8bd846c18e7eccb"/>
     <w:p>
       <w:pPr>
         <w:pStyle w:val="Heading2"/>
@@ -9749,8 +10625,8 @@
       </w:pPr>
       <w:r>
         <w:rPr>
+          <w:bCs/>
           <w:b/>
-          <w:bCs/>
         </w:rPr>
         <w:t xml:space="preserve">A whole file, read and written:</w:t>
       </w:r>
@@ -10072,8 +10948,8 @@
       </w:pPr>
       <w:r>
         <w:rPr>
+          <w:bCs/>
           <w:b/>
-          <w:bCs/>
         </w:rPr>
         <w:t xml:space="preserve">Folders and paths:</w:t>
       </w:r>
@@ -10479,8 +11355,8 @@
       </w:pPr>
       <w:r>
         <w:rPr>
+          <w:bCs/>
           <w:b/>
-          <w:bCs/>
         </w:rPr>
         <w:t xml:space="preserve">A ZIP archive, read:</w:t>
       </w:r>
@@ -11051,8 +11927,8 @@
       </w:pPr>
       <w:r>
         <w:rPr>
+          <w:bCs/>
           <w:b/>
-          <w:bCs/>
         </w:rPr>
         <w:t xml:space="preserve">A ZIP archive, written:</w:t>
       </w:r>
@@ -11316,8 +12192,8 @@
         <w:t xml:space="preserve">) instead of keeping its own list.</w:t>
       </w:r>
     </w:p>
-    <w:bookmarkEnd w:id="41"/>
-    <w:bookmarkStart w:id="42" w:name="Xf777c6178c1b7acc606d863a1dc288d7a0b8399"/>
+    <w:bookmarkEnd w:id="43"/>
+    <w:bookmarkStart w:id="44" w:name="Xf777c6178c1b7acc606d863a1dc288d7a0b8399"/>
     <w:p>
       <w:pPr>
         <w:pStyle w:val="Heading2"/>
@@ -11375,8 +12251,8 @@
       </w:pPr>
       <w:r>
         <w:rPr>
+          <w:bCs/>
           <w:b/>
-          <w:bCs/>
         </w:rPr>
         <w:t xml:space="preserve">A picture read, turned, saved in another format:</w:t>
       </w:r>
@@ -11848,8 +12724,8 @@
       </w:pPr>
       <w:r>
         <w:rPr>
+          <w:bCs/>
           <w:b/>
-          <w:bCs/>
         </w:rPr>
         <w:t xml:space="preserve">Pixels of the program's own, saved:</w:t>
       </w:r>
@@ -12039,8 +12915,8 @@
       </w:pPr>
       <w:r>
         <w:rPr>
+          <w:bCs/>
           <w:b/>
-          <w:bCs/>
         </w:rPr>
         <w:t xml:space="preserve">The formats, asked</w:t>
       </w:r>
@@ -12181,8 +13057,8 @@
         <w:t xml:space="preserve">same header.</w:t>
       </w:r>
     </w:p>
-    <w:bookmarkEnd w:id="42"/>
-    <w:bookmarkStart w:id="43" w:name="X5d555d25266128ff4d9fa5481cdbbe513b622de"/>
+    <w:bookmarkEnd w:id="44"/>
+    <w:bookmarkStart w:id="45" w:name="X5d555d25266128ff4d9fa5481cdbbe513b622de"/>
     <w:p>
       <w:pPr>
         <w:pStyle w:val="Heading2"/>
@@ -12240,8 +13116,8 @@
       </w:pPr>
       <w:r>
         <w:rPr>
+          <w:bCs/>
           <w:b/>
-          <w:bCs/>
         </w:rPr>
         <w:t xml:space="preserve">A sound file</w:t>
       </w:r>
@@ -12458,8 +13334,8 @@
       </w:pPr>
       <w:r>
         <w:rPr>
+          <w:bCs/>
           <w:b/>
-          <w:bCs/>
         </w:rPr>
         <w:t xml:space="preserve">Notes</w:t>
       </w:r>
@@ -12625,8 +13501,8 @@
       </w:pPr>
       <w:r>
         <w:rPr>
+          <w:bCs/>
           <w:b/>
-          <w:bCs/>
         </w:rPr>
         <w:t xml:space="preserve">A sound effect</w:t>
       </w:r>
@@ -12792,8 +13668,8 @@
       </w:pPr>
       <w:r>
         <w:rPr>
+          <w:bCs/>
           <w:b/>
-          <w:bCs/>
         </w:rPr>
         <w:t xml:space="preserve">The program's own samples</w:t>
       </w:r>
@@ -13076,8 +13952,8 @@
         <w:t xml:space="preserve">}</w:t>
       </w:r>
     </w:p>
-    <w:bookmarkEnd w:id="43"/>
-    <w:bookmarkStart w:id="44" w:name="Xfe4ab0ec0802ddea0ccd1e2aa45325e2067bf65"/>
+    <w:bookmarkEnd w:id="45"/>
+    <w:bookmarkStart w:id="46" w:name="Xfe4ab0ec0802ddea0ccd1e2aa45325e2067bf65"/>
     <w:p>
       <w:pPr>
         <w:pStyle w:val="Heading2"/>
@@ -13153,8 +14029,8 @@
       </w:pPr>
       <w:r>
         <w:rPr>
+          <w:bCs/>
           <w:b/>
-          <w:bCs/>
         </w:rPr>
         <w:t xml:space="preserve">Anti-aliased text in a UIKit application</w:t>
       </w:r>
@@ -13599,8 +14475,8 @@
       </w:pPr>
       <w:r>
         <w:rPr>
+          <w:bCs/>
           <w:b/>
-          <w:bCs/>
         </w:rPr>
         <w:t xml:space="preserve">The font manager</w:t>
       </w:r>
@@ -14111,8 +14987,8 @@
         <w:t xml:space="preserve">// in 26.6 units</w:t>
       </w:r>
     </w:p>
-    <w:bookmarkEnd w:id="44"/>
-    <w:bookmarkStart w:id="45" w:name="Xc2f542cdd1b9794d820c6abd4ac9243886c7e6b"/>
+    <w:bookmarkEnd w:id="46"/>
+    <w:bookmarkStart w:id="47" w:name="Xc2f542cdd1b9794d820c6abd4ac9243886c7e6b"/>
     <w:p>
       <w:pPr>
         <w:pStyle w:val="Heading2"/>
@@ -15173,8 +16049,8 @@
         <w:t xml:space="preserve">).</w:t>
       </w:r>
     </w:p>
-    <w:bookmarkEnd w:id="45"/>
-    <w:bookmarkStart w:id="48" w:name="Xf452947779f3bd1a7569ef68ee5cf3beada5d88"/>
+    <w:bookmarkEnd w:id="47"/>
+    <w:bookmarkStart w:id="50" w:name="Xf452947779f3bd1a7569ef68ee5cf3beada5d88"/>
     <w:p>
       <w:pPr>
         <w:pStyle w:val="Heading2"/>
@@ -15189,8 +16065,8 @@
       </w:pPr>
       <w:r>
         <w:rPr>
+          <w:bCs/>
           <w:b/>
-          <w:bCs/>
         </w:rPr>
         <w:t xml:space="preserve">Before writing a helper, look for it in the kits.</w:t>
       </w:r>
@@ -15207,7 +16083,7 @@
         <w:t xml:space="preserve">kit.</w:t>
       </w:r>
     </w:p>
-    <w:bookmarkStart w:id="46" w:name="adding-a-function-to-a-kit"/>
+    <w:bookmarkStart w:id="48" w:name="adding-a-function-to-a-kit"/>
     <w:p>
       <w:pPr>
         <w:pStyle w:val="Heading3"/>
@@ -15218,16 +16094,16 @@
     </w:p>
     <w:p>
       <w:pPr>
-        <w:pStyle w:val="Compact"/>
         <w:numPr>
           <w:ilvl w:val="0"/>
           <w:numId w:val="1003"/>
         </w:numPr>
+        <w:pStyle w:val="Compact"/>
       </w:pPr>
       <w:r>
         <w:rPr>
+          <w:bCs/>
           <w:b/>
-          <w:bCs/>
         </w:rPr>
         <w:t xml:space="preserve">Declare</w:t>
       </w:r>
@@ -15240,16 +16116,16 @@
     </w:p>
     <w:p>
       <w:pPr>
-        <w:pStyle w:val="Compact"/>
         <w:numPr>
           <w:ilvl w:val="0"/>
           <w:numId w:val="1003"/>
         </w:numPr>
+        <w:pStyle w:val="Compact"/>
       </w:pPr>
       <w:r>
         <w:rPr>
+          <w:bCs/>
           <w:b/>
-          <w:bCs/>
         </w:rPr>
         <w:t xml:space="preserve">Write its code</w:t>
       </w:r>
@@ -15289,16 +16165,16 @@
     </w:p>
     <w:p>
       <w:pPr>
-        <w:pStyle w:val="Compact"/>
         <w:numPr>
           <w:ilvl w:val="0"/>
           <w:numId w:val="1003"/>
         </w:numPr>
+        <w:pStyle w:val="Compact"/>
       </w:pPr>
       <w:r>
         <w:rPr>
+          <w:bCs/>
           <w:b/>
-          <w:bCs/>
         </w:rPr>
         <w:t xml:space="preserve">Build</w:t>
       </w:r>
@@ -15335,16 +16211,16 @@
     </w:p>
     <w:p>
       <w:pPr>
-        <w:pStyle w:val="Compact"/>
         <w:numPr>
           <w:ilvl w:val="0"/>
           <w:numId w:val="1003"/>
         </w:numPr>
+        <w:pStyle w:val="Compact"/>
       </w:pPr>
       <w:r>
         <w:rPr>
+          <w:bCs/>
           <w:b/>
-          <w:bCs/>
         </w:rPr>
         <w:t xml:space="preserve">Raise the package's version</w:t>
       </w:r>
@@ -15408,16 +16284,16 @@
     </w:p>
     <w:p>
       <w:pPr>
-        <w:pStyle w:val="Compact"/>
         <w:numPr>
           <w:ilvl w:val="0"/>
           <w:numId w:val="1003"/>
         </w:numPr>
+        <w:pStyle w:val="Compact"/>
       </w:pPr>
       <w:r>
         <w:rPr>
+          <w:bCs/>
           <w:b/>
-          <w:bCs/>
         </w:rPr>
         <w:t xml:space="preserve">Document</w:t>
       </w:r>
@@ -15461,8 +16337,8 @@
         <w:t xml:space="preserve">.</w:t>
       </w:r>
     </w:p>
-    <w:bookmarkEnd w:id="46"/>
-    <w:bookmarkStart w:id="47" w:name="creating-a-kit"/>
+    <w:bookmarkEnd w:id="48"/>
+    <w:bookmarkStart w:id="49" w:name="creating-a-kit"/>
     <w:p>
       <w:pPr>
         <w:pStyle w:val="Heading3"/>
@@ -15481,11 +16357,11 @@
     </w:p>
     <w:p>
       <w:pPr>
-        <w:pStyle w:val="Compact"/>
         <w:numPr>
           <w:ilvl w:val="0"/>
           <w:numId w:val="1004"/>
         </w:numPr>
+        <w:pStyle w:val="Compact"/>
       </w:pPr>
       <w:r>
         <w:t xml:space="preserve">a folder</w:t>
@@ -15507,23 +16383,23 @@
       </w:r>
       <w:r>
         <w:rPr>
+          <w:bCs/>
           <w:b/>
+        </w:rPr>
+        <w:t xml:space="preserve">one header a program includes,</w:t>
+      </w:r>
+      <w:r>
+        <w:rPr>
           <w:bCs/>
-        </w:rPr>
-        <w:t xml:space="preserve">one header a program includes,</w:t>
-      </w:r>
-      <w:r>
-        <w:rPr>
           <w:b/>
+        </w:rPr>
+        <w:t xml:space="preserve"> </w:t>
+      </w:r>
+      <w:r>
+        <w:rPr>
+          <w:rStyle w:val="VerbatimChar"/>
           <w:bCs/>
-        </w:rPr>
-        <w:t xml:space="preserve"> </w:t>
-      </w:r>
-      <w:r>
-        <w:rPr>
-          <w:rStyle w:val="VerbatimChar"/>
           <w:b/>
-          <w:bCs/>
         </w:rPr>
         <w:t xml:space="preserve">&lt;kit&gt;/&lt;kit&gt;.h</w:t>
       </w:r>
@@ -15587,11 +16463,11 @@
     </w:p>
     <w:p>
       <w:pPr>
-        <w:pStyle w:val="Compact"/>
         <w:numPr>
           <w:ilvl w:val="0"/>
           <w:numId w:val="1004"/>
         </w:numPr>
+        <w:pStyle w:val="Compact"/>
       </w:pPr>
       <w:r>
         <w:t xml:space="preserve">its rules in</w:t>
@@ -15662,11 +16538,11 @@
     </w:p>
     <w:p>
       <w:pPr>
-        <w:pStyle w:val="Compact"/>
         <w:numPr>
           <w:ilvl w:val="0"/>
           <w:numId w:val="1004"/>
         </w:numPr>
+        <w:pStyle w:val="Compact"/>
       </w:pPr>
       <w:r>
         <w:t xml:space="preserve">its package in</w:t>
@@ -15736,8 +16612,8 @@
       </w:r>
       <w:r>
         <w:rPr>
+          <w:iCs/>
           <w:i/>
-          <w:iCs/>
         </w:rPr>
         <w:t xml:space="preserve">From BASIC</w:t>
       </w:r>
@@ -15756,9 +16632,9 @@
         <w:t xml:space="preserve">The header of a kit a C program may use is written in C.</w:t>
       </w:r>
     </w:p>
-    <w:bookmarkEnd w:id="47"/>
-    <w:bookmarkEnd w:id="48"/>
-    <w:bookmarkStart w:id="49" w:name="X727ca5ffb7cfa954933197d729c7f04b3404e24"/>
+    <w:bookmarkEnd w:id="49"/>
+    <w:bookmarkEnd w:id="50"/>
+    <w:bookmarkStart w:id="51" w:name="X727ca5ffb7cfa954933197d729c7f04b3404e24"/>
     <w:p>
       <w:pPr>
         <w:pStyle w:val="Heading2"/>
@@ -15772,6 +16648,7 @@
         <w:tblStyle w:val="Table"/>
         <w:tblW w:type="auto" w:w="0"/>
         <w:tblLook w:firstRow="1" w:lastRow="0" w:firstColumn="0" w:lastColumn="0" w:noHBand="0" w:noVBand="0" w:val="0020"/>
+        <w:jc w:val="start"/>
       </w:tblPr>
       <w:tblGrid>
         <w:gridCol w:w="2640"/>
@@ -15780,13 +16657,14 @@
       </w:tblGrid>
       <w:tr>
         <w:trPr>
-          <w:tblHeader w:val="on"/>
+          <w:tblHeader w:val="true"/>
         </w:trPr>
         <w:tc>
           <w:tcPr/>
           <w:p>
             <w:pPr>
               <w:pStyle w:val="Compact"/>
+              <w:jc w:val="left"/>
             </w:pPr>
             <w:r>
               <w:t xml:space="preserve">I want to…</w:t>
@@ -15798,6 +16676,7 @@
           <w:p>
             <w:pPr>
               <w:pStyle w:val="Compact"/>
+              <w:jc w:val="left"/>
             </w:pPr>
             <w:r>
               <w:t xml:space="preserve">Kit</w:t>
@@ -15809,6 +16688,7 @@
           <w:p>
             <w:pPr>
               <w:pStyle w:val="Compact"/>
+              <w:jc w:val="left"/>
             </w:pPr>
             <w:r>
               <w:t xml:space="preserve">Call</w:t>
@@ -15822,6 +16702,7 @@
           <w:p>
             <w:pPr>
               <w:pStyle w:val="Compact"/>
+              <w:jc w:val="left"/>
             </w:pPr>
             <w:r>
               <w:t xml:space="preserve">read or write a file</w:t>
@@ -15833,6 +16714,7 @@
           <w:p>
             <w:pPr>
               <w:pStyle w:val="Compact"/>
+              <w:jc w:val="left"/>
             </w:pPr>
             <w:r>
               <w:t xml:space="preserve">AppKit</w:t>
@@ -15844,6 +16726,7 @@
           <w:p>
             <w:pPr>
               <w:pStyle w:val="Compact"/>
+              <w:jc w:val="left"/>
             </w:pPr>
             <w:r>
               <w:rPr>
@@ -15884,6 +16767,7 @@
           <w:p>
             <w:pPr>
               <w:pStyle w:val="Compact"/>
+              <w:jc w:val="left"/>
             </w:pPr>
             <w:r>
               <w:t xml:space="preserve">load a whole file in memory</w:t>
@@ -15895,6 +16779,7 @@
           <w:p>
             <w:pPr>
               <w:pStyle w:val="Compact"/>
+              <w:jc w:val="left"/>
             </w:pPr>
             <w:r>
               <w:t xml:space="preserve">FileKit</w:t>
@@ -15906,6 +16791,7 @@
           <w:p>
             <w:pPr>
               <w:pStyle w:val="Compact"/>
+              <w:jc w:val="left"/>
             </w:pPr>
             <w:r>
               <w:rPr>
@@ -15934,6 +16820,7 @@
           <w:p>
             <w:pPr>
               <w:pStyle w:val="Compact"/>
+              <w:jc w:val="left"/>
             </w:pPr>
             <w:r>
               <w:t xml:space="preserve">copy or remove a folder</w:t>
@@ -15945,6 +16832,7 @@
           <w:p>
             <w:pPr>
               <w:pStyle w:val="Compact"/>
+              <w:jc w:val="left"/>
             </w:pPr>
             <w:r>
               <w:t xml:space="preserve">FileKit</w:t>
@@ -15956,6 +16844,7 @@
           <w:p>
             <w:pPr>
               <w:pStyle w:val="Compact"/>
+              <w:jc w:val="left"/>
             </w:pPr>
             <w:r>
               <w:rPr>
@@ -15984,6 +16873,7 @@
           <w:p>
             <w:pPr>
               <w:pStyle w:val="Compact"/>
+              <w:jc w:val="left"/>
             </w:pPr>
             <w:r>
               <w:t xml:space="preserve">build a path</w:t>
@@ -15995,6 +16885,7 @@
           <w:p>
             <w:pPr>
               <w:pStyle w:val="Compact"/>
+              <w:jc w:val="left"/>
             </w:pPr>
             <w:r>
               <w:t xml:space="preserve">FileKit</w:t>
@@ -16006,6 +16897,7 @@
           <w:p>
             <w:pPr>
               <w:pStyle w:val="Compact"/>
+              <w:jc w:val="left"/>
             </w:pPr>
             <w:r>
               <w:rPr>
@@ -16034,6 +16926,7 @@
           <w:p>
             <w:pPr>
               <w:pStyle w:val="Compact"/>
+              <w:jc w:val="left"/>
             </w:pPr>
             <w:r>
               <w:t xml:space="preserve">read or write a ZIP</w:t>
@@ -16045,6 +16938,7 @@
           <w:p>
             <w:pPr>
               <w:pStyle w:val="Compact"/>
+              <w:jc w:val="left"/>
             </w:pPr>
             <w:r>
               <w:t xml:space="preserve">FileKit</w:t>
@@ -16056,6 +16950,7 @@
           <w:p>
             <w:pPr>
               <w:pStyle w:val="Compact"/>
+              <w:jc w:val="left"/>
             </w:pPr>
             <w:r>
               <w:rPr>
@@ -16084,6 +16979,7 @@
           <w:p>
             <w:pPr>
               <w:pStyle w:val="Compact"/>
+              <w:jc w:val="left"/>
             </w:pPr>
             <w:r>
               <w:t xml:space="preserve">print to the console</w:t>
@@ -16095,6 +16991,7 @@
           <w:p>
             <w:pPr>
               <w:pStyle w:val="Compact"/>
+              <w:jc w:val="left"/>
             </w:pPr>
             <w:r>
               <w:t xml:space="preserve">AppKit</w:t>
@@ -16106,6 +17003,7 @@
           <w:p>
             <w:pPr>
               <w:pStyle w:val="Compact"/>
+              <w:jc w:val="left"/>
             </w:pPr>
             <w:r>
               <w:rPr>
@@ -16134,6 +17032,7 @@
           <w:p>
             <w:pPr>
               <w:pStyle w:val="Compact"/>
+              <w:jc w:val="left"/>
             </w:pPr>
             <w:r>
               <w:t xml:space="preserve">read an</w:t>
@@ -16160,6 +17059,7 @@
           <w:p>
             <w:pPr>
               <w:pStyle w:val="Compact"/>
+              <w:jc w:val="left"/>
             </w:pPr>
             <w:r>
               <w:t xml:space="preserve">AppKit</w:t>
@@ -16171,6 +17071,7 @@
           <w:p>
             <w:pPr>
               <w:pStyle w:val="Compact"/>
+              <w:jc w:val="left"/>
             </w:pPr>
             <w:r>
               <w:rPr>
@@ -16199,6 +17100,7 @@
           <w:p>
             <w:pPr>
               <w:pStyle w:val="Compact"/>
+              <w:jc w:val="left"/>
             </w:pPr>
             <w:r>
               <w:t xml:space="preserve">start another program</w:t>
@@ -16210,6 +17112,7 @@
           <w:p>
             <w:pPr>
               <w:pStyle w:val="Compact"/>
+              <w:jc w:val="left"/>
             </w:pPr>
             <w:r>
               <w:t xml:space="preserve">AppKit</w:t>
@@ -16221,6 +17124,7 @@
           <w:p>
             <w:pPr>
               <w:pStyle w:val="Compact"/>
+              <w:jc w:val="left"/>
             </w:pPr>
             <w:r>
               <w:rPr>
@@ -16249,6 +17153,7 @@
           <w:p>
             <w:pPr>
               <w:pStyle w:val="Compact"/>
+              <w:jc w:val="left"/>
             </w:pPr>
             <w:r>
               <w:t xml:space="preserve">open a window with widgets</w:t>
@@ -16260,6 +17165,7 @@
           <w:p>
             <w:pPr>
               <w:pStyle w:val="Compact"/>
+              <w:jc w:val="left"/>
             </w:pPr>
             <w:r>
               <w:t xml:space="preserve">UIKit</w:t>
@@ -16271,6 +17177,7 @@
           <w:p>
             <w:pPr>
               <w:pStyle w:val="Compact"/>
+              <w:jc w:val="left"/>
             </w:pPr>
             <w:r>
               <w:rPr>
@@ -16314,6 +17221,7 @@
           <w:p>
             <w:pPr>
               <w:pStyle w:val="Compact"/>
+              <w:jc w:val="left"/>
             </w:pPr>
             <w:r>
               <w:t xml:space="preserve">ask the user (message, file, colour)</w:t>
@@ -16325,6 +17233,7 @@
           <w:p>
             <w:pPr>
               <w:pStyle w:val="Compact"/>
+              <w:jc w:val="left"/>
             </w:pPr>
             <w:r>
               <w:t xml:space="preserve">UIKit</w:t>
@@ -16336,6 +17245,7 @@
           <w:p>
             <w:pPr>
               <w:pStyle w:val="Compact"/>
+              <w:jc w:val="left"/>
             </w:pPr>
             <w:r>
               <w:rPr>
@@ -16376,6 +17286,7 @@
           <w:p>
             <w:pPr>
               <w:pStyle w:val="Compact"/>
+              <w:jc w:val="left"/>
             </w:pPr>
             <w:r>
               <w:t xml:space="preserve">load an icon</w:t>
@@ -16387,6 +17298,7 @@
           <w:p>
             <w:pPr>
               <w:pStyle w:val="Compact"/>
+              <w:jc w:val="left"/>
             </w:pPr>
             <w:r>
               <w:t xml:space="preserve">UIKit</w:t>
@@ -16398,6 +17310,7 @@
           <w:p>
             <w:pPr>
               <w:pStyle w:val="Compact"/>
+              <w:jc w:val="left"/>
             </w:pPr>
             <w:r>
               <w:rPr>
@@ -16414,6 +17327,7 @@
           <w:p>
             <w:pPr>
               <w:pStyle w:val="Compact"/>
+              <w:jc w:val="left"/>
             </w:pPr>
             <w:r>
               <w:t xml:space="preserve">show a notification</w:t>
@@ -16425,6 +17339,7 @@
           <w:p>
             <w:pPr>
               <w:pStyle w:val="Compact"/>
+              <w:jc w:val="left"/>
             </w:pPr>
             <w:r>
               <w:t xml:space="preserve">SystemKit</w:t>
@@ -16436,6 +17351,7 @@
           <w:p>
             <w:pPr>
               <w:pStyle w:val="Compact"/>
+              <w:jc w:val="left"/>
             </w:pPr>
             <w:r>
               <w:rPr>
@@ -16464,6 +17380,7 @@
           <w:p>
             <w:pPr>
               <w:pStyle w:val="Compact"/>
+              <w:jc w:val="left"/>
             </w:pPr>
             <w:r>
               <w:t xml:space="preserve">copy / paste</w:t>
@@ -16475,6 +17392,7 @@
           <w:p>
             <w:pPr>
               <w:pStyle w:val="Compact"/>
+              <w:jc w:val="left"/>
             </w:pPr>
             <w:r>
               <w:t xml:space="preserve">SystemKit</w:t>
@@ -16486,6 +17404,7 @@
           <w:p>
             <w:pPr>
               <w:pStyle w:val="Compact"/>
+              <w:jc w:val="left"/>
             </w:pPr>
             <w:r>
               <w:rPr>
@@ -16514,6 +17433,7 @@
           <w:p>
             <w:pPr>
               <w:pStyle w:val="Compact"/>
+              <w:jc w:val="left"/>
             </w:pPr>
             <w:r>
               <w:t xml:space="preserve">move a file to the trash</w:t>
@@ -16525,6 +17445,7 @@
           <w:p>
             <w:pPr>
               <w:pStyle w:val="Compact"/>
+              <w:jc w:val="left"/>
             </w:pPr>
             <w:r>
               <w:t xml:space="preserve">SystemKit</w:t>
@@ -16536,6 +17457,7 @@
           <w:p>
             <w:pPr>
               <w:pStyle w:val="Compact"/>
+              <w:jc w:val="left"/>
             </w:pPr>
             <w:r>
               <w:rPr>
@@ -16552,6 +17474,7 @@
           <w:p>
             <w:pPr>
               <w:pStyle w:val="Compact"/>
+              <w:jc w:val="left"/>
             </w:pPr>
             <w:r>
               <w:t xml:space="preserve">open a file with its application</w:t>
@@ -16563,6 +17486,7 @@
           <w:p>
             <w:pPr>
               <w:pStyle w:val="Compact"/>
+              <w:jc w:val="left"/>
             </w:pPr>
             <w:r>
               <w:t xml:space="preserve">SystemKit</w:t>
@@ -16574,6 +17498,7 @@
           <w:p>
             <w:pPr>
               <w:pStyle w:val="Compact"/>
+              <w:jc w:val="left"/>
             </w:pPr>
             <w:r>
               <w:rPr>
@@ -16590,6 +17515,7 @@
           <w:p>
             <w:pPr>
               <w:pStyle w:val="Compact"/>
+              <w:jc w:val="left"/>
             </w:pPr>
             <w:r>
               <w:t xml:space="preserve">fetch a web page</w:t>
@@ -16601,6 +17527,7 @@
           <w:p>
             <w:pPr>
               <w:pStyle w:val="Compact"/>
+              <w:jc w:val="left"/>
             </w:pPr>
             <w:r>
               <w:t xml:space="preserve">NetKit</w:t>
@@ -16612,6 +17539,7 @@
           <w:p>
             <w:pPr>
               <w:pStyle w:val="Compact"/>
+              <w:jc w:val="left"/>
             </w:pPr>
             <w:r>
               <w:rPr>
@@ -16640,6 +17568,7 @@
           <w:p>
             <w:pPr>
               <w:pStyle w:val="Compact"/>
+              <w:jc w:val="left"/>
             </w:pPr>
             <w:r>
               <w:t xml:space="preserve">reach an FTP server</w:t>
@@ -16651,6 +17580,7 @@
           <w:p>
             <w:pPr>
               <w:pStyle w:val="Compact"/>
+              <w:jc w:val="left"/>
             </w:pPr>
             <w:r>
               <w:t xml:space="preserve">NetKit</w:t>
@@ -16662,6 +17592,7 @@
           <w:p>
             <w:pPr>
               <w:pStyle w:val="Compact"/>
+              <w:jc w:val="left"/>
             </w:pPr>
             <w:r>
               <w:rPr>
@@ -16696,6 +17627,7 @@
           <w:p>
             <w:pPr>
               <w:pStyle w:val="Compact"/>
+              <w:jc w:val="left"/>
             </w:pPr>
             <w:r>
               <w:t xml:space="preserve">load or save a picture</w:t>
@@ -16707,6 +17639,7 @@
           <w:p>
             <w:pPr>
               <w:pStyle w:val="Compact"/>
+              <w:jc w:val="left"/>
             </w:pPr>
             <w:r>
               <w:t xml:space="preserve">ImageKit</w:t>
@@ -16718,6 +17651,7 @@
           <w:p>
             <w:pPr>
               <w:pStyle w:val="Compact"/>
+              <w:jc w:val="left"/>
             </w:pPr>
             <w:r>
               <w:rPr>
@@ -16746,6 +17680,7 @@
           <w:p>
             <w:pPr>
               <w:pStyle w:val="Compact"/>
+              <w:jc w:val="left"/>
             </w:pPr>
             <w:r>
               <w:t xml:space="preserve">resize or turn a picture</w:t>
@@ -16757,6 +17692,7 @@
           <w:p>
             <w:pPr>
               <w:pStyle w:val="Compact"/>
+              <w:jc w:val="left"/>
             </w:pPr>
             <w:r>
               <w:t xml:space="preserve">ImageKit</w:t>
@@ -16768,6 +17704,7 @@
           <w:p>
             <w:pPr>
               <w:pStyle w:val="Compact"/>
+              <w:jc w:val="left"/>
             </w:pPr>
             <w:r>
               <w:rPr>
@@ -16796,6 +17733,7 @@
           <w:p>
             <w:pPr>
               <w:pStyle w:val="Compact"/>
+              <w:jc w:val="left"/>
             </w:pPr>
             <w:r>
               <w:t xml:space="preserve">play a sound file</w:t>
@@ -16807,6 +17745,7 @@
           <w:p>
             <w:pPr>
               <w:pStyle w:val="Compact"/>
+              <w:jc w:val="left"/>
             </w:pPr>
             <w:r>
               <w:t xml:space="preserve">AudioKit</w:t>
@@ -16818,6 +17757,7 @@
           <w:p>
             <w:pPr>
               <w:pStyle w:val="Compact"/>
+              <w:jc w:val="left"/>
             </w:pPr>
             <w:r>
               <w:rPr>
@@ -16834,6 +17774,7 @@
           <w:p>
             <w:pPr>
               <w:pStyle w:val="Compact"/>
+              <w:jc w:val="left"/>
             </w:pPr>
             <w:r>
               <w:t xml:space="preserve">play a note or an effect</w:t>
@@ -16845,6 +17786,7 @@
           <w:p>
             <w:pPr>
               <w:pStyle w:val="Compact"/>
+              <w:jc w:val="left"/>
             </w:pPr>
             <w:r>
               <w:t xml:space="preserve">AudioKit</w:t>
@@ -16856,6 +17798,7 @@
           <w:p>
             <w:pPr>
               <w:pStyle w:val="Compact"/>
+              <w:jc w:val="left"/>
             </w:pPr>
             <w:r>
               <w:rPr>
@@ -16884,6 +17827,7 @@
           <w:p>
             <w:pPr>
               <w:pStyle w:val="Compact"/>
+              <w:jc w:val="left"/>
             </w:pPr>
             <w:r>
               <w:t xml:space="preserve">send samples to the output</w:t>
@@ -16895,6 +17839,7 @@
           <w:p>
             <w:pPr>
               <w:pStyle w:val="Compact"/>
+              <w:jc w:val="left"/>
             </w:pPr>
             <w:r>
               <w:t xml:space="preserve">AudioKit</w:t>
@@ -16906,6 +17851,7 @@
           <w:p>
             <w:pPr>
               <w:pStyle w:val="Compact"/>
+              <w:jc w:val="left"/>
             </w:pPr>
             <w:r>
               <w:rPr>
@@ -16934,6 +17880,7 @@
           <w:p>
             <w:pPr>
               <w:pStyle w:val="Compact"/>
+              <w:jc w:val="left"/>
             </w:pPr>
             <w:r>
               <w:t xml:space="preserve">draw smooth text</w:t>
@@ -16945,6 +17892,7 @@
           <w:p>
             <w:pPr>
               <w:pStyle w:val="Compact"/>
+              <w:jc w:val="left"/>
             </w:pPr>
             <w:r>
               <w:t xml:space="preserve">FontKit</w:t>
@@ -16956,6 +17904,7 @@
           <w:p>
             <w:pPr>
               <w:pStyle w:val="Compact"/>
+              <w:jc w:val="left"/>
             </w:pPr>
             <w:r>
               <w:rPr>
@@ -16984,6 +17933,7 @@
           <w:p>
             <w:pPr>
               <w:pStyle w:val="Compact"/>
+              <w:jc w:val="left"/>
             </w:pPr>
             <w:r>
               <w:t xml:space="preserve">print</w:t>
@@ -16995,6 +17945,7 @@
           <w:p>
             <w:pPr>
               <w:pStyle w:val="Compact"/>
+              <w:jc w:val="left"/>
             </w:pPr>
             <w:r>
               <w:t xml:space="preserve">PrinterKit</w:t>
@@ -17006,6 +17957,7 @@
           <w:p>
             <w:pPr>
               <w:pStyle w:val="Compact"/>
+              <w:jc w:val="left"/>
             </w:pPr>
             <w:r>
               <w:rPr>
@@ -17053,7 +18005,7 @@
         </w:tc>
       </w:tr>
     </w:tbl>
-    <w:bookmarkEnd w:id="49"/>
+    <w:bookmarkEnd w:id="51"/>
     <w:sectPr>
       <w:footerReference r:id="rId9" w:type="default"/>
       <w:footnotePr>
@@ -17135,14 +18087,14 @@
 <file path=word/numbering.xml><?xml version="1.0" encoding="utf-8"?>
 <w:numbering xmlns:w="http://schemas.openxmlformats.org/wordprocessingml/2006/main">
   <w:abstractNum w:abstractNumId="990">
-    <w:nsid w:val="0000A990"/>
+    <w:nsid w:val="A990"/>
     <w:multiLevelType w:val="multilevel"/>
     <w:lvl w:ilvl="0">
       <w:numFmt w:val="bullet"/>
       <w:lvlText w:val=" "/>
       <w:lvlJc w:val="left"/>
       <w:pPr>
-        <w:ind w:left="720" w:hanging="360"/>
+        <w:ind w:left="720" w:hanging="480"/>
       </w:pPr>
     </w:lvl>
     <w:lvl w:ilvl="1">
@@ -17150,7 +18102,7 @@
       <w:lvlText w:val=" "/>
       <w:lvlJc w:val="left"/>
       <w:pPr>
-        <w:ind w:left="1440" w:hanging="360"/>
+        <w:ind w:left="1440" w:hanging="480"/>
       </w:pPr>
     </w:lvl>
     <w:lvl w:ilvl="2">
@@ -17158,7 +18110,7 @@
       <w:lvlText w:val=" "/>
       <w:lvlJc w:val="left"/>
       <w:pPr>
-        <w:ind w:left="2160" w:hanging="360"/>
+        <w:ind w:left="2160" w:hanging="480"/>
       </w:pPr>
     </w:lvl>
     <w:lvl w:ilvl="3">
@@ -17166,7 +18118,7 @@
       <w:lvlText w:val=" "/>
       <w:lvlJc w:val="left"/>
       <w:pPr>
-        <w:ind w:left="2880" w:hanging="360"/>
+        <w:ind w:left="2880" w:hanging="480"/>
       </w:pPr>
     </w:lvl>
     <w:lvl w:ilvl="4">
@@ -17174,7 +18126,7 @@
       <w:lvlText w:val=" "/>
       <w:lvlJc w:val="left"/>
       <w:pPr>
-        <w:ind w:left="3600" w:hanging="360"/>
+        <w:ind w:left="3600" w:hanging="480"/>
       </w:pPr>
     </w:lvl>
     <w:lvl w:ilvl="5">
@@ -17182,7 +18134,7 @@
       <w:lvlText w:val=" "/>
       <w:lvlJc w:val="left"/>
       <w:pPr>
-        <w:ind w:left="4320" w:hanging="360"/>
+        <w:ind w:left="4320" w:hanging="480"/>
       </w:pPr>
     </w:lvl>
     <w:lvl w:ilvl="6">
@@ -17190,7 +18142,7 @@
       <w:lvlText w:val=" "/>
       <w:lvlJc w:val="left"/>
       <w:pPr>
-        <w:ind w:left="5040" w:hanging="360"/>
+        <w:ind w:left="5040" w:hanging="480"/>
       </w:pPr>
     </w:lvl>
     <w:lvl w:ilvl="7">
@@ -17198,7 +18150,7 @@
       <w:lvlText w:val=" "/>
       <w:lvlJc w:val="left"/>
       <w:pPr>
-        <w:ind w:left="5760" w:hanging="360"/>
+        <w:ind w:left="5760" w:hanging="480"/>
       </w:pPr>
     </w:lvl>
     <w:lvl w:ilvl="8">
@@ -17206,12 +18158,12 @@
       <w:lvlText w:val=" "/>
       <w:lvlJc w:val="left"/>
       <w:pPr>
-        <w:ind w:left="6480" w:hanging="360"/>
+        <w:ind w:left="6480" w:hanging="480"/>
       </w:pPr>
     </w:lvl>
   </w:abstractNum>
   <w:abstractNum w:abstractNumId="99411">
-    <w:nsid w:val="00A99411"/>
+    <w:nsid w:val="A99411"/>
     <w:multiLevelType w:val="multilevel"/>
     <w:lvl w:ilvl="0">
       <w:start w:val="1"/>
@@ -17219,7 +18171,7 @@
       <w:lvlText w:val="%1."/>
       <w:lvlJc w:val="left"/>
       <w:pPr>
-        <w:ind w:left="720" w:hanging="360"/>
+        <w:ind w:left="720" w:hanging="480"/>
       </w:pPr>
     </w:lvl>
     <w:lvl w:ilvl="1">
@@ -17228,7 +18180,7 @@
       <w:lvlText w:val="%2."/>
       <w:lvlJc w:val="left"/>
       <w:pPr>
-        <w:ind w:left="1440" w:hanging="360"/>
+        <w:ind w:left="1440" w:hanging="480"/>
       </w:pPr>
     </w:lvl>
     <w:lvl w:ilvl="2">
@@ -17237,7 +18189,7 @@
       <w:lvlText w:val="%3."/>
       <w:lvlJc w:val="left"/>
       <w:pPr>
-        <w:ind w:left="2160" w:hanging="360"/>
+        <w:ind w:left="2160" w:hanging="480"/>
       </w:pPr>
     </w:lvl>
     <w:lvl w:ilvl="3">
@@ -17246,7 +18198,7 @@
       <w:lvlText w:val="%4."/>
       <w:lvlJc w:val="left"/>
       <w:pPr>
-        <w:ind w:left="2880" w:hanging="360"/>
+        <w:ind w:left="2880" w:hanging="480"/>
       </w:pPr>
     </w:lvl>
     <w:lvl w:ilvl="4">
@@ -17255,7 +18207,7 @@
       <w:lvlText w:val="%5."/>
       <w:lvlJc w:val="left"/>
       <w:pPr>
-        <w:ind w:left="3600" w:hanging="360"/>
+        <w:ind w:left="3600" w:hanging="480"/>
       </w:pPr>
     </w:lvl>
     <w:lvl w:ilvl="5">
@@ -17264,7 +18216,7 @@
       <w:lvlText w:val="%6."/>
       <w:lvlJc w:val="left"/>
       <w:pPr>
-        <w:ind w:left="4320" w:hanging="360"/>
+        <w:ind w:left="4320" w:hanging="480"/>
       </w:pPr>
     </w:lvl>
     <w:lvl w:ilvl="6">
@@ -17273,7 +18225,7 @@
       <w:lvlText w:val="%7."/>
       <w:lvlJc w:val="left"/>
       <w:pPr>
-        <w:ind w:left="5040" w:hanging="360"/>
+        <w:ind w:left="5040" w:hanging="480"/>
       </w:pPr>
     </w:lvl>
     <w:lvl w:ilvl="7">
@@ -17282,7 +18234,7 @@
       <w:lvlText w:val="%8."/>
       <w:lvlJc w:val="left"/>
       <w:pPr>
-        <w:ind w:left="5760" w:hanging="360"/>
+        <w:ind w:left="5760" w:hanging="480"/>
       </w:pPr>
     </w:lvl>
     <w:lvl w:ilvl="8">
@@ -17291,111 +18243,84 @@
       <w:lvlText w:val="%9."/>
       <w:lvlJc w:val="left"/>
       <w:pPr>
-        <w:ind w:left="6480" w:hanging="360"/>
+        <w:ind w:left="6480" w:hanging="480"/>
       </w:pPr>
     </w:lvl>
   </w:abstractNum>
   <w:abstractNum w:abstractNumId="991">
-    <w:nsid w:val="0000A991"/>
+    <w:nsid w:val="A991"/>
     <w:multiLevelType w:val="multilevel"/>
     <w:lvl w:ilvl="0">
       <w:numFmt w:val="bullet"/>
-      <w:lvlText w:val=""/>
+      <w:lvlText w:val="•"/>
       <w:lvlJc w:val="left"/>
       <w:pPr>
-        <w:ind w:left="720" w:hanging="360"/>
+        <w:ind w:left="720" w:hanging="480"/>
       </w:pPr>
-      <w:rPr>
-        <w:rFonts w:ascii="Symbol" w:hAnsi="Symbol" w:cs="Symbol" w:hint="default"/>
-      </w:rPr>
     </w:lvl>
     <w:lvl w:ilvl="1">
       <w:numFmt w:val="bullet"/>
-      <w:lvlText w:val="o"/>
+      <w:lvlText w:val="–"/>
       <w:lvlJc w:val="left"/>
       <w:pPr>
-        <w:ind w:left="1440" w:hanging="360"/>
+        <w:ind w:left="1440" w:hanging="480"/>
       </w:pPr>
-      <w:rPr>
-        <w:rFonts w:ascii="Courier New" w:hAnsi="Courier New" w:cs="Courier New" w:hint="default"/>
-      </w:rPr>
     </w:lvl>
     <w:lvl w:ilvl="2">
       <w:numFmt w:val="bullet"/>
-      <w:lvlText w:val=""/>
+      <w:lvlText w:val="•"/>
       <w:lvlJc w:val="left"/>
       <w:pPr>
-        <w:ind w:left="2160" w:hanging="360"/>
+        <w:ind w:left="2160" w:hanging="480"/>
       </w:pPr>
-      <w:rPr>
-        <w:rFonts w:ascii="Wingdings" w:hAnsi="Wingdings" w:cs="Wingdings" w:hint="default"/>
-      </w:rPr>
     </w:lvl>
     <w:lvl w:ilvl="3">
       <w:numFmt w:val="bullet"/>
-      <w:lvlText w:val=""/>
+      <w:lvlText w:val="–"/>
       <w:lvlJc w:val="left"/>
       <w:pPr>
-        <w:ind w:left="2880" w:hanging="360"/>
+        <w:ind w:left="2880" w:hanging="480"/>
       </w:pPr>
-      <w:rPr>
-        <w:rFonts w:ascii="Symbol" w:hAnsi="Symbol" w:cs="Symbol" w:hint="default"/>
-      </w:rPr>
     </w:lvl>
     <w:lvl w:ilvl="4">
       <w:numFmt w:val="bullet"/>
-      <w:lvlText w:val="o"/>
+      <w:lvlText w:val="•"/>
       <w:lvlJc w:val="left"/>
       <w:pPr>
-        <w:ind w:left="3600" w:hanging="360"/>
+        <w:ind w:left="3600" w:hanging="480"/>
       </w:pPr>
-      <w:rPr>
-        <w:rFonts w:ascii="Courier New" w:hAnsi="Courier New" w:cs="Courier New" w:hint="default"/>
-      </w:rPr>
     </w:lvl>
     <w:lvl w:ilvl="5">
       <w:numFmt w:val="bullet"/>
-      <w:lvlText w:val=""/>
+      <w:lvlText w:val="–"/>
       <w:lvlJc w:val="left"/>
       <w:pPr>
-        <w:ind w:left="4320" w:hanging="360"/>
+        <w:ind w:left="4320" w:hanging="480"/>
       </w:pPr>
-      <w:rPr>
-        <w:rFonts w:ascii="Wingdings" w:hAnsi="Wingdings" w:cs="Wingdings" w:hint="default"/>
-      </w:rPr>
     </w:lvl>
     <w:lvl w:ilvl="6">
       <w:numFmt w:val="bullet"/>
-      <w:lvlText w:val=""/>
+      <w:lvlText w:val="•"/>
       <w:lvlJc w:val="left"/>
       <w:pPr>
-        <w:ind w:left="5040" w:hanging="360"/>
+        <w:ind w:left="5040" w:hanging="480"/>
       </w:pPr>
-      <w:rPr>
-        <w:rFonts w:ascii="Symbol" w:hAnsi="Symbol" w:cs="Symbol" w:hint="default"/>
-      </w:rPr>
     </w:lvl>
     <w:lvl w:ilvl="7">
       <w:numFmt w:val="bullet"/>
-      <w:lvlText w:val="o"/>
+      <w:lvlText w:val="–"/>
       <w:lvlJc w:val="left"/>
       <w:pPr>
-        <w:ind w:left="5760" w:hanging="360"/>
+        <w:ind w:left="5760" w:hanging="480"/>
       </w:pPr>
-      <w:rPr>
-        <w:rFonts w:ascii="Courier New" w:hAnsi="Courier New" w:cs="Courier New" w:hint="default"/>
-      </w:rPr>
     </w:lvl>
     <w:lvl w:ilvl="8">
       <w:numFmt w:val="bullet"/>
-      <w:lvlText w:val=""/>
+      <w:lvlText w:val="•"/>
       <w:lvlJc w:val="left"/>
       <w:pPr>
-        <w:ind w:left="6480" w:hanging="360"/>
+        <w:ind w:left="6480" w:hanging="480"/>
       </w:pPr>
-      <w:rPr>
-        <w:rFonts w:ascii="Wingdings" w:hAnsi="Wingdings" w:cs="Wingdings" w:hint="default"/>
-      </w:rPr>
     </w:lvl>
   </w:abstractNum>
   <w:num w:numId="1000">
@@ -18168,8 +19093,8 @@
     <w:name w:val="KeywordTok"/>
     <w:basedOn w:val="VerbatimChar"/>
     <w:rPr>
+      <w:color w:val="007020"/>
       <w:b/>
-      <w:color w:val="007020"/>
     </w:rPr>
   </w:style>
   <w:style w:type="character" w:customStyle="1" w:styleId="DataTypeTok">
@@ -18246,42 +19171,42 @@
     <w:name w:val="ImportTok"/>
     <w:basedOn w:val="VerbatimChar"/>
     <w:rPr>
+      <w:color w:val="008000"/>
       <w:b/>
-      <w:color w:val="008000"/>
     </w:rPr>
   </w:style>
   <w:style w:type="character" w:customStyle="1" w:styleId="CommentTok">
     <w:name w:val="CommentTok"/>
     <w:basedOn w:val="VerbatimChar"/>
     <w:rPr>
+      <w:color w:val="60a0b0"/>
       <w:i/>
-      <w:color w:val="60a0b0"/>
     </w:rPr>
   </w:style>
   <w:style w:type="character" w:customStyle="1" w:styleId="DocumentationTok">
     <w:name w:val="DocumentationTok"/>
     <w:basedOn w:val="VerbatimChar"/>
     <w:rPr>
+      <w:color w:val="ba2121"/>
       <w:i/>
-      <w:color w:val="ba2121"/>
     </w:rPr>
   </w:style>
   <w:style w:type="character" w:customStyle="1" w:styleId="AnnotationTok">
     <w:name w:val="AnnotationTok"/>
     <w:basedOn w:val="VerbatimChar"/>
     <w:rPr>
+      <w:color w:val="60a0b0"/>
       <w:b/>
       <w:i/>
-      <w:color w:val="60a0b0"/>
     </w:rPr>
   </w:style>
   <w:style w:type="character" w:customStyle="1" w:styleId="CommentVarTok">
     <w:name w:val="CommentVarTok"/>
     <w:basedOn w:val="VerbatimChar"/>
     <w:rPr>
+      <w:color w:val="60a0b0"/>
       <w:b/>
       <w:i/>
-      <w:color w:val="60a0b0"/>
     </w:rPr>
   </w:style>
   <w:style w:type="character" w:customStyle="1" w:styleId="OtherTok">
@@ -18309,8 +19234,8 @@
     <w:name w:val="ControlFlowTok"/>
     <w:basedOn w:val="VerbatimChar"/>
     <w:rPr>
+      <w:color w:val="007020"/>
       <w:b/>
-      <w:color w:val="007020"/>
     </w:rPr>
   </w:style>
   <w:style w:type="character" w:customStyle="1" w:styleId="OperatorTok">
@@ -18355,34 +19280,34 @@
     <w:name w:val="InformationTok"/>
     <w:basedOn w:val="VerbatimChar"/>
     <w:rPr>
+      <w:color w:val="60a0b0"/>
       <w:b/>
       <w:i/>
-      <w:color w:val="60a0b0"/>
     </w:rPr>
   </w:style>
   <w:style w:type="character" w:customStyle="1" w:styleId="WarningTok">
     <w:name w:val="WarningTok"/>
     <w:basedOn w:val="VerbatimChar"/>
     <w:rPr>
+      <w:color w:val="60a0b0"/>
       <w:b/>
       <w:i/>
-      <w:color w:val="60a0b0"/>
     </w:rPr>
   </w:style>
   <w:style w:type="character" w:customStyle="1" w:styleId="AlertTok">
     <w:name w:val="AlertTok"/>
     <w:basedOn w:val="VerbatimChar"/>
     <w:rPr>
+      <w:color w:val="ff0000"/>
       <w:b/>
-      <w:color w:val="ff0000"/>
     </w:rPr>
   </w:style>
   <w:style w:type="character" w:customStyle="1" w:styleId="ErrorTok">
     <w:name w:val="ErrorTok"/>
     <w:basedOn w:val="VerbatimChar"/>
     <w:rPr>
+      <w:color w:val="ff0000"/>
       <w:b/>
-      <w:color w:val="ff0000"/>
     </w:rPr>
   </w:style>
   <w:style w:type="character" w:customStyle="1" w:styleId="NormalTok">

</xml_diff>

<commit_message>
AutoDev round 1, step 8: docs exports regenerated (python docs/build_docs.py; PDFs by LibreOffice)
Co-Authored-By: Claude Opus 5.5 <noreply@anthropic.com>
Claude-Session: https://claude.ai/code/session_0145mF2U9pqHyxBku3qqCUbZ
</commit_message>
<xml_diff>
--- a/docs/exports/06-KITS-GUIDE.docx
+++ b/docs/exports/06-KITS-GUIDE.docx
@@ -7755,6 +7755,1067 @@
           <w:bCs/>
           <w:b/>
         </w:rPr>
+        <w:t xml:space="preserve">Text in an owner-drawn widget</w:t>
+      </w:r>
+      <w:r>
+        <w:t xml:space="preserve"> </w:t>
+      </w:r>
+      <w:r>
+        <w:t xml:space="preserve">(</w:t>
+      </w:r>
+      <w:r>
+        <w:rPr>
+          <w:rStyle w:val="VerbatimChar"/>
+        </w:rPr>
+        <w:t xml:space="preserve">uikit/text.h</w:t>
+      </w:r>
+      <w:r>
+        <w:t xml:space="preserve">):</w:t>
+      </w:r>
+      <w:r>
+        <w:t xml:space="preserve"> </w:t>
+      </w:r>
+      <w:r>
+        <w:rPr>
+          <w:rStyle w:val="VerbatimChar"/>
+        </w:rPr>
+        <w:t xml:space="preserve">uk_text_fit</w:t>
+      </w:r>
+      <w:r>
+        <w:t xml:space="preserve"> </w:t>
+      </w:r>
+      <w:r>
+        <w:t xml:space="preserve">cuts a line with "…",</w:t>
+      </w:r>
+      <w:r>
+        <w:t xml:space="preserve"> </w:t>
+      </w:r>
+      <w:r>
+        <w:rPr>
+          <w:rStyle w:val="VerbatimChar"/>
+        </w:rPr>
+        <w:t xml:space="preserve">uk_text_wrap</w:t>
+      </w:r>
+      <w:r>
+        <w:t xml:space="preserve"> </w:t>
+      </w:r>
+      <w:r>
+        <w:t xml:space="preserve">word-wraps a paragraph into lines of a width (Stickies' cards),</w:t>
+      </w:r>
+      <w:r>
+        <w:t xml:space="preserve"> </w:t>
+      </w:r>
+      <w:r>
+        <w:rPr>
+          <w:rStyle w:val="VerbatimChar"/>
+        </w:rPr>
+        <w:t xml:space="preserve">uk_text_over</w:t>
+      </w:r>
+      <w:r>
+        <w:t xml:space="preserve"> </w:t>
+      </w:r>
+      <w:r>
+        <w:t xml:space="preserve">writes straight on a</w:t>
+      </w:r>
+      <w:r>
+        <w:t xml:space="preserve"> </w:t>
+      </w:r>
+      <w:r>
+        <w:t xml:space="preserve">see-through window — the wallpaper — blended by coverage, with a soft shadow or engraved (the agenda's and</w:t>
+      </w:r>
+      <w:r>
+        <w:t xml:space="preserve"> </w:t>
+      </w:r>
+      <w:r>
+        <w:t xml:space="preserve">Stickies' headers). The tool bar's icons (</w:t>
+      </w:r>
+      <w:r>
+        <w:rPr>
+          <w:rStyle w:val="VerbatimChar"/>
+        </w:rPr>
+        <w:t xml:space="preserve">uikit/toolbar.h</w:t>
+      </w:r>
+      <w:r>
+        <w:t xml:space="preserve">,</w:t>
+      </w:r>
+      <w:r>
+        <w:t xml:space="preserve"> </w:t>
+      </w:r>
+      <w:r>
+        <w:rPr>
+          <w:rStyle w:val="VerbatimChar"/>
+        </w:rPr>
+        <w:t xml:space="preserve">WKT_*</w:t>
+      </w:r>
+      <w:r>
+        <w:t xml:space="preserve">) include</w:t>
+      </w:r>
+      <w:r>
+        <w:t xml:space="preserve"> </w:t>
+      </w:r>
+      <w:r>
+        <w:rPr>
+          <w:rStyle w:val="VerbatimChar"/>
+        </w:rPr>
+        <w:t xml:space="preserve">WKT_TRASH</w:t>
+      </w:r>
+      <w:r>
+        <w:t xml:space="preserve"> </w:t>
+      </w:r>
+      <w:r>
+        <w:t xml:space="preserve">and</w:t>
+      </w:r>
+      <w:r>
+        <w:t xml:space="preserve"> </w:t>
+      </w:r>
+      <w:r>
+        <w:rPr>
+          <w:rStyle w:val="VerbatimChar"/>
+        </w:rPr>
+        <w:t xml:space="preserve">WKT_PIN</w:t>
+      </w:r>
+      <w:r>
+        <w:t xml:space="preserve">:</w:t>
+      </w:r>
+    </w:p>
+    <w:p>
+      <w:pPr>
+        <w:pStyle w:val="SourceCode"/>
+      </w:pPr>
+      <w:r>
+        <w:rPr>
+          <w:rStyle w:val="DataTypeTok"/>
+        </w:rPr>
+        <w:t xml:space="preserve">int</w:t>
+      </w:r>
+      <w:r>
+        <w:rPr>
+          <w:rStyle w:val="NormalTok"/>
+        </w:rPr>
+        <w:t xml:space="preserve"> st</w:t>
+      </w:r>
+      <w:r>
+        <w:rPr>
+          <w:rStyle w:val="OperatorTok"/>
+        </w:rPr>
+        <w:t xml:space="preserve">[</w:t>
+      </w:r>
+      <w:r>
+        <w:rPr>
+          <w:rStyle w:val="DecValTok"/>
+        </w:rPr>
+        <w:t xml:space="preserve">6</w:t>
+      </w:r>
+      <w:r>
+        <w:rPr>
+          <w:rStyle w:val="OperatorTok"/>
+        </w:rPr>
+        <w:t xml:space="preserve">],</w:t>
+      </w:r>
+      <w:r>
+        <w:rPr>
+          <w:rStyle w:val="NormalTok"/>
+        </w:rPr>
+        <w:t xml:space="preserve"> ln</w:t>
+      </w:r>
+      <w:r>
+        <w:rPr>
+          <w:rStyle w:val="OperatorTok"/>
+        </w:rPr>
+        <w:t xml:space="preserve">[</w:t>
+      </w:r>
+      <w:r>
+        <w:rPr>
+          <w:rStyle w:val="DecValTok"/>
+        </w:rPr>
+        <w:t xml:space="preserve">6</w:t>
+      </w:r>
+      <w:r>
+        <w:rPr>
+          <w:rStyle w:val="OperatorTok"/>
+        </w:rPr>
+        <w:t xml:space="preserve">];</w:t>
+      </w:r>
+      <w:r>
+        <w:rPr>
+          <w:rStyle w:val="NormalTok"/>
+        </w:rPr>
+        <w:t xml:space="preserve"> </w:t>
+      </w:r>
+      <w:r>
+        <w:rPr>
+          <w:rStyle w:val="DataTypeTok"/>
+        </w:rPr>
+        <w:t xml:space="preserve">bool</w:t>
+      </w:r>
+      <w:r>
+        <w:rPr>
+          <w:rStyle w:val="NormalTok"/>
+        </w:rPr>
+        <w:t xml:space="preserve"> more</w:t>
+      </w:r>
+      <w:r>
+        <w:rPr>
+          <w:rStyle w:val="OperatorTok"/>
+        </w:rPr>
+        <w:t xml:space="preserve">;</w:t>
+      </w:r>
+      <w:r>
+        <w:br/>
+      </w:r>
+      <w:r>
+        <w:rPr>
+          <w:rStyle w:val="DataTypeTok"/>
+        </w:rPr>
+        <w:t xml:space="preserve">int</w:t>
+      </w:r>
+      <w:r>
+        <w:rPr>
+          <w:rStyle w:val="NormalTok"/>
+        </w:rPr>
+        <w:t xml:space="preserve"> k </w:t>
+      </w:r>
+      <w:r>
+        <w:rPr>
+          <w:rStyle w:val="OperatorTok"/>
+        </w:rPr>
+        <w:t xml:space="preserve">=</w:t>
+      </w:r>
+      <w:r>
+        <w:rPr>
+          <w:rStyle w:val="NormalTok"/>
+        </w:rPr>
+        <w:t xml:space="preserve"> uk_text_wrap </w:t>
+      </w:r>
+      <w:r>
+        <w:rPr>
+          <w:rStyle w:val="OperatorTok"/>
+        </w:rPr>
+        <w:t xml:space="preserve">(</w:t>
+      </w:r>
+      <w:r>
+        <w:rPr>
+          <w:rStyle w:val="NormalTok"/>
+        </w:rPr>
+        <w:t xml:space="preserve">text</w:t>
+      </w:r>
+      <w:r>
+        <w:rPr>
+          <w:rStyle w:val="OperatorTok"/>
+        </w:rPr>
+        <w:t xml:space="preserve">,</w:t>
+      </w:r>
+      <w:r>
+        <w:rPr>
+          <w:rStyle w:val="NormalTok"/>
+        </w:rPr>
+        <w:t xml:space="preserve"> len</w:t>
+      </w:r>
+      <w:r>
+        <w:rPr>
+          <w:rStyle w:val="OperatorTok"/>
+        </w:rPr>
+        <w:t xml:space="preserve">,</w:t>
+      </w:r>
+      <w:r>
+        <w:rPr>
+          <w:rStyle w:val="NormalTok"/>
+        </w:rPr>
+        <w:t xml:space="preserve"> </w:t>
+      </w:r>
+      <w:r>
+        <w:rPr>
+          <w:rStyle w:val="DecValTok"/>
+        </w:rPr>
+        <w:t xml:space="preserve">196</w:t>
+      </w:r>
+      <w:r>
+        <w:rPr>
+          <w:rStyle w:val="OperatorTok"/>
+        </w:rPr>
+        <w:t xml:space="preserve">,</w:t>
+      </w:r>
+      <w:r>
+        <w:rPr>
+          <w:rStyle w:val="NormalTok"/>
+        </w:rPr>
+        <w:t xml:space="preserve"> </w:t>
+      </w:r>
+      <w:r>
+        <w:rPr>
+          <w:rStyle w:val="DecValTok"/>
+        </w:rPr>
+        <w:t xml:space="preserve">6</w:t>
+      </w:r>
+      <w:r>
+        <w:rPr>
+          <w:rStyle w:val="OperatorTok"/>
+        </w:rPr>
+        <w:t xml:space="preserve">,</w:t>
+      </w:r>
+      <w:r>
+        <w:rPr>
+          <w:rStyle w:val="NormalTok"/>
+        </w:rPr>
+        <w:t xml:space="preserve"> st</w:t>
+      </w:r>
+      <w:r>
+        <w:rPr>
+          <w:rStyle w:val="OperatorTok"/>
+        </w:rPr>
+        <w:t xml:space="preserve">,</w:t>
+      </w:r>
+      <w:r>
+        <w:rPr>
+          <w:rStyle w:val="NormalTok"/>
+        </w:rPr>
+        <w:t xml:space="preserve"> ln</w:t>
+      </w:r>
+      <w:r>
+        <w:rPr>
+          <w:rStyle w:val="OperatorTok"/>
+        </w:rPr>
+        <w:t xml:space="preserve">,</w:t>
+      </w:r>
+      <w:r>
+        <w:rPr>
+          <w:rStyle w:val="NormalTok"/>
+        </w:rPr>
+        <w:t xml:space="preserve"> </w:t>
+      </w:r>
+      <w:r>
+        <w:rPr>
+          <w:rStyle w:val="OperatorTok"/>
+        </w:rPr>
+        <w:t xml:space="preserve">&amp;</w:t>
+      </w:r>
+      <w:r>
+        <w:rPr>
+          <w:rStyle w:val="NormalTok"/>
+        </w:rPr>
+        <w:t xml:space="preserve">more</w:t>
+      </w:r>
+      <w:r>
+        <w:rPr>
+          <w:rStyle w:val="OperatorTok"/>
+        </w:rPr>
+        <w:t xml:space="preserve">);</w:t>
+      </w:r>
+      <w:r>
+        <w:rPr>
+          <w:rStyle w:val="NormalTok"/>
+        </w:rPr>
+        <w:t xml:space="preserve">   </w:t>
+      </w:r>
+      <w:r>
+        <w:rPr>
+          <w:rStyle w:val="CommentTok"/>
+        </w:rPr>
+        <w:t xml:space="preserve">// up to 6 lines of 196 px</w:t>
+      </w:r>
+      <w:r>
+        <w:br/>
+      </w:r>
+      <w:r>
+        <w:rPr>
+          <w:rStyle w:val="ControlFlowTok"/>
+        </w:rPr>
+        <w:t xml:space="preserve">for</w:t>
+      </w:r>
+      <w:r>
+        <w:rPr>
+          <w:rStyle w:val="NormalTok"/>
+        </w:rPr>
+        <w:t xml:space="preserve"> </w:t>
+      </w:r>
+      <w:r>
+        <w:rPr>
+          <w:rStyle w:val="OperatorTok"/>
+        </w:rPr>
+        <w:t xml:space="preserve">(</w:t>
+      </w:r>
+      <w:r>
+        <w:rPr>
+          <w:rStyle w:val="DataTypeTok"/>
+        </w:rPr>
+        <w:t xml:space="preserve">int</w:t>
+      </w:r>
+      <w:r>
+        <w:rPr>
+          <w:rStyle w:val="NormalTok"/>
+        </w:rPr>
+        <w:t xml:space="preserve"> i </w:t>
+      </w:r>
+      <w:r>
+        <w:rPr>
+          <w:rStyle w:val="OperatorTok"/>
+        </w:rPr>
+        <w:t xml:space="preserve">=</w:t>
+      </w:r>
+      <w:r>
+        <w:rPr>
+          <w:rStyle w:val="NormalTok"/>
+        </w:rPr>
+        <w:t xml:space="preserve"> </w:t>
+      </w:r>
+      <w:r>
+        <w:rPr>
+          <w:rStyle w:val="DecValTok"/>
+        </w:rPr>
+        <w:t xml:space="preserve">0</w:t>
+      </w:r>
+      <w:r>
+        <w:rPr>
+          <w:rStyle w:val="OperatorTok"/>
+        </w:rPr>
+        <w:t xml:space="preserve">;</w:t>
+      </w:r>
+      <w:r>
+        <w:rPr>
+          <w:rStyle w:val="NormalTok"/>
+        </w:rPr>
+        <w:t xml:space="preserve"> i </w:t>
+      </w:r>
+      <w:r>
+        <w:rPr>
+          <w:rStyle w:val="OperatorTok"/>
+        </w:rPr>
+        <w:t xml:space="preserve">&lt;</w:t>
+      </w:r>
+      <w:r>
+        <w:rPr>
+          <w:rStyle w:val="NormalTok"/>
+        </w:rPr>
+        <w:t xml:space="preserve"> k</w:t>
+      </w:r>
+      <w:r>
+        <w:rPr>
+          <w:rStyle w:val="OperatorTok"/>
+        </w:rPr>
+        <w:t xml:space="preserve">;</w:t>
+      </w:r>
+      <w:r>
+        <w:rPr>
+          <w:rStyle w:val="NormalTok"/>
+        </w:rPr>
+        <w:t xml:space="preserve"> i</w:t>
+      </w:r>
+      <w:r>
+        <w:rPr>
+          <w:rStyle w:val="OperatorTok"/>
+        </w:rPr>
+        <w:t xml:space="preserve">++)</w:t>
+      </w:r>
+      <w:r>
+        <w:rPr>
+          <w:rStyle w:val="NormalTok"/>
+        </w:rPr>
+        <w:t xml:space="preserve"> </w:t>
+      </w:r>
+      <w:r>
+        <w:rPr>
+          <w:rStyle w:val="OperatorTok"/>
+        </w:rPr>
+        <w:t xml:space="preserve">{</w:t>
+      </w:r>
+      <w:r>
+        <w:rPr>
+          <w:rStyle w:val="NormalTok"/>
+        </w:rPr>
+        <w:t xml:space="preserve"> </w:t>
+      </w:r>
+      <w:r>
+        <w:rPr>
+          <w:rStyle w:val="DataTypeTok"/>
+        </w:rPr>
+        <w:t xml:space="preserve">char</w:t>
+      </w:r>
+      <w:r>
+        <w:rPr>
+          <w:rStyle w:val="NormalTok"/>
+        </w:rPr>
+        <w:t xml:space="preserve"> l</w:t>
+      </w:r>
+      <w:r>
+        <w:rPr>
+          <w:rStyle w:val="OperatorTok"/>
+        </w:rPr>
+        <w:t xml:space="preserve">[</w:t>
+      </w:r>
+      <w:r>
+        <w:rPr>
+          <w:rStyle w:val="DecValTok"/>
+        </w:rPr>
+        <w:t xml:space="preserve">256</w:t>
+      </w:r>
+      <w:r>
+        <w:rPr>
+          <w:rStyle w:val="OperatorTok"/>
+        </w:rPr>
+        <w:t xml:space="preserve">];</w:t>
+      </w:r>
+      <w:r>
+        <w:rPr>
+          <w:rStyle w:val="NormalTok"/>
+        </w:rPr>
+        <w:t xml:space="preserve"> </w:t>
+      </w:r>
+      <w:r>
+        <w:rPr>
+          <w:rStyle w:val="DataTypeTok"/>
+        </w:rPr>
+        <w:t xml:space="preserve">int</w:t>
+      </w:r>
+      <w:r>
+        <w:rPr>
+          <w:rStyle w:val="NormalTok"/>
+        </w:rPr>
+        <w:t xml:space="preserve"> n </w:t>
+      </w:r>
+      <w:r>
+        <w:rPr>
+          <w:rStyle w:val="OperatorTok"/>
+        </w:rPr>
+        <w:t xml:space="preserve">=</w:t>
+      </w:r>
+      <w:r>
+        <w:rPr>
+          <w:rStyle w:val="NormalTok"/>
+        </w:rPr>
+        <w:t xml:space="preserve"> ln</w:t>
+      </w:r>
+      <w:r>
+        <w:rPr>
+          <w:rStyle w:val="OperatorTok"/>
+        </w:rPr>
+        <w:t xml:space="preserve">[</w:t>
+      </w:r>
+      <w:r>
+        <w:rPr>
+          <w:rStyle w:val="NormalTok"/>
+        </w:rPr>
+        <w:t xml:space="preserve">i</w:t>
+      </w:r>
+      <w:r>
+        <w:rPr>
+          <w:rStyle w:val="OperatorTok"/>
+        </w:rPr>
+        <w:t xml:space="preserve">]</w:t>
+      </w:r>
+      <w:r>
+        <w:rPr>
+          <w:rStyle w:val="NormalTok"/>
+        </w:rPr>
+        <w:t xml:space="preserve"> </w:t>
+      </w:r>
+      <w:r>
+        <w:rPr>
+          <w:rStyle w:val="OperatorTok"/>
+        </w:rPr>
+        <w:t xml:space="preserve">&lt;</w:t>
+      </w:r>
+      <w:r>
+        <w:rPr>
+          <w:rStyle w:val="NormalTok"/>
+        </w:rPr>
+        <w:t xml:space="preserve"> </w:t>
+      </w:r>
+      <w:r>
+        <w:rPr>
+          <w:rStyle w:val="DecValTok"/>
+        </w:rPr>
+        <w:t xml:space="preserve">255</w:t>
+      </w:r>
+      <w:r>
+        <w:rPr>
+          <w:rStyle w:val="NormalTok"/>
+        </w:rPr>
+        <w:t xml:space="preserve"> </w:t>
+      </w:r>
+      <w:r>
+        <w:rPr>
+          <w:rStyle w:val="OperatorTok"/>
+        </w:rPr>
+        <w:t xml:space="preserve">?</w:t>
+      </w:r>
+      <w:r>
+        <w:rPr>
+          <w:rStyle w:val="NormalTok"/>
+        </w:rPr>
+        <w:t xml:space="preserve"> ln</w:t>
+      </w:r>
+      <w:r>
+        <w:rPr>
+          <w:rStyle w:val="OperatorTok"/>
+        </w:rPr>
+        <w:t xml:space="preserve">[</w:t>
+      </w:r>
+      <w:r>
+        <w:rPr>
+          <w:rStyle w:val="NormalTok"/>
+        </w:rPr>
+        <w:t xml:space="preserve">i</w:t>
+      </w:r>
+      <w:r>
+        <w:rPr>
+          <w:rStyle w:val="OperatorTok"/>
+        </w:rPr>
+        <w:t xml:space="preserve">]</w:t>
+      </w:r>
+      <w:r>
+        <w:rPr>
+          <w:rStyle w:val="NormalTok"/>
+        </w:rPr>
+        <w:t xml:space="preserve"> </w:t>
+      </w:r>
+      <w:r>
+        <w:rPr>
+          <w:rStyle w:val="OperatorTok"/>
+        </w:rPr>
+        <w:t xml:space="preserve">:</w:t>
+      </w:r>
+      <w:r>
+        <w:rPr>
+          <w:rStyle w:val="NormalTok"/>
+        </w:rPr>
+        <w:t xml:space="preserve"> </w:t>
+      </w:r>
+      <w:r>
+        <w:rPr>
+          <w:rStyle w:val="DecValTok"/>
+        </w:rPr>
+        <w:t xml:space="preserve">255</w:t>
+      </w:r>
+      <w:r>
+        <w:rPr>
+          <w:rStyle w:val="OperatorTok"/>
+        </w:rPr>
+        <w:t xml:space="preserve">;</w:t>
+      </w:r>
+      <w:r>
+        <w:br/>
+      </w:r>
+      <w:r>
+        <w:rPr>
+          <w:rStyle w:val="NormalTok"/>
+        </w:rPr>
+        <w:t xml:space="preserve">    memcpy </w:t>
+      </w:r>
+      <w:r>
+        <w:rPr>
+          <w:rStyle w:val="OperatorTok"/>
+        </w:rPr>
+        <w:t xml:space="preserve">(</w:t>
+      </w:r>
+      <w:r>
+        <w:rPr>
+          <w:rStyle w:val="NormalTok"/>
+        </w:rPr>
+        <w:t xml:space="preserve">l</w:t>
+      </w:r>
+      <w:r>
+        <w:rPr>
+          <w:rStyle w:val="OperatorTok"/>
+        </w:rPr>
+        <w:t xml:space="preserve">,</w:t>
+      </w:r>
+      <w:r>
+        <w:rPr>
+          <w:rStyle w:val="NormalTok"/>
+        </w:rPr>
+        <w:t xml:space="preserve"> text </w:t>
+      </w:r>
+      <w:r>
+        <w:rPr>
+          <w:rStyle w:val="OperatorTok"/>
+        </w:rPr>
+        <w:t xml:space="preserve">+</w:t>
+      </w:r>
+      <w:r>
+        <w:rPr>
+          <w:rStyle w:val="NormalTok"/>
+        </w:rPr>
+        <w:t xml:space="preserve"> st</w:t>
+      </w:r>
+      <w:r>
+        <w:rPr>
+          <w:rStyle w:val="OperatorTok"/>
+        </w:rPr>
+        <w:t xml:space="preserve">[</w:t>
+      </w:r>
+      <w:r>
+        <w:rPr>
+          <w:rStyle w:val="NormalTok"/>
+        </w:rPr>
+        <w:t xml:space="preserve">i</w:t>
+      </w:r>
+      <w:r>
+        <w:rPr>
+          <w:rStyle w:val="OperatorTok"/>
+        </w:rPr>
+        <w:t xml:space="preserve">],</w:t>
+      </w:r>
+      <w:r>
+        <w:rPr>
+          <w:rStyle w:val="NormalTok"/>
+        </w:rPr>
+        <w:t xml:space="preserve"> n</w:t>
+      </w:r>
+      <w:r>
+        <w:rPr>
+          <w:rStyle w:val="OperatorTok"/>
+        </w:rPr>
+        <w:t xml:space="preserve">);</w:t>
+      </w:r>
+      <w:r>
+        <w:rPr>
+          <w:rStyle w:val="NormalTok"/>
+        </w:rPr>
+        <w:t xml:space="preserve"> l</w:t>
+      </w:r>
+      <w:r>
+        <w:rPr>
+          <w:rStyle w:val="OperatorTok"/>
+        </w:rPr>
+        <w:t xml:space="preserve">[</w:t>
+      </w:r>
+      <w:r>
+        <w:rPr>
+          <w:rStyle w:val="NormalTok"/>
+        </w:rPr>
+        <w:t xml:space="preserve">n</w:t>
+      </w:r>
+      <w:r>
+        <w:rPr>
+          <w:rStyle w:val="OperatorTok"/>
+        </w:rPr>
+        <w:t xml:space="preserve">]</w:t>
+      </w:r>
+      <w:r>
+        <w:rPr>
+          <w:rStyle w:val="NormalTok"/>
+        </w:rPr>
+        <w:t xml:space="preserve"> </w:t>
+      </w:r>
+      <w:r>
+        <w:rPr>
+          <w:rStyle w:val="OperatorTok"/>
+        </w:rPr>
+        <w:t xml:space="preserve">=</w:t>
+      </w:r>
+      <w:r>
+        <w:rPr>
+          <w:rStyle w:val="NormalTok"/>
+        </w:rPr>
+        <w:t xml:space="preserve"> </w:t>
+      </w:r>
+      <w:r>
+        <w:rPr>
+          <w:rStyle w:val="DecValTok"/>
+        </w:rPr>
+        <w:t xml:space="preserve">0</w:t>
+      </w:r>
+      <w:r>
+        <w:rPr>
+          <w:rStyle w:val="OperatorTok"/>
+        </w:rPr>
+        <w:t xml:space="preserve">;</w:t>
+      </w:r>
+      <w:r>
+        <w:rPr>
+          <w:rStyle w:val="NormalTok"/>
+        </w:rPr>
+        <w:t xml:space="preserve"> uk_text </w:t>
+      </w:r>
+      <w:r>
+        <w:rPr>
+          <w:rStyle w:val="OperatorTok"/>
+        </w:rPr>
+        <w:t xml:space="preserve">(</w:t>
+      </w:r>
+      <w:r>
+        <w:rPr>
+          <w:rStyle w:val="NormalTok"/>
+        </w:rPr>
+        <w:t xml:space="preserve">canvas</w:t>
+      </w:r>
+      <w:r>
+        <w:rPr>
+          <w:rStyle w:val="OperatorTok"/>
+        </w:rPr>
+        <w:t xml:space="preserve">,</w:t>
+      </w:r>
+      <w:r>
+        <w:rPr>
+          <w:rStyle w:val="NormalTok"/>
+        </w:rPr>
+        <w:t xml:space="preserve"> </w:t>
+      </w:r>
+      <w:r>
+        <w:rPr>
+          <w:rStyle w:val="DecValTok"/>
+        </w:rPr>
+        <w:t xml:space="preserve">22</w:t>
+      </w:r>
+      <w:r>
+        <w:rPr>
+          <w:rStyle w:val="OperatorTok"/>
+        </w:rPr>
+        <w:t xml:space="preserve">,</w:t>
+      </w:r>
+      <w:r>
+        <w:rPr>
+          <w:rStyle w:val="NormalTok"/>
+        </w:rPr>
+        <w:t xml:space="preserve"> </w:t>
+      </w:r>
+      <w:r>
+        <w:rPr>
+          <w:rStyle w:val="DecValTok"/>
+        </w:rPr>
+        <w:t xml:space="preserve">33</w:t>
+      </w:r>
+      <w:r>
+        <w:rPr>
+          <w:rStyle w:val="NormalTok"/>
+        </w:rPr>
+        <w:t xml:space="preserve"> </w:t>
+      </w:r>
+      <w:r>
+        <w:rPr>
+          <w:rStyle w:val="OperatorTok"/>
+        </w:rPr>
+        <w:t xml:space="preserve">+</w:t>
+      </w:r>
+      <w:r>
+        <w:rPr>
+          <w:rStyle w:val="NormalTok"/>
+        </w:rPr>
+        <w:t xml:space="preserve"> </w:t>
+      </w:r>
+      <w:r>
+        <w:rPr>
+          <w:rStyle w:val="DecValTok"/>
+        </w:rPr>
+        <w:t xml:space="preserve">17</w:t>
+      </w:r>
+      <w:r>
+        <w:rPr>
+          <w:rStyle w:val="NormalTok"/>
+        </w:rPr>
+        <w:t xml:space="preserve"> </w:t>
+      </w:r>
+      <w:r>
+        <w:rPr>
+          <w:rStyle w:val="OperatorTok"/>
+        </w:rPr>
+        <w:t xml:space="preserve">*</w:t>
+      </w:r>
+      <w:r>
+        <w:rPr>
+          <w:rStyle w:val="NormalTok"/>
+        </w:rPr>
+        <w:t xml:space="preserve"> i</w:t>
+      </w:r>
+      <w:r>
+        <w:rPr>
+          <w:rStyle w:val="OperatorTok"/>
+        </w:rPr>
+        <w:t xml:space="preserve">,</w:t>
+      </w:r>
+      <w:r>
+        <w:rPr>
+          <w:rStyle w:val="NormalTok"/>
+        </w:rPr>
+        <w:t xml:space="preserve"> l</w:t>
+      </w:r>
+      <w:r>
+        <w:rPr>
+          <w:rStyle w:val="OperatorTok"/>
+        </w:rPr>
+        <w:t xml:space="preserve">,</w:t>
+      </w:r>
+      <w:r>
+        <w:rPr>
+          <w:rStyle w:val="NormalTok"/>
+        </w:rPr>
+        <w:t xml:space="preserve"> ink</w:t>
+      </w:r>
+      <w:r>
+        <w:rPr>
+          <w:rStyle w:val="OperatorTok"/>
+        </w:rPr>
+        <w:t xml:space="preserve">);</w:t>
+      </w:r>
+      <w:r>
+        <w:rPr>
+          <w:rStyle w:val="NormalTok"/>
+        </w:rPr>
+        <w:t xml:space="preserve"> </w:t>
+      </w:r>
+      <w:r>
+        <w:rPr>
+          <w:rStyle w:val="OperatorTok"/>
+        </w:rPr>
+        <w:t xml:space="preserve">}</w:t>
+      </w:r>
+      <w:r>
+        <w:br/>
+      </w:r>
+      <w:r>
+        <w:rPr>
+          <w:rStyle w:val="NormalTok"/>
+        </w:rPr>
+        <w:t xml:space="preserve">uk_text_over </w:t>
+      </w:r>
+      <w:r>
+        <w:rPr>
+          <w:rStyle w:val="OperatorTok"/>
+        </w:rPr>
+        <w:t xml:space="preserve">(</w:t>
+      </w:r>
+      <w:r>
+        <w:rPr>
+          <w:rStyle w:val="NormalTok"/>
+        </w:rPr>
+        <w:t xml:space="preserve">canvas</w:t>
+      </w:r>
+      <w:r>
+        <w:rPr>
+          <w:rStyle w:val="OperatorTok"/>
+        </w:rPr>
+        <w:t xml:space="preserve">,</w:t>
+      </w:r>
+      <w:r>
+        <w:rPr>
+          <w:rStyle w:val="NormalTok"/>
+        </w:rPr>
+        <w:t xml:space="preserve"> </w:t>
+      </w:r>
+      <w:r>
+        <w:rPr>
+          <w:rStyle w:val="DecValTok"/>
+        </w:rPr>
+        <w:t xml:space="preserve">38</w:t>
+      </w:r>
+      <w:r>
+        <w:rPr>
+          <w:rStyle w:val="OperatorTok"/>
+        </w:rPr>
+        <w:t xml:space="preserve">,</w:t>
+      </w:r>
+      <w:r>
+        <w:rPr>
+          <w:rStyle w:val="NormalTok"/>
+        </w:rPr>
+        <w:t xml:space="preserve"> </w:t>
+      </w:r>
+      <w:r>
+        <w:rPr>
+          <w:rStyle w:val="DecValTok"/>
+        </w:rPr>
+        <w:t xml:space="preserve">9</w:t>
+      </w:r>
+      <w:r>
+        <w:rPr>
+          <w:rStyle w:val="OperatorTok"/>
+        </w:rPr>
+        <w:t xml:space="preserve">,</w:t>
+      </w:r>
+      <w:r>
+        <w:rPr>
+          <w:rStyle w:val="NormalTok"/>
+        </w:rPr>
+        <w:t xml:space="preserve"> </w:t>
+      </w:r>
+      <w:r>
+        <w:rPr>
+          <w:rStyle w:val="StringTok"/>
+        </w:rPr>
+        <w:t xml:space="preserve">"Pinned notes"</w:t>
+      </w:r>
+      <w:r>
+        <w:rPr>
+          <w:rStyle w:val="OperatorTok"/>
+        </w:rPr>
+        <w:t xml:space="preserve">,</w:t>
+      </w:r>
+      <w:r>
+        <w:rPr>
+          <w:rStyle w:val="NormalTok"/>
+        </w:rPr>
+        <w:t xml:space="preserve"> </w:t>
+      </w:r>
+      <w:r>
+        <w:rPr>
+          <w:rStyle w:val="BaseNTok"/>
+        </w:rPr>
+        <w:t xml:space="preserve">0x00FAFCFF</w:t>
+      </w:r>
+      <w:r>
+        <w:rPr>
+          <w:rStyle w:val="OperatorTok"/>
+        </w:rPr>
+        <w:t xml:space="preserve">,</w:t>
+      </w:r>
+      <w:r>
+        <w:rPr>
+          <w:rStyle w:val="NormalTok"/>
+        </w:rPr>
+        <w:t xml:space="preserve"> </w:t>
+      </w:r>
+      <w:r>
+        <w:rPr>
+          <w:rStyle w:val="DecValTok"/>
+        </w:rPr>
+        <w:t xml:space="preserve">2</w:t>
+      </w:r>
+      <w:r>
+        <w:rPr>
+          <w:rStyle w:val="OperatorTok"/>
+        </w:rPr>
+        <w:t xml:space="preserve">,</w:t>
+      </w:r>
+      <w:r>
+        <w:rPr>
+          <w:rStyle w:val="NormalTok"/>
+        </w:rPr>
+        <w:t xml:space="preserve"> </w:t>
+      </w:r>
+      <w:r>
+        <w:rPr>
+          <w:rStyle w:val="DecValTok"/>
+        </w:rPr>
+        <w:t xml:space="preserve">1</w:t>
+      </w:r>
+      <w:r>
+        <w:rPr>
+          <w:rStyle w:val="OperatorTok"/>
+        </w:rPr>
+        <w:t xml:space="preserve">);</w:t>
+      </w:r>
+      <w:r>
+        <w:rPr>
+          <w:rStyle w:val="NormalTok"/>
+        </w:rPr>
+        <w:t xml:space="preserve">   </w:t>
+      </w:r>
+      <w:r>
+        <w:rPr>
+          <w:rStyle w:val="CommentTok"/>
+        </w:rPr>
+        <w:t xml:space="preserve">// bold, a soft shadow, on the wallpaper</w:t>
+      </w:r>
+    </w:p>
+    <w:p>
+      <w:pPr>
+        <w:pStyle w:val="FirstParagraph"/>
+      </w:pPr>
+      <w:r>
+        <w:rPr>
+          <w:bCs/>
+          <w:b/>
+        </w:rPr>
         <w:t xml:space="preserve">Without C++</w:t>
       </w:r>
       <w:r>
@@ -9623,7 +10684,7 @@
         <w:t xml:space="preserve"> </w:t>
       </w:r>
       <w:r>
-        <w:t xml:space="preserve">volume, preload list, the applets' protocol).</w:t>
+        <w:t xml:space="preserve">volume, preload list, autostart, the applets' protocol).</w:t>
       </w:r>
     </w:p>
     <w:p>
@@ -10837,6 +11898,182 @@
           <w:rStyle w:val="CommentTok"/>
         </w:rPr>
         <w:t xml:space="preserve">// the dock reads its settings again</w:t>
+      </w:r>
+    </w:p>
+    <w:p>
+      <w:pPr>
+        <w:pStyle w:val="FirstParagraph"/>
+      </w:pPr>
+      <w:r>
+        <w:rPr>
+          <w:bCs/>
+          <w:b/>
+        </w:rPr>
+        <w:t xml:space="preserve">Starting a program at every boot</w:t>
+      </w:r>
+      <w:r>
+        <w:t xml:space="preserve"> </w:t>
+      </w:r>
+      <w:r>
+        <w:t xml:space="preserve">— a line of</w:t>
+      </w:r>
+      <w:r>
+        <w:t xml:space="preserve"> </w:t>
+      </w:r>
+      <w:r>
+        <w:rPr>
+          <w:rStyle w:val="VerbatimChar"/>
+        </w:rPr>
+        <w:t xml:space="preserve">SD:/etc/autostart</w:t>
+      </w:r>
+      <w:r>
+        <w:t xml:space="preserve"> </w:t>
+      </w:r>
+      <w:r>
+        <w:t xml:space="preserve">looked for, or added where it</w:t>
+      </w:r>
+      <w:r>
+        <w:t xml:space="preserve"> </w:t>
+      </w:r>
+      <w:r>
+        <w:t xml:space="preserve">belongs (after a given line, else before</w:t>
+      </w:r>
+      <w:r>
+        <w:t xml:space="preserve"> </w:t>
+      </w:r>
+      <w:r>
+        <w:rPr>
+          <w:rStyle w:val="VerbatimChar"/>
+        </w:rPr>
+        <w:t xml:space="preserve">preload /boot</w:t>
+      </w:r>
+      <w:r>
+        <w:t xml:space="preserve">, which stays last; Setup's held-back</w:t>
+      </w:r>
+      <w:r>
+        <w:t xml:space="preserve"> </w:t>
+      </w:r>
+      <w:r>
+        <w:rPr>
+          <w:rStyle w:val="VerbatimChar"/>
+        </w:rPr>
+        <w:t xml:space="preserve">#setup:</w:t>
+      </w:r>
+      <w:r>
+        <w:t xml:space="preserve"> </w:t>
+      </w:r>
+      <w:r>
+        <w:t xml:space="preserve">lines respected), and the user told so:</w:t>
+      </w:r>
+    </w:p>
+    <w:p>
+      <w:pPr>
+        <w:pStyle w:val="SourceCode"/>
+      </w:pPr>
+      <w:r>
+        <w:rPr>
+          <w:rStyle w:val="PreprocessorTok"/>
+        </w:rPr>
+        <w:t xml:space="preserve">#include </w:t>
+      </w:r>
+      <w:r>
+        <w:rPr>
+          <w:rStyle w:val="ImportTok"/>
+        </w:rPr>
+        <w:t xml:space="preserve">"systemkit/systemkit.h"</w:t>
+      </w:r>
+      <w:r>
+        <w:br/>
+      </w:r>
+      <w:r>
+        <w:br/>
+      </w:r>
+      <w:r>
+        <w:rPr>
+          <w:rStyle w:val="DataTypeTok"/>
+        </w:rPr>
+        <w:t xml:space="preserve">int</w:t>
+      </w:r>
+      <w:r>
+        <w:rPr>
+          <w:rStyle w:val="NormalTok"/>
+        </w:rPr>
+        <w:t xml:space="preserve"> r </w:t>
+      </w:r>
+      <w:r>
+        <w:rPr>
+          <w:rStyle w:val="OperatorTok"/>
+        </w:rPr>
+        <w:t xml:space="preserve">=</w:t>
+      </w:r>
+      <w:r>
+        <w:rPr>
+          <w:rStyle w:val="NormalTok"/>
+        </w:rPr>
+        <w:t xml:space="preserve"> autostart_ensure </w:t>
+      </w:r>
+      <w:r>
+        <w:rPr>
+          <w:rStyle w:val="OperatorTok"/>
+        </w:rPr>
+        <w:t xml:space="preserve">(</w:t>
+      </w:r>
+      <w:r>
+        <w:rPr>
+          <w:rStyle w:val="StringTok"/>
+        </w:rPr>
+        <w:t xml:space="preserve">"run stickies"</w:t>
+      </w:r>
+      <w:r>
+        <w:rPr>
+          <w:rStyle w:val="OperatorTok"/>
+        </w:rPr>
+        <w:t xml:space="preserve">,</w:t>
+      </w:r>
+      <w:r>
+        <w:rPr>
+          <w:rStyle w:val="NormalTok"/>
+        </w:rPr>
+        <w:t xml:space="preserve"> </w:t>
+      </w:r>
+      <w:r>
+        <w:rPr>
+          <w:rStyle w:val="StringTok"/>
+        </w:rPr>
+        <w:t xml:space="preserve">"run agenda"</w:t>
+      </w:r>
+      <w:r>
+        <w:rPr>
+          <w:rStyle w:val="OperatorTok"/>
+        </w:rPr>
+        <w:t xml:space="preserve">,</w:t>
+      </w:r>
+      <w:r>
+        <w:rPr>
+          <w:rStyle w:val="NormalTok"/>
+        </w:rPr>
+        <w:t xml:space="preserve"> </w:t>
+      </w:r>
+      <w:r>
+        <w:rPr>
+          <w:rStyle w:val="StringTok"/>
+        </w:rPr>
+        <w:t xml:space="preserve">"# Stickies: the pinned notes on the desktop"</w:t>
+      </w:r>
+      <w:r>
+        <w:rPr>
+          <w:rStyle w:val="OperatorTok"/>
+        </w:rPr>
+        <w:t xml:space="preserve">);</w:t>
+      </w:r>
+      <w:r>
+        <w:br/>
+      </w:r>
+      <w:r>
+        <w:rPr>
+          <w:rStyle w:val="CommentTok"/>
+        </w:rPr>
+        <w:t xml:space="preserve">/* 2 added, 1 already there (autostart_has), 0 not written */</w:t>
       </w:r>
     </w:p>
     <w:tbl>
@@ -11134,6 +12371,44 @@
             </w:pPr>
             <w:r>
               <w:t xml:space="preserve">The programs loaded ahead at boot</w:t>
+            </w:r>
+          </w:p>
+        </w:tc>
+      </w:tr>
+      <w:tr>
+        <w:tc>
+          <w:tcPr/>
+          <w:p>
+            <w:pPr>
+              <w:pStyle w:val="Compact"/>
+              <w:jc w:val="left"/>
+            </w:pPr>
+            <w:r>
+              <w:rPr>
+                <w:rStyle w:val="VerbatimChar"/>
+              </w:rPr>
+              <w:t xml:space="preserve">autostart.h</w:t>
+            </w:r>
+          </w:p>
+        </w:tc>
+        <w:tc>
+          <w:tcPr/>
+          <w:p>
+            <w:pPr>
+              <w:pStyle w:val="Compact"/>
+              <w:jc w:val="left"/>
+            </w:pPr>
+            <w:r>
+              <w:t xml:space="preserve">The programs started at boot (</w:t>
+            </w:r>
+            <w:r>
+              <w:rPr>
+                <w:rStyle w:val="VerbatimChar"/>
+              </w:rPr>
+              <w:t xml:space="preserve">SD:/etc/autostart</w:t>
+            </w:r>
+            <w:r>
+              <w:t xml:space="preserve">)</w:t>
             </w:r>
           </w:p>
         </w:tc>

</xml_diff>

<commit_message>
AutoDev round 2: step 10 -- docs: docs/04 (catalog row, the Circuits section, the menu bar and Language & Region lists), docs/03 (Circuits, translated apps), HANDOFF; exports regenerated (pandoc + LibreOffice)
Co-Authored-By: Claude Opus 5.5 <noreply@anthropic.com>
Claude-Session: https://claude.ai/code/session_01HmLTZQTqXoyQVhbAstA13W
</commit_message>
<xml_diff>
--- a/docs/exports/06-KITS-GUIDE.docx
+++ b/docs/exports/06-KITS-GUIDE.docx
@@ -721,7 +721,7 @@
               <w:jc w:val="left"/>
             </w:pPr>
             <w:r>
-              <w:t xml:space="preserve">Talking to the system and the other programs: notifications, clipboard, trash, volume, wallpaper, file associations, the dock</w:t>
+              <w:t xml:space="preserve">Talking to the system and the other programs: notifications, clipboard, trash, volume, wallpaper, file associations, the dock, the language and the time zone</w:t>
             </w:r>
           </w:p>
         </w:tc>
@@ -12076,6 +12076,359 @@
         <w:t xml:space="preserve">/* 2 added, 1 already there (autostart_has), 0 not written */</w:t>
       </w:r>
     </w:p>
+    <w:p>
+      <w:pPr>
+        <w:pStyle w:val="FirstParagraph"/>
+      </w:pPr>
+      <w:r>
+        <w:rPr>
+          <w:bCs/>
+          <w:b/>
+        </w:rPr>
+        <w:t xml:space="preserve">The system's language</w:t>
+      </w:r>
+      <w:r>
+        <w:t xml:space="preserve"> </w:t>
+      </w:r>
+      <w:r>
+        <w:t xml:space="preserve">(the Control Panel's Language &amp; Region): an app's words go through UIKit's</w:t>
+      </w:r>
+      <w:r>
+        <w:t xml:space="preserve"> </w:t>
+      </w:r>
+      <w:r>
+        <w:rPr>
+          <w:rStyle w:val="VerbatimChar"/>
+        </w:rPr>
+        <w:t xml:space="preserve">TR ("...")</w:t>
+      </w:r>
+      <w:r>
+        <w:t xml:space="preserve"> </w:t>
+      </w:r>
+      <w:r>
+        <w:t xml:space="preserve">after</w:t>
+      </w:r>
+      <w:r>
+        <w:t xml:space="preserve"> </w:t>
+      </w:r>
+      <w:r>
+        <w:rPr>
+          <w:rStyle w:val="VerbatimChar"/>
+        </w:rPr>
+        <w:t xml:space="preserve">uk_lang_init ()</w:t>
+      </w:r>
+      <w:r>
+        <w:t xml:space="preserve"> </w:t>
+      </w:r>
+      <w:r>
+        <w:t xml:space="preserve">(section 3); a program with words of its own asks SystemKit:</w:t>
+      </w:r>
+    </w:p>
+    <w:p>
+      <w:pPr>
+        <w:pStyle w:val="SourceCode"/>
+      </w:pPr>
+      <w:r>
+        <w:rPr>
+          <w:rStyle w:val="DataTypeTok"/>
+        </w:rPr>
+        <w:t xml:space="preserve">const</w:t>
+      </w:r>
+      <w:r>
+        <w:rPr>
+          <w:rStyle w:val="NormalTok"/>
+        </w:rPr>
+        <w:t xml:space="preserve"> </w:t>
+      </w:r>
+      <w:r>
+        <w:rPr>
+          <w:rStyle w:val="DataTypeTok"/>
+        </w:rPr>
+        <w:t xml:space="preserve">char</w:t>
+      </w:r>
+      <w:r>
+        <w:rPr>
+          <w:rStyle w:val="NormalTok"/>
+        </w:rPr>
+        <w:t xml:space="preserve"> </w:t>
+      </w:r>
+      <w:r>
+        <w:rPr>
+          <w:rStyle w:val="OperatorTok"/>
+        </w:rPr>
+        <w:t xml:space="preserve">*</w:t>
+      </w:r>
+      <w:r>
+        <w:rPr>
+          <w:rStyle w:val="NormalTok"/>
+        </w:rPr>
+        <w:t xml:space="preserve">code </w:t>
+      </w:r>
+      <w:r>
+        <w:rPr>
+          <w:rStyle w:val="OperatorTok"/>
+        </w:rPr>
+        <w:t xml:space="preserve">=</w:t>
+      </w:r>
+      <w:r>
+        <w:rPr>
+          <w:rStyle w:val="NormalTok"/>
+        </w:rPr>
+        <w:t xml:space="preserve"> locale_language </w:t>
+      </w:r>
+      <w:r>
+        <w:rPr>
+          <w:rStyle w:val="OperatorTok"/>
+        </w:rPr>
+        <w:t xml:space="preserve">();</w:t>
+      </w:r>
+      <w:r>
+        <w:rPr>
+          <w:rStyle w:val="NormalTok"/>
+        </w:rPr>
+        <w:t xml:space="preserve">                </w:t>
+      </w:r>
+      <w:r>
+        <w:rPr>
+          <w:rStyle w:val="CommentTok"/>
+        </w:rPr>
+        <w:t xml:space="preserve">// "en", "fr" (system.ini's language=; none: "en")</w:t>
+      </w:r>
+      <w:r>
+        <w:br/>
+      </w:r>
+      <w:r>
+        <w:rPr>
+          <w:rStyle w:val="ControlFlowTok"/>
+        </w:rPr>
+        <w:t xml:space="preserve">for</w:t>
+      </w:r>
+      <w:r>
+        <w:rPr>
+          <w:rStyle w:val="NormalTok"/>
+        </w:rPr>
+        <w:t xml:space="preserve"> </w:t>
+      </w:r>
+      <w:r>
+        <w:rPr>
+          <w:rStyle w:val="OperatorTok"/>
+        </w:rPr>
+        <w:t xml:space="preserve">(</w:t>
+      </w:r>
+      <w:r>
+        <w:rPr>
+          <w:rStyle w:val="DataTypeTok"/>
+        </w:rPr>
+        <w:t xml:space="preserve">int</w:t>
+      </w:r>
+      <w:r>
+        <w:rPr>
+          <w:rStyle w:val="NormalTok"/>
+        </w:rPr>
+        <w:t xml:space="preserve"> i </w:t>
+      </w:r>
+      <w:r>
+        <w:rPr>
+          <w:rStyle w:val="OperatorTok"/>
+        </w:rPr>
+        <w:t xml:space="preserve">=</w:t>
+      </w:r>
+      <w:r>
+        <w:rPr>
+          <w:rStyle w:val="NormalTok"/>
+        </w:rPr>
+        <w:t xml:space="preserve"> </w:t>
+      </w:r>
+      <w:r>
+        <w:rPr>
+          <w:rStyle w:val="DecValTok"/>
+        </w:rPr>
+        <w:t xml:space="preserve">0</w:t>
+      </w:r>
+      <w:r>
+        <w:rPr>
+          <w:rStyle w:val="OperatorTok"/>
+        </w:rPr>
+        <w:t xml:space="preserve">;</w:t>
+      </w:r>
+      <w:r>
+        <w:rPr>
+          <w:rStyle w:val="NormalTok"/>
+        </w:rPr>
+        <w:t xml:space="preserve"> i </w:t>
+      </w:r>
+      <w:r>
+        <w:rPr>
+          <w:rStyle w:val="OperatorTok"/>
+        </w:rPr>
+        <w:t xml:space="preserve">&lt;</w:t>
+      </w:r>
+      <w:r>
+        <w:rPr>
+          <w:rStyle w:val="NormalTok"/>
+        </w:rPr>
+        <w:t xml:space="preserve"> locale_language_count </w:t>
+      </w:r>
+      <w:r>
+        <w:rPr>
+          <w:rStyle w:val="OperatorTok"/>
+        </w:rPr>
+        <w:t xml:space="preserve">();</w:t>
+      </w:r>
+      <w:r>
+        <w:rPr>
+          <w:rStyle w:val="NormalTok"/>
+        </w:rPr>
+        <w:t xml:space="preserve"> i</w:t>
+      </w:r>
+      <w:r>
+        <w:rPr>
+          <w:rStyle w:val="OperatorTok"/>
+        </w:rPr>
+        <w:t xml:space="preserve">++)</w:t>
+      </w:r>
+      <w:r>
+        <w:rPr>
+          <w:rStyle w:val="NormalTok"/>
+        </w:rPr>
+        <w:t xml:space="preserve">    </w:t>
+      </w:r>
+      <w:r>
+        <w:rPr>
+          <w:rStyle w:val="CommentTok"/>
+        </w:rPr>
+        <w:t xml:space="preserve">// the languages Onyx speaks, each in its own words</w:t>
+      </w:r>
+      <w:r>
+        <w:br/>
+      </w:r>
+      <w:r>
+        <w:rPr>
+          <w:rStyle w:val="NormalTok"/>
+        </w:rPr>
+        <w:t xml:space="preserve">    list</w:t>
+      </w:r>
+      <w:r>
+        <w:rPr>
+          <w:rStyle w:val="OperatorTok"/>
+        </w:rPr>
+        <w:t xml:space="preserve">-&gt;</w:t>
+      </w:r>
+      <w:r>
+        <w:rPr>
+          <w:rStyle w:val="NormalTok"/>
+        </w:rPr>
+        <w:t xml:space="preserve">add </w:t>
+      </w:r>
+      <w:r>
+        <w:rPr>
+          <w:rStyle w:val="OperatorTok"/>
+        </w:rPr>
+        <w:t xml:space="preserve">(</w:t>
+      </w:r>
+      <w:r>
+        <w:rPr>
+          <w:rStyle w:val="NormalTok"/>
+        </w:rPr>
+        <w:t xml:space="preserve">locale_language_name </w:t>
+      </w:r>
+      <w:r>
+        <w:rPr>
+          <w:rStyle w:val="OperatorTok"/>
+        </w:rPr>
+        <w:t xml:space="preserve">(</w:t>
+      </w:r>
+      <w:r>
+        <w:rPr>
+          <w:rStyle w:val="NormalTok"/>
+        </w:rPr>
+        <w:t xml:space="preserve">i</w:t>
+      </w:r>
+      <w:r>
+        <w:rPr>
+          <w:rStyle w:val="OperatorTok"/>
+        </w:rPr>
+        <w:t xml:space="preserve">));</w:t>
+      </w:r>
+      <w:r>
+        <w:br/>
+      </w:r>
+      <w:r>
+        <w:rPr>
+          <w:rStyle w:val="NormalTok"/>
+        </w:rPr>
+        <w:t xml:space="preserve">locale_set_language </w:t>
+      </w:r>
+      <w:r>
+        <w:rPr>
+          <w:rStyle w:val="OperatorTok"/>
+        </w:rPr>
+        <w:t xml:space="preserve">(</w:t>
+      </w:r>
+      <w:r>
+        <w:rPr>
+          <w:rStyle w:val="StringTok"/>
+        </w:rPr>
+        <w:t xml:space="preserve">"fr"</w:t>
+      </w:r>
+      <w:r>
+        <w:rPr>
+          <w:rStyle w:val="OperatorTok"/>
+        </w:rPr>
+        <w:t xml:space="preserve">);</w:t>
+      </w:r>
+      <w:r>
+        <w:rPr>
+          <w:rStyle w:val="NormalTok"/>
+        </w:rPr>
+        <w:t xml:space="preserve">                           </w:t>
+      </w:r>
+      <w:r>
+        <w:rPr>
+          <w:rStyle w:val="CommentTok"/>
+        </w:rPr>
+        <w:t xml:space="preserve">// kept: the programs started next speak it</w:t>
+      </w:r>
+      <w:r>
+        <w:br/>
+      </w:r>
+      <w:r>
+        <w:rPr>
+          <w:rStyle w:val="NormalTok"/>
+        </w:rPr>
+        <w:t xml:space="preserve">locale_set_zone </w:t>
+      </w:r>
+      <w:r>
+        <w:rPr>
+          <w:rStyle w:val="OperatorTok"/>
+        </w:rPr>
+        <w:t xml:space="preserve">(</w:t>
+      </w:r>
+      <w:r>
+        <w:rPr>
+          <w:rStyle w:val="DecValTok"/>
+        </w:rPr>
+        <w:t xml:space="preserve">0</w:t>
+      </w:r>
+      <w:r>
+        <w:rPr>
+          <w:rStyle w:val="OperatorTok"/>
+        </w:rPr>
+        <w:t xml:space="preserve">);</w:t>
+      </w:r>
+      <w:r>
+        <w:rPr>
+          <w:rStyle w:val="NormalTok"/>
+        </w:rPr>
+        <w:t xml:space="preserve">                                  </w:t>
+      </w:r>
+      <w:r>
+        <w:rPr>
+          <w:rStyle w:val="CommentTok"/>
+        </w:rPr>
+        <w:t xml:space="preserve">// a time zone (locale_zone_count / _city / _offset): now, and kept</w:t>
+      </w:r>
+    </w:p>
     <w:tbl>
       <w:tblPr>
         <w:tblStyle w:val="Table"/>
@@ -12442,6 +12795,44 @@
           </w:p>
         </w:tc>
       </w:tr>
+      <w:tr>
+        <w:tc>
+          <w:tcPr/>
+          <w:p>
+            <w:pPr>
+              <w:pStyle w:val="Compact"/>
+              <w:jc w:val="left"/>
+            </w:pPr>
+            <w:r>
+              <w:rPr>
+                <w:rStyle w:val="VerbatimChar"/>
+              </w:rPr>
+              <w:t xml:space="preserve">locale.h</w:t>
+            </w:r>
+          </w:p>
+        </w:tc>
+        <w:tc>
+          <w:tcPr/>
+          <w:p>
+            <w:pPr>
+              <w:pStyle w:val="Compact"/>
+              <w:jc w:val="left"/>
+            </w:pPr>
+            <w:r>
+              <w:t xml:space="preserve">The system's language and time zone (</w:t>
+            </w:r>
+            <w:r>
+              <w:rPr>
+                <w:rStyle w:val="VerbatimChar"/>
+              </w:rPr>
+              <w:t xml:space="preserve">SD:/etc/system.ini</w:t>
+            </w:r>
+            <w:r>
+              <w:t xml:space="preserve">)</w:t>
+            </w:r>
+          </w:p>
+        </w:tc>
+      </w:tr>
     </w:tbl>
     <w:bookmarkEnd w:id="42"/>
     <w:bookmarkStart w:id="43" w:name="X21c5dfbcb5a69cd5c428264b88180cd193f70a2"/>
@@ -15387,6 +15778,676 @@
       </w:r>
       <w:r>
         <w:t xml:space="preserve">) instead of keeping its own list.</w:t>
+      </w:r>
+    </w:p>
+    <w:p>
+      <w:pPr>
+        <w:pStyle w:val="BodyText"/>
+      </w:pPr>
+      <w:r>
+        <w:rPr>
+          <w:bCs/>
+          <w:b/>
+        </w:rPr>
+        <w:t xml:space="preserve">A settings or progress file with sections, read and written back</w:t>
+      </w:r>
+      <w:r>
+        <w:t xml:space="preserve"> </w:t>
+      </w:r>
+      <w:r>
+        <w:t xml:space="preserve">(</w:t>
+      </w:r>
+      <w:r>
+        <w:rPr>
+          <w:rStyle w:val="VerbatimChar"/>
+        </w:rPr>
+        <w:t xml:space="preserve">filekit/kvtext.h</w:t>
+      </w:r>
+      <w:r>
+        <w:t xml:space="preserve">, C and C++): the</w:t>
+      </w:r>
+      <w:r>
+        <w:t xml:space="preserve"> </w:t>
+      </w:r>
+      <w:r>
+        <w:t xml:space="preserve">entries stay in the file's order, the keys a program does not know are kept, values may hold new lines.</w:t>
+      </w:r>
+    </w:p>
+    <w:p>
+      <w:pPr>
+        <w:pStyle w:val="SourceCode"/>
+      </w:pPr>
+      <w:r>
+        <w:rPr>
+          <w:rStyle w:val="NormalTok"/>
+        </w:rPr>
+        <w:t xml:space="preserve">fk_kv </w:t>
+      </w:r>
+      <w:r>
+        <w:rPr>
+          <w:rStyle w:val="OperatorTok"/>
+        </w:rPr>
+        <w:t xml:space="preserve">*</w:t>
+      </w:r>
+      <w:r>
+        <w:rPr>
+          <w:rStyle w:val="NormalTok"/>
+        </w:rPr>
+        <w:t xml:space="preserve">kv </w:t>
+      </w:r>
+      <w:r>
+        <w:rPr>
+          <w:rStyle w:val="OperatorTok"/>
+        </w:rPr>
+        <w:t xml:space="preserve">=</w:t>
+      </w:r>
+      <w:r>
+        <w:rPr>
+          <w:rStyle w:val="NormalTok"/>
+        </w:rPr>
+        <w:t xml:space="preserve"> fk_kv_load </w:t>
+      </w:r>
+      <w:r>
+        <w:rPr>
+          <w:rStyle w:val="OperatorTok"/>
+        </w:rPr>
+        <w:t xml:space="preserve">(</w:t>
+      </w:r>
+      <w:r>
+        <w:rPr>
+          <w:rStyle w:val="StringTok"/>
+        </w:rPr>
+        <w:t xml:space="preserve">"SD:/apps/game.app/progress.ini"</w:t>
+      </w:r>
+      <w:r>
+        <w:rPr>
+          <w:rStyle w:val="OperatorTok"/>
+        </w:rPr>
+        <w:t xml:space="preserve">,</w:t>
+      </w:r>
+      <w:r>
+        <w:rPr>
+          <w:rStyle w:val="NormalTok"/>
+        </w:rPr>
+        <w:t xml:space="preserve"> FK_KV_ESCAPES</w:t>
+      </w:r>
+      <w:r>
+        <w:rPr>
+          <w:rStyle w:val="OperatorTok"/>
+        </w:rPr>
+        <w:t xml:space="preserve">);</w:t>
+      </w:r>
+      <w:r>
+        <w:br/>
+      </w:r>
+      <w:r>
+        <w:rPr>
+          <w:rStyle w:val="ControlFlowTok"/>
+        </w:rPr>
+        <w:t xml:space="preserve">if</w:t>
+      </w:r>
+      <w:r>
+        <w:rPr>
+          <w:rStyle w:val="NormalTok"/>
+        </w:rPr>
+        <w:t xml:space="preserve"> </w:t>
+      </w:r>
+      <w:r>
+        <w:rPr>
+          <w:rStyle w:val="OperatorTok"/>
+        </w:rPr>
+        <w:t xml:space="preserve">(!</w:t>
+      </w:r>
+      <w:r>
+        <w:rPr>
+          <w:rStyle w:val="NormalTok"/>
+        </w:rPr>
+        <w:t xml:space="preserve">kv</w:t>
+      </w:r>
+      <w:r>
+        <w:rPr>
+          <w:rStyle w:val="OperatorTok"/>
+        </w:rPr>
+        <w:t xml:space="preserve">)</w:t>
+      </w:r>
+      <w:r>
+        <w:rPr>
+          <w:rStyle w:val="NormalTok"/>
+        </w:rPr>
+        <w:t xml:space="preserve"> kv </w:t>
+      </w:r>
+      <w:r>
+        <w:rPr>
+          <w:rStyle w:val="OperatorTok"/>
+        </w:rPr>
+        <w:t xml:space="preserve">=</w:t>
+      </w:r>
+      <w:r>
+        <w:rPr>
+          <w:rStyle w:val="NormalTok"/>
+        </w:rPr>
+        <w:t xml:space="preserve"> fk_kv_new </w:t>
+      </w:r>
+      <w:r>
+        <w:rPr>
+          <w:rStyle w:val="OperatorTok"/>
+        </w:rPr>
+        <w:t xml:space="preserve">(</w:t>
+      </w:r>
+      <w:r>
+        <w:rPr>
+          <w:rStyle w:val="NormalTok"/>
+        </w:rPr>
+        <w:t xml:space="preserve">FK_KV_ESCAPES</w:t>
+      </w:r>
+      <w:r>
+        <w:rPr>
+          <w:rStyle w:val="OperatorTok"/>
+        </w:rPr>
+        <w:t xml:space="preserve">);</w:t>
+      </w:r>
+      <w:r>
+        <w:rPr>
+          <w:rStyle w:val="NormalTok"/>
+        </w:rPr>
+        <w:t xml:space="preserve">                    </w:t>
+      </w:r>
+      <w:r>
+        <w:rPr>
+          <w:rStyle w:val="CommentTok"/>
+        </w:rPr>
+        <w:t xml:space="preserve">// no file yet: a fresh start</w:t>
+      </w:r>
+      <w:r>
+        <w:br/>
+      </w:r>
+      <w:r>
+        <w:rPr>
+          <w:rStyle w:val="DataTypeTok"/>
+        </w:rPr>
+        <w:t xml:space="preserve">int</w:t>
+      </w:r>
+      <w:r>
+        <w:rPr>
+          <w:rStyle w:val="NormalTok"/>
+        </w:rPr>
+        <w:t xml:space="preserve"> stars </w:t>
+      </w:r>
+      <w:r>
+        <w:rPr>
+          <w:rStyle w:val="OperatorTok"/>
+        </w:rPr>
+        <w:t xml:space="preserve">=</w:t>
+      </w:r>
+      <w:r>
+        <w:rPr>
+          <w:rStyle w:val="NormalTok"/>
+        </w:rPr>
+        <w:t xml:space="preserve"> atoi </w:t>
+      </w:r>
+      <w:r>
+        <w:rPr>
+          <w:rStyle w:val="OperatorTok"/>
+        </w:rPr>
+        <w:t xml:space="preserve">(</w:t>
+      </w:r>
+      <w:r>
+        <w:rPr>
+          <w:rStyle w:val="NormalTok"/>
+        </w:rPr>
+        <w:t xml:space="preserve">fk_kv_get </w:t>
+      </w:r>
+      <w:r>
+        <w:rPr>
+          <w:rStyle w:val="OperatorTok"/>
+        </w:rPr>
+        <w:t xml:space="preserve">(</w:t>
+      </w:r>
+      <w:r>
+        <w:rPr>
+          <w:rStyle w:val="NormalTok"/>
+        </w:rPr>
+        <w:t xml:space="preserve">kv</w:t>
+      </w:r>
+      <w:r>
+        <w:rPr>
+          <w:rStyle w:val="OperatorTok"/>
+        </w:rPr>
+        <w:t xml:space="preserve">,</w:t>
+      </w:r>
+      <w:r>
+        <w:rPr>
+          <w:rStyle w:val="NormalTok"/>
+        </w:rPr>
+        <w:t xml:space="preserve"> </w:t>
+      </w:r>
+      <w:r>
+        <w:rPr>
+          <w:rStyle w:val="StringTok"/>
+        </w:rPr>
+        <w:t xml:space="preserve">"Player"</w:t>
+      </w:r>
+      <w:r>
+        <w:rPr>
+          <w:rStyle w:val="OperatorTok"/>
+        </w:rPr>
+        <w:t xml:space="preserve">,</w:t>
+      </w:r>
+      <w:r>
+        <w:rPr>
+          <w:rStyle w:val="NormalTok"/>
+        </w:rPr>
+        <w:t xml:space="preserve"> </w:t>
+      </w:r>
+      <w:r>
+        <w:rPr>
+          <w:rStyle w:val="StringTok"/>
+        </w:rPr>
+        <w:t xml:space="preserve">"level1"</w:t>
+      </w:r>
+      <w:r>
+        <w:rPr>
+          <w:rStyle w:val="OperatorTok"/>
+        </w:rPr>
+        <w:t xml:space="preserve">,</w:t>
+      </w:r>
+      <w:r>
+        <w:rPr>
+          <w:rStyle w:val="NormalTok"/>
+        </w:rPr>
+        <w:t xml:space="preserve"> </w:t>
+      </w:r>
+      <w:r>
+        <w:rPr>
+          <w:rStyle w:val="StringTok"/>
+        </w:rPr>
+        <w:t xml:space="preserve">"0"</w:t>
+      </w:r>
+      <w:r>
+        <w:rPr>
+          <w:rStyle w:val="OperatorTok"/>
+        </w:rPr>
+        <w:t xml:space="preserve">));</w:t>
+      </w:r>
+      <w:r>
+        <w:br/>
+      </w:r>
+      <w:r>
+        <w:rPr>
+          <w:rStyle w:val="NormalTok"/>
+        </w:rPr>
+        <w:t xml:space="preserve">fk_kv_set </w:t>
+      </w:r>
+      <w:r>
+        <w:rPr>
+          <w:rStyle w:val="OperatorTok"/>
+        </w:rPr>
+        <w:t xml:space="preserve">(</w:t>
+      </w:r>
+      <w:r>
+        <w:rPr>
+          <w:rStyle w:val="NormalTok"/>
+        </w:rPr>
+        <w:t xml:space="preserve">kv</w:t>
+      </w:r>
+      <w:r>
+        <w:rPr>
+          <w:rStyle w:val="OperatorTok"/>
+        </w:rPr>
+        <w:t xml:space="preserve">,</w:t>
+      </w:r>
+      <w:r>
+        <w:rPr>
+          <w:rStyle w:val="NormalTok"/>
+        </w:rPr>
+        <w:t xml:space="preserve"> </w:t>
+      </w:r>
+      <w:r>
+        <w:rPr>
+          <w:rStyle w:val="StringTok"/>
+        </w:rPr>
+        <w:t xml:space="preserve">"Player"</w:t>
+      </w:r>
+      <w:r>
+        <w:rPr>
+          <w:rStyle w:val="OperatorTok"/>
+        </w:rPr>
+        <w:t xml:space="preserve">,</w:t>
+      </w:r>
+      <w:r>
+        <w:rPr>
+          <w:rStyle w:val="NormalTok"/>
+        </w:rPr>
+        <w:t xml:space="preserve"> </w:t>
+      </w:r>
+      <w:r>
+        <w:rPr>
+          <w:rStyle w:val="StringTok"/>
+        </w:rPr>
+        <w:t xml:space="preserve">"level1"</w:t>
+      </w:r>
+      <w:r>
+        <w:rPr>
+          <w:rStyle w:val="OperatorTok"/>
+        </w:rPr>
+        <w:t xml:space="preserve">,</w:t>
+      </w:r>
+      <w:r>
+        <w:rPr>
+          <w:rStyle w:val="NormalTok"/>
+        </w:rPr>
+        <w:t xml:space="preserve"> </w:t>
+      </w:r>
+      <w:r>
+        <w:rPr>
+          <w:rStyle w:val="StringTok"/>
+        </w:rPr>
+        <w:t xml:space="preserve">"3"</w:t>
+      </w:r>
+      <w:r>
+        <w:rPr>
+          <w:rStyle w:val="OperatorTok"/>
+        </w:rPr>
+        <w:t xml:space="preserve">);</w:t>
+      </w:r>
+      <w:r>
+        <w:br/>
+      </w:r>
+      <w:r>
+        <w:rPr>
+          <w:rStyle w:val="NormalTok"/>
+        </w:rPr>
+        <w:t xml:space="preserve">fk_kv_set </w:t>
+      </w:r>
+      <w:r>
+        <w:rPr>
+          <w:rStyle w:val="OperatorTok"/>
+        </w:rPr>
+        <w:t xml:space="preserve">(</w:t>
+      </w:r>
+      <w:r>
+        <w:rPr>
+          <w:rStyle w:val="NormalTok"/>
+        </w:rPr>
+        <w:t xml:space="preserve">kv</w:t>
+      </w:r>
+      <w:r>
+        <w:rPr>
+          <w:rStyle w:val="OperatorTok"/>
+        </w:rPr>
+        <w:t xml:space="preserve">,</w:t>
+      </w:r>
+      <w:r>
+        <w:rPr>
+          <w:rStyle w:val="NormalTok"/>
+        </w:rPr>
+        <w:t xml:space="preserve"> </w:t>
+      </w:r>
+      <w:r>
+        <w:rPr>
+          <w:rStyle w:val="StringTok"/>
+        </w:rPr>
+        <w:t xml:space="preserve">""</w:t>
+      </w:r>
+      <w:r>
+        <w:rPr>
+          <w:rStyle w:val="OperatorTok"/>
+        </w:rPr>
+        <w:t xml:space="preserve">,</w:t>
+      </w:r>
+      <w:r>
+        <w:rPr>
+          <w:rStyle w:val="NormalTok"/>
+        </w:rPr>
+        <w:t xml:space="preserve"> </w:t>
+      </w:r>
+      <w:r>
+        <w:rPr>
+          <w:rStyle w:val="StringTok"/>
+        </w:rPr>
+        <w:t xml:space="preserve">"last"</w:t>
+      </w:r>
+      <w:r>
+        <w:rPr>
+          <w:rStyle w:val="OperatorTok"/>
+        </w:rPr>
+        <w:t xml:space="preserve">,</w:t>
+      </w:r>
+      <w:r>
+        <w:rPr>
+          <w:rStyle w:val="NormalTok"/>
+        </w:rPr>
+        <w:t xml:space="preserve"> </w:t>
+      </w:r>
+      <w:r>
+        <w:rPr>
+          <w:rStyle w:val="StringTok"/>
+        </w:rPr>
+        <w:t xml:space="preserve">"level1"</w:t>
+      </w:r>
+      <w:r>
+        <w:rPr>
+          <w:rStyle w:val="OperatorTok"/>
+        </w:rPr>
+        <w:t xml:space="preserve">);</w:t>
+      </w:r>
+      <w:r>
+        <w:rPr>
+          <w:rStyle w:val="NormalTok"/>
+        </w:rPr>
+        <w:t xml:space="preserve">                       </w:t>
+      </w:r>
+      <w:r>
+        <w:rPr>
+          <w:rStyle w:val="CommentTok"/>
+        </w:rPr>
+        <w:t xml:space="preserve">// "": before the first [header]</w:t>
+      </w:r>
+      <w:r>
+        <w:br/>
+      </w:r>
+      <w:r>
+        <w:rPr>
+          <w:rStyle w:val="NormalTok"/>
+        </w:rPr>
+        <w:t xml:space="preserve">fk_kv_save </w:t>
+      </w:r>
+      <w:r>
+        <w:rPr>
+          <w:rStyle w:val="OperatorTok"/>
+        </w:rPr>
+        <w:t xml:space="preserve">(</w:t>
+      </w:r>
+      <w:r>
+        <w:rPr>
+          <w:rStyle w:val="NormalTok"/>
+        </w:rPr>
+        <w:t xml:space="preserve">kv</w:t>
+      </w:r>
+      <w:r>
+        <w:rPr>
+          <w:rStyle w:val="OperatorTok"/>
+        </w:rPr>
+        <w:t xml:space="preserve">,</w:t>
+      </w:r>
+      <w:r>
+        <w:rPr>
+          <w:rStyle w:val="NormalTok"/>
+        </w:rPr>
+        <w:t xml:space="preserve"> </w:t>
+      </w:r>
+      <w:r>
+        <w:rPr>
+          <w:rStyle w:val="StringTok"/>
+        </w:rPr>
+        <w:t xml:space="preserve">"SD:/apps/game.app/progress.ini"</w:t>
+      </w:r>
+      <w:r>
+        <w:rPr>
+          <w:rStyle w:val="OperatorTok"/>
+        </w:rPr>
+        <w:t xml:space="preserve">,</w:t>
+      </w:r>
+      <w:r>
+        <w:rPr>
+          <w:rStyle w:val="NormalTok"/>
+        </w:rPr>
+        <w:t xml:space="preserve"> </w:t>
+      </w:r>
+      <w:r>
+        <w:rPr>
+          <w:rStyle w:val="StringTok"/>
+        </w:rPr>
+        <w:t xml:space="preserve">"# my game's progress"</w:t>
+      </w:r>
+      <w:r>
+        <w:rPr>
+          <w:rStyle w:val="OperatorTok"/>
+        </w:rPr>
+        <w:t xml:space="preserve">);</w:t>
+      </w:r>
+      <w:r>
+        <w:br/>
+      </w:r>
+      <w:r>
+        <w:rPr>
+          <w:rStyle w:val="NormalTok"/>
+        </w:rPr>
+        <w:t xml:space="preserve">fk_kv_free </w:t>
+      </w:r>
+      <w:r>
+        <w:rPr>
+          <w:rStyle w:val="OperatorTok"/>
+        </w:rPr>
+        <w:t xml:space="preserve">(</w:t>
+      </w:r>
+      <w:r>
+        <w:rPr>
+          <w:rStyle w:val="NormalTok"/>
+        </w:rPr>
+        <w:t xml:space="preserve">kv</w:t>
+      </w:r>
+      <w:r>
+        <w:rPr>
+          <w:rStyle w:val="OperatorTok"/>
+        </w:rPr>
+        <w:t xml:space="preserve">);</w:t>
+      </w:r>
+    </w:p>
+    <w:p>
+      <w:pPr>
+        <w:pStyle w:val="FirstParagraph"/>
+      </w:pPr>
+      <w:r>
+        <w:t xml:space="preserve">A level pack (</w:t>
+      </w:r>
+      <w:r>
+        <w:rPr>
+          <w:rStyle w:val="VerbatimChar"/>
+        </w:rPr>
+        <w:t xml:space="preserve">FK_KV_PIPES</w:t>
+      </w:r>
+      <w:r>
+        <w:t xml:space="preserve">): many</w:t>
+      </w:r>
+      <w:r>
+        <w:t xml:space="preserve"> </w:t>
+      </w:r>
+      <w:r>
+        <w:rPr>
+          <w:rStyle w:val="VerbatimChar"/>
+        </w:rPr>
+        <w:t xml:space="preserve">[level]</w:t>
+      </w:r>
+      <w:r>
+        <w:t xml:space="preserve"> </w:t>
+      </w:r>
+      <w:r>
+        <w:t xml:space="preserve">blocks (</w:t>
+      </w:r>
+      <w:r>
+        <w:rPr>
+          <w:rStyle w:val="VerbatimChar"/>
+        </w:rPr>
+        <w:t xml:space="preserve">fk_kv_block</w:t>
+      </w:r>
+      <w:r>
+        <w:t xml:space="preserve">,</w:t>
+      </w:r>
+      <w:r>
+        <w:t xml:space="preserve"> </w:t>
+      </w:r>
+      <w:r>
+        <w:rPr>
+          <w:rStyle w:val="VerbatimChar"/>
+        </w:rPr>
+        <w:t xml:space="preserve">fk_kv_blocks</w:t>
+      </w:r>
+      <w:r>
+        <w:t xml:space="preserve">,</w:t>
+      </w:r>
+      <w:r>
+        <w:t xml:space="preserve"> </w:t>
+      </w:r>
+      <w:r>
+        <w:rPr>
+          <w:rStyle w:val="VerbatimChar"/>
+        </w:rPr>
+        <w:t xml:space="preserve">fk_kv_block_name</w:t>
+      </w:r>
+      <w:r>
+        <w:t xml:space="preserve">), a value</w:t>
+      </w:r>
+      <w:r>
+        <w:t xml:space="preserve"> </w:t>
+      </w:r>
+      <w:r>
+        <w:t xml:space="preserve">going on over the</w:t>
+      </w:r>
+      <w:r>
+        <w:t xml:space="preserve"> </w:t>
+      </w:r>
+      <w:r>
+        <w:rPr>
+          <w:rStyle w:val="VerbatimChar"/>
+        </w:rPr>
+        <w:t xml:space="preserve">|</w:t>
+      </w:r>
+      <w:r>
+        <w:t xml:space="preserve"> </w:t>
+      </w:r>
+      <w:r>
+        <w:t xml:space="preserve">lines that follow, and the line of each value (</w:t>
+      </w:r>
+      <w:r>
+        <w:rPr>
+          <w:rStyle w:val="VerbatimChar"/>
+        </w:rPr>
+        <w:t xml:space="preserve">fk_kv_line</w:t>
+      </w:r>
+      <w:r>
+        <w:t xml:space="preserve">) for an error message. Circuits</w:t>
+      </w:r>
+      <w:r>
+        <w:t xml:space="preserve"> </w:t>
+      </w:r>
+      <w:r>
+        <w:t xml:space="preserve">reads its packs and its</w:t>
+      </w:r>
+      <w:r>
+        <w:t xml:space="preserve"> </w:t>
+      </w:r>
+      <w:r>
+        <w:rPr>
+          <w:rStyle w:val="VerbatimChar"/>
+        </w:rPr>
+        <w:t xml:space="preserve">progress.ini</w:t>
+      </w:r>
+      <w:r>
+        <w:t xml:space="preserve"> </w:t>
+      </w:r>
+      <w:r>
+        <w:t xml:space="preserve">so.</w:t>
       </w:r>
     </w:p>
     <w:bookmarkEnd w:id="44"/>
@@ -21886,7 +22947,7 @@
               <w:jc w:val="left"/>
             </w:pPr>
             <w:r>
-              <w:t xml:space="preserve">print to the console</w:t>
+              <w:t xml:space="preserve">read and write a settings / progress file with sections</w:t>
             </w:r>
           </w:p>
         </w:tc>
@@ -21898,7 +22959,7 @@
               <w:jc w:val="left"/>
             </w:pPr>
             <w:r>
-              <w:t xml:space="preserve">AppKit</w:t>
+              <w:t xml:space="preserve">FileKit</w:t>
             </w:r>
           </w:p>
         </w:tc>
@@ -21913,7 +22974,7 @@
               <w:rPr>
                 <w:rStyle w:val="VerbatimChar"/>
               </w:rPr>
-              <w:t xml:space="preserve">ax_puts</w:t>
+              <w:t xml:space="preserve">fk_kv_load</w:t>
             </w:r>
             <w:r>
               <w:t xml:space="preserve">,</w:t>
@@ -21925,7 +22986,19 @@
               <w:rPr>
                 <w:rStyle w:val="VerbatimChar"/>
               </w:rPr>
-              <w:t xml:space="preserve">ax_putln</w:t>
+              <w:t xml:space="preserve">fk_kv_set</w:t>
+            </w:r>
+            <w:r>
+              <w:t xml:space="preserve">,</w:t>
+            </w:r>
+            <w:r>
+              <w:t xml:space="preserve"> </w:t>
+            </w:r>
+            <w:r>
+              <w:rPr>
+                <w:rStyle w:val="VerbatimChar"/>
+              </w:rPr>
+              <w:t xml:space="preserve">fk_kv_save</w:t>
             </w:r>
           </w:p>
         </w:tc>
@@ -21939,22 +23012,7 @@
               <w:jc w:val="left"/>
             </w:pPr>
             <w:r>
-              <w:t xml:space="preserve">read an</w:t>
-            </w:r>
-            <w:r>
-              <w:t xml:space="preserve"> </w:t>
-            </w:r>
-            <w:r>
-              <w:rPr>
-                <w:rStyle w:val="VerbatimChar"/>
-              </w:rPr>
-              <w:t xml:space="preserve">.ini</w:t>
-            </w:r>
-            <w:r>
-              <w:t xml:space="preserve"> </w:t>
-            </w:r>
-            <w:r>
-              <w:t xml:space="preserve">file</w:t>
+              <w:t xml:space="preserve">print to the console</w:t>
             </w:r>
           </w:p>
         </w:tc>
@@ -21981,7 +23039,7 @@
               <w:rPr>
                 <w:rStyle w:val="VerbatimChar"/>
               </w:rPr>
-              <w:t xml:space="preserve">app_ini_load</w:t>
+              <w:t xml:space="preserve">ax_puts</w:t>
             </w:r>
             <w:r>
               <w:t xml:space="preserve">,</w:t>
@@ -21993,7 +23051,7 @@
               <w:rPr>
                 <w:rStyle w:val="VerbatimChar"/>
               </w:rPr>
-              <w:t xml:space="preserve">app_ini_get</w:t>
+              <w:t xml:space="preserve">ax_putln</w:t>
             </w:r>
           </w:p>
         </w:tc>
@@ -22007,7 +23065,22 @@
               <w:jc w:val="left"/>
             </w:pPr>
             <w:r>
-              <w:t xml:space="preserve">start another program</w:t>
+              <w:t xml:space="preserve">read an</w:t>
+            </w:r>
+            <w:r>
+              <w:t xml:space="preserve"> </w:t>
+            </w:r>
+            <w:r>
+              <w:rPr>
+                <w:rStyle w:val="VerbatimChar"/>
+              </w:rPr>
+              <w:t xml:space="preserve">.ini</w:t>
+            </w:r>
+            <w:r>
+              <w:t xml:space="preserve"> </w:t>
+            </w:r>
+            <w:r>
+              <w:t xml:space="preserve">file</w:t>
             </w:r>
           </w:p>
         </w:tc>
@@ -22034,7 +23107,7 @@
               <w:rPr>
                 <w:rStyle w:val="VerbatimChar"/>
               </w:rPr>
-              <w:t xml:space="preserve">lx_launch</w:t>
+              <w:t xml:space="preserve">app_ini_load</w:t>
             </w:r>
             <w:r>
               <w:t xml:space="preserve">,</w:t>
@@ -22046,7 +23119,7 @@
               <w:rPr>
                 <w:rStyle w:val="VerbatimChar"/>
               </w:rPr>
-              <w:t xml:space="preserve">lx_open</w:t>
+              <w:t xml:space="preserve">app_ini_get</w:t>
             </w:r>
           </w:p>
         </w:tc>
@@ -22060,7 +23133,7 @@
               <w:jc w:val="left"/>
             </w:pPr>
             <w:r>
-              <w:t xml:space="preserve">open a window with widgets</w:t>
+              <w:t xml:space="preserve">start another program</w:t>
             </w:r>
           </w:p>
         </w:tc>
@@ -22072,7 +23145,7 @@
               <w:jc w:val="left"/>
             </w:pPr>
             <w:r>
-              <w:t xml:space="preserve">UIKit</w:t>
+              <w:t xml:space="preserve">AppKit</w:t>
             </w:r>
           </w:p>
         </w:tc>
@@ -22087,7 +23160,7 @@
               <w:rPr>
                 <w:rStyle w:val="VerbatimChar"/>
               </w:rPr>
-              <w:t xml:space="preserve">Root</w:t>
+              <w:t xml:space="preserve">lx_launch</w:t>
             </w:r>
             <w:r>
               <w:t xml:space="preserve">,</w:t>
@@ -22099,22 +23172,7 @@
               <w:rPr>
                 <w:rStyle w:val="VerbatimChar"/>
               </w:rPr>
-              <w:t xml:space="preserve">Label</w:t>
-            </w:r>
-            <w:r>
-              <w:t xml:space="preserve">,</w:t>
-            </w:r>
-            <w:r>
-              <w:t xml:space="preserve"> </w:t>
-            </w:r>
-            <w:r>
-              <w:rPr>
-                <w:rStyle w:val="VerbatimChar"/>
-              </w:rPr>
-              <w:t xml:space="preserve">Button</w:t>
-            </w:r>
-            <w:r>
-              <w:t xml:space="preserve">…</w:t>
+              <w:t xml:space="preserve">lx_open</w:t>
             </w:r>
           </w:p>
         </w:tc>
@@ -22128,7 +23186,7 @@
               <w:jc w:val="left"/>
             </w:pPr>
             <w:r>
-              <w:t xml:space="preserve">ask the user (message, file, colour)</w:t>
+              <w:t xml:space="preserve">open a window with widgets</w:t>
             </w:r>
           </w:p>
         </w:tc>
@@ -22155,7 +23213,7 @@
               <w:rPr>
                 <w:rStyle w:val="VerbatimChar"/>
               </w:rPr>
-              <w:t xml:space="preserve">uk_messagebox</w:t>
+              <w:t xml:space="preserve">Root</w:t>
             </w:r>
             <w:r>
               <w:t xml:space="preserve">,</w:t>
@@ -22167,7 +23225,7 @@
               <w:rPr>
                 <w:rStyle w:val="VerbatimChar"/>
               </w:rPr>
-              <w:t xml:space="preserve">uk_file_open</w:t>
+              <w:t xml:space="preserve">Label</w:t>
             </w:r>
             <w:r>
               <w:t xml:space="preserve">,</w:t>
@@ -22179,7 +23237,10 @@
               <w:rPr>
                 <w:rStyle w:val="VerbatimChar"/>
               </w:rPr>
-              <w:t xml:space="preserve">uk_color_dialog</w:t>
+              <w:t xml:space="preserve">Button</w:t>
+            </w:r>
+            <w:r>
+              <w:t xml:space="preserve">…</w:t>
             </w:r>
           </w:p>
         </w:tc>
@@ -22193,7 +23254,7 @@
               <w:jc w:val="left"/>
             </w:pPr>
             <w:r>
-              <w:t xml:space="preserve">load an icon</w:t>
+              <w:t xml:space="preserve">ask the user (message, file, colour)</w:t>
             </w:r>
           </w:p>
         </w:tc>
@@ -22220,7 +23281,31 @@
               <w:rPr>
                 <w:rStyle w:val="VerbatimChar"/>
               </w:rPr>
-              <w:t xml:space="preserve">ui::icon_load</w:t>
+              <w:t xml:space="preserve">uk_messagebox</w:t>
+            </w:r>
+            <w:r>
+              <w:t xml:space="preserve">,</w:t>
+            </w:r>
+            <w:r>
+              <w:t xml:space="preserve"> </w:t>
+            </w:r>
+            <w:r>
+              <w:rPr>
+                <w:rStyle w:val="VerbatimChar"/>
+              </w:rPr>
+              <w:t xml:space="preserve">uk_file_open</w:t>
+            </w:r>
+            <w:r>
+              <w:t xml:space="preserve">,</w:t>
+            </w:r>
+            <w:r>
+              <w:t xml:space="preserve"> </w:t>
+            </w:r>
+            <w:r>
+              <w:rPr>
+                <w:rStyle w:val="VerbatimChar"/>
+              </w:rPr>
+              <w:t xml:space="preserve">uk_color_dialog</w:t>
             </w:r>
           </w:p>
         </w:tc>
@@ -22234,7 +23319,7 @@
               <w:jc w:val="left"/>
             </w:pPr>
             <w:r>
-              <w:t xml:space="preserve">show a notification</w:t>
+              <w:t xml:space="preserve">load an icon</w:t>
             </w:r>
           </w:p>
         </w:tc>
@@ -22246,7 +23331,7 @@
               <w:jc w:val="left"/>
             </w:pPr>
             <w:r>
-              <w:t xml:space="preserve">SystemKit</w:t>
+              <w:t xml:space="preserve">UIKit</w:t>
             </w:r>
           </w:p>
         </w:tc>
@@ -22261,19 +23346,7 @@
               <w:rPr>
                 <w:rStyle w:val="VerbatimChar"/>
               </w:rPr>
-              <w:t xml:space="preserve">notify</w:t>
-            </w:r>
-            <w:r>
-              <w:t xml:space="preserve">,</w:t>
-            </w:r>
-            <w:r>
-              <w:t xml:space="preserve"> </w:t>
-            </w:r>
-            <w:r>
-              <w:rPr>
-                <w:rStyle w:val="VerbatimChar"/>
-              </w:rPr>
-              <w:t xml:space="preserve">notify_action</w:t>
+              <w:t xml:space="preserve">ui::icon_load</w:t>
             </w:r>
           </w:p>
         </w:tc>
@@ -22287,7 +23360,7 @@
               <w:jc w:val="left"/>
             </w:pPr>
             <w:r>
-              <w:t xml:space="preserve">copy / paste</w:t>
+              <w:t xml:space="preserve">show a notification</w:t>
             </w:r>
           </w:p>
         </w:tc>
@@ -22314,6 +23387,59 @@
               <w:rPr>
                 <w:rStyle w:val="VerbatimChar"/>
               </w:rPr>
+              <w:t xml:space="preserve">notify</w:t>
+            </w:r>
+            <w:r>
+              <w:t xml:space="preserve">,</w:t>
+            </w:r>
+            <w:r>
+              <w:t xml:space="preserve"> </w:t>
+            </w:r>
+            <w:r>
+              <w:rPr>
+                <w:rStyle w:val="VerbatimChar"/>
+              </w:rPr>
+              <w:t xml:space="preserve">notify_action</w:t>
+            </w:r>
+          </w:p>
+        </w:tc>
+      </w:tr>
+      <w:tr>
+        <w:tc>
+          <w:tcPr/>
+          <w:p>
+            <w:pPr>
+              <w:pStyle w:val="Compact"/>
+              <w:jc w:val="left"/>
+            </w:pPr>
+            <w:r>
+              <w:t xml:space="preserve">copy / paste</w:t>
+            </w:r>
+          </w:p>
+        </w:tc>
+        <w:tc>
+          <w:tcPr/>
+          <w:p>
+            <w:pPr>
+              <w:pStyle w:val="Compact"/>
+              <w:jc w:val="left"/>
+            </w:pPr>
+            <w:r>
+              <w:t xml:space="preserve">SystemKit</w:t>
+            </w:r>
+          </w:p>
+        </w:tc>
+        <w:tc>
+          <w:tcPr/>
+          <w:p>
+            <w:pPr>
+              <w:pStyle w:val="Compact"/>
+              <w:jc w:val="left"/>
+            </w:pPr>
+            <w:r>
+              <w:rPr>
+                <w:rStyle w:val="VerbatimChar"/>
+              </w:rPr>
               <w:t xml:space="preserve">clip_set_text</w:t>
             </w:r>
             <w:r>
@@ -22327,6 +23453,74 @@
                 <w:rStyle w:val="VerbatimChar"/>
               </w:rPr>
               <w:t xml:space="preserve">clip_get_text</w:t>
+            </w:r>
+          </w:p>
+        </w:tc>
+      </w:tr>
+      <w:tr>
+        <w:tc>
+          <w:tcPr/>
+          <w:p>
+            <w:pPr>
+              <w:pStyle w:val="Compact"/>
+              <w:jc w:val="left"/>
+            </w:pPr>
+            <w:r>
+              <w:t xml:space="preserve">know the system's language</w:t>
+            </w:r>
+          </w:p>
+        </w:tc>
+        <w:tc>
+          <w:tcPr/>
+          <w:p>
+            <w:pPr>
+              <w:pStyle w:val="Compact"/>
+              <w:jc w:val="left"/>
+            </w:pPr>
+            <w:r>
+              <w:t xml:space="preserve">SystemKit (UIKit's</w:t>
+            </w:r>
+            <w:r>
+              <w:t xml:space="preserve"> </w:t>
+            </w:r>
+            <w:r>
+              <w:rPr>
+                <w:rStyle w:val="VerbatimChar"/>
+              </w:rPr>
+              <w:t xml:space="preserve">TR ()</w:t>
+            </w:r>
+            <w:r>
+              <w:t xml:space="preserve"> </w:t>
+            </w:r>
+            <w:r>
+              <w:t xml:space="preserve">for the words)</w:t>
+            </w:r>
+          </w:p>
+        </w:tc>
+        <w:tc>
+          <w:tcPr/>
+          <w:p>
+            <w:pPr>
+              <w:pStyle w:val="Compact"/>
+              <w:jc w:val="left"/>
+            </w:pPr>
+            <w:r>
+              <w:rPr>
+                <w:rStyle w:val="VerbatimChar"/>
+              </w:rPr>
+              <w:t xml:space="preserve">locale_language</w:t>
+            </w:r>
+            <w:r>
+              <w:t xml:space="preserve">,</w:t>
+            </w:r>
+            <w:r>
+              <w:t xml:space="preserve"> </w:t>
+            </w:r>
+            <w:r>
+              <w:rPr>
+                <w:rStyle w:val="VerbatimChar"/>
+              </w:rPr>
+              <w:t xml:space="preserve">uk_lang_init</w:t>
             </w:r>
           </w:p>
         </w:tc>

</xml_diff>

<commit_message>
AutoDev round 6: docs exports of 06, 12 and 14 regenerated (build_docs.py)
Co-Authored-By: Claude Opus 5.5 <noreply@anthropic.com>
Claude-Session: https://claude.ai/code/session_01DvjGxTXhJuNry8i8kyXruM
</commit_message>
<xml_diff>
--- a/docs/exports/06-KITS-GUIDE.docx
+++ b/docs/exports/06-KITS-GUIDE.docx
@@ -13347,6 +13347,604 @@
         <w:t xml:space="preserve">// a time zone (locale_zone_count / _city / _offset): now, and kept</w:t>
       </w:r>
     </w:p>
+    <w:p>
+      <w:pPr>
+        <w:pStyle w:val="FirstParagraph"/>
+      </w:pPr>
+      <w:r>
+        <w:rPr>
+          <w:bCs/>
+          <w:b/>
+        </w:rPr>
+        <w:t xml:space="preserve">The time zones at an instant</w:t>
+      </w:r>
+      <w:r>
+        <w:t xml:space="preserve"> </w:t>
+      </w:r>
+      <w:r>
+        <w:t xml:space="preserve">(the Clock's World tab):</w:t>
+      </w:r>
+      <w:r>
+        <w:t xml:space="preserve"> </w:t>
+      </w:r>
+      <w:r>
+        <w:rPr>
+          <w:rStyle w:val="VerbatimChar"/>
+        </w:rPr>
+        <w:t xml:space="preserve">locale_zone_offset (z)</w:t>
+      </w:r>
+      <w:r>
+        <w:t xml:space="preserve"> </w:t>
+      </w:r>
+      <w:r>
+        <w:t xml:space="preserve">judges the summer time by</w:t>
+      </w:r>
+      <w:r>
+        <w:t xml:space="preserve"> </w:t>
+      </w:r>
+      <w:r>
+        <w:t xml:space="preserve">today's date only;</w:t>
+      </w:r>
+      <w:r>
+        <w:t xml:space="preserve"> </w:t>
+      </w:r>
+      <w:r>
+        <w:rPr>
+          <w:rStyle w:val="VerbatimChar"/>
+        </w:rPr>
+        <w:t xml:space="preserve">locale_zone_offset_at (z, utc_minutes)</w:t>
+      </w:r>
+      <w:r>
+        <w:t xml:space="preserve"> </w:t>
+      </w:r>
+      <w:r>
+        <w:t xml:space="preserve">gives a zone's offset at an exact instant, the hour of</w:t>
+      </w:r>
+      <w:r>
+        <w:t xml:space="preserve"> </w:t>
+      </w:r>
+      <w:r>
+        <w:t xml:space="preserve">the change counted (the EU's at 01:00 UTC, the US' at 02:00 local) — a city's time is its UTC plus that offset,</w:t>
+      </w:r>
+      <w:r>
+        <w:t xml:space="preserve"> </w:t>
+      </w:r>
+      <w:r>
+        <w:t xml:space="preserve">right on the night of a change whatever the local day says:</w:t>
+      </w:r>
+    </w:p>
+    <w:p>
+      <w:pPr>
+        <w:pStyle w:val="SourceCode"/>
+      </w:pPr>
+      <w:r>
+        <w:rPr>
+          <w:rStyle w:val="KeywordTok"/>
+        </w:rPr>
+        <w:t xml:space="preserve">struct</w:t>
+      </w:r>
+      <w:r>
+        <w:rPr>
+          <w:rStyle w:val="NormalTok"/>
+        </w:rPr>
+        <w:t xml:space="preserve"> kapi_clock_info ci</w:t>
+      </w:r>
+      <w:r>
+        <w:rPr>
+          <w:rStyle w:val="OperatorTok"/>
+        </w:rPr>
+        <w:t xml:space="preserve">;</w:t>
+      </w:r>
+      <w:r>
+        <w:br/>
+      </w:r>
+      <w:r>
+        <w:rPr>
+          <w:rStyle w:val="ControlFlowTok"/>
+        </w:rPr>
+        <w:t xml:space="preserve">if</w:t>
+      </w:r>
+      <w:r>
+        <w:rPr>
+          <w:rStyle w:val="NormalTok"/>
+        </w:rPr>
+        <w:t xml:space="preserve"> </w:t>
+      </w:r>
+      <w:r>
+        <w:rPr>
+          <w:rStyle w:val="OperatorTok"/>
+        </w:rPr>
+        <w:t xml:space="preserve">(</w:t>
+      </w:r>
+      <w:r>
+        <w:rPr>
+          <w:rStyle w:val="NormalTok"/>
+        </w:rPr>
+        <w:t xml:space="preserve">kapi_clock_info </w:t>
+      </w:r>
+      <w:r>
+        <w:rPr>
+          <w:rStyle w:val="OperatorTok"/>
+        </w:rPr>
+        <w:t xml:space="preserve">(&amp;</w:t>
+      </w:r>
+      <w:r>
+        <w:rPr>
+          <w:rStyle w:val="NormalTok"/>
+        </w:rPr>
+        <w:t xml:space="preserve">ci</w:t>
+      </w:r>
+      <w:r>
+        <w:rPr>
+          <w:rStyle w:val="OperatorTok"/>
+        </w:rPr>
+        <w:t xml:space="preserve">)</w:t>
+      </w:r>
+      <w:r>
+        <w:rPr>
+          <w:rStyle w:val="NormalTok"/>
+        </w:rPr>
+        <w:t xml:space="preserve"> </w:t>
+      </w:r>
+      <w:r>
+        <w:rPr>
+          <w:rStyle w:val="OperatorTok"/>
+        </w:rPr>
+        <w:t xml:space="preserve">==</w:t>
+      </w:r>
+      <w:r>
+        <w:rPr>
+          <w:rStyle w:val="NormalTok"/>
+        </w:rPr>
+        <w:t xml:space="preserve"> </w:t>
+      </w:r>
+      <w:r>
+        <w:rPr>
+          <w:rStyle w:val="DecValTok"/>
+        </w:rPr>
+        <w:t xml:space="preserve">0</w:t>
+      </w:r>
+      <w:r>
+        <w:rPr>
+          <w:rStyle w:val="NormalTok"/>
+        </w:rPr>
+        <w:t xml:space="preserve"> </w:t>
+      </w:r>
+      <w:r>
+        <w:rPr>
+          <w:rStyle w:val="OperatorTok"/>
+        </w:rPr>
+        <w:t xml:space="preserve">&amp;&amp;</w:t>
+      </w:r>
+      <w:r>
+        <w:rPr>
+          <w:rStyle w:val="NormalTok"/>
+        </w:rPr>
+        <w:t xml:space="preserve"> </w:t>
+      </w:r>
+      <w:r>
+        <w:rPr>
+          <w:rStyle w:val="OperatorTok"/>
+        </w:rPr>
+        <w:t xml:space="preserve">(</w:t>
+      </w:r>
+      <w:r>
+        <w:rPr>
+          <w:rStyle w:val="NormalTok"/>
+        </w:rPr>
+        <w:t xml:space="preserve">ci</w:t>
+      </w:r>
+      <w:r>
+        <w:rPr>
+          <w:rStyle w:val="OperatorTok"/>
+        </w:rPr>
+        <w:t xml:space="preserve">.</w:t>
+      </w:r>
+      <w:r>
+        <w:rPr>
+          <w:rStyle w:val="NormalTok"/>
+        </w:rPr>
+        <w:t xml:space="preserve">flags </w:t>
+      </w:r>
+      <w:r>
+        <w:rPr>
+          <w:rStyle w:val="OperatorTok"/>
+        </w:rPr>
+        <w:t xml:space="preserve">&amp;</w:t>
+      </w:r>
+      <w:r>
+        <w:rPr>
+          <w:rStyle w:val="NormalTok"/>
+        </w:rPr>
+        <w:t xml:space="preserve"> KAPI_CLOCK_REALTIME_VALID</w:t>
+      </w:r>
+      <w:r>
+        <w:rPr>
+          <w:rStyle w:val="OperatorTok"/>
+        </w:rPr>
+        <w:t xml:space="preserve">))</w:t>
+      </w:r>
+      <w:r>
+        <w:br/>
+      </w:r>
+      <w:r>
+        <w:rPr>
+          <w:rStyle w:val="OperatorTok"/>
+        </w:rPr>
+        <w:t xml:space="preserve">{</w:t>
+      </w:r>
+      <w:r>
+        <w:br/>
+      </w:r>
+      <w:r>
+        <w:rPr>
+          <w:rStyle w:val="NormalTok"/>
+        </w:rPr>
+        <w:t xml:space="preserve">    </w:t>
+      </w:r>
+      <w:r>
+        <w:rPr>
+          <w:rStyle w:val="DataTypeTok"/>
+        </w:rPr>
+        <w:t xml:space="preserve">long</w:t>
+      </w:r>
+      <w:r>
+        <w:rPr>
+          <w:rStyle w:val="NormalTok"/>
+        </w:rPr>
+        <w:t xml:space="preserve"> </w:t>
+      </w:r>
+      <w:r>
+        <w:rPr>
+          <w:rStyle w:val="DataTypeTok"/>
+        </w:rPr>
+        <w:t xml:space="preserve">long</w:t>
+      </w:r>
+      <w:r>
+        <w:rPr>
+          <w:rStyle w:val="NormalTok"/>
+        </w:rPr>
+        <w:t xml:space="preserve"> utc </w:t>
+      </w:r>
+      <w:r>
+        <w:rPr>
+          <w:rStyle w:val="OperatorTok"/>
+        </w:rPr>
+        <w:t xml:space="preserve">=</w:t>
+      </w:r>
+      <w:r>
+        <w:rPr>
+          <w:rStyle w:val="NormalTok"/>
+        </w:rPr>
+        <w:t xml:space="preserve"> ci</w:t>
+      </w:r>
+      <w:r>
+        <w:rPr>
+          <w:rStyle w:val="OperatorTok"/>
+        </w:rPr>
+        <w:t xml:space="preserve">.</w:t>
+      </w:r>
+      <w:r>
+        <w:rPr>
+          <w:rStyle w:val="NormalTok"/>
+        </w:rPr>
+        <w:t xml:space="preserve">utc_us </w:t>
+      </w:r>
+      <w:r>
+        <w:rPr>
+          <w:rStyle w:val="OperatorTok"/>
+        </w:rPr>
+        <w:t xml:space="preserve">/</w:t>
+      </w:r>
+      <w:r>
+        <w:rPr>
+          <w:rStyle w:val="NormalTok"/>
+        </w:rPr>
+        <w:t xml:space="preserve"> </w:t>
+      </w:r>
+      <w:r>
+        <w:rPr>
+          <w:rStyle w:val="DecValTok"/>
+        </w:rPr>
+        <w:t xml:space="preserve">60000000</w:t>
+      </w:r>
+      <w:r>
+        <w:rPr>
+          <w:rStyle w:val="OperatorTok"/>
+        </w:rPr>
+        <w:t xml:space="preserve">;</w:t>
+      </w:r>
+      <w:r>
+        <w:rPr>
+          <w:rStyle w:val="NormalTok"/>
+        </w:rPr>
+        <w:t xml:space="preserve">                        </w:t>
+      </w:r>
+      <w:r>
+        <w:rPr>
+          <w:rStyle w:val="CommentTok"/>
+        </w:rPr>
+        <w:t xml:space="preserve">// minutes since 1970, UTC</w:t>
+      </w:r>
+      <w:r>
+        <w:br/>
+      </w:r>
+      <w:r>
+        <w:rPr>
+          <w:rStyle w:val="NormalTok"/>
+        </w:rPr>
+        <w:t xml:space="preserve">    </w:t>
+      </w:r>
+      <w:r>
+        <w:rPr>
+          <w:rStyle w:val="DataTypeTok"/>
+        </w:rPr>
+        <w:t xml:space="preserve">int</w:t>
+      </w:r>
+      <w:r>
+        <w:rPr>
+          <w:rStyle w:val="NormalTok"/>
+        </w:rPr>
+        <w:t xml:space="preserve"> ny </w:t>
+      </w:r>
+      <w:r>
+        <w:rPr>
+          <w:rStyle w:val="OperatorTok"/>
+        </w:rPr>
+        <w:t xml:space="preserve">=</w:t>
+      </w:r>
+      <w:r>
+        <w:rPr>
+          <w:rStyle w:val="NormalTok"/>
+        </w:rPr>
+        <w:t xml:space="preserve"> </w:t>
+      </w:r>
+      <w:r>
+        <w:rPr>
+          <w:rStyle w:val="DecValTok"/>
+        </w:rPr>
+        <w:t xml:space="preserve">16</w:t>
+      </w:r>
+      <w:r>
+        <w:rPr>
+          <w:rStyle w:val="OperatorTok"/>
+        </w:rPr>
+        <w:t xml:space="preserve">;</w:t>
+      </w:r>
+      <w:r>
+        <w:rPr>
+          <w:rStyle w:val="NormalTok"/>
+        </w:rPr>
+        <w:t xml:space="preserve">                                                 </w:t>
+      </w:r>
+      <w:r>
+        <w:rPr>
+          <w:rStyle w:val="CommentTok"/>
+        </w:rPr>
+        <w:t xml:space="preserve">// locale_zone_city (16): "New York"</w:t>
+      </w:r>
+      <w:r>
+        <w:br/>
+      </w:r>
+      <w:r>
+        <w:rPr>
+          <w:rStyle w:val="NormalTok"/>
+        </w:rPr>
+        <w:t xml:space="preserve">    </w:t>
+      </w:r>
+      <w:r>
+        <w:rPr>
+          <w:rStyle w:val="DataTypeTok"/>
+        </w:rPr>
+        <w:t xml:space="preserve">long</w:t>
+      </w:r>
+      <w:r>
+        <w:rPr>
+          <w:rStyle w:val="NormalTok"/>
+        </w:rPr>
+        <w:t xml:space="preserve"> </w:t>
+      </w:r>
+      <w:r>
+        <w:rPr>
+          <w:rStyle w:val="DataTypeTok"/>
+        </w:rPr>
+        <w:t xml:space="preserve">long</w:t>
+      </w:r>
+      <w:r>
+        <w:rPr>
+          <w:rStyle w:val="NormalTok"/>
+        </w:rPr>
+        <w:t xml:space="preserve"> there </w:t>
+      </w:r>
+      <w:r>
+        <w:rPr>
+          <w:rStyle w:val="OperatorTok"/>
+        </w:rPr>
+        <w:t xml:space="preserve">=</w:t>
+      </w:r>
+      <w:r>
+        <w:rPr>
+          <w:rStyle w:val="NormalTok"/>
+        </w:rPr>
+        <w:t xml:space="preserve"> utc </w:t>
+      </w:r>
+      <w:r>
+        <w:rPr>
+          <w:rStyle w:val="OperatorTok"/>
+        </w:rPr>
+        <w:t xml:space="preserve">+</w:t>
+      </w:r>
+      <w:r>
+        <w:rPr>
+          <w:rStyle w:val="NormalTok"/>
+        </w:rPr>
+        <w:t xml:space="preserve"> locale_zone_offset_at </w:t>
+      </w:r>
+      <w:r>
+        <w:rPr>
+          <w:rStyle w:val="OperatorTok"/>
+        </w:rPr>
+        <w:t xml:space="preserve">(</w:t>
+      </w:r>
+      <w:r>
+        <w:rPr>
+          <w:rStyle w:val="NormalTok"/>
+        </w:rPr>
+        <w:t xml:space="preserve">ny</w:t>
+      </w:r>
+      <w:r>
+        <w:rPr>
+          <w:rStyle w:val="OperatorTok"/>
+        </w:rPr>
+        <w:t xml:space="preserve">,</w:t>
+      </w:r>
+      <w:r>
+        <w:rPr>
+          <w:rStyle w:val="NormalTok"/>
+        </w:rPr>
+        <w:t xml:space="preserve"> utc</w:t>
+      </w:r>
+      <w:r>
+        <w:rPr>
+          <w:rStyle w:val="OperatorTok"/>
+        </w:rPr>
+        <w:t xml:space="preserve">);</w:t>
+      </w:r>
+      <w:r>
+        <w:rPr>
+          <w:rStyle w:val="NormalTok"/>
+        </w:rPr>
+        <w:t xml:space="preserve">     </w:t>
+      </w:r>
+      <w:r>
+        <w:rPr>
+          <w:rStyle w:val="CommentTok"/>
+        </w:rPr>
+        <w:t xml:space="preserve">// its wall minute now</w:t>
+      </w:r>
+      <w:r>
+        <w:br/>
+      </w:r>
+      <w:r>
+        <w:rPr>
+          <w:rStyle w:val="OperatorTok"/>
+        </w:rPr>
+        <w:t xml:space="preserve">}</w:t>
+      </w:r>
+    </w:p>
+    <w:p>
+      <w:pPr>
+        <w:pStyle w:val="FirstParagraph"/>
+      </w:pPr>
+      <w:r>
+        <w:t xml:space="preserve">The kernel reads</w:t>
+      </w:r>
+      <w:r>
+        <w:t xml:space="preserve"> </w:t>
+      </w:r>
+      <w:r>
+        <w:rPr>
+          <w:rStyle w:val="VerbatimChar"/>
+        </w:rPr>
+        <w:t xml:space="preserve">timezone=</w:t>
+      </w:r>
+      <w:r>
+        <w:t xml:space="preserve"> </w:t>
+      </w:r>
+      <w:r>
+        <w:t xml:space="preserve">once at boot;</w:t>
+      </w:r>
+      <w:r>
+        <w:t xml:space="preserve"> </w:t>
+      </w:r>
+      <w:r>
+        <w:rPr>
+          <w:rStyle w:val="VerbatimChar"/>
+        </w:rPr>
+        <w:t xml:space="preserve">locale_zone_sync ()</w:t>
+      </w:r>
+      <w:r>
+        <w:t xml:space="preserve"> </w:t>
+      </w:r>
+      <w:r>
+        <w:t xml:space="preserve">puts the system's clock on the zone chosen in</w:t>
+      </w:r>
+      <w:r>
+        <w:t xml:space="preserve"> </w:t>
+      </w:r>
+      <w:r>
+        <w:t xml:space="preserve">Language &amp; Region or Setup (</w:t>
+      </w:r>
+      <w:r>
+        <w:rPr>
+          <w:rStyle w:val="VerbatimChar"/>
+        </w:rPr>
+        <w:t xml:space="preserve">zone=</w:t>
+      </w:r>
+      <w:r>
+        <w:t xml:space="preserve"> </w:t>
+      </w:r>
+      <w:r>
+        <w:t xml:space="preserve">only — a card with a</w:t>
+      </w:r>
+      <w:r>
+        <w:t xml:space="preserve"> </w:t>
+      </w:r>
+      <w:r>
+        <w:rPr>
+          <w:rStyle w:val="VerbatimChar"/>
+        </w:rPr>
+        <w:t xml:space="preserve">timezone=</w:t>
+      </w:r>
+      <w:r>
+        <w:t xml:space="preserve"> </w:t>
+      </w:r>
+      <w:r>
+        <w:t xml:space="preserve">and no</w:t>
+      </w:r>
+      <w:r>
+        <w:t xml:space="preserve"> </w:t>
+      </w:r>
+      <w:r>
+        <w:rPr>
+          <w:rStyle w:val="VerbatimChar"/>
+        </w:rPr>
+        <w:t xml:space="preserve">zone=</w:t>
+      </w:r>
+      <w:r>
+        <w:t xml:space="preserve"> </w:t>
+      </w:r>
+      <w:r>
+        <w:t xml:space="preserve">is left as it is) when the summer</w:t>
+      </w:r>
+      <w:r>
+        <w:t xml:space="preserve"> </w:t>
+      </w:r>
+      <w:r>
+        <w:t xml:space="preserve">time begins or ends: called once a minute (clockd, the Clock's service, does), on 25 October 2026 at 03:00 CEST the</w:t>
+      </w:r>
+      <w:r>
+        <w:t xml:space="preserve"> </w:t>
+      </w:r>
+      <w:r>
+        <w:t xml:space="preserve">clock becomes 02:00 CET,</w:t>
+      </w:r>
+      <w:r>
+        <w:t xml:space="preserve"> </w:t>
+      </w:r>
+      <w:r>
+        <w:rPr>
+          <w:rStyle w:val="VerbatimChar"/>
+        </w:rPr>
+        <w:t xml:space="preserve">timezone=</w:t>
+      </w:r>
+      <w:r>
+        <w:t xml:space="preserve"> </w:t>
+      </w:r>
+      <w:r>
+        <w:t xml:space="preserve">rewritten (1 changed, 0 not).</w:t>
+      </w:r>
+    </w:p>
     <w:tbl>
       <w:tblPr>
         <w:tblStyle w:val="Table"/>
@@ -17366,6 +17964,457 @@
       </w:r>
       <w:r>
         <w:t xml:space="preserve">so.</w:t>
+      </w:r>
+    </w:p>
+    <w:p>
+      <w:pPr>
+        <w:pStyle w:val="BodyText"/>
+      </w:pPr>
+      <w:r>
+        <w:t xml:space="preserve">Blocks of the same name written (the Clock's</w:t>
+      </w:r>
+      <w:r>
+        <w:t xml:space="preserve"> </w:t>
+      </w:r>
+      <w:r>
+        <w:rPr>
+          <w:rStyle w:val="VerbatimChar"/>
+        </w:rPr>
+        <w:t xml:space="preserve">[alarm]</w:t>
+      </w:r>
+      <w:r>
+        <w:t xml:space="preserve"> </w:t>
+      </w:r>
+      <w:r>
+        <w:t xml:space="preserve">list;</w:t>
+      </w:r>
+      <w:r>
+        <w:t xml:space="preserve"> </w:t>
+      </w:r>
+      <w:r>
+        <w:rPr>
+          <w:rStyle w:val="VerbatimChar"/>
+        </w:rPr>
+        <w:t xml:space="preserve">fk_kv_set</w:t>
+      </w:r>
+      <w:r>
+        <w:t xml:space="preserve"> </w:t>
+      </w:r>
+      <w:r>
+        <w:t xml:space="preserve">reaches only a name's first block): a new</w:t>
+      </w:r>
+      <w:r>
+        <w:t xml:space="preserve"> </w:t>
+      </w:r>
+      <w:r>
+        <w:t xml:space="preserve">block made at the end, its keys set and read by its number —</w:t>
+      </w:r>
+    </w:p>
+    <w:p>
+      <w:pPr>
+        <w:pStyle w:val="SourceCode"/>
+      </w:pPr>
+      <w:r>
+        <w:rPr>
+          <w:rStyle w:val="NormalTok"/>
+        </w:rPr>
+        <w:t xml:space="preserve">fk_kv </w:t>
+      </w:r>
+      <w:r>
+        <w:rPr>
+          <w:rStyle w:val="OperatorTok"/>
+        </w:rPr>
+        <w:t xml:space="preserve">*</w:t>
+      </w:r>
+      <w:r>
+        <w:rPr>
+          <w:rStyle w:val="NormalTok"/>
+        </w:rPr>
+        <w:t xml:space="preserve">kv </w:t>
+      </w:r>
+      <w:r>
+        <w:rPr>
+          <w:rStyle w:val="OperatorTok"/>
+        </w:rPr>
+        <w:t xml:space="preserve">=</w:t>
+      </w:r>
+      <w:r>
+        <w:rPr>
+          <w:rStyle w:val="NormalTok"/>
+        </w:rPr>
+        <w:t xml:space="preserve"> fk_kv_new </w:t>
+      </w:r>
+      <w:r>
+        <w:rPr>
+          <w:rStyle w:val="OperatorTok"/>
+        </w:rPr>
+        <w:t xml:space="preserve">(</w:t>
+      </w:r>
+      <w:r>
+        <w:rPr>
+          <w:rStyle w:val="DecValTok"/>
+        </w:rPr>
+        <w:t xml:space="preserve">0</w:t>
+      </w:r>
+      <w:r>
+        <w:rPr>
+          <w:rStyle w:val="OperatorTok"/>
+        </w:rPr>
+        <w:t xml:space="preserve">);</w:t>
+      </w:r>
+      <w:r>
+        <w:br/>
+      </w:r>
+      <w:r>
+        <w:rPr>
+          <w:rStyle w:val="DataTypeTok"/>
+        </w:rPr>
+        <w:t xml:space="preserve">int</w:t>
+      </w:r>
+      <w:r>
+        <w:rPr>
+          <w:rStyle w:val="NormalTok"/>
+        </w:rPr>
+        <w:t xml:space="preserve"> b </w:t>
+      </w:r>
+      <w:r>
+        <w:rPr>
+          <w:rStyle w:val="OperatorTok"/>
+        </w:rPr>
+        <w:t xml:space="preserve">=</w:t>
+      </w:r>
+      <w:r>
+        <w:rPr>
+          <w:rStyle w:val="NormalTok"/>
+        </w:rPr>
+        <w:t xml:space="preserve"> fk_kv_block_new </w:t>
+      </w:r>
+      <w:r>
+        <w:rPr>
+          <w:rStyle w:val="OperatorTok"/>
+        </w:rPr>
+        <w:t xml:space="preserve">(</w:t>
+      </w:r>
+      <w:r>
+        <w:rPr>
+          <w:rStyle w:val="NormalTok"/>
+        </w:rPr>
+        <w:t xml:space="preserve">kv</w:t>
+      </w:r>
+      <w:r>
+        <w:rPr>
+          <w:rStyle w:val="OperatorTok"/>
+        </w:rPr>
+        <w:t xml:space="preserve">,</w:t>
+      </w:r>
+      <w:r>
+        <w:rPr>
+          <w:rStyle w:val="NormalTok"/>
+        </w:rPr>
+        <w:t xml:space="preserve"> </w:t>
+      </w:r>
+      <w:r>
+        <w:rPr>
+          <w:rStyle w:val="StringTok"/>
+        </w:rPr>
+        <w:t xml:space="preserve">"alarm"</w:t>
+      </w:r>
+      <w:r>
+        <w:rPr>
+          <w:rStyle w:val="OperatorTok"/>
+        </w:rPr>
+        <w:t xml:space="preserve">);</w:t>
+      </w:r>
+      <w:r>
+        <w:rPr>
+          <w:rStyle w:val="NormalTok"/>
+        </w:rPr>
+        <w:t xml:space="preserve">                      </w:t>
+      </w:r>
+      <w:r>
+        <w:rPr>
+          <w:rStyle w:val="CommentTok"/>
+        </w:rPr>
+        <w:t xml:space="preserve">// its number (1-based), -1 no memory</w:t>
+      </w:r>
+      <w:r>
+        <w:br/>
+      </w:r>
+      <w:r>
+        <w:rPr>
+          <w:rStyle w:val="NormalTok"/>
+        </w:rPr>
+        <w:t xml:space="preserve">fk_kv_block_set </w:t>
+      </w:r>
+      <w:r>
+        <w:rPr>
+          <w:rStyle w:val="OperatorTok"/>
+        </w:rPr>
+        <w:t xml:space="preserve">(</w:t>
+      </w:r>
+      <w:r>
+        <w:rPr>
+          <w:rStyle w:val="NormalTok"/>
+        </w:rPr>
+        <w:t xml:space="preserve">kv</w:t>
+      </w:r>
+      <w:r>
+        <w:rPr>
+          <w:rStyle w:val="OperatorTok"/>
+        </w:rPr>
+        <w:t xml:space="preserve">,</w:t>
+      </w:r>
+      <w:r>
+        <w:rPr>
+          <w:rStyle w:val="NormalTok"/>
+        </w:rPr>
+        <w:t xml:space="preserve"> b</w:t>
+      </w:r>
+      <w:r>
+        <w:rPr>
+          <w:rStyle w:val="OperatorTok"/>
+        </w:rPr>
+        <w:t xml:space="preserve">,</w:t>
+      </w:r>
+      <w:r>
+        <w:rPr>
+          <w:rStyle w:val="NormalTok"/>
+        </w:rPr>
+        <w:t xml:space="preserve"> </w:t>
+      </w:r>
+      <w:r>
+        <w:rPr>
+          <w:rStyle w:val="StringTok"/>
+        </w:rPr>
+        <w:t xml:space="preserve">"time"</w:t>
+      </w:r>
+      <w:r>
+        <w:rPr>
+          <w:rStyle w:val="OperatorTok"/>
+        </w:rPr>
+        <w:t xml:space="preserve">,</w:t>
+      </w:r>
+      <w:r>
+        <w:rPr>
+          <w:rStyle w:val="NormalTok"/>
+        </w:rPr>
+        <w:t xml:space="preserve"> </w:t>
+      </w:r>
+      <w:r>
+        <w:rPr>
+          <w:rStyle w:val="StringTok"/>
+        </w:rPr>
+        <w:t xml:space="preserve">"07:00"</w:t>
+      </w:r>
+      <w:r>
+        <w:rPr>
+          <w:rStyle w:val="OperatorTok"/>
+        </w:rPr>
+        <w:t xml:space="preserve">);</w:t>
+      </w:r>
+      <w:r>
+        <w:rPr>
+          <w:rStyle w:val="NormalTok"/>
+        </w:rPr>
+        <w:t xml:space="preserve">                   </w:t>
+      </w:r>
+      <w:r>
+        <w:rPr>
+          <w:rStyle w:val="CommentTok"/>
+        </w:rPr>
+        <w:t xml:space="preserve">// replaced in block b, else added at its end</w:t>
+      </w:r>
+      <w:r>
+        <w:br/>
+      </w:r>
+      <w:r>
+        <w:rPr>
+          <w:rStyle w:val="DataTypeTok"/>
+        </w:rPr>
+        <w:t xml:space="preserve">const</w:t>
+      </w:r>
+      <w:r>
+        <w:rPr>
+          <w:rStyle w:val="NormalTok"/>
+        </w:rPr>
+        <w:t xml:space="preserve"> </w:t>
+      </w:r>
+      <w:r>
+        <w:rPr>
+          <w:rStyle w:val="DataTypeTok"/>
+        </w:rPr>
+        <w:t xml:space="preserve">char</w:t>
+      </w:r>
+      <w:r>
+        <w:rPr>
+          <w:rStyle w:val="NormalTok"/>
+        </w:rPr>
+        <w:t xml:space="preserve"> </w:t>
+      </w:r>
+      <w:r>
+        <w:rPr>
+          <w:rStyle w:val="OperatorTok"/>
+        </w:rPr>
+        <w:t xml:space="preserve">*</w:t>
+      </w:r>
+      <w:r>
+        <w:rPr>
+          <w:rStyle w:val="NormalTok"/>
+        </w:rPr>
+        <w:t xml:space="preserve">t </w:t>
+      </w:r>
+      <w:r>
+        <w:rPr>
+          <w:rStyle w:val="OperatorTok"/>
+        </w:rPr>
+        <w:t xml:space="preserve">=</w:t>
+      </w:r>
+      <w:r>
+        <w:rPr>
+          <w:rStyle w:val="NormalTok"/>
+        </w:rPr>
+        <w:t xml:space="preserve"> fk_kv_block_get </w:t>
+      </w:r>
+      <w:r>
+        <w:rPr>
+          <w:rStyle w:val="OperatorTok"/>
+        </w:rPr>
+        <w:t xml:space="preserve">(</w:t>
+      </w:r>
+      <w:r>
+        <w:rPr>
+          <w:rStyle w:val="NormalTok"/>
+        </w:rPr>
+        <w:t xml:space="preserve">kv</w:t>
+      </w:r>
+      <w:r>
+        <w:rPr>
+          <w:rStyle w:val="OperatorTok"/>
+        </w:rPr>
+        <w:t xml:space="preserve">,</w:t>
+      </w:r>
+      <w:r>
+        <w:rPr>
+          <w:rStyle w:val="NormalTok"/>
+        </w:rPr>
+        <w:t xml:space="preserve"> b</w:t>
+      </w:r>
+      <w:r>
+        <w:rPr>
+          <w:rStyle w:val="OperatorTok"/>
+        </w:rPr>
+        <w:t xml:space="preserve">,</w:t>
+      </w:r>
+      <w:r>
+        <w:rPr>
+          <w:rStyle w:val="NormalTok"/>
+        </w:rPr>
+        <w:t xml:space="preserve"> </w:t>
+      </w:r>
+      <w:r>
+        <w:rPr>
+          <w:rStyle w:val="StringTok"/>
+        </w:rPr>
+        <w:t xml:space="preserve">"time"</w:t>
+      </w:r>
+      <w:r>
+        <w:rPr>
+          <w:rStyle w:val="OperatorTok"/>
+        </w:rPr>
+        <w:t xml:space="preserve">,</w:t>
+      </w:r>
+      <w:r>
+        <w:rPr>
+          <w:rStyle w:val="NormalTok"/>
+        </w:rPr>
+        <w:t xml:space="preserve"> </w:t>
+      </w:r>
+      <w:r>
+        <w:rPr>
+          <w:rStyle w:val="StringTok"/>
+        </w:rPr>
+        <w:t xml:space="preserve">""</w:t>
+      </w:r>
+      <w:r>
+        <w:rPr>
+          <w:rStyle w:val="OperatorTok"/>
+        </w:rPr>
+        <w:t xml:space="preserve">);</w:t>
+      </w:r>
+      <w:r>
+        <w:rPr>
+          <w:rStyle w:val="NormalTok"/>
+        </w:rPr>
+        <w:t xml:space="preserve">        </w:t>
+      </w:r>
+      <w:r>
+        <w:rPr>
+          <w:rStyle w:val="CommentTok"/>
+        </w:rPr>
+        <w:t xml:space="preserve">// block b's value ("" if none)</w:t>
+      </w:r>
+      <w:r>
+        <w:br/>
+      </w:r>
+      <w:r>
+        <w:rPr>
+          <w:rStyle w:val="NormalTok"/>
+        </w:rPr>
+        <w:t xml:space="preserve">fk_kv_save </w:t>
+      </w:r>
+      <w:r>
+        <w:rPr>
+          <w:rStyle w:val="OperatorTok"/>
+        </w:rPr>
+        <w:t xml:space="preserve">(</w:t>
+      </w:r>
+      <w:r>
+        <w:rPr>
+          <w:rStyle w:val="NormalTok"/>
+        </w:rPr>
+        <w:t xml:space="preserve">kv</w:t>
+      </w:r>
+      <w:r>
+        <w:rPr>
+          <w:rStyle w:val="OperatorTok"/>
+        </w:rPr>
+        <w:t xml:space="preserve">,</w:t>
+      </w:r>
+      <w:r>
+        <w:rPr>
+          <w:rStyle w:val="NormalTok"/>
+        </w:rPr>
+        <w:t xml:space="preserve"> </w:t>
+      </w:r>
+      <w:r>
+        <w:rPr>
+          <w:rStyle w:val="StringTok"/>
+        </w:rPr>
+        <w:t xml:space="preserve">"SD:/apps/clock.app/alarms.txt"</w:t>
+      </w:r>
+      <w:r>
+        <w:rPr>
+          <w:rStyle w:val="OperatorTok"/>
+        </w:rPr>
+        <w:t xml:space="preserve">,</w:t>
+      </w:r>
+      <w:r>
+        <w:rPr>
+          <w:rStyle w:val="NormalTok"/>
+        </w:rPr>
+        <w:t xml:space="preserve"> </w:t>
+      </w:r>
+      <w:r>
+        <w:rPr>
+          <w:rStyle w:val="StringTok"/>
+        </w:rPr>
+        <w:t xml:space="preserve">"# Clock -- the alarms"</w:t>
+      </w:r>
+      <w:r>
+        <w:rPr>
+          <w:rStyle w:val="OperatorTok"/>
+        </w:rPr>
+        <w:t xml:space="preserve">);</w:t>
       </w:r>
     </w:p>
     <w:bookmarkEnd w:id="44"/>

</xml_diff>

<commit_message>
PocketUI P2: the window API moves into UIKit (uk_win_*), AppKit keeps the transport
UIKit's uikit/win.h (C linkage): 48 uk_win_* calls, uk_win_server and the
shell's uk_shell_* (provisional); the client of Elegant's protocol
(appkit_ws.inc, the KAPI_WS bodies, the replay after a restart, elegant.h)
is UIKit's desktop port (uikit/port/). AppKit keeps kapi_ws_ctl, the
kernel's full screen and the pump; its 46 window functions are retired in
place (kapi_retired_<slot>: no slot renumbered, an old binary fails its
window calls gracefully). About 80 programs migrated (games, emulators,
Doom, BASIC, the desktop's shell, services, Telegram, Control Panel, Jet's
sources, rdpd...); C programs link lib/uikit.imp_c.a. The 173 screenshots
are pixel-identical. docs 02, 03, 04, 06, 10, 11, HANDOFF (the decision
'the protocol is AppKit's' reversed).

Co-Authored-By: Claude Opus 5.5 <noreply@anthropic.com>
Claude-Session: https://claude.ai/code/session_01Rso9E1gr5271FnTGcMLUVZ
</commit_message>
<xml_diff>
--- a/docs/exports/06-KITS-GUIDE.docx
+++ b/docs/exports/06-KITS-GUIDE.docx
@@ -2275,13 +2275,31 @@
         <w:t xml:space="preserve"> </w:t>
       </w:r>
       <w:r>
-        <w:t xml:space="preserve">the kits' headers bring their code inline, and UIKit's sources are compiled with the program. Nothing</w:t>
-      </w:r>
-      <w:r>
-        <w:t xml:space="preserve"> </w:t>
-      </w:r>
-      <w:r>
-        <w:t xml:space="preserve">changes in the program's code.</w:t>
+        <w:t xml:space="preserve">the kits' headers bring their code inline, and UIKit's sources are compiled with the program (its window</w:t>
+      </w:r>
+      <w:r>
+        <w:t xml:space="preserve"> </w:t>
+      </w:r>
+      <w:r>
+        <w:t xml:space="preserve">API relayed to the stand-in kernel's window manager:</w:t>
+      </w:r>
+      <w:r>
+        <w:t xml:space="preserve"> </w:t>
+      </w:r>
+      <w:r>
+        <w:rPr>
+          <w:rStyle w:val="VerbatimChar"/>
+        </w:rPr>
+        <w:t xml:space="preserve">user/Kits/uikit/port.cpp</w:t>
+      </w:r>
+      <w:r>
+        <w:t xml:space="preserve">). Nothing changes in the</w:t>
+      </w:r>
+      <w:r>
+        <w:t xml:space="preserve"> </w:t>
+      </w:r>
+      <w:r>
+        <w:t xml:space="preserve">program's code.</w:t>
       </w:r>
     </w:p>
     <w:bookmarkEnd w:id="38"/>
@@ -2317,7 +2335,7 @@
         <w:pStyle w:val="BodyText"/>
       </w:pPr>
       <w:r>
-        <w:t xml:space="preserve">AppKit is the program's link to the system: files, processes, time, windows, sockets… (the</w:t>
+        <w:t xml:space="preserve">AppKit is the program's link to the system: files, processes, time, sockets, the events' pump… (the</w:t>
       </w:r>
       <w:r>
         <w:t xml:space="preserve"> </w:t>
@@ -2332,7 +2350,19 @@
         <w:t xml:space="preserve"> </w:t>
       </w:r>
       <w:r>
-        <w:t xml:space="preserve">calls, listed in the Developer Guide), plus the small services every program needs: strings without a</w:t>
+        <w:t xml:space="preserve">calls, listed in the Developer Guide; the windows are UIKit's since 2026-10-08:</w:t>
+      </w:r>
+      <w:r>
+        <w:t xml:space="preserve"> </w:t>
+      </w:r>
+      <w:r>
+        <w:rPr>
+          <w:rStyle w:val="VerbatimChar"/>
+        </w:rPr>
+        <w:t xml:space="preserve">uk_win_*</w:t>
+      </w:r>
+      <w:r>
+        <w:t xml:space="preserve">, §4), plus the small services every program needs: strings without a</w:t>
       </w:r>
       <w:r>
         <w:t xml:space="preserve"> </w:t>
@@ -11534,6 +11564,1301 @@
       </w:r>
       <w:r>
         <w:t xml:space="preserve">takes it away.</w:t>
+      </w:r>
+    </w:p>
+    <w:p>
+      <w:pPr>
+        <w:pStyle w:val="BodyText"/>
+      </w:pPr>
+      <w:r>
+        <w:rPr>
+          <w:bCs/>
+          <w:b/>
+        </w:rPr>
+        <w:t xml:space="preserve">The window API</w:t>
+      </w:r>
+      <w:r>
+        <w:t xml:space="preserve"> </w:t>
+      </w:r>
+      <w:r>
+        <w:t xml:space="preserve">(</w:t>
+      </w:r>
+      <w:r>
+        <w:rPr>
+          <w:rStyle w:val="VerbatimChar"/>
+        </w:rPr>
+        <w:t xml:space="preserve">uikit/win.h</w:t>
+      </w:r>
+      <w:r>
+        <w:t xml:space="preserve">, 2026-10-08; in</w:t>
+      </w:r>
+      <w:r>
+        <w:t xml:space="preserve"> </w:t>
+      </w:r>
+      <w:r>
+        <w:rPr>
+          <w:rStyle w:val="VerbatimChar"/>
+        </w:rPr>
+        <w:t xml:space="preserve">uikit/uikit.h</w:t>
+      </w:r>
+      <w:r>
+        <w:t xml:space="preserve">, or included alone by a C program, which links</w:t>
+      </w:r>
+      <w:r>
+        <w:t xml:space="preserve"> </w:t>
+      </w:r>
+      <w:r>
+        <w:rPr>
+          <w:rStyle w:val="VerbatimChar"/>
+        </w:rPr>
+        <w:t xml:space="preserve">lib/uikit.imp_c.a</w:t>
+      </w:r>
+      <w:r>
+        <w:t xml:space="preserve">): the program's windows and what it asks of the graphics server, as plain C functions —</w:t>
+      </w:r>
+      <w:r>
+        <w:t xml:space="preserve"> </w:t>
+      </w:r>
+      <w:r>
+        <w:rPr>
+          <w:rStyle w:val="VerbatimChar"/>
+        </w:rPr>
+        <w:t xml:space="preserve">uk_win_create</w:t>
+      </w:r>
+      <w:r>
+        <w:t xml:space="preserve">,</w:t>
+      </w:r>
+      <w:r>
+        <w:t xml:space="preserve"> </w:t>
+      </w:r>
+      <w:r>
+        <w:rPr>
+          <w:rStyle w:val="VerbatimChar"/>
+        </w:rPr>
+        <w:t xml:space="preserve">uk_win_present</w:t>
+      </w:r>
+      <w:r>
+        <w:t xml:space="preserve">,</w:t>
+      </w:r>
+      <w:r>
+        <w:t xml:space="preserve"> </w:t>
+      </w:r>
+      <w:r>
+        <w:rPr>
+          <w:rStyle w:val="VerbatimChar"/>
+        </w:rPr>
+        <w:t xml:space="preserve">uk_win_on_key</w:t>
+      </w:r>
+      <w:r>
+        <w:t xml:space="preserve">,</w:t>
+      </w:r>
+      <w:r>
+        <w:t xml:space="preserve"> </w:t>
+      </w:r>
+      <w:r>
+        <w:rPr>
+          <w:rStyle w:val="VerbatimChar"/>
+        </w:rPr>
+        <w:t xml:space="preserve">uk_win_menu_set</w:t>
+      </w:r>
+      <w:r>
+        <w:t xml:space="preserve">,</w:t>
+      </w:r>
+      <w:r>
+        <w:t xml:space="preserve"> </w:t>
+      </w:r>
+      <w:r>
+        <w:rPr>
+          <w:rStyle w:val="VerbatimChar"/>
+        </w:rPr>
+        <w:t xml:space="preserve">uk_win_list</w:t>
+      </w:r>
+      <w:r>
+        <w:t xml:space="preserve">,</w:t>
+      </w:r>
+      <w:r>
+        <w:t xml:space="preserve"> </w:t>
+      </w:r>
+      <w:r>
+        <w:rPr>
+          <w:rStyle w:val="VerbatimChar"/>
+        </w:rPr>
+        <w:t xml:space="preserve">uk_win_tray_set</w:t>
+      </w:r>
+      <w:r>
+        <w:t xml:space="preserve">,</w:t>
+      </w:r>
+      <w:r>
+        <w:t xml:space="preserve"> </w:t>
+      </w:r>
+      <w:r>
+        <w:rPr>
+          <w:rStyle w:val="VerbatimChar"/>
+        </w:rPr>
+        <w:t xml:space="preserve">uk_win_fullscreen_begin</w:t>
+      </w:r>
+      <w:r>
+        <w:t xml:space="preserve">… (they were AppKit's</w:t>
+      </w:r>
+      <w:r>
+        <w:t xml:space="preserve"> </w:t>
+      </w:r>
+      <w:r>
+        <w:rPr>
+          <w:rStyle w:val="VerbatimChar"/>
+        </w:rPr>
+        <w:t xml:space="preserve">kapi_create_window</w:t>
+      </w:r>
+      <w:r>
+        <w:t xml:space="preserve">,</w:t>
+      </w:r>
+      <w:r>
+        <w:t xml:space="preserve"> </w:t>
+      </w:r>
+      <w:r>
+        <w:rPr>
+          <w:rStyle w:val="VerbatimChar"/>
+        </w:rPr>
+        <w:t xml:space="preserve">kapi_present</w:t>
+      </w:r>
+      <w:r>
+        <w:t xml:space="preserve">…: docs/03 §5.10.1 has the</w:t>
+      </w:r>
+      <w:r>
+        <w:t xml:space="preserve"> </w:t>
+      </w:r>
+      <w:r>
+        <w:t xml:space="preserve">table). A</w:t>
+      </w:r>
+      <w:r>
+        <w:t xml:space="preserve"> </w:t>
+      </w:r>
+      <w:r>
+        <w:rPr>
+          <w:rStyle w:val="VerbatimChar"/>
+        </w:rPr>
+        <w:t xml:space="preserve">Root</w:t>
+      </w:r>
+      <w:r>
+        <w:t xml:space="preserve"> </w:t>
+      </w:r>
+      <w:r>
+        <w:t xml:space="preserve">calls them for you; a game that draws its own canvas, a full-screen program or a shell</w:t>
+      </w:r>
+      <w:r>
+        <w:t xml:space="preserve"> </w:t>
+      </w:r>
+      <w:r>
+        <w:t xml:space="preserve">program (the dock, the menu bar) calls them itself. Each graphics server has its own UIKit (the desktop's</w:t>
+      </w:r>
+      <w:r>
+        <w:t xml:space="preserve"> </w:t>
+      </w:r>
+      <w:r>
+        <w:t xml:space="preserve">speaks to Elegant), so the same binary runs on every one;</w:t>
+      </w:r>
+      <w:r>
+        <w:t xml:space="preserve"> </w:t>
+      </w:r>
+      <w:r>
+        <w:rPr>
+          <w:rStyle w:val="VerbatimChar"/>
+        </w:rPr>
+        <w:t xml:space="preserve">uk_win_server</w:t>
+      </w:r>
+      <w:r>
+        <w:t xml:space="preserve"> </w:t>
+      </w:r>
+      <w:r>
+        <w:t xml:space="preserve">says which.</w:t>
+      </w:r>
+    </w:p>
+    <w:p>
+      <w:pPr>
+        <w:pStyle w:val="SourceCode"/>
+      </w:pPr>
+      <w:r>
+        <w:rPr>
+          <w:rStyle w:val="PreprocessorTok"/>
+        </w:rPr>
+        <w:t xml:space="preserve">#include </w:t>
+      </w:r>
+      <w:r>
+        <w:rPr>
+          <w:rStyle w:val="ImportTok"/>
+        </w:rPr>
+        <w:t xml:space="preserve">"appkit/appkit.h"</w:t>
+      </w:r>
+      <w:r>
+        <w:br/>
+      </w:r>
+      <w:r>
+        <w:rPr>
+          <w:rStyle w:val="PreprocessorTok"/>
+        </w:rPr>
+        <w:t xml:space="preserve">#include </w:t>
+      </w:r>
+      <w:r>
+        <w:rPr>
+          <w:rStyle w:val="ImportTok"/>
+        </w:rPr>
+        <w:t xml:space="preserve">"uikit/win.h"</w:t>
+      </w:r>
+      <w:r>
+        <w:br/>
+      </w:r>
+      <w:r>
+        <w:br/>
+      </w:r>
+      <w:r>
+        <w:rPr>
+          <w:rStyle w:val="DataTypeTok"/>
+        </w:rPr>
+        <w:t xml:space="preserve">static</w:t>
+      </w:r>
+      <w:r>
+        <w:rPr>
+          <w:rStyle w:val="NormalTok"/>
+        </w:rPr>
+        <w:t xml:space="preserve"> </w:t>
+      </w:r>
+      <w:r>
+        <w:rPr>
+          <w:rStyle w:val="DataTypeTok"/>
+        </w:rPr>
+        <w:t xml:space="preserve">void</w:t>
+      </w:r>
+      <w:r>
+        <w:rPr>
+          <w:rStyle w:val="NormalTok"/>
+        </w:rPr>
+        <w:t xml:space="preserve"> on_key </w:t>
+      </w:r>
+      <w:r>
+        <w:rPr>
+          <w:rStyle w:val="OperatorTok"/>
+        </w:rPr>
+        <w:t xml:space="preserve">(</w:t>
+      </w:r>
+      <w:r>
+        <w:rPr>
+          <w:rStyle w:val="DataTypeTok"/>
+        </w:rPr>
+        <w:t xml:space="preserve">unsigned</w:t>
+      </w:r>
+      <w:r>
+        <w:rPr>
+          <w:rStyle w:val="NormalTok"/>
+        </w:rPr>
+        <w:t xml:space="preserve"> </w:t>
+      </w:r>
+      <w:r>
+        <w:rPr>
+          <w:rStyle w:val="DataTypeTok"/>
+        </w:rPr>
+        <w:t xml:space="preserve">long</w:t>
+      </w:r>
+      <w:r>
+        <w:rPr>
+          <w:rStyle w:val="NormalTok"/>
+        </w:rPr>
+        <w:t xml:space="preserve"> sender</w:t>
+      </w:r>
+      <w:r>
+        <w:rPr>
+          <w:rStyle w:val="OperatorTok"/>
+        </w:rPr>
+        <w:t xml:space="preserve">,</w:t>
+      </w:r>
+      <w:r>
+        <w:rPr>
+          <w:rStyle w:val="NormalTok"/>
+        </w:rPr>
+        <w:t xml:space="preserve"> </w:t>
+      </w:r>
+      <w:r>
+        <w:rPr>
+          <w:rStyle w:val="DataTypeTok"/>
+        </w:rPr>
+        <w:t xml:space="preserve">int</w:t>
+      </w:r>
+      <w:r>
+        <w:rPr>
+          <w:rStyle w:val="NormalTok"/>
+        </w:rPr>
+        <w:t xml:space="preserve"> ev</w:t>
+      </w:r>
+      <w:r>
+        <w:rPr>
+          <w:rStyle w:val="OperatorTok"/>
+        </w:rPr>
+        <w:t xml:space="preserve">,</w:t>
+      </w:r>
+      <w:r>
+        <w:rPr>
+          <w:rStyle w:val="NormalTok"/>
+        </w:rPr>
+        <w:t xml:space="preserve"> gui_value v</w:t>
+      </w:r>
+      <w:r>
+        <w:rPr>
+          <w:rStyle w:val="OperatorTok"/>
+        </w:rPr>
+        <w:t xml:space="preserve">)</w:t>
+      </w:r>
+      <w:r>
+        <w:rPr>
+          <w:rStyle w:val="NormalTok"/>
+        </w:rPr>
+        <w:t xml:space="preserve"> </w:t>
+      </w:r>
+      <w:r>
+        <w:rPr>
+          <w:rStyle w:val="OperatorTok"/>
+        </w:rPr>
+        <w:t xml:space="preserve">{</w:t>
+      </w:r>
+      <w:r>
+        <w:rPr>
+          <w:rStyle w:val="NormalTok"/>
+        </w:rPr>
+        <w:t xml:space="preserve"> </w:t>
+      </w:r>
+      <w:r>
+        <w:rPr>
+          <w:rStyle w:val="OperatorTok"/>
+        </w:rPr>
+        <w:t xml:space="preserve">(</w:t>
+      </w:r>
+      <w:r>
+        <w:rPr>
+          <w:rStyle w:val="DataTypeTok"/>
+        </w:rPr>
+        <w:t xml:space="preserve">void</w:t>
+      </w:r>
+      <w:r>
+        <w:rPr>
+          <w:rStyle w:val="OperatorTok"/>
+        </w:rPr>
+        <w:t xml:space="preserve">)</w:t>
+      </w:r>
+      <w:r>
+        <w:rPr>
+          <w:rStyle w:val="NormalTok"/>
+        </w:rPr>
+        <w:t xml:space="preserve"> sender</w:t>
+      </w:r>
+      <w:r>
+        <w:rPr>
+          <w:rStyle w:val="OperatorTok"/>
+        </w:rPr>
+        <w:t xml:space="preserve">;</w:t>
+      </w:r>
+      <w:r>
+        <w:rPr>
+          <w:rStyle w:val="NormalTok"/>
+        </w:rPr>
+        <w:t xml:space="preserve"> </w:t>
+      </w:r>
+      <w:r>
+        <w:rPr>
+          <w:rStyle w:val="ControlFlowTok"/>
+        </w:rPr>
+        <w:t xml:space="preserve">if</w:t>
+      </w:r>
+      <w:r>
+        <w:rPr>
+          <w:rStyle w:val="NormalTok"/>
+        </w:rPr>
+        <w:t xml:space="preserve"> </w:t>
+      </w:r>
+      <w:r>
+        <w:rPr>
+          <w:rStyle w:val="OperatorTok"/>
+        </w:rPr>
+        <w:t xml:space="preserve">(</w:t>
+      </w:r>
+      <w:r>
+        <w:rPr>
+          <w:rStyle w:val="NormalTok"/>
+        </w:rPr>
+        <w:t xml:space="preserve">ev </w:t>
+      </w:r>
+      <w:r>
+        <w:rPr>
+          <w:rStyle w:val="OperatorTok"/>
+        </w:rPr>
+        <w:t xml:space="preserve">==</w:t>
+      </w:r>
+      <w:r>
+        <w:rPr>
+          <w:rStyle w:val="NormalTok"/>
+        </w:rPr>
+        <w:t xml:space="preserve"> GUI_EVENT_KEY </w:t>
+      </w:r>
+      <w:r>
+        <w:rPr>
+          <w:rStyle w:val="OperatorTok"/>
+        </w:rPr>
+        <w:t xml:space="preserve">&amp;&amp;</w:t>
+      </w:r>
+      <w:r>
+        <w:rPr>
+          <w:rStyle w:val="NormalTok"/>
+        </w:rPr>
+        <w:t xml:space="preserve"> v </w:t>
+      </w:r>
+      <w:r>
+        <w:rPr>
+          <w:rStyle w:val="OperatorTok"/>
+        </w:rPr>
+        <w:t xml:space="preserve">==</w:t>
+      </w:r>
+      <w:r>
+        <w:rPr>
+          <w:rStyle w:val="NormalTok"/>
+        </w:rPr>
+        <w:t xml:space="preserve"> </w:t>
+      </w:r>
+      <w:r>
+        <w:rPr>
+          <w:rStyle w:val="DecValTok"/>
+        </w:rPr>
+        <w:t xml:space="preserve">27</w:t>
+      </w:r>
+      <w:r>
+        <w:rPr>
+          <w:rStyle w:val="OperatorTok"/>
+        </w:rPr>
+        <w:t xml:space="preserve">)</w:t>
+      </w:r>
+      <w:r>
+        <w:rPr>
+          <w:rStyle w:val="NormalTok"/>
+        </w:rPr>
+        <w:t xml:space="preserve"> kapi_exit </w:t>
+      </w:r>
+      <w:r>
+        <w:rPr>
+          <w:rStyle w:val="OperatorTok"/>
+        </w:rPr>
+        <w:t xml:space="preserve">(</w:t>
+      </w:r>
+      <w:r>
+        <w:rPr>
+          <w:rStyle w:val="DecValTok"/>
+        </w:rPr>
+        <w:t xml:space="preserve">0</w:t>
+      </w:r>
+      <w:r>
+        <w:rPr>
+          <w:rStyle w:val="OperatorTok"/>
+        </w:rPr>
+        <w:t xml:space="preserve">);</w:t>
+      </w:r>
+      <w:r>
+        <w:rPr>
+          <w:rStyle w:val="NormalTok"/>
+        </w:rPr>
+        <w:t xml:space="preserve"> </w:t>
+      </w:r>
+      <w:r>
+        <w:rPr>
+          <w:rStyle w:val="OperatorTok"/>
+        </w:rPr>
+        <w:t xml:space="preserve">}</w:t>
+      </w:r>
+      <w:r>
+        <w:br/>
+      </w:r>
+      <w:r>
+        <w:br/>
+      </w:r>
+      <w:r>
+        <w:rPr>
+          <w:rStyle w:val="DataTypeTok"/>
+        </w:rPr>
+        <w:t xml:space="preserve">int</w:t>
+      </w:r>
+      <w:r>
+        <w:rPr>
+          <w:rStyle w:val="NormalTok"/>
+        </w:rPr>
+        <w:t xml:space="preserve"> main </w:t>
+      </w:r>
+      <w:r>
+        <w:rPr>
+          <w:rStyle w:val="OperatorTok"/>
+        </w:rPr>
+        <w:t xml:space="preserve">(</w:t>
+      </w:r>
+      <w:r>
+        <w:rPr>
+          <w:rStyle w:val="DataTypeTok"/>
+        </w:rPr>
+        <w:t xml:space="preserve">void</w:t>
+      </w:r>
+      <w:r>
+        <w:rPr>
+          <w:rStyle w:val="OperatorTok"/>
+        </w:rPr>
+        <w:t xml:space="preserve">)</w:t>
+      </w:r>
+      <w:r>
+        <w:br/>
+      </w:r>
+      <w:r>
+        <w:rPr>
+          <w:rStyle w:val="OperatorTok"/>
+        </w:rPr>
+        <w:t xml:space="preserve">{</w:t>
+      </w:r>
+      <w:r>
+        <w:br/>
+      </w:r>
+      <w:r>
+        <w:rPr>
+          <w:rStyle w:val="NormalTok"/>
+        </w:rPr>
+        <w:t xml:space="preserve">    </w:t>
+      </w:r>
+      <w:r>
+        <w:rPr>
+          <w:rStyle w:val="DataTypeTok"/>
+        </w:rPr>
+        <w:t xml:space="preserve">unsigned</w:t>
+      </w:r>
+      <w:r>
+        <w:rPr>
+          <w:rStyle w:val="NormalTok"/>
+        </w:rPr>
+        <w:t xml:space="preserve"> </w:t>
+      </w:r>
+      <w:r>
+        <w:rPr>
+          <w:rStyle w:val="OperatorTok"/>
+        </w:rPr>
+        <w:t xml:space="preserve">*</w:t>
+      </w:r>
+      <w:r>
+        <w:rPr>
+          <w:rStyle w:val="NormalTok"/>
+        </w:rPr>
+        <w:t xml:space="preserve">fb </w:t>
+      </w:r>
+      <w:r>
+        <w:rPr>
+          <w:rStyle w:val="OperatorTok"/>
+        </w:rPr>
+        <w:t xml:space="preserve">=</w:t>
+      </w:r>
+      <w:r>
+        <w:rPr>
+          <w:rStyle w:val="NormalTok"/>
+        </w:rPr>
+        <w:t xml:space="preserve"> uk_win_create </w:t>
+      </w:r>
+      <w:r>
+        <w:rPr>
+          <w:rStyle w:val="OperatorTok"/>
+        </w:rPr>
+        <w:t xml:space="preserve">(</w:t>
+      </w:r>
+      <w:r>
+        <w:rPr>
+          <w:rStyle w:val="DecValTok"/>
+        </w:rPr>
+        <w:t xml:space="preserve">320</w:t>
+      </w:r>
+      <w:r>
+        <w:rPr>
+          <w:rStyle w:val="OperatorTok"/>
+        </w:rPr>
+        <w:t xml:space="preserve">,</w:t>
+      </w:r>
+      <w:r>
+        <w:rPr>
+          <w:rStyle w:val="NormalTok"/>
+        </w:rPr>
+        <w:t xml:space="preserve"> </w:t>
+      </w:r>
+      <w:r>
+        <w:rPr>
+          <w:rStyle w:val="DecValTok"/>
+        </w:rPr>
+        <w:t xml:space="preserve">200</w:t>
+      </w:r>
+      <w:r>
+        <w:rPr>
+          <w:rStyle w:val="OperatorTok"/>
+        </w:rPr>
+        <w:t xml:space="preserve">,</w:t>
+      </w:r>
+      <w:r>
+        <w:rPr>
+          <w:rStyle w:val="NormalTok"/>
+        </w:rPr>
+        <w:t xml:space="preserve"> </w:t>
+      </w:r>
+      <w:r>
+        <w:rPr>
+          <w:rStyle w:val="StringTok"/>
+        </w:rPr>
+        <w:t xml:space="preserve">"Plasma"</w:t>
+      </w:r>
+      <w:r>
+        <w:rPr>
+          <w:rStyle w:val="OperatorTok"/>
+        </w:rPr>
+        <w:t xml:space="preserve">);</w:t>
+      </w:r>
+      <w:r>
+        <w:rPr>
+          <w:rStyle w:val="NormalTok"/>
+        </w:rPr>
+        <w:t xml:space="preserve">     </w:t>
+      </w:r>
+      <w:r>
+        <w:rPr>
+          <w:rStyle w:val="CommentTok"/>
+        </w:rPr>
+        <w:t xml:space="preserve">/* the canvas: 0x00RRGGBB, 320 a row */</w:t>
+      </w:r>
+      <w:r>
+        <w:br/>
+      </w:r>
+      <w:r>
+        <w:rPr>
+          <w:rStyle w:val="NormalTok"/>
+        </w:rPr>
+        <w:t xml:space="preserve">    </w:t>
+      </w:r>
+      <w:r>
+        <w:rPr>
+          <w:rStyle w:val="ControlFlowTok"/>
+        </w:rPr>
+        <w:t xml:space="preserve">if</w:t>
+      </w:r>
+      <w:r>
+        <w:rPr>
+          <w:rStyle w:val="NormalTok"/>
+        </w:rPr>
+        <w:t xml:space="preserve"> </w:t>
+      </w:r>
+      <w:r>
+        <w:rPr>
+          <w:rStyle w:val="OperatorTok"/>
+        </w:rPr>
+        <w:t xml:space="preserve">(</w:t>
+      </w:r>
+      <w:r>
+        <w:rPr>
+          <w:rStyle w:val="NormalTok"/>
+        </w:rPr>
+        <w:t xml:space="preserve">fb </w:t>
+      </w:r>
+      <w:r>
+        <w:rPr>
+          <w:rStyle w:val="OperatorTok"/>
+        </w:rPr>
+        <w:t xml:space="preserve">==</w:t>
+      </w:r>
+      <w:r>
+        <w:rPr>
+          <w:rStyle w:val="NormalTok"/>
+        </w:rPr>
+        <w:t xml:space="preserve"> </w:t>
+      </w:r>
+      <w:r>
+        <w:rPr>
+          <w:rStyle w:val="DecValTok"/>
+        </w:rPr>
+        <w:t xml:space="preserve">0</w:t>
+      </w:r>
+      <w:r>
+        <w:rPr>
+          <w:rStyle w:val="OperatorTok"/>
+        </w:rPr>
+        <w:t xml:space="preserve">)</w:t>
+      </w:r>
+      <w:r>
+        <w:rPr>
+          <w:rStyle w:val="NormalTok"/>
+        </w:rPr>
+        <w:t xml:space="preserve"> </w:t>
+      </w:r>
+      <w:r>
+        <w:rPr>
+          <w:rStyle w:val="ControlFlowTok"/>
+        </w:rPr>
+        <w:t xml:space="preserve">return</w:t>
+      </w:r>
+      <w:r>
+        <w:rPr>
+          <w:rStyle w:val="NormalTok"/>
+        </w:rPr>
+        <w:t xml:space="preserve"> </w:t>
+      </w:r>
+      <w:r>
+        <w:rPr>
+          <w:rStyle w:val="DecValTok"/>
+        </w:rPr>
+        <w:t xml:space="preserve">1</w:t>
+      </w:r>
+      <w:r>
+        <w:rPr>
+          <w:rStyle w:val="OperatorTok"/>
+        </w:rPr>
+        <w:t xml:space="preserve">;</w:t>
+      </w:r>
+      <w:r>
+        <w:br/>
+      </w:r>
+      <w:r>
+        <w:rPr>
+          <w:rStyle w:val="NormalTok"/>
+        </w:rPr>
+        <w:t xml:space="preserve">    uk_win_on_key </w:t>
+      </w:r>
+      <w:r>
+        <w:rPr>
+          <w:rStyle w:val="OperatorTok"/>
+        </w:rPr>
+        <w:t xml:space="preserve">(</w:t>
+      </w:r>
+      <w:r>
+        <w:rPr>
+          <w:rStyle w:val="NormalTok"/>
+        </w:rPr>
+        <w:t xml:space="preserve">on_key</w:t>
+      </w:r>
+      <w:r>
+        <w:rPr>
+          <w:rStyle w:val="OperatorTok"/>
+        </w:rPr>
+        <w:t xml:space="preserve">);</w:t>
+      </w:r>
+      <w:r>
+        <w:br/>
+      </w:r>
+      <w:r>
+        <w:rPr>
+          <w:rStyle w:val="NormalTok"/>
+        </w:rPr>
+        <w:t xml:space="preserve">    </w:t>
+      </w:r>
+      <w:r>
+        <w:rPr>
+          <w:rStyle w:val="ControlFlowTok"/>
+        </w:rPr>
+        <w:t xml:space="preserve">for</w:t>
+      </w:r>
+      <w:r>
+        <w:rPr>
+          <w:rStyle w:val="NormalTok"/>
+        </w:rPr>
+        <w:t xml:space="preserve"> </w:t>
+      </w:r>
+      <w:r>
+        <w:rPr>
+          <w:rStyle w:val="OperatorTok"/>
+        </w:rPr>
+        <w:t xml:space="preserve">(</w:t>
+      </w:r>
+      <w:r>
+        <w:rPr>
+          <w:rStyle w:val="DataTypeTok"/>
+        </w:rPr>
+        <w:t xml:space="preserve">int</w:t>
+      </w:r>
+      <w:r>
+        <w:rPr>
+          <w:rStyle w:val="NormalTok"/>
+        </w:rPr>
+        <w:t xml:space="preserve"> t </w:t>
+      </w:r>
+      <w:r>
+        <w:rPr>
+          <w:rStyle w:val="OperatorTok"/>
+        </w:rPr>
+        <w:t xml:space="preserve">=</w:t>
+      </w:r>
+      <w:r>
+        <w:rPr>
+          <w:rStyle w:val="NormalTok"/>
+        </w:rPr>
+        <w:t xml:space="preserve"> </w:t>
+      </w:r>
+      <w:r>
+        <w:rPr>
+          <w:rStyle w:val="DecValTok"/>
+        </w:rPr>
+        <w:t xml:space="preserve">0</w:t>
+      </w:r>
+      <w:r>
+        <w:rPr>
+          <w:rStyle w:val="OperatorTok"/>
+        </w:rPr>
+        <w:t xml:space="preserve">;</w:t>
+      </w:r>
+      <w:r>
+        <w:rPr>
+          <w:rStyle w:val="NormalTok"/>
+        </w:rPr>
+        <w:t xml:space="preserve"> </w:t>
+      </w:r>
+      <w:r>
+        <w:rPr>
+          <w:rStyle w:val="OperatorTok"/>
+        </w:rPr>
+        <w:t xml:space="preserve">!</w:t>
+      </w:r>
+      <w:r>
+        <w:rPr>
+          <w:rStyle w:val="NormalTok"/>
+        </w:rPr>
+        <w:t xml:space="preserve">kapi_should_exit </w:t>
+      </w:r>
+      <w:r>
+        <w:rPr>
+          <w:rStyle w:val="OperatorTok"/>
+        </w:rPr>
+        <w:t xml:space="preserve">();</w:t>
+      </w:r>
+      <w:r>
+        <w:rPr>
+          <w:rStyle w:val="NormalTok"/>
+        </w:rPr>
+        <w:t xml:space="preserve"> t</w:t>
+      </w:r>
+      <w:r>
+        <w:rPr>
+          <w:rStyle w:val="OperatorTok"/>
+        </w:rPr>
+        <w:t xml:space="preserve">++)</w:t>
+      </w:r>
+      <w:r>
+        <w:br/>
+      </w:r>
+      <w:r>
+        <w:rPr>
+          <w:rStyle w:val="NormalTok"/>
+        </w:rPr>
+        <w:t xml:space="preserve">    </w:t>
+      </w:r>
+      <w:r>
+        <w:rPr>
+          <w:rStyle w:val="OperatorTok"/>
+        </w:rPr>
+        <w:t xml:space="preserve">{</w:t>
+      </w:r>
+      <w:r>
+        <w:br/>
+      </w:r>
+      <w:r>
+        <w:rPr>
+          <w:rStyle w:val="NormalTok"/>
+        </w:rPr>
+        <w:t xml:space="preserve">        </w:t>
+      </w:r>
+      <w:r>
+        <w:rPr>
+          <w:rStyle w:val="ControlFlowTok"/>
+        </w:rPr>
+        <w:t xml:space="preserve">for</w:t>
+      </w:r>
+      <w:r>
+        <w:rPr>
+          <w:rStyle w:val="NormalTok"/>
+        </w:rPr>
+        <w:t xml:space="preserve"> </w:t>
+      </w:r>
+      <w:r>
+        <w:rPr>
+          <w:rStyle w:val="OperatorTok"/>
+        </w:rPr>
+        <w:t xml:space="preserve">(</w:t>
+      </w:r>
+      <w:r>
+        <w:rPr>
+          <w:rStyle w:val="DataTypeTok"/>
+        </w:rPr>
+        <w:t xml:space="preserve">int</w:t>
+      </w:r>
+      <w:r>
+        <w:rPr>
+          <w:rStyle w:val="NormalTok"/>
+        </w:rPr>
+        <w:t xml:space="preserve"> i </w:t>
+      </w:r>
+      <w:r>
+        <w:rPr>
+          <w:rStyle w:val="OperatorTok"/>
+        </w:rPr>
+        <w:t xml:space="preserve">=</w:t>
+      </w:r>
+      <w:r>
+        <w:rPr>
+          <w:rStyle w:val="NormalTok"/>
+        </w:rPr>
+        <w:t xml:space="preserve"> </w:t>
+      </w:r>
+      <w:r>
+        <w:rPr>
+          <w:rStyle w:val="DecValTok"/>
+        </w:rPr>
+        <w:t xml:space="preserve">0</w:t>
+      </w:r>
+      <w:r>
+        <w:rPr>
+          <w:rStyle w:val="OperatorTok"/>
+        </w:rPr>
+        <w:t xml:space="preserve">;</w:t>
+      </w:r>
+      <w:r>
+        <w:rPr>
+          <w:rStyle w:val="NormalTok"/>
+        </w:rPr>
+        <w:t xml:space="preserve"> i </w:t>
+      </w:r>
+      <w:r>
+        <w:rPr>
+          <w:rStyle w:val="OperatorTok"/>
+        </w:rPr>
+        <w:t xml:space="preserve">&lt;</w:t>
+      </w:r>
+      <w:r>
+        <w:rPr>
+          <w:rStyle w:val="NormalTok"/>
+        </w:rPr>
+        <w:t xml:space="preserve"> </w:t>
+      </w:r>
+      <w:r>
+        <w:rPr>
+          <w:rStyle w:val="DecValTok"/>
+        </w:rPr>
+        <w:t xml:space="preserve">320</w:t>
+      </w:r>
+      <w:r>
+        <w:rPr>
+          <w:rStyle w:val="NormalTok"/>
+        </w:rPr>
+        <w:t xml:space="preserve"> </w:t>
+      </w:r>
+      <w:r>
+        <w:rPr>
+          <w:rStyle w:val="OperatorTok"/>
+        </w:rPr>
+        <w:t xml:space="preserve">*</w:t>
+      </w:r>
+      <w:r>
+        <w:rPr>
+          <w:rStyle w:val="NormalTok"/>
+        </w:rPr>
+        <w:t xml:space="preserve"> </w:t>
+      </w:r>
+      <w:r>
+        <w:rPr>
+          <w:rStyle w:val="DecValTok"/>
+        </w:rPr>
+        <w:t xml:space="preserve">200</w:t>
+      </w:r>
+      <w:r>
+        <w:rPr>
+          <w:rStyle w:val="OperatorTok"/>
+        </w:rPr>
+        <w:t xml:space="preserve">;</w:t>
+      </w:r>
+      <w:r>
+        <w:rPr>
+          <w:rStyle w:val="NormalTok"/>
+        </w:rPr>
+        <w:t xml:space="preserve"> i</w:t>
+      </w:r>
+      <w:r>
+        <w:rPr>
+          <w:rStyle w:val="OperatorTok"/>
+        </w:rPr>
+        <w:t xml:space="preserve">++)</w:t>
+      </w:r>
+      <w:r>
+        <w:rPr>
+          <w:rStyle w:val="NormalTok"/>
+        </w:rPr>
+        <w:t xml:space="preserve"> fb</w:t>
+      </w:r>
+      <w:r>
+        <w:rPr>
+          <w:rStyle w:val="OperatorTok"/>
+        </w:rPr>
+        <w:t xml:space="preserve">[</w:t>
+      </w:r>
+      <w:r>
+        <w:rPr>
+          <w:rStyle w:val="NormalTok"/>
+        </w:rPr>
+        <w:t xml:space="preserve">i</w:t>
+      </w:r>
+      <w:r>
+        <w:rPr>
+          <w:rStyle w:val="OperatorTok"/>
+        </w:rPr>
+        <w:t xml:space="preserve">]</w:t>
+      </w:r>
+      <w:r>
+        <w:rPr>
+          <w:rStyle w:val="NormalTok"/>
+        </w:rPr>
+        <w:t xml:space="preserve"> </w:t>
+      </w:r>
+      <w:r>
+        <w:rPr>
+          <w:rStyle w:val="OperatorTok"/>
+        </w:rPr>
+        <w:t xml:space="preserve">=</w:t>
+      </w:r>
+      <w:r>
+        <w:rPr>
+          <w:rStyle w:val="NormalTok"/>
+        </w:rPr>
+        <w:t xml:space="preserve"> </w:t>
+      </w:r>
+      <w:r>
+        <w:rPr>
+          <w:rStyle w:val="OperatorTok"/>
+        </w:rPr>
+        <w:t xml:space="preserve">(</w:t>
+      </w:r>
+      <w:r>
+        <w:rPr>
+          <w:rStyle w:val="DataTypeTok"/>
+        </w:rPr>
+        <w:t xml:space="preserve">unsigned</w:t>
+      </w:r>
+      <w:r>
+        <w:rPr>
+          <w:rStyle w:val="OperatorTok"/>
+        </w:rPr>
+        <w:t xml:space="preserve">)</w:t>
+      </w:r>
+      <w:r>
+        <w:rPr>
+          <w:rStyle w:val="NormalTok"/>
+        </w:rPr>
+        <w:t xml:space="preserve"> </w:t>
+      </w:r>
+      <w:r>
+        <w:rPr>
+          <w:rStyle w:val="OperatorTok"/>
+        </w:rPr>
+        <w:t xml:space="preserve">(</w:t>
+      </w:r>
+      <w:r>
+        <w:rPr>
+          <w:rStyle w:val="NormalTok"/>
+        </w:rPr>
+        <w:t xml:space="preserve">i </w:t>
+      </w:r>
+      <w:r>
+        <w:rPr>
+          <w:rStyle w:val="OperatorTok"/>
+        </w:rPr>
+        <w:t xml:space="preserve">+</w:t>
+      </w:r>
+      <w:r>
+        <w:rPr>
+          <w:rStyle w:val="NormalTok"/>
+        </w:rPr>
+        <w:t xml:space="preserve"> t</w:t>
+      </w:r>
+      <w:r>
+        <w:rPr>
+          <w:rStyle w:val="OperatorTok"/>
+        </w:rPr>
+        <w:t xml:space="preserve">)</w:t>
+      </w:r>
+      <w:r>
+        <w:rPr>
+          <w:rStyle w:val="NormalTok"/>
+        </w:rPr>
+        <w:t xml:space="preserve"> </w:t>
+      </w:r>
+      <w:r>
+        <w:rPr>
+          <w:rStyle w:val="OperatorTok"/>
+        </w:rPr>
+        <w:t xml:space="preserve">*</w:t>
+      </w:r>
+      <w:r>
+        <w:rPr>
+          <w:rStyle w:val="NormalTok"/>
+        </w:rPr>
+        <w:t xml:space="preserve"> </w:t>
+      </w:r>
+      <w:r>
+        <w:rPr>
+          <w:rStyle w:val="DecValTok"/>
+        </w:rPr>
+        <w:t xml:space="preserve">2654435761</w:t>
+      </w:r>
+      <w:r>
+        <w:rPr>
+          <w:rStyle w:val="BuiltInTok"/>
+        </w:rPr>
+        <w:t xml:space="preserve">u</w:t>
+      </w:r>
+      <w:r>
+        <w:rPr>
+          <w:rStyle w:val="NormalTok"/>
+        </w:rPr>
+        <w:t xml:space="preserve"> </w:t>
+      </w:r>
+      <w:r>
+        <w:rPr>
+          <w:rStyle w:val="OperatorTok"/>
+        </w:rPr>
+        <w:t xml:space="preserve">&gt;&gt;</w:t>
+      </w:r>
+      <w:r>
+        <w:rPr>
+          <w:rStyle w:val="NormalTok"/>
+        </w:rPr>
+        <w:t xml:space="preserve"> </w:t>
+      </w:r>
+      <w:r>
+        <w:rPr>
+          <w:rStyle w:val="DecValTok"/>
+        </w:rPr>
+        <w:t xml:space="preserve">8</w:t>
+      </w:r>
+      <w:r>
+        <w:rPr>
+          <w:rStyle w:val="OperatorTok"/>
+        </w:rPr>
+        <w:t xml:space="preserve">;</w:t>
+      </w:r>
+      <w:r>
+        <w:br/>
+      </w:r>
+      <w:r>
+        <w:rPr>
+          <w:rStyle w:val="NormalTok"/>
+        </w:rPr>
+        <w:t xml:space="preserve">        uk_win_present </w:t>
+      </w:r>
+      <w:r>
+        <w:rPr>
+          <w:rStyle w:val="OperatorTok"/>
+        </w:rPr>
+        <w:t xml:space="preserve">();</w:t>
+      </w:r>
+      <w:r>
+        <w:rPr>
+          <w:rStyle w:val="NormalTok"/>
+        </w:rPr>
+        <w:t xml:space="preserve">                                 </w:t>
+      </w:r>
+      <w:r>
+        <w:rPr>
+          <w:rStyle w:val="CommentTok"/>
+        </w:rPr>
+        <w:t xml:space="preserve">/* the server shows it */</w:t>
+      </w:r>
+      <w:r>
+        <w:br/>
+      </w:r>
+      <w:r>
+        <w:rPr>
+          <w:rStyle w:val="NormalTok"/>
+        </w:rPr>
+        <w:t xml:space="preserve">        kapi_pump_wait </w:t>
+      </w:r>
+      <w:r>
+        <w:rPr>
+          <w:rStyle w:val="OperatorTok"/>
+        </w:rPr>
+        <w:t xml:space="preserve">(</w:t>
+      </w:r>
+      <w:r>
+        <w:rPr>
+          <w:rStyle w:val="DecValTok"/>
+        </w:rPr>
+        <w:t xml:space="preserve">16</w:t>
+      </w:r>
+      <w:r>
+        <w:rPr>
+          <w:rStyle w:val="OperatorTok"/>
+        </w:rPr>
+        <w:t xml:space="preserve">);</w:t>
+      </w:r>
+      <w:r>
+        <w:rPr>
+          <w:rStyle w:val="NormalTok"/>
+        </w:rPr>
+        <w:t xml:space="preserve">                               </w:t>
+      </w:r>
+      <w:r>
+        <w:rPr>
+          <w:rStyle w:val="CommentTok"/>
+        </w:rPr>
+        <w:t xml:space="preserve">/* the events (AppKit's pump) */</w:t>
+      </w:r>
+      <w:r>
+        <w:br/>
+      </w:r>
+      <w:r>
+        <w:rPr>
+          <w:rStyle w:val="NormalTok"/>
+        </w:rPr>
+        <w:t xml:space="preserve">    </w:t>
+      </w:r>
+      <w:r>
+        <w:rPr>
+          <w:rStyle w:val="OperatorTok"/>
+        </w:rPr>
+        <w:t xml:space="preserve">}</w:t>
+      </w:r>
+      <w:r>
+        <w:br/>
+      </w:r>
+      <w:r>
+        <w:rPr>
+          <w:rStyle w:val="NormalTok"/>
+        </w:rPr>
+        <w:t xml:space="preserve">    </w:t>
+      </w:r>
+      <w:r>
+        <w:rPr>
+          <w:rStyle w:val="ControlFlowTok"/>
+        </w:rPr>
+        <w:t xml:space="preserve">return</w:t>
+      </w:r>
+      <w:r>
+        <w:rPr>
+          <w:rStyle w:val="NormalTok"/>
+        </w:rPr>
+        <w:t xml:space="preserve"> </w:t>
+      </w:r>
+      <w:r>
+        <w:rPr>
+          <w:rStyle w:val="DecValTok"/>
+        </w:rPr>
+        <w:t xml:space="preserve">0</w:t>
+      </w:r>
+      <w:r>
+        <w:rPr>
+          <w:rStyle w:val="OperatorTok"/>
+        </w:rPr>
+        <w:t xml:space="preserve">;</w:t>
+      </w:r>
+      <w:r>
+        <w:br/>
+      </w:r>
+      <w:r>
+        <w:rPr>
+          <w:rStyle w:val="OperatorTok"/>
+        </w:rPr>
+        <w:t xml:space="preserve">}</w:t>
       </w:r>
     </w:p>
     <w:bookmarkEnd w:id="41"/>
@@ -25208,6 +26533,201 @@
             </w:r>
             <w:r>
               <w:t xml:space="preserve">…</w:t>
+            </w:r>
+          </w:p>
+        </w:tc>
+      </w:tr>
+      <w:tr>
+        <w:tc>
+          <w:tcPr/>
+          <w:p>
+            <w:pPr>
+              <w:pStyle w:val="Compact"/>
+              <w:jc w:val="left"/>
+            </w:pPr>
+            <w:r>
+              <w:t xml:space="preserve">open a bare window, draw its pixels</w:t>
+            </w:r>
+          </w:p>
+        </w:tc>
+        <w:tc>
+          <w:tcPr/>
+          <w:p>
+            <w:pPr>
+              <w:pStyle w:val="Compact"/>
+              <w:jc w:val="left"/>
+            </w:pPr>
+            <w:r>
+              <w:t xml:space="preserve">UIKit</w:t>
+            </w:r>
+          </w:p>
+        </w:tc>
+        <w:tc>
+          <w:tcPr/>
+          <w:p>
+            <w:pPr>
+              <w:pStyle w:val="Compact"/>
+              <w:jc w:val="left"/>
+            </w:pPr>
+            <w:r>
+              <w:rPr>
+                <w:rStyle w:val="VerbatimChar"/>
+              </w:rPr>
+              <w:t xml:space="preserve">uk_win_create</w:t>
+            </w:r>
+            <w:r>
+              <w:t xml:space="preserve">,</w:t>
+            </w:r>
+            <w:r>
+              <w:t xml:space="preserve"> </w:t>
+            </w:r>
+            <w:r>
+              <w:rPr>
+                <w:rStyle w:val="VerbatimChar"/>
+              </w:rPr>
+              <w:t xml:space="preserve">uk_win_present</w:t>
+            </w:r>
+            <w:r>
+              <w:t xml:space="preserve">,</w:t>
+            </w:r>
+            <w:r>
+              <w:t xml:space="preserve"> </w:t>
+            </w:r>
+            <w:r>
+              <w:rPr>
+                <w:rStyle w:val="VerbatimChar"/>
+              </w:rPr>
+              <w:t xml:space="preserve">uk_win_on_key</w:t>
+            </w:r>
+          </w:p>
+        </w:tc>
+      </w:tr>
+      <w:tr>
+        <w:tc>
+          <w:tcPr/>
+          <w:p>
+            <w:pPr>
+              <w:pStyle w:val="Compact"/>
+              <w:jc w:val="left"/>
+            </w:pPr>
+            <w:r>
+              <w:t xml:space="preserve">take the whole screen (a game, an emulator)</w:t>
+            </w:r>
+          </w:p>
+        </w:tc>
+        <w:tc>
+          <w:tcPr/>
+          <w:p>
+            <w:pPr>
+              <w:pStyle w:val="Compact"/>
+              <w:jc w:val="left"/>
+            </w:pPr>
+            <w:r>
+              <w:t xml:space="preserve">UIKit (then AppKit's</w:t>
+            </w:r>
+            <w:r>
+              <w:t xml:space="preserve"> </w:t>
+            </w:r>
+            <w:r>
+              <w:rPr>
+                <w:rStyle w:val="VerbatimChar"/>
+              </w:rPr>
+              <w:t xml:space="preserve">kapi_present_fb</w:t>
+            </w:r>
+            <w:r>
+              <w:t xml:space="preserve">)</w:t>
+            </w:r>
+          </w:p>
+        </w:tc>
+        <w:tc>
+          <w:tcPr/>
+          <w:p>
+            <w:pPr>
+              <w:pStyle w:val="Compact"/>
+              <w:jc w:val="left"/>
+            </w:pPr>
+            <w:r>
+              <w:rPr>
+                <w:rStyle w:val="VerbatimChar"/>
+              </w:rPr>
+              <w:t xml:space="preserve">uk_win_fullscreen_begin</w:t>
+            </w:r>
+            <w:r>
+              <w:t xml:space="preserve">,</w:t>
+            </w:r>
+            <w:r>
+              <w:t xml:space="preserve"> </w:t>
+            </w:r>
+            <w:r>
+              <w:rPr>
+                <w:rStyle w:val="VerbatimChar"/>
+              </w:rPr>
+              <w:t xml:space="preserve">uk_win_fullscreen_end</w:t>
+            </w:r>
+          </w:p>
+        </w:tc>
+      </w:tr>
+      <w:tr>
+        <w:tc>
+          <w:tcPr/>
+          <w:p>
+            <w:pPr>
+              <w:pStyle w:val="Compact"/>
+              <w:jc w:val="left"/>
+            </w:pPr>
+            <w:r>
+              <w:t xml:space="preserve">list, raise, move the windows (a shell)</w:t>
+            </w:r>
+          </w:p>
+        </w:tc>
+        <w:tc>
+          <w:tcPr/>
+          <w:p>
+            <w:pPr>
+              <w:pStyle w:val="Compact"/>
+              <w:jc w:val="left"/>
+            </w:pPr>
+            <w:r>
+              <w:t xml:space="preserve">UIKit</w:t>
+            </w:r>
+          </w:p>
+        </w:tc>
+        <w:tc>
+          <w:tcPr/>
+          <w:p>
+            <w:pPr>
+              <w:pStyle w:val="Compact"/>
+              <w:jc w:val="left"/>
+            </w:pPr>
+            <w:r>
+              <w:rPr>
+                <w:rStyle w:val="VerbatimChar"/>
+              </w:rPr>
+              <w:t xml:space="preserve">uk_win_list</w:t>
+            </w:r>
+            <w:r>
+              <w:t xml:space="preserve">,</w:t>
+            </w:r>
+            <w:r>
+              <w:t xml:space="preserve"> </w:t>
+            </w:r>
+            <w:r>
+              <w:rPr>
+                <w:rStyle w:val="VerbatimChar"/>
+              </w:rPr>
+              <w:t xml:space="preserve">uk_win_raise</w:t>
+            </w:r>
+            <w:r>
+              <w:t xml:space="preserve">,</w:t>
+            </w:r>
+            <w:r>
+              <w:t xml:space="preserve"> </w:t>
+            </w:r>
+            <w:r>
+              <w:rPr>
+                <w:rStyle w:val="VerbatimChar"/>
+              </w:rPr>
+              <w:t xml:space="preserve">uk_win_place</w:t>
             </w:r>
           </w:p>
         </w:tc>

</xml_diff>

<commit_message>
Packages: onyx 2026.10.124, systemkit 1.78.2, uikit 1.793.4 and the programs (PocketUI P4: sessions, /bin/session, the Mode applet; PocketUI's fixes); the docs' exports
Co-Authored-By: Claude Opus 5.5 <noreply@anthropic.com>
Claude-Session: https://claude.ai/code/session_01Rso9E1gr5271FnTGcMLUVZ
</commit_message>
<xml_diff>
--- a/docs/exports/06-KITS-GUIDE.docx
+++ b/docs/exports/06-KITS-GUIDE.docx
@@ -15270,6 +15270,787 @@
         <w:t xml:space="preserve">rewritten (1 changed, 0 not).</w:t>
       </w:r>
     </w:p>
+    <w:p>
+      <w:pPr>
+        <w:pStyle w:val="BodyText"/>
+      </w:pPr>
+      <w:r>
+        <w:rPr>
+          <w:bCs/>
+          <w:b/>
+        </w:rPr>
+        <w:t xml:space="preserve">The interface's mode and its session</w:t>
+      </w:r>
+      <w:r>
+        <w:t xml:space="preserve"> </w:t>
+      </w:r>
+      <w:r>
+        <w:t xml:space="preserve">(</w:t>
+      </w:r>
+      <w:r>
+        <w:rPr>
+          <w:rStyle w:val="VerbatimChar"/>
+        </w:rPr>
+        <w:t xml:space="preserve">session.h</w:t>
+      </w:r>
+      <w:r>
+        <w:t xml:space="preserve">, 2026-10-08): the mode —</w:t>
+      </w:r>
+      <w:r>
+        <w:t xml:space="preserve"> </w:t>
+      </w:r>
+      <w:r>
+        <w:rPr>
+          <w:rStyle w:val="VerbatimChar"/>
+        </w:rPr>
+        <w:t xml:space="preserve">SESSION_DESKTOP</w:t>
+      </w:r>
+      <w:r>
+        <w:t xml:space="preserve">,</w:t>
+      </w:r>
+      <w:r>
+        <w:t xml:space="preserve"> </w:t>
+      </w:r>
+      <w:r>
+        <w:rPr>
+          <w:rStyle w:val="VerbatimChar"/>
+        </w:rPr>
+        <w:t xml:space="preserve">SESSION_POCKET</w:t>
+      </w:r>
+      <w:r>
+        <w:t xml:space="preserve">,</w:t>
+      </w:r>
+      <w:r>
+        <w:t xml:space="preserve"> </w:t>
+      </w:r>
+      <w:r>
+        <w:rPr>
+          <w:rStyle w:val="VerbatimChar"/>
+        </w:rPr>
+        <w:t xml:space="preserve">SESSION_CONSOLE</w:t>
+      </w:r>
+      <w:r>
+        <w:t xml:space="preserve"> </w:t>
+      </w:r>
+      <w:r>
+        <w:t xml:space="preserve">— is</w:t>
+      </w:r>
+      <w:r>
+        <w:t xml:space="preserve"> </w:t>
+      </w:r>
+      <w:r>
+        <w:rPr>
+          <w:rStyle w:val="VerbatimChar"/>
+        </w:rPr>
+        <w:t xml:space="preserve">system.ini</w:t>
+      </w:r>
+      <w:r>
+        <w:t xml:space="preserve">'s</w:t>
+      </w:r>
+      <w:r>
+        <w:t xml:space="preserve"> </w:t>
+      </w:r>
+      <w:r>
+        <w:rPr>
+          <w:rStyle w:val="VerbatimChar"/>
+        </w:rPr>
+        <w:t xml:space="preserve">shell=</w:t>
+      </w:r>
+      <w:r>
+        <w:t xml:space="preserve">; each mode's programs are its session file</w:t>
+      </w:r>
+      <w:r>
+        <w:t xml:space="preserve"> </w:t>
+      </w:r>
+      <w:r>
+        <w:rPr>
+          <w:rStyle w:val="VerbatimChar"/>
+        </w:rPr>
+        <w:t xml:space="preserve">SD:/etc/session/&lt;mode&gt;</w:t>
+      </w:r>
+      <w:r>
+        <w:t xml:space="preserve">.</w:t>
+      </w:r>
+      <w:r>
+        <w:t xml:space="preserve"> </w:t>
+      </w:r>
+      <w:r>
+        <w:t xml:space="preserve">A settings page switches the mode as the Control Panel's Mode applet does:</w:t>
+      </w:r>
+      <w:r>
+        <w:t xml:space="preserve"> </w:t>
+      </w:r>
+      <w:r>
+        <w:rPr>
+          <w:rStyle w:val="VerbatimChar"/>
+        </w:rPr>
+        <w:t xml:space="preserve">/bin/session</w:t>
+      </w:r>
+      <w:r>
+        <w:t xml:space="preserve"> </w:t>
+      </w:r>
+      <w:r>
+        <w:t xml:space="preserve">is started, closes the</w:t>
+      </w:r>
+      <w:r>
+        <w:t xml:space="preserve"> </w:t>
+      </w:r>
+      <w:r>
+        <w:t xml:space="preserve">open programs (each one asks about its unsaved work), and the caller polls it:</w:t>
+      </w:r>
+    </w:p>
+    <w:p>
+      <w:pPr>
+        <w:pStyle w:val="SourceCode"/>
+      </w:pPr>
+      <w:r>
+        <w:rPr>
+          <w:rStyle w:val="DataTypeTok"/>
+        </w:rPr>
+        <w:t xml:space="preserve">void</w:t>
+      </w:r>
+      <w:r>
+        <w:rPr>
+          <w:rStyle w:val="NormalTok"/>
+        </w:rPr>
+        <w:t xml:space="preserve"> </w:t>
+      </w:r>
+      <w:r>
+        <w:rPr>
+          <w:rStyle w:val="OperatorTok"/>
+        </w:rPr>
+        <w:t xml:space="preserve">*</w:t>
+      </w:r>
+      <w:r>
+        <w:rPr>
+          <w:rStyle w:val="NormalTok"/>
+        </w:rPr>
+        <w:t xml:space="preserve">h </w:t>
+      </w:r>
+      <w:r>
+        <w:rPr>
+          <w:rStyle w:val="OperatorTok"/>
+        </w:rPr>
+        <w:t xml:space="preserve">=</w:t>
+      </w:r>
+      <w:r>
+        <w:rPr>
+          <w:rStyle w:val="NormalTok"/>
+        </w:rPr>
+        <w:t xml:space="preserve"> session_switch_start </w:t>
+      </w:r>
+      <w:r>
+        <w:rPr>
+          <w:rStyle w:val="OperatorTok"/>
+        </w:rPr>
+        <w:t xml:space="preserve">(</w:t>
+      </w:r>
+      <w:r>
+        <w:rPr>
+          <w:rStyle w:val="NormalTok"/>
+        </w:rPr>
+        <w:t xml:space="preserve">SESSION_POCKET</w:t>
+      </w:r>
+      <w:r>
+        <w:rPr>
+          <w:rStyle w:val="OperatorTok"/>
+        </w:rPr>
+        <w:t xml:space="preserve">,</w:t>
+      </w:r>
+      <w:r>
+        <w:rPr>
+          <w:rStyle w:val="NormalTok"/>
+        </w:rPr>
+        <w:t xml:space="preserve"> </w:t>
+      </w:r>
+      <w:r>
+        <w:rPr>
+          <w:rStyle w:val="DecValTok"/>
+        </w:rPr>
+        <w:t xml:space="preserve">0</w:t>
+      </w:r>
+      <w:r>
+        <w:rPr>
+          <w:rStyle w:val="OperatorTok"/>
+        </w:rPr>
+        <w:t xml:space="preserve">,</w:t>
+      </w:r>
+      <w:r>
+        <w:rPr>
+          <w:rStyle w:val="NormalTok"/>
+        </w:rPr>
+        <w:t xml:space="preserve"> </w:t>
+      </w:r>
+      <w:r>
+        <w:rPr>
+          <w:rStyle w:val="DecValTok"/>
+        </w:rPr>
+        <w:t xml:space="preserve">0</w:t>
+      </w:r>
+      <w:r>
+        <w:rPr>
+          <w:rStyle w:val="OperatorTok"/>
+        </w:rPr>
+        <w:t xml:space="preserve">);</w:t>
+      </w:r>
+      <w:r>
+        <w:rPr>
+          <w:rStyle w:val="NormalTok"/>
+        </w:rPr>
+        <w:t xml:space="preserve">     </w:t>
+      </w:r>
+      <w:r>
+        <w:rPr>
+          <w:rStyle w:val="CommentTok"/>
+        </w:rPr>
+        <w:t xml:space="preserve">// the caller and its parents are kept open, then ended</w:t>
+      </w:r>
+      <w:r>
+        <w:br/>
+      </w:r>
+      <w:r>
+        <w:rPr>
+          <w:rStyle w:val="CommentTok"/>
+        </w:rPr>
+        <w:t xml:space="preserve">/* ... each turn: */</w:t>
+      </w:r>
+      <w:r>
+        <w:rPr>
+          <w:rStyle w:val="NormalTok"/>
+        </w:rPr>
+        <w:t xml:space="preserve"> </w:t>
+      </w:r>
+      <w:r>
+        <w:rPr>
+          <w:rStyle w:val="ControlFlowTok"/>
+        </w:rPr>
+        <w:t xml:space="preserve">if</w:t>
+      </w:r>
+      <w:r>
+        <w:rPr>
+          <w:rStyle w:val="NormalTok"/>
+        </w:rPr>
+        <w:t xml:space="preserve"> </w:t>
+      </w:r>
+      <w:r>
+        <w:rPr>
+          <w:rStyle w:val="OperatorTok"/>
+        </w:rPr>
+        <w:t xml:space="preserve">(</w:t>
+      </w:r>
+      <w:r>
+        <w:rPr>
+          <w:rStyle w:val="NormalTok"/>
+        </w:rPr>
+        <w:t xml:space="preserve">h </w:t>
+      </w:r>
+      <w:r>
+        <w:rPr>
+          <w:rStyle w:val="OperatorTok"/>
+        </w:rPr>
+        <w:t xml:space="preserve">&amp;&amp;</w:t>
+      </w:r>
+      <w:r>
+        <w:rPr>
+          <w:rStyle w:val="NormalTok"/>
+        </w:rPr>
+        <w:t xml:space="preserve"> kapi_proc_done </w:t>
+      </w:r>
+      <w:r>
+        <w:rPr>
+          <w:rStyle w:val="OperatorTok"/>
+        </w:rPr>
+        <w:t xml:space="preserve">(</w:t>
+      </w:r>
+      <w:r>
+        <w:rPr>
+          <w:rStyle w:val="NormalTok"/>
+        </w:rPr>
+        <w:t xml:space="preserve">h</w:t>
+      </w:r>
+      <w:r>
+        <w:rPr>
+          <w:rStyle w:val="OperatorTok"/>
+        </w:rPr>
+        <w:t xml:space="preserve">))</w:t>
+      </w:r>
+      <w:r>
+        <w:rPr>
+          <w:rStyle w:val="NormalTok"/>
+        </w:rPr>
+        <w:t xml:space="preserve"> </w:t>
+      </w:r>
+      <w:r>
+        <w:rPr>
+          <w:rStyle w:val="OperatorTok"/>
+        </w:rPr>
+        <w:t xml:space="preserve">{</w:t>
+      </w:r>
+      <w:r>
+        <w:br/>
+      </w:r>
+      <w:r>
+        <w:rPr>
+          <w:rStyle w:val="NormalTok"/>
+        </w:rPr>
+        <w:t xml:space="preserve">    </w:t>
+      </w:r>
+      <w:r>
+        <w:rPr>
+          <w:rStyle w:val="DataTypeTok"/>
+        </w:rPr>
+        <w:t xml:space="preserve">int</w:t>
+      </w:r>
+      <w:r>
+        <w:rPr>
+          <w:rStyle w:val="NormalTok"/>
+        </w:rPr>
+        <w:t xml:space="preserve"> r </w:t>
+      </w:r>
+      <w:r>
+        <w:rPr>
+          <w:rStyle w:val="OperatorTok"/>
+        </w:rPr>
+        <w:t xml:space="preserve">=</w:t>
+      </w:r>
+      <w:r>
+        <w:rPr>
+          <w:rStyle w:val="NormalTok"/>
+        </w:rPr>
+        <w:t xml:space="preserve"> kapi_wait </w:t>
+      </w:r>
+      <w:r>
+        <w:rPr>
+          <w:rStyle w:val="OperatorTok"/>
+        </w:rPr>
+        <w:t xml:space="preserve">(</w:t>
+      </w:r>
+      <w:r>
+        <w:rPr>
+          <w:rStyle w:val="NormalTok"/>
+        </w:rPr>
+        <w:t xml:space="preserve">h</w:t>
+      </w:r>
+      <w:r>
+        <w:rPr>
+          <w:rStyle w:val="OperatorTok"/>
+        </w:rPr>
+        <w:t xml:space="preserve">);</w:t>
+      </w:r>
+      <w:r>
+        <w:rPr>
+          <w:rStyle w:val="NormalTok"/>
+        </w:rPr>
+        <w:t xml:space="preserve"> h </w:t>
+      </w:r>
+      <w:r>
+        <w:rPr>
+          <w:rStyle w:val="OperatorTok"/>
+        </w:rPr>
+        <w:t xml:space="preserve">=</w:t>
+      </w:r>
+      <w:r>
+        <w:rPr>
+          <w:rStyle w:val="NormalTok"/>
+        </w:rPr>
+        <w:t xml:space="preserve"> </w:t>
+      </w:r>
+      <w:r>
+        <w:rPr>
+          <w:rStyle w:val="DecValTok"/>
+        </w:rPr>
+        <w:t xml:space="preserve">0</w:t>
+      </w:r>
+      <w:r>
+        <w:rPr>
+          <w:rStyle w:val="OperatorTok"/>
+        </w:rPr>
+        <w:t xml:space="preserve">;</w:t>
+      </w:r>
+      <w:r>
+        <w:br/>
+      </w:r>
+      <w:r>
+        <w:rPr>
+          <w:rStyle w:val="NormalTok"/>
+        </w:rPr>
+        <w:t xml:space="preserve">    </w:t>
+      </w:r>
+      <w:r>
+        <w:rPr>
+          <w:rStyle w:val="ControlFlowTok"/>
+        </w:rPr>
+        <w:t xml:space="preserve">if</w:t>
+      </w:r>
+      <w:r>
+        <w:rPr>
+          <w:rStyle w:val="NormalTok"/>
+        </w:rPr>
+        <w:t xml:space="preserve"> </w:t>
+      </w:r>
+      <w:r>
+        <w:rPr>
+          <w:rStyle w:val="OperatorTok"/>
+        </w:rPr>
+        <w:t xml:space="preserve">(</w:t>
+      </w:r>
+      <w:r>
+        <w:rPr>
+          <w:rStyle w:val="NormalTok"/>
+        </w:rPr>
+        <w:t xml:space="preserve">r </w:t>
+      </w:r>
+      <w:r>
+        <w:rPr>
+          <w:rStyle w:val="OperatorTok"/>
+        </w:rPr>
+        <w:t xml:space="preserve">==</w:t>
+      </w:r>
+      <w:r>
+        <w:rPr>
+          <w:rStyle w:val="NormalTok"/>
+        </w:rPr>
+        <w:t xml:space="preserve"> SESSION_WAITING_APPS</w:t>
+      </w:r>
+      <w:r>
+        <w:rPr>
+          <w:rStyle w:val="OperatorTok"/>
+        </w:rPr>
+        <w:t xml:space="preserve">)</w:t>
+      </w:r>
+      <w:r>
+        <w:rPr>
+          <w:rStyle w:val="NormalTok"/>
+        </w:rPr>
+        <w:t xml:space="preserve"> </w:t>
+      </w:r>
+      <w:r>
+        <w:rPr>
+          <w:rStyle w:val="OperatorTok"/>
+        </w:rPr>
+        <w:t xml:space="preserve">{</w:t>
+      </w:r>
+      <w:r>
+        <w:rPr>
+          <w:rStyle w:val="NormalTok"/>
+        </w:rPr>
+        <w:t xml:space="preserve"> </w:t>
+      </w:r>
+      <w:r>
+        <w:rPr>
+          <w:rStyle w:val="DataTypeTok"/>
+        </w:rPr>
+        <w:t xml:space="preserve">char</w:t>
+      </w:r>
+      <w:r>
+        <w:rPr>
+          <w:rStyle w:val="NormalTok"/>
+        </w:rPr>
+        <w:t xml:space="preserve"> who</w:t>
+      </w:r>
+      <w:r>
+        <w:rPr>
+          <w:rStyle w:val="OperatorTok"/>
+        </w:rPr>
+        <w:t xml:space="preserve">[</w:t>
+      </w:r>
+      <w:r>
+        <w:rPr>
+          <w:rStyle w:val="DecValTok"/>
+        </w:rPr>
+        <w:t xml:space="preserve">512</w:t>
+      </w:r>
+      <w:r>
+        <w:rPr>
+          <w:rStyle w:val="OperatorTok"/>
+        </w:rPr>
+        <w:t xml:space="preserve">];</w:t>
+      </w:r>
+      <w:r>
+        <w:rPr>
+          <w:rStyle w:val="NormalTok"/>
+        </w:rPr>
+        <w:t xml:space="preserve"> session_waiting </w:t>
+      </w:r>
+      <w:r>
+        <w:rPr>
+          <w:rStyle w:val="OperatorTok"/>
+        </w:rPr>
+        <w:t xml:space="preserve">(</w:t>
+      </w:r>
+      <w:r>
+        <w:rPr>
+          <w:rStyle w:val="NormalTok"/>
+        </w:rPr>
+        <w:t xml:space="preserve">who</w:t>
+      </w:r>
+      <w:r>
+        <w:rPr>
+          <w:rStyle w:val="OperatorTok"/>
+        </w:rPr>
+        <w:t xml:space="preserve">,</w:t>
+      </w:r>
+      <w:r>
+        <w:rPr>
+          <w:rStyle w:val="NormalTok"/>
+        </w:rPr>
+        <w:t xml:space="preserve"> </w:t>
+      </w:r>
+      <w:r>
+        <w:rPr>
+          <w:rStyle w:val="KeywordTok"/>
+        </w:rPr>
+        <w:t xml:space="preserve">sizeof</w:t>
+      </w:r>
+      <w:r>
+        <w:rPr>
+          <w:rStyle w:val="NormalTok"/>
+        </w:rPr>
+        <w:t xml:space="preserve"> who</w:t>
+      </w:r>
+      <w:r>
+        <w:rPr>
+          <w:rStyle w:val="OperatorTok"/>
+        </w:rPr>
+        <w:t xml:space="preserve">);</w:t>
+      </w:r>
+      <w:r>
+        <w:rPr>
+          <w:rStyle w:val="NormalTok"/>
+        </w:rPr>
+        <w:t xml:space="preserve">   </w:t>
+      </w:r>
+      <w:r>
+        <w:rPr>
+          <w:rStyle w:val="CommentTok"/>
+        </w:rPr>
+        <w:t xml:space="preserve">// "name\ttitle" lines</w:t>
+      </w:r>
+      <w:r>
+        <w:br/>
+      </w:r>
+      <w:r>
+        <w:rPr>
+          <w:rStyle w:val="NormalTok"/>
+        </w:rPr>
+        <w:t xml:space="preserve">        </w:t>
+      </w:r>
+      <w:r>
+        <w:rPr>
+          <w:rStyle w:val="CommentTok"/>
+        </w:rPr>
+        <w:t xml:space="preserve">/* ask: Wait -&gt; session_switch_start (m, SESSION_NO_ASK, 0); Force -&gt; ... SESSION_NO_ASK | SESSION_FORCE */</w:t>
+      </w:r>
+      <w:r>
+        <w:rPr>
+          <w:rStyle w:val="NormalTok"/>
+        </w:rPr>
+        <w:t xml:space="preserve"> </w:t>
+      </w:r>
+      <w:r>
+        <w:rPr>
+          <w:rStyle w:val="OperatorTok"/>
+        </w:rPr>
+        <w:t xml:space="preserve">}</w:t>
+      </w:r>
+      <w:r>
+        <w:br/>
+      </w:r>
+      <w:r>
+        <w:rPr>
+          <w:rStyle w:val="OperatorTok"/>
+        </w:rPr>
+        <w:t xml:space="preserve">}</w:t>
+      </w:r>
+      <w:r>
+        <w:br/>
+      </w:r>
+      <w:r>
+        <w:rPr>
+          <w:rStyle w:val="DataTypeTok"/>
+        </w:rPr>
+        <w:t xml:space="preserve">int</w:t>
+      </w:r>
+      <w:r>
+        <w:rPr>
+          <w:rStyle w:val="NormalTok"/>
+        </w:rPr>
+        <w:t xml:space="preserve"> m </w:t>
+      </w:r>
+      <w:r>
+        <w:rPr>
+          <w:rStyle w:val="OperatorTok"/>
+        </w:rPr>
+        <w:t xml:space="preserve">=</w:t>
+      </w:r>
+      <w:r>
+        <w:rPr>
+          <w:rStyle w:val="NormalTok"/>
+        </w:rPr>
+        <w:t xml:space="preserve"> session_mode </w:t>
+      </w:r>
+      <w:r>
+        <w:rPr>
+          <w:rStyle w:val="OperatorTok"/>
+        </w:rPr>
+        <w:t xml:space="preserve">();</w:t>
+      </w:r>
+      <w:r>
+        <w:rPr>
+          <w:rStyle w:val="NormalTok"/>
+        </w:rPr>
+        <w:t xml:space="preserve">                                   </w:t>
+      </w:r>
+      <w:r>
+        <w:rPr>
+          <w:rStyle w:val="CommentTok"/>
+        </w:rPr>
+        <w:t xml:space="preserve">// the mode chosen (no line: the desktop)</w:t>
+      </w:r>
+      <w:r>
+        <w:br/>
+      </w:r>
+      <w:r>
+        <w:rPr>
+          <w:rStyle w:val="DataTypeTok"/>
+        </w:rPr>
+        <w:t xml:space="preserve">char</w:t>
+      </w:r>
+      <w:r>
+        <w:rPr>
+          <w:rStyle w:val="NormalTok"/>
+        </w:rPr>
+        <w:t xml:space="preserve"> names</w:t>
+      </w:r>
+      <w:r>
+        <w:rPr>
+          <w:rStyle w:val="OperatorTok"/>
+        </w:rPr>
+        <w:t xml:space="preserve">[</w:t>
+      </w:r>
+      <w:r>
+        <w:rPr>
+          <w:rStyle w:val="DecValTok"/>
+        </w:rPr>
+        <w:t xml:space="preserve">512</w:t>
+      </w:r>
+      <w:r>
+        <w:rPr>
+          <w:rStyle w:val="OperatorTok"/>
+        </w:rPr>
+        <w:t xml:space="preserve">];</w:t>
+      </w:r>
+      <w:r>
+        <w:rPr>
+          <w:rStyle w:val="NormalTok"/>
+        </w:rPr>
+        <w:t xml:space="preserve"> session_programs </w:t>
+      </w:r>
+      <w:r>
+        <w:rPr>
+          <w:rStyle w:val="OperatorTok"/>
+        </w:rPr>
+        <w:t xml:space="preserve">(</w:t>
+      </w:r>
+      <w:r>
+        <w:rPr>
+          <w:rStyle w:val="NormalTok"/>
+        </w:rPr>
+        <w:t xml:space="preserve">m</w:t>
+      </w:r>
+      <w:r>
+        <w:rPr>
+          <w:rStyle w:val="OperatorTok"/>
+        </w:rPr>
+        <w:t xml:space="preserve">,</w:t>
+      </w:r>
+      <w:r>
+        <w:rPr>
+          <w:rStyle w:val="NormalTok"/>
+        </w:rPr>
+        <w:t xml:space="preserve"> names</w:t>
+      </w:r>
+      <w:r>
+        <w:rPr>
+          <w:rStyle w:val="OperatorTok"/>
+        </w:rPr>
+        <w:t xml:space="preserve">,</w:t>
+      </w:r>
+      <w:r>
+        <w:rPr>
+          <w:rStyle w:val="NormalTok"/>
+        </w:rPr>
+        <w:t xml:space="preserve"> </w:t>
+      </w:r>
+      <w:r>
+        <w:rPr>
+          <w:rStyle w:val="KeywordTok"/>
+        </w:rPr>
+        <w:t xml:space="preserve">sizeof</w:t>
+      </w:r>
+      <w:r>
+        <w:rPr>
+          <w:rStyle w:val="NormalTok"/>
+        </w:rPr>
+        <w:t xml:space="preserve"> names</w:t>
+      </w:r>
+      <w:r>
+        <w:rPr>
+          <w:rStyle w:val="OperatorTok"/>
+        </w:rPr>
+        <w:t xml:space="preserve">);</w:t>
+      </w:r>
+      <w:r>
+        <w:rPr>
+          <w:rStyle w:val="NormalTok"/>
+        </w:rPr>
+        <w:t xml:space="preserve"> </w:t>
+      </w:r>
+      <w:r>
+        <w:rPr>
+          <w:rStyle w:val="CommentTok"/>
+        </w:rPr>
+        <w:t xml:space="preserve">// "menubar\nterminal\n": what its session starts</w:t>
+      </w:r>
+    </w:p>
+    <w:p>
+      <w:pPr>
+        <w:pStyle w:val="FirstParagraph"/>
+      </w:pPr>
+      <w:r>
+        <w:rPr>
+          <w:rStyle w:val="VerbatimChar"/>
+        </w:rPr>
+        <w:t xml:space="preserve">autostart_has</w:t>
+      </w:r>
+      <w:r>
+        <w:t xml:space="preserve"> </w:t>
+      </w:r>
+      <w:r>
+        <w:t xml:space="preserve">/</w:t>
+      </w:r>
+      <w:r>
+        <w:t xml:space="preserve"> </w:t>
+      </w:r>
+      <w:r>
+        <w:rPr>
+          <w:rStyle w:val="VerbatimChar"/>
+        </w:rPr>
+        <w:t xml:space="preserve">autostart_ensure</w:t>
+      </w:r>
+      <w:r>
+        <w:t xml:space="preserve"> </w:t>
+      </w:r>
+      <w:r>
+        <w:t xml:space="preserve">look in the autostart and in the session files: a line added after an anchor</w:t>
+      </w:r>
+      <w:r>
+        <w:t xml:space="preserve"> </w:t>
+      </w:r>
+      <w:r>
+        <w:t xml:space="preserve">goes into the file that has it.</w:t>
+      </w:r>
+    </w:p>
     <w:tbl>
       <w:tblPr>
         <w:tblStyle w:val="Table"/>
@@ -15602,7 +16383,10 @@
               <w:t xml:space="preserve">SD:/etc/autostart</w:t>
             </w:r>
             <w:r>
-              <w:t xml:space="preserve">)</w:t>
+              <w:t xml:space="preserve"> </w:t>
+            </w:r>
+            <w:r>
+              <w:t xml:space="preserve">and the session files)</w:t>
             </w:r>
           </w:p>
         </w:tc>
@@ -15670,6 +16454,47 @@
             </w:r>
             <w:r>
               <w:t xml:space="preserve">)</w:t>
+            </w:r>
+          </w:p>
+        </w:tc>
+      </w:tr>
+      <w:tr>
+        <w:tc>
+          <w:tcPr/>
+          <w:p>
+            <w:pPr>
+              <w:pStyle w:val="Compact"/>
+              <w:jc w:val="left"/>
+            </w:pPr>
+            <w:r>
+              <w:rPr>
+                <w:rStyle w:val="VerbatimChar"/>
+              </w:rPr>
+              <w:t xml:space="preserve">session.h</w:t>
+            </w:r>
+          </w:p>
+        </w:tc>
+        <w:tc>
+          <w:tcPr/>
+          <w:p>
+            <w:pPr>
+              <w:pStyle w:val="Compact"/>
+              <w:jc w:val="left"/>
+            </w:pPr>
+            <w:r>
+              <w:t xml:space="preserve">The interface's mode (desktop, pocket, console) and its session:</w:t>
+            </w:r>
+            <w:r>
+              <w:t xml:space="preserve"> </w:t>
+            </w:r>
+            <w:r>
+              <w:rPr>
+                <w:rStyle w:val="VerbatimChar"/>
+              </w:rPr>
+              <w:t xml:space="preserve">SD:/etc/session/&lt;mode&gt;</w:t>
+            </w:r>
+            <w:r>
+              <w:t xml:space="preserve">, the switch</w:t>
             </w:r>
           </w:p>
         </w:tc>

</xml_diff>

<commit_message>
consolehome: the console's settings pages in the XMB -- Sound, Gamepad (the wizard, the keyboard as pad 1), Keyboard & Mouse, Language & Region, Wi-Fi (all known networks, a network's page), Packages, Mode, Display (keep-this-size dialog, the games' resolutions); a virtual keyboard after the keymap, the dialog; French; server_sim scenarios; docs
Co-Authored-By: Claude Opus 5.5 <noreply@anthropic.com>
Claude-Session: https://claude.ai/code/session_019HZNXkLwzsAQuW11C1P6uR
</commit_message>
<xml_diff>
--- a/docs/exports/06-KITS-GUIDE.docx
+++ b/docs/exports/06-KITS-GUIDE.docx
@@ -18133,6 +18133,982 @@
         <w:t xml:space="preserve">// the latest first: d[i].path, .date (YYYYMMDD), .time (HHMM)</w:t>
       </w:r>
     </w:p>
+    <w:p>
+      <w:pPr>
+        <w:pStyle w:val="FirstParagraph"/>
+      </w:pPr>
+      <w:r>
+        <w:rPr>
+          <w:bCs/>
+          <w:b/>
+        </w:rPr>
+        <w:t xml:space="preserve">The screen's resolution</w:t>
+      </w:r>
+      <w:r>
+        <w:t xml:space="preserve"> </w:t>
+      </w:r>
+      <w:r>
+        <w:t xml:space="preserve">(</w:t>
+      </w:r>
+      <w:r>
+        <w:rPr>
+          <w:rStyle w:val="VerbatimChar"/>
+        </w:rPr>
+        <w:t xml:space="preserve">display.h</w:t>
+      </w:r>
+      <w:r>
+        <w:t xml:space="preserve">, 2026-10-09): the sizes offered, the one kept for the next start, and in the</w:t>
+      </w:r>
+      <w:r>
+        <w:t xml:space="preserve"> </w:t>
+      </w:r>
+      <w:r>
+        <w:t xml:space="preserve">console mode each app's own (an emulator's</w:t>
+      </w:r>
+      <w:r>
+        <w:t xml:space="preserve"> </w:t>
+      </w:r>
+      <w:r>
+        <w:rPr>
+          <w:rStyle w:val="VerbatimChar"/>
+        </w:rPr>
+        <w:t xml:space="preserve">resolution =</w:t>
+      </w:r>
+      <w:r>
+        <w:t xml:space="preserve">,</w:t>
+      </w:r>
+      <w:r>
+        <w:t xml:space="preserve"> </w:t>
+      </w:r>
+      <w:r>
+        <w:rPr>
+          <w:rStyle w:val="VerbatimChar"/>
+        </w:rPr>
+        <w:t xml:space="preserve">SD:/etc/console.ini [screen]</w:t>
+      </w:r>
+      <w:r>
+        <w:t xml:space="preserve">). The Display applet and the</w:t>
+      </w:r>
+      <w:r>
+        <w:t xml:space="preserve"> </w:t>
+      </w:r>
+      <w:r>
+        <w:t xml:space="preserve">console's Display page share it:</w:t>
+      </w:r>
+    </w:p>
+    <w:p>
+      <w:pPr>
+        <w:pStyle w:val="SourceCode"/>
+      </w:pPr>
+      <w:r>
+        <w:rPr>
+          <w:rStyle w:val="DataTypeTok"/>
+        </w:rPr>
+        <w:t xml:space="preserve">int</w:t>
+      </w:r>
+      <w:r>
+        <w:rPr>
+          <w:rStyle w:val="NormalTok"/>
+        </w:rPr>
+        <w:t xml:space="preserve"> w</w:t>
+      </w:r>
+      <w:r>
+        <w:rPr>
+          <w:rStyle w:val="OperatorTok"/>
+        </w:rPr>
+        <w:t xml:space="preserve">,</w:t>
+      </w:r>
+      <w:r>
+        <w:rPr>
+          <w:rStyle w:val="NormalTok"/>
+        </w:rPr>
+        <w:t xml:space="preserve"> h</w:t>
+      </w:r>
+      <w:r>
+        <w:rPr>
+          <w:rStyle w:val="OperatorTok"/>
+        </w:rPr>
+        <w:t xml:space="preserve">;</w:t>
+      </w:r>
+      <w:r>
+        <w:br/>
+      </w:r>
+      <w:r>
+        <w:rPr>
+          <w:rStyle w:val="DataTypeTok"/>
+        </w:rPr>
+        <w:t xml:space="preserve">const</w:t>
+      </w:r>
+      <w:r>
+        <w:rPr>
+          <w:rStyle w:val="NormalTok"/>
+        </w:rPr>
+        <w:t xml:space="preserve"> </w:t>
+      </w:r>
+      <w:r>
+        <w:rPr>
+          <w:rStyle w:val="DataTypeTok"/>
+        </w:rPr>
+        <w:t xml:space="preserve">char</w:t>
+      </w:r>
+      <w:r>
+        <w:rPr>
+          <w:rStyle w:val="NormalTok"/>
+        </w:rPr>
+        <w:t xml:space="preserve"> </w:t>
+      </w:r>
+      <w:r>
+        <w:rPr>
+          <w:rStyle w:val="OperatorTok"/>
+        </w:rPr>
+        <w:t xml:space="preserve">*</w:t>
+      </w:r>
+      <w:r>
+        <w:rPr>
+          <w:rStyle w:val="NormalTok"/>
+        </w:rPr>
+        <w:t xml:space="preserve">what </w:t>
+      </w:r>
+      <w:r>
+        <w:rPr>
+          <w:rStyle w:val="OperatorTok"/>
+        </w:rPr>
+        <w:t xml:space="preserve">=</w:t>
+      </w:r>
+      <w:r>
+        <w:rPr>
+          <w:rStyle w:val="NormalTok"/>
+        </w:rPr>
+        <w:t xml:space="preserve"> display_mode </w:t>
+      </w:r>
+      <w:r>
+        <w:rPr>
+          <w:rStyle w:val="OperatorTok"/>
+        </w:rPr>
+        <w:t xml:space="preserve">(</w:t>
+      </w:r>
+      <w:r>
+        <w:rPr>
+          <w:rStyle w:val="DecValTok"/>
+        </w:rPr>
+        <w:t xml:space="preserve">8</w:t>
+      </w:r>
+      <w:r>
+        <w:rPr>
+          <w:rStyle w:val="OperatorTok"/>
+        </w:rPr>
+        <w:t xml:space="preserve">,</w:t>
+      </w:r>
+      <w:r>
+        <w:rPr>
+          <w:rStyle w:val="NormalTok"/>
+        </w:rPr>
+        <w:t xml:space="preserve"> </w:t>
+      </w:r>
+      <w:r>
+        <w:rPr>
+          <w:rStyle w:val="OperatorTok"/>
+        </w:rPr>
+        <w:t xml:space="preserve">&amp;</w:t>
+      </w:r>
+      <w:r>
+        <w:rPr>
+          <w:rStyle w:val="NormalTok"/>
+        </w:rPr>
+        <w:t xml:space="preserve">w</w:t>
+      </w:r>
+      <w:r>
+        <w:rPr>
+          <w:rStyle w:val="OperatorTok"/>
+        </w:rPr>
+        <w:t xml:space="preserve">,</w:t>
+      </w:r>
+      <w:r>
+        <w:rPr>
+          <w:rStyle w:val="NormalTok"/>
+        </w:rPr>
+        <w:t xml:space="preserve"> </w:t>
+      </w:r>
+      <w:r>
+        <w:rPr>
+          <w:rStyle w:val="OperatorTok"/>
+        </w:rPr>
+        <w:t xml:space="preserve">&amp;</w:t>
+      </w:r>
+      <w:r>
+        <w:rPr>
+          <w:rStyle w:val="NormalTok"/>
+        </w:rPr>
+        <w:t xml:space="preserve">h</w:t>
+      </w:r>
+      <w:r>
+        <w:rPr>
+          <w:rStyle w:val="OperatorTok"/>
+        </w:rPr>
+        <w:t xml:space="preserve">);</w:t>
+      </w:r>
+      <w:r>
+        <w:rPr>
+          <w:rStyle w:val="NormalTok"/>
+        </w:rPr>
+        <w:t xml:space="preserve">               </w:t>
+      </w:r>
+      <w:r>
+        <w:rPr>
+          <w:rStyle w:val="CommentTok"/>
+        </w:rPr>
+        <w:t xml:space="preserve">// 1920 x 1080, "16:9, Full HD" (English: translate it)</w:t>
+      </w:r>
+      <w:r>
+        <w:br/>
+      </w:r>
+      <w:r>
+        <w:rPr>
+          <w:rStyle w:val="ControlFlowTok"/>
+        </w:rPr>
+        <w:t xml:space="preserve">if</w:t>
+      </w:r>
+      <w:r>
+        <w:rPr>
+          <w:rStyle w:val="NormalTok"/>
+        </w:rPr>
+        <w:t xml:space="preserve"> </w:t>
+      </w:r>
+      <w:r>
+        <w:rPr>
+          <w:rStyle w:val="OperatorTok"/>
+        </w:rPr>
+        <w:t xml:space="preserve">(</w:t>
+      </w:r>
+      <w:r>
+        <w:rPr>
+          <w:rStyle w:val="NormalTok"/>
+        </w:rPr>
+        <w:t xml:space="preserve">kapi_screen_set </w:t>
+      </w:r>
+      <w:r>
+        <w:rPr>
+          <w:rStyle w:val="OperatorTok"/>
+        </w:rPr>
+        <w:t xml:space="preserve">(</w:t>
+      </w:r>
+      <w:r>
+        <w:rPr>
+          <w:rStyle w:val="NormalTok"/>
+        </w:rPr>
+        <w:t xml:space="preserve">w</w:t>
+      </w:r>
+      <w:r>
+        <w:rPr>
+          <w:rStyle w:val="OperatorTok"/>
+        </w:rPr>
+        <w:t xml:space="preserve">,</w:t>
+      </w:r>
+      <w:r>
+        <w:rPr>
+          <w:rStyle w:val="NormalTok"/>
+        </w:rPr>
+        <w:t xml:space="preserve"> h</w:t>
+      </w:r>
+      <w:r>
+        <w:rPr>
+          <w:rStyle w:val="OperatorTok"/>
+        </w:rPr>
+        <w:t xml:space="preserve">)</w:t>
+      </w:r>
+      <w:r>
+        <w:rPr>
+          <w:rStyle w:val="NormalTok"/>
+        </w:rPr>
+        <w:t xml:space="preserve"> </w:t>
+      </w:r>
+      <w:r>
+        <w:rPr>
+          <w:rStyle w:val="OperatorTok"/>
+        </w:rPr>
+        <w:t xml:space="preserve">==</w:t>
+      </w:r>
+      <w:r>
+        <w:rPr>
+          <w:rStyle w:val="NormalTok"/>
+        </w:rPr>
+        <w:t xml:space="preserve"> </w:t>
+      </w:r>
+      <w:r>
+        <w:rPr>
+          <w:rStyle w:val="DecValTok"/>
+        </w:rPr>
+        <w:t xml:space="preserve">0</w:t>
+      </w:r>
+      <w:r>
+        <w:rPr>
+          <w:rStyle w:val="OperatorTok"/>
+        </w:rPr>
+        <w:t xml:space="preserve">)</w:t>
+      </w:r>
+      <w:r>
+        <w:rPr>
+          <w:rStyle w:val="NormalTok"/>
+        </w:rPr>
+        <w:t xml:space="preserve"> display_save_size </w:t>
+      </w:r>
+      <w:r>
+        <w:rPr>
+          <w:rStyle w:val="OperatorTok"/>
+        </w:rPr>
+        <w:t xml:space="preserve">(</w:t>
+      </w:r>
+      <w:r>
+        <w:rPr>
+          <w:rStyle w:val="NormalTok"/>
+        </w:rPr>
+        <w:t xml:space="preserve">w</w:t>
+      </w:r>
+      <w:r>
+        <w:rPr>
+          <w:rStyle w:val="OperatorTok"/>
+        </w:rPr>
+        <w:t xml:space="preserve">,</w:t>
+      </w:r>
+      <w:r>
+        <w:rPr>
+          <w:rStyle w:val="NormalTok"/>
+        </w:rPr>
+        <w:t xml:space="preserve"> h</w:t>
+      </w:r>
+      <w:r>
+        <w:rPr>
+          <w:rStyle w:val="OperatorTok"/>
+        </w:rPr>
+        <w:t xml:space="preserve">);</w:t>
+      </w:r>
+      <w:r>
+        <w:rPr>
+          <w:rStyle w:val="NormalTok"/>
+        </w:rPr>
+        <w:t xml:space="preserve">  </w:t>
+      </w:r>
+      <w:r>
+        <w:rPr>
+          <w:rStyle w:val="CommentTok"/>
+        </w:rPr>
+        <w:t xml:space="preserve">// applied, then kept in SD:/cmdline.txt</w:t>
+      </w:r>
+      <w:r>
+        <w:br/>
+      </w:r>
+      <w:r>
+        <w:rPr>
+          <w:rStyle w:val="NormalTok"/>
+        </w:rPr>
+        <w:t xml:space="preserve">display_game_set </w:t>
+      </w:r>
+      <w:r>
+        <w:rPr>
+          <w:rStyle w:val="OperatorTok"/>
+        </w:rPr>
+        <w:t xml:space="preserve">(</w:t>
+      </w:r>
+      <w:r>
+        <w:rPr>
+          <w:rStyle w:val="StringTok"/>
+        </w:rPr>
+        <w:t xml:space="preserve">"n64emu"</w:t>
+      </w:r>
+      <w:r>
+        <w:rPr>
+          <w:rStyle w:val="OperatorTok"/>
+        </w:rPr>
+        <w:t xml:space="preserve">,</w:t>
+      </w:r>
+      <w:r>
+        <w:rPr>
+          <w:rStyle w:val="NormalTok"/>
+        </w:rPr>
+        <w:t xml:space="preserve"> </w:t>
+      </w:r>
+      <w:r>
+        <w:rPr>
+          <w:rStyle w:val="DecValTok"/>
+        </w:rPr>
+        <w:t xml:space="preserve">1024</w:t>
+      </w:r>
+      <w:r>
+        <w:rPr>
+          <w:rStyle w:val="OperatorTok"/>
+        </w:rPr>
+        <w:t xml:space="preserve">,</w:t>
+      </w:r>
+      <w:r>
+        <w:rPr>
+          <w:rStyle w:val="NormalTok"/>
+        </w:rPr>
+        <w:t xml:space="preserve"> </w:t>
+      </w:r>
+      <w:r>
+        <w:rPr>
+          <w:rStyle w:val="DecValTok"/>
+        </w:rPr>
+        <w:t xml:space="preserve">768</w:t>
+      </w:r>
+      <w:r>
+        <w:rPr>
+          <w:rStyle w:val="OperatorTok"/>
+        </w:rPr>
+        <w:t xml:space="preserve">);</w:t>
+      </w:r>
+      <w:r>
+        <w:rPr>
+          <w:rStyle w:val="NormalTok"/>
+        </w:rPr>
+        <w:t xml:space="preserve">                    </w:t>
+      </w:r>
+      <w:r>
+        <w:rPr>
+          <w:rStyle w:val="CommentTok"/>
+        </w:rPr>
+        <w:t xml:space="preserve">// the N64 emulator at 1024 x 768 while it plays</w:t>
+      </w:r>
+      <w:r>
+        <w:br/>
+      </w:r>
+      <w:r>
+        <w:rPr>
+          <w:rStyle w:val="NormalTok"/>
+        </w:rPr>
+        <w:t xml:space="preserve">display_game_set </w:t>
+      </w:r>
+      <w:r>
+        <w:rPr>
+          <w:rStyle w:val="OperatorTok"/>
+        </w:rPr>
+        <w:t xml:space="preserve">(</w:t>
+      </w:r>
+      <w:r>
+        <w:rPr>
+          <w:rStyle w:val="StringTok"/>
+        </w:rPr>
+        <w:t xml:space="preserve">"gcemu"</w:t>
+      </w:r>
+      <w:r>
+        <w:rPr>
+          <w:rStyle w:val="OperatorTok"/>
+        </w:rPr>
+        <w:t xml:space="preserve">,</w:t>
+      </w:r>
+      <w:r>
+        <w:rPr>
+          <w:rStyle w:val="NormalTok"/>
+        </w:rPr>
+        <w:t xml:space="preserve"> DISPLAY_SYSTEM</w:t>
+      </w:r>
+      <w:r>
+        <w:rPr>
+          <w:rStyle w:val="OperatorTok"/>
+        </w:rPr>
+        <w:t xml:space="preserve">,</w:t>
+      </w:r>
+      <w:r>
+        <w:rPr>
+          <w:rStyle w:val="NormalTok"/>
+        </w:rPr>
+        <w:t xml:space="preserve"> </w:t>
+      </w:r>
+      <w:r>
+        <w:rPr>
+          <w:rStyle w:val="DecValTok"/>
+        </w:rPr>
+        <w:t xml:space="preserve">0</w:t>
+      </w:r>
+      <w:r>
+        <w:rPr>
+          <w:rStyle w:val="OperatorTok"/>
+        </w:rPr>
+        <w:t xml:space="preserve">);</w:t>
+      </w:r>
+      <w:r>
+        <w:rPr>
+          <w:rStyle w:val="NormalTok"/>
+        </w:rPr>
+        <w:t xml:space="preserve">             </w:t>
+      </w:r>
+      <w:r>
+        <w:rPr>
+          <w:rStyle w:val="CommentTok"/>
+        </w:rPr>
+        <w:t xml:space="preserve">// ... the system's size; DISPLAY_OWN: its app.txt's again</w:t>
+      </w:r>
+      <w:r>
+        <w:br/>
+      </w:r>
+      <w:r>
+        <w:rPr>
+          <w:rStyle w:val="ControlFlowTok"/>
+        </w:rPr>
+        <w:t xml:space="preserve">if</w:t>
+      </w:r>
+      <w:r>
+        <w:rPr>
+          <w:rStyle w:val="NormalTok"/>
+        </w:rPr>
+        <w:t xml:space="preserve"> </w:t>
+      </w:r>
+      <w:r>
+        <w:rPr>
+          <w:rStyle w:val="OperatorTok"/>
+        </w:rPr>
+        <w:t xml:space="preserve">(</w:t>
+      </w:r>
+      <w:r>
+        <w:rPr>
+          <w:rStyle w:val="NormalTok"/>
+        </w:rPr>
+        <w:t xml:space="preserve">display_game_size </w:t>
+      </w:r>
+      <w:r>
+        <w:rPr>
+          <w:rStyle w:val="OperatorTok"/>
+        </w:rPr>
+        <w:t xml:space="preserve">(</w:t>
+      </w:r>
+      <w:r>
+        <w:rPr>
+          <w:rStyle w:val="StringTok"/>
+        </w:rPr>
+        <w:t xml:space="preserve">"snesemu"</w:t>
+      </w:r>
+      <w:r>
+        <w:rPr>
+          <w:rStyle w:val="OperatorTok"/>
+        </w:rPr>
+        <w:t xml:space="preserve">,</w:t>
+      </w:r>
+      <w:r>
+        <w:rPr>
+          <w:rStyle w:val="NormalTok"/>
+        </w:rPr>
+        <w:t xml:space="preserve"> </w:t>
+      </w:r>
+      <w:r>
+        <w:rPr>
+          <w:rStyle w:val="OperatorTok"/>
+        </w:rPr>
+        <w:t xml:space="preserve">&amp;</w:t>
+      </w:r>
+      <w:r>
+        <w:rPr>
+          <w:rStyle w:val="NormalTok"/>
+        </w:rPr>
+        <w:t xml:space="preserve">w</w:t>
+      </w:r>
+      <w:r>
+        <w:rPr>
+          <w:rStyle w:val="OperatorTok"/>
+        </w:rPr>
+        <w:t xml:space="preserve">,</w:t>
+      </w:r>
+      <w:r>
+        <w:rPr>
+          <w:rStyle w:val="NormalTok"/>
+        </w:rPr>
+        <w:t xml:space="preserve"> </w:t>
+      </w:r>
+      <w:r>
+        <w:rPr>
+          <w:rStyle w:val="OperatorTok"/>
+        </w:rPr>
+        <w:t xml:space="preserve">&amp;</w:t>
+      </w:r>
+      <w:r>
+        <w:rPr>
+          <w:rStyle w:val="NormalTok"/>
+        </w:rPr>
+        <w:t xml:space="preserve">h</w:t>
+      </w:r>
+      <w:r>
+        <w:rPr>
+          <w:rStyle w:val="OperatorTok"/>
+        </w:rPr>
+        <w:t xml:space="preserve">))</w:t>
+      </w:r>
+      <w:r>
+        <w:rPr>
+          <w:rStyle w:val="NormalTok"/>
+        </w:rPr>
+        <w:t xml:space="preserve"> </w:t>
+      </w:r>
+      <w:r>
+        <w:rPr>
+          <w:rStyle w:val="OperatorTok"/>
+        </w:rPr>
+        <w:t xml:space="preserve">{</w:t>
+      </w:r>
+      <w:r>
+        <w:rPr>
+          <w:rStyle w:val="NormalTok"/>
+        </w:rPr>
+        <w:t xml:space="preserve"> </w:t>
+      </w:r>
+      <w:r>
+        <w:rPr>
+          <w:rStyle w:val="CommentTok"/>
+        </w:rPr>
+        <w:t xml:space="preserve">/* the size consolehome switches to */</w:t>
+      </w:r>
+      <w:r>
+        <w:rPr>
+          <w:rStyle w:val="NormalTok"/>
+        </w:rPr>
+        <w:t xml:space="preserve"> </w:t>
+      </w:r>
+      <w:r>
+        <w:rPr>
+          <w:rStyle w:val="OperatorTok"/>
+        </w:rPr>
+        <w:t xml:space="preserve">}</w:t>
+      </w:r>
+    </w:p>
+    <w:p>
+      <w:pPr>
+        <w:pStyle w:val="FirstParagraph"/>
+      </w:pPr>
+      <w:r>
+        <w:rPr>
+          <w:bCs/>
+          <w:b/>
+        </w:rPr>
+        <w:t xml:space="preserve">The keyboard and the mouse</w:t>
+      </w:r>
+      <w:r>
+        <w:t xml:space="preserve"> </w:t>
+      </w:r>
+      <w:r>
+        <w:t xml:space="preserve">(</w:t>
+      </w:r>
+      <w:r>
+        <w:rPr>
+          <w:rStyle w:val="VerbatimChar"/>
+        </w:rPr>
+        <w:t xml:space="preserve">input.h</w:t>
+      </w:r>
+      <w:r>
+        <w:t xml:space="preserve">, 2026-10-09): the layouts on the card, the one in use, taking one (kept for</w:t>
+      </w:r>
+      <w:r>
+        <w:t xml:space="preserve"> </w:t>
+      </w:r>
+      <w:r>
+        <w:t xml:space="preserve">every start), whether it is AZERTY or QWERTZ (a virtual keyboard follows it), the wheel's speed:</w:t>
+      </w:r>
+    </w:p>
+    <w:p>
+      <w:pPr>
+        <w:pStyle w:val="SourceCode"/>
+      </w:pPr>
+      <w:r>
+        <w:rPr>
+          <w:rStyle w:val="DataTypeTok"/>
+        </w:rPr>
+        <w:t xml:space="preserve">char</w:t>
+      </w:r>
+      <w:r>
+        <w:rPr>
+          <w:rStyle w:val="NormalTok"/>
+        </w:rPr>
+        <w:t xml:space="preserve"> maps</w:t>
+      </w:r>
+      <w:r>
+        <w:rPr>
+          <w:rStyle w:val="OperatorTok"/>
+        </w:rPr>
+        <w:t xml:space="preserve">[</w:t>
+      </w:r>
+      <w:r>
+        <w:rPr>
+          <w:rStyle w:val="NormalTok"/>
+        </w:rPr>
+        <w:t xml:space="preserve">INPUT_KEYMAPS_MAX</w:t>
+      </w:r>
+      <w:r>
+        <w:rPr>
+          <w:rStyle w:val="OperatorTok"/>
+        </w:rPr>
+        <w:t xml:space="preserve">][</w:t>
+      </w:r>
+      <w:r>
+        <w:rPr>
+          <w:rStyle w:val="DecValTok"/>
+        </w:rPr>
+        <w:t xml:space="preserve">12</w:t>
+      </w:r>
+      <w:r>
+        <w:rPr>
+          <w:rStyle w:val="OperatorTok"/>
+        </w:rPr>
+        <w:t xml:space="preserve">];</w:t>
+      </w:r>
+      <w:r>
+        <w:rPr>
+          <w:rStyle w:val="NormalTok"/>
+        </w:rPr>
+        <w:t xml:space="preserve"> </w:t>
+      </w:r>
+      <w:r>
+        <w:rPr>
+          <w:rStyle w:val="DataTypeTok"/>
+        </w:rPr>
+        <w:t xml:space="preserve">int</w:t>
+      </w:r>
+      <w:r>
+        <w:rPr>
+          <w:rStyle w:val="NormalTok"/>
+        </w:rPr>
+        <w:t xml:space="preserve"> n </w:t>
+      </w:r>
+      <w:r>
+        <w:rPr>
+          <w:rStyle w:val="OperatorTok"/>
+        </w:rPr>
+        <w:t xml:space="preserve">=</w:t>
+      </w:r>
+      <w:r>
+        <w:rPr>
+          <w:rStyle w:val="NormalTok"/>
+        </w:rPr>
+        <w:t xml:space="preserve"> input_keymaps </w:t>
+      </w:r>
+      <w:r>
+        <w:rPr>
+          <w:rStyle w:val="OperatorTok"/>
+        </w:rPr>
+        <w:t xml:space="preserve">(</w:t>
+      </w:r>
+      <w:r>
+        <w:rPr>
+          <w:rStyle w:val="NormalTok"/>
+        </w:rPr>
+        <w:t xml:space="preserve">maps</w:t>
+      </w:r>
+      <w:r>
+        <w:rPr>
+          <w:rStyle w:val="OperatorTok"/>
+        </w:rPr>
+        <w:t xml:space="preserve">,</w:t>
+      </w:r>
+      <w:r>
+        <w:rPr>
+          <w:rStyle w:val="NormalTok"/>
+        </w:rPr>
+        <w:t xml:space="preserve"> INPUT_KEYMAPS_MAX</w:t>
+      </w:r>
+      <w:r>
+        <w:rPr>
+          <w:rStyle w:val="OperatorTok"/>
+        </w:rPr>
+        <w:t xml:space="preserve">);</w:t>
+      </w:r>
+      <w:r>
+        <w:rPr>
+          <w:rStyle w:val="NormalTok"/>
+        </w:rPr>
+        <w:t xml:space="preserve">   </w:t>
+      </w:r>
+      <w:r>
+        <w:rPr>
+          <w:rStyle w:val="CommentTok"/>
+        </w:rPr>
+        <w:t xml:space="preserve">// "BE", "DE", "FR", "US"...</w:t>
+      </w:r>
+      <w:r>
+        <w:br/>
+      </w:r>
+      <w:r>
+        <w:rPr>
+          <w:rStyle w:val="NormalTok"/>
+        </w:rPr>
+        <w:t xml:space="preserve">input_keymap_set </w:t>
+      </w:r>
+      <w:r>
+        <w:rPr>
+          <w:rStyle w:val="OperatorTok"/>
+        </w:rPr>
+        <w:t xml:space="preserve">(</w:t>
+      </w:r>
+      <w:r>
+        <w:rPr>
+          <w:rStyle w:val="StringTok"/>
+        </w:rPr>
+        <w:t xml:space="preserve">"BE"</w:t>
+      </w:r>
+      <w:r>
+        <w:rPr>
+          <w:rStyle w:val="OperatorTok"/>
+        </w:rPr>
+        <w:t xml:space="preserve">);</w:t>
+      </w:r>
+      <w:r>
+        <w:rPr>
+          <w:rStyle w:val="NormalTok"/>
+        </w:rPr>
+        <w:t xml:space="preserve">                                    </w:t>
+      </w:r>
+      <w:r>
+        <w:rPr>
+          <w:rStyle w:val="CommentTok"/>
+        </w:rPr>
+        <w:t xml:space="preserve">// INPUT_KEPT: loaded now and in SD:/etc/autostart</w:t>
+      </w:r>
+      <w:r>
+        <w:br/>
+      </w:r>
+      <w:r>
+        <w:rPr>
+          <w:rStyle w:val="ControlFlowTok"/>
+        </w:rPr>
+        <w:t xml:space="preserve">if</w:t>
+      </w:r>
+      <w:r>
+        <w:rPr>
+          <w:rStyle w:val="NormalTok"/>
+        </w:rPr>
+        <w:t xml:space="preserve"> </w:t>
+      </w:r>
+      <w:r>
+        <w:rPr>
+          <w:rStyle w:val="OperatorTok"/>
+        </w:rPr>
+        <w:t xml:space="preserve">(</w:t>
+      </w:r>
+      <w:r>
+        <w:rPr>
+          <w:rStyle w:val="NormalTok"/>
+        </w:rPr>
+        <w:t xml:space="preserve">input_keymap_kind </w:t>
+      </w:r>
+      <w:r>
+        <w:rPr>
+          <w:rStyle w:val="OperatorTok"/>
+        </w:rPr>
+        <w:t xml:space="preserve">(</w:t>
+      </w:r>
+      <w:r>
+        <w:rPr>
+          <w:rStyle w:val="StringTok"/>
+        </w:rPr>
+        <w:t xml:space="preserve">"FR"</w:t>
+      </w:r>
+      <w:r>
+        <w:rPr>
+          <w:rStyle w:val="OperatorTok"/>
+        </w:rPr>
+        <w:t xml:space="preserve">)</w:t>
+      </w:r>
+      <w:r>
+        <w:rPr>
+          <w:rStyle w:val="NormalTok"/>
+        </w:rPr>
+        <w:t xml:space="preserve"> </w:t>
+      </w:r>
+      <w:r>
+        <w:rPr>
+          <w:rStyle w:val="OperatorTok"/>
+        </w:rPr>
+        <w:t xml:space="preserve">==</w:t>
+      </w:r>
+      <w:r>
+        <w:rPr>
+          <w:rStyle w:val="NormalTok"/>
+        </w:rPr>
+        <w:t xml:space="preserve"> </w:t>
+      </w:r>
+      <w:r>
+        <w:rPr>
+          <w:rStyle w:val="DecValTok"/>
+        </w:rPr>
+        <w:t xml:space="preserve">1</w:t>
+      </w:r>
+      <w:r>
+        <w:rPr>
+          <w:rStyle w:val="OperatorTok"/>
+        </w:rPr>
+        <w:t xml:space="preserve">)</w:t>
+      </w:r>
+      <w:r>
+        <w:rPr>
+          <w:rStyle w:val="NormalTok"/>
+        </w:rPr>
+        <w:t xml:space="preserve"> </w:t>
+      </w:r>
+      <w:r>
+        <w:rPr>
+          <w:rStyle w:val="OperatorTok"/>
+        </w:rPr>
+        <w:t xml:space="preserve">{</w:t>
+      </w:r>
+      <w:r>
+        <w:rPr>
+          <w:rStyle w:val="NormalTok"/>
+        </w:rPr>
+        <w:t xml:space="preserve"> </w:t>
+      </w:r>
+      <w:r>
+        <w:rPr>
+          <w:rStyle w:val="CommentTok"/>
+        </w:rPr>
+        <w:t xml:space="preserve">/* AZERTY */</w:t>
+      </w:r>
+      <w:r>
+        <w:rPr>
+          <w:rStyle w:val="NormalTok"/>
+        </w:rPr>
+        <w:t xml:space="preserve"> </w:t>
+      </w:r>
+      <w:r>
+        <w:rPr>
+          <w:rStyle w:val="OperatorTok"/>
+        </w:rPr>
+        <w:t xml:space="preserve">}</w:t>
+      </w:r>
+      <w:r>
+        <w:br/>
+      </w:r>
+      <w:r>
+        <w:rPr>
+          <w:rStyle w:val="NormalTok"/>
+        </w:rPr>
+        <w:t xml:space="preserve">input_wheel_save </w:t>
+      </w:r>
+      <w:r>
+        <w:rPr>
+          <w:rStyle w:val="OperatorTok"/>
+        </w:rPr>
+        <w:t xml:space="preserve">(</w:t>
+      </w:r>
+      <w:r>
+        <w:rPr>
+          <w:rStyle w:val="DecValTok"/>
+        </w:rPr>
+        <w:t xml:space="preserve">3</w:t>
+      </w:r>
+      <w:r>
+        <w:rPr>
+          <w:rStyle w:val="OperatorTok"/>
+        </w:rPr>
+        <w:t xml:space="preserve">);</w:t>
+      </w:r>
+      <w:r>
+        <w:rPr>
+          <w:rStyle w:val="NormalTok"/>
+        </w:rPr>
+        <w:t xml:space="preserve">                                       </w:t>
+      </w:r>
+      <w:r>
+        <w:rPr>
+          <w:rStyle w:val="CommentTok"/>
+        </w:rPr>
+        <w:t xml:space="preserve">// SD:/etc/theme.txt wheelspeed= (apply: uk_win_wheel_set)</w:t>
+      </w:r>
+    </w:p>
     <w:tbl>
       <w:tblPr>
         <w:tblStyle w:val="Table"/>
@@ -18708,6 +19684,103 @@
           </w:p>
         </w:tc>
       </w:tr>
+      <w:tr>
+        <w:tc>
+          <w:tcPr/>
+          <w:p>
+            <w:pPr>
+              <w:pStyle w:val="Compact"/>
+              <w:jc w:val="left"/>
+            </w:pPr>
+            <w:r>
+              <w:rPr>
+                <w:rStyle w:val="VerbatimChar"/>
+              </w:rPr>
+              <w:t xml:space="preserve">display.h</w:t>
+            </w:r>
+          </w:p>
+        </w:tc>
+        <w:tc>
+          <w:tcPr/>
+          <w:p>
+            <w:pPr>
+              <w:pStyle w:val="Compact"/>
+              <w:jc w:val="left"/>
+            </w:pPr>
+            <w:r>
+              <w:t xml:space="preserve">The screen's resolution: the sizes, the one kept (</w:t>
+            </w:r>
+            <w:r>
+              <w:rPr>
+                <w:rStyle w:val="VerbatimChar"/>
+              </w:rPr>
+              <w:t xml:space="preserve">SD:/cmdline.txt</w:t>
+            </w:r>
+            <w:r>
+              <w:t xml:space="preserve">), the console's games' own (</w:t>
+            </w:r>
+            <w:r>
+              <w:rPr>
+                <w:rStyle w:val="VerbatimChar"/>
+              </w:rPr>
+              <w:t xml:space="preserve">SD:/etc/console.ini [screen]</w:t>
+            </w:r>
+            <w:r>
+              <w:t xml:space="preserve">)</w:t>
+            </w:r>
+          </w:p>
+        </w:tc>
+      </w:tr>
+      <w:tr>
+        <w:tc>
+          <w:tcPr/>
+          <w:p>
+            <w:pPr>
+              <w:pStyle w:val="Compact"/>
+              <w:jc w:val="left"/>
+            </w:pPr>
+            <w:r>
+              <w:rPr>
+                <w:rStyle w:val="VerbatimChar"/>
+              </w:rPr>
+              <w:t xml:space="preserve">input.h</w:t>
+            </w:r>
+          </w:p>
+        </w:tc>
+        <w:tc>
+          <w:tcPr/>
+          <w:p>
+            <w:pPr>
+              <w:pStyle w:val="Compact"/>
+              <w:jc w:val="left"/>
+            </w:pPr>
+            <w:r>
+              <w:t xml:space="preserve">The keyboard's layouts (</w:t>
+            </w:r>
+            <w:r>
+              <w:rPr>
+                <w:rStyle w:val="VerbatimChar"/>
+              </w:rPr>
+              <w:t xml:space="preserve">SD:/etc/keymaps</w:t>
+            </w:r>
+            <w:r>
+              <w:t xml:space="preserve">, kept in</w:t>
+            </w:r>
+            <w:r>
+              <w:t xml:space="preserve"> </w:t>
+            </w:r>
+            <w:r>
+              <w:rPr>
+                <w:rStyle w:val="VerbatimChar"/>
+              </w:rPr>
+              <w:t xml:space="preserve">SD:/etc/autostart</w:t>
+            </w:r>
+            <w:r>
+              <w:t xml:space="preserve">) and the mouse wheel's speed</w:t>
+            </w:r>
+          </w:p>
+        </w:tc>
+      </w:tr>
     </w:tbl>
     <w:bookmarkEnd w:id="43"/>
     <w:bookmarkStart w:id="44" w:name="X21c5dfbcb5a69cd5c428264b88180cd193f70a2"/>
@@ -20011,6 +21084,397 @@
     <w:p>
       <w:pPr>
         <w:pStyle w:val="FirstParagraph"/>
+      </w:pPr>
+      <w:r>
+        <w:rPr>
+          <w:bCs/>
+          <w:b/>
+        </w:rPr>
+        <w:t xml:space="preserve">The known Wi-Fi networks</w:t>
+      </w:r>
+      <w:r>
+        <w:t xml:space="preserve"> </w:t>
+      </w:r>
+      <w:r>
+        <w:t xml:space="preserve">(</w:t>
+      </w:r>
+      <w:r>
+        <w:rPr>
+          <w:rStyle w:val="VerbatimChar"/>
+        </w:rPr>
+        <w:t xml:space="preserve">wifi.h</w:t>
+      </w:r>
+      <w:r>
+        <w:t xml:space="preserve">, 2026-10-09):</w:t>
+      </w:r>
+      <w:r>
+        <w:t xml:space="preserve"> </w:t>
+      </w:r>
+      <w:r>
+        <w:rPr>
+          <w:rStyle w:val="VerbatimChar"/>
+        </w:rPr>
+        <w:t xml:space="preserve">SD:/etc/wpa_supplicant.conf</w:t>
+      </w:r>
+      <w:r>
+        <w:t xml:space="preserve"> </w:t>
+      </w:r>
+      <w:r>
+        <w:t xml:space="preserve">read and written with every</w:t>
+      </w:r>
+      <w:r>
+        <w:t xml:space="preserve"> </w:t>
+      </w:r>
+      <w:r>
+        <w:t xml:space="preserve">network kept (the one joined last first), joining one at once (the scan itself is AppKit's</w:t>
+      </w:r>
+      <w:r>
+        <w:t xml:space="preserve"> </w:t>
+      </w:r>
+      <w:r>
+        <w:rPr>
+          <w:rStyle w:val="VerbatimChar"/>
+        </w:rPr>
+        <w:t xml:space="preserve">kapi_wlan_scan</w:t>
+      </w:r>
+      <w:r>
+        <w:t xml:space="preserve">). The menu</w:t>
+      </w:r>
+      <w:r>
+        <w:t xml:space="preserve"> </w:t>
+      </w:r>
+      <w:r>
+        <w:t xml:space="preserve">bar's Wi-Fi menu, the Wi-Fi applet and the console's Wi-Fi page share it:</w:t>
+      </w:r>
+    </w:p>
+    <w:p>
+      <w:pPr>
+        <w:pStyle w:val="SourceCode"/>
+      </w:pPr>
+      <w:r>
+        <w:rPr>
+          <w:rStyle w:val="KeywordTok"/>
+        </w:rPr>
+        <w:t xml:space="preserve">struct</w:t>
+      </w:r>
+      <w:r>
+        <w:rPr>
+          <w:rStyle w:val="NormalTok"/>
+        </w:rPr>
+        <w:t xml:space="preserve"> wifi_known k</w:t>
+      </w:r>
+      <w:r>
+        <w:rPr>
+          <w:rStyle w:val="OperatorTok"/>
+        </w:rPr>
+        <w:t xml:space="preserve">[</w:t>
+      </w:r>
+      <w:r>
+        <w:rPr>
+          <w:rStyle w:val="NormalTok"/>
+        </w:rPr>
+        <w:t xml:space="preserve">WIFI_KNOWN_MAX</w:t>
+      </w:r>
+      <w:r>
+        <w:rPr>
+          <w:rStyle w:val="OperatorTok"/>
+        </w:rPr>
+        <w:t xml:space="preserve">];</w:t>
+      </w:r>
+      <w:r>
+        <w:rPr>
+          <w:rStyle w:val="NormalTok"/>
+        </w:rPr>
+        <w:t xml:space="preserve"> </w:t>
+      </w:r>
+      <w:r>
+        <w:rPr>
+          <w:rStyle w:val="DataTypeTok"/>
+        </w:rPr>
+        <w:t xml:space="preserve">char</w:t>
+      </w:r>
+      <w:r>
+        <w:rPr>
+          <w:rStyle w:val="NormalTok"/>
+        </w:rPr>
+        <w:t xml:space="preserve"> cc</w:t>
+      </w:r>
+      <w:r>
+        <w:rPr>
+          <w:rStyle w:val="OperatorTok"/>
+        </w:rPr>
+        <w:t xml:space="preserve">[</w:t>
+      </w:r>
+      <w:r>
+        <w:rPr>
+          <w:rStyle w:val="DecValTok"/>
+        </w:rPr>
+        <w:t xml:space="preserve">8</w:t>
+      </w:r>
+      <w:r>
+        <w:rPr>
+          <w:rStyle w:val="OperatorTok"/>
+        </w:rPr>
+        <w:t xml:space="preserve">];</w:t>
+      </w:r>
+      <w:r>
+        <w:br/>
+      </w:r>
+      <w:r>
+        <w:rPr>
+          <w:rStyle w:val="DataTypeTok"/>
+        </w:rPr>
+        <w:t xml:space="preserve">int</w:t>
+      </w:r>
+      <w:r>
+        <w:rPr>
+          <w:rStyle w:val="NormalTok"/>
+        </w:rPr>
+        <w:t xml:space="preserve"> n </w:t>
+      </w:r>
+      <w:r>
+        <w:rPr>
+          <w:rStyle w:val="OperatorTok"/>
+        </w:rPr>
+        <w:t xml:space="preserve">=</w:t>
+      </w:r>
+      <w:r>
+        <w:rPr>
+          <w:rStyle w:val="NormalTok"/>
+        </w:rPr>
+        <w:t xml:space="preserve"> wifi_known_load </w:t>
+      </w:r>
+      <w:r>
+        <w:rPr>
+          <w:rStyle w:val="OperatorTok"/>
+        </w:rPr>
+        <w:t xml:space="preserve">(</w:t>
+      </w:r>
+      <w:r>
+        <w:rPr>
+          <w:rStyle w:val="NormalTok"/>
+        </w:rPr>
+        <w:t xml:space="preserve">k</w:t>
+      </w:r>
+      <w:r>
+        <w:rPr>
+          <w:rStyle w:val="OperatorTok"/>
+        </w:rPr>
+        <w:t xml:space="preserve">,</w:t>
+      </w:r>
+      <w:r>
+        <w:rPr>
+          <w:rStyle w:val="NormalTok"/>
+        </w:rPr>
+        <w:t xml:space="preserve"> WIFI_KNOWN_MAX</w:t>
+      </w:r>
+      <w:r>
+        <w:rPr>
+          <w:rStyle w:val="OperatorTok"/>
+        </w:rPr>
+        <w:t xml:space="preserve">,</w:t>
+      </w:r>
+      <w:r>
+        <w:rPr>
+          <w:rStyle w:val="NormalTok"/>
+        </w:rPr>
+        <w:t xml:space="preserve"> cc</w:t>
+      </w:r>
+      <w:r>
+        <w:rPr>
+          <w:rStyle w:val="OperatorTok"/>
+        </w:rPr>
+        <w:t xml:space="preserve">,</w:t>
+      </w:r>
+      <w:r>
+        <w:rPr>
+          <w:rStyle w:val="NormalTok"/>
+        </w:rPr>
+        <w:t xml:space="preserve"> </w:t>
+      </w:r>
+      <w:r>
+        <w:rPr>
+          <w:rStyle w:val="KeywordTok"/>
+        </w:rPr>
+        <w:t xml:space="preserve">sizeof</w:t>
+      </w:r>
+      <w:r>
+        <w:rPr>
+          <w:rStyle w:val="NormalTok"/>
+        </w:rPr>
+        <w:t xml:space="preserve"> cc</w:t>
+      </w:r>
+      <w:r>
+        <w:rPr>
+          <w:rStyle w:val="OperatorTok"/>
+        </w:rPr>
+        <w:t xml:space="preserve">);</w:t>
+      </w:r>
+      <w:r>
+        <w:rPr>
+          <w:rStyle w:val="NormalTok"/>
+        </w:rPr>
+        <w:t xml:space="preserve">   </w:t>
+      </w:r>
+      <w:r>
+        <w:rPr>
+          <w:rStyle w:val="CommentTok"/>
+        </w:rPr>
+        <w:t xml:space="preserve">// the networks, the country</w:t>
+      </w:r>
+      <w:r>
+        <w:br/>
+      </w:r>
+      <w:r>
+        <w:rPr>
+          <w:rStyle w:val="DataTypeTok"/>
+        </w:rPr>
+        <w:t xml:space="preserve">int</w:t>
+      </w:r>
+      <w:r>
+        <w:rPr>
+          <w:rStyle w:val="NormalTok"/>
+        </w:rPr>
+        <w:t xml:space="preserve"> r </w:t>
+      </w:r>
+      <w:r>
+        <w:rPr>
+          <w:rStyle w:val="OperatorTok"/>
+        </w:rPr>
+        <w:t xml:space="preserve">=</w:t>
+      </w:r>
+      <w:r>
+        <w:rPr>
+          <w:rStyle w:val="NormalTok"/>
+        </w:rPr>
+        <w:t xml:space="preserve"> wifi_join </w:t>
+      </w:r>
+      <w:r>
+        <w:rPr>
+          <w:rStyle w:val="OperatorTok"/>
+        </w:rPr>
+        <w:t xml:space="preserve">(</w:t>
+      </w:r>
+      <w:r>
+        <w:rPr>
+          <w:rStyle w:val="StringTok"/>
+        </w:rPr>
+        <w:t xml:space="preserve">"Maison"</w:t>
+      </w:r>
+      <w:r>
+        <w:rPr>
+          <w:rStyle w:val="OperatorTok"/>
+        </w:rPr>
+        <w:t xml:space="preserve">,</w:t>
+      </w:r>
+      <w:r>
+        <w:rPr>
+          <w:rStyle w:val="NormalTok"/>
+        </w:rPr>
+        <w:t xml:space="preserve"> WLAN_SEC_WPA2</w:t>
+      </w:r>
+      <w:r>
+        <w:rPr>
+          <w:rStyle w:val="OperatorTok"/>
+        </w:rPr>
+        <w:t xml:space="preserve">,</w:t>
+      </w:r>
+      <w:r>
+        <w:rPr>
+          <w:rStyle w:val="NormalTok"/>
+        </w:rPr>
+        <w:t xml:space="preserve"> </w:t>
+      </w:r>
+      <w:r>
+        <w:rPr>
+          <w:rStyle w:val="StringTok"/>
+        </w:rPr>
+        <w:t xml:space="preserve">"the password"</w:t>
+      </w:r>
+      <w:r>
+        <w:rPr>
+          <w:rStyle w:val="OperatorTok"/>
+        </w:rPr>
+        <w:t xml:space="preserve">);</w:t>
+      </w:r>
+      <w:r>
+        <w:rPr>
+          <w:rStyle w:val="NormalTok"/>
+        </w:rPr>
+        <w:t xml:space="preserve">  </w:t>
+      </w:r>
+      <w:r>
+        <w:rPr>
+          <w:rStyle w:val="CommentTok"/>
+        </w:rPr>
+        <w:t xml:space="preserve">// WIFI_OK (joining), WIFI_SAVED (a reboot joins it), WIFI_E*</w:t>
+      </w:r>
+      <w:r>
+        <w:br/>
+      </w:r>
+      <w:r>
+        <w:rPr>
+          <w:rStyle w:val="NormalTok"/>
+        </w:rPr>
+        <w:t xml:space="preserve">wifi_forget </w:t>
+      </w:r>
+      <w:r>
+        <w:rPr>
+          <w:rStyle w:val="OperatorTok"/>
+        </w:rPr>
+        <w:t xml:space="preserve">(</w:t>
+      </w:r>
+      <w:r>
+        <w:rPr>
+          <w:rStyle w:val="StringTok"/>
+        </w:rPr>
+        <w:t xml:space="preserve">"Voisin"</w:t>
+      </w:r>
+      <w:r>
+        <w:rPr>
+          <w:rStyle w:val="OperatorTok"/>
+        </w:rPr>
+        <w:t xml:space="preserve">);</w:t>
+      </w:r>
+      <w:r>
+        <w:br/>
+      </w:r>
+      <w:r>
+        <w:rPr>
+          <w:rStyle w:val="NormalTok"/>
+        </w:rPr>
+        <w:t xml:space="preserve">wifi_set_country </w:t>
+      </w:r>
+      <w:r>
+        <w:rPr>
+          <w:rStyle w:val="OperatorTok"/>
+        </w:rPr>
+        <w:t xml:space="preserve">(</w:t>
+      </w:r>
+      <w:r>
+        <w:rPr>
+          <w:rStyle w:val="StringTok"/>
+        </w:rPr>
+        <w:t xml:space="preserve">"BE"</w:t>
+      </w:r>
+      <w:r>
+        <w:rPr>
+          <w:rStyle w:val="OperatorTok"/>
+        </w:rPr>
+        <w:t xml:space="preserve">);</w:t>
+      </w:r>
+    </w:p>
+    <w:p>
+      <w:pPr>
+        <w:pStyle w:val="FirstParagraph"/>
+      </w:pPr>
+      <w:r>
+        <w:t xml:space="preserve">The passwords are in clear text on the card (the radio needs them).</w:t>
+      </w:r>
+    </w:p>
+    <w:p>
+      <w:pPr>
+        <w:pStyle w:val="BodyText"/>
       </w:pPr>
       <w:r>
         <w:t xml:space="preserve">The raw sockets (</w:t>

</xml_diff>